<commit_message>
Completing quarto code for Methods.
</commit_message>
<xml_diff>
--- a/2025_earwig_fecundity_revised/Backup of 2025_earwig_fecundity_revised.docx
+++ b/2025_earwig_fecundity_revised/Backup of 2025_earwig_fecundity_revised.docx
@@ -303,7 +303,7 @@
       </w:r>
     </w:p>
     <w:bookmarkEnd w:id="22"/>
-    <w:bookmarkStart w:id="24" w:name="methods"/>
+    <w:bookmarkStart w:id="30" w:name="methods"/>
     <w:p>
       <w:pPr>
         <w:pStyle w:val="Heading1"/>
@@ -495,29 +495,29 @@
         <w:pStyle w:val="BodyText"/>
       </w:pPr>
       <w:r>
-        <w:t xml:space="preserve">I tested the prediction that egg number and egg size trade off within females using a Bayesian multivariate linear mixed-effects model (</w:t>
+        <w:t xml:space="preserve">I tested whether egg number and egg size changed across successive broods by fitting a multivariate Bayesian mixed-effects model including clutch order (first vs. second clutch) as a fixed effect for both traits. Egg size was modelled using a Gaussian distribution with an identity link, whereas egg number was modelled using a Poisson distribution with a log link.</w:t>
+      </w:r>
+      <w:r>
+        <w:t xml:space="preserve"> </w:t>
+      </w:r>
+      <w:r>
+        <w:t xml:space="preserve">For female</w:t>
+      </w:r>
+      <w:r>
+        <w:t xml:space="preserve"> </w:t>
       </w:r>
       <w:r>
         <w:rPr>
           <w:i/>
           <w:iCs/>
         </w:rPr>
-        <w:t xml:space="preserve">brms</w:t>
-      </w:r>
-      <w:r>
-        <w:t xml:space="preserve"> </w:t>
-      </w:r>
-      <w:r>
-        <w:t xml:space="preserve">package,</w:t>
-      </w:r>
-      <w:r>
-        <w:t xml:space="preserve"> </w:t>
-      </w:r>
-      <w:r>
-        <w:t xml:space="preserve">Bürkner (2017)</w:t>
-      </w:r>
-      <w:r>
-        <w:t xml:space="preserve">). Egg number and egg perimeter were entered as scaled response variables, and</w:t>
+        <w:t xml:space="preserve">i</w:t>
+      </w:r>
+      <w:r>
+        <w:t xml:space="preserve"> </w:t>
+      </w:r>
+      <w:r>
+        <w:t xml:space="preserve">and brood</w:t>
       </w:r>
       <w:r>
         <w:t xml:space="preserve"> </w:t>
@@ -527,13 +527,820 @@
           <w:i/>
           <w:iCs/>
         </w:rPr>
-        <w:t xml:space="preserve">res_cor</w:t>
-      </w:r>
-      <w:r>
-        <w:t xml:space="preserve"> </w:t>
-      </w:r>
-      <w:r>
-        <w:t xml:space="preserve">was set to TRUE to estimate the within-individual (residual) correlation (</w:t>
+        <w:t xml:space="preserve">j</w:t>
+      </w:r>
+      <w:r>
+        <w:t xml:space="preserve">, the model was specified as:</w:t>
+      </w:r>
+    </w:p>
+    <w:bookmarkEnd w:id="23"/>
+    <w:bookmarkStart w:id="24" w:name="multivariate-brood-order-model"/>
+    <w:p>
+      <w:pPr>
+        <w:pStyle w:val="Heading2"/>
+      </w:pPr>
+      <w:r>
+        <w:t xml:space="preserve">Multivariate Brood-Order Model</w:t>
+      </w:r>
+    </w:p>
+    <w:p>
+      <w:pPr>
+        <w:pStyle w:val="FirstParagraph"/>
+      </w:pPr>
+      <w:r>
+        <w:t xml:space="preserve">For female</w:t>
+      </w:r>
+      <w:r>
+        <w:t xml:space="preserve"> </w:t>
+      </w:r>
+      <m:oMath>
+        <m:r>
+          <m:t>i</m:t>
+        </m:r>
+      </m:oMath>
+      <w:r>
+        <w:t xml:space="preserve"> </w:t>
+      </w:r>
+      <w:r>
+        <w:t xml:space="preserve">and brood</w:t>
+      </w:r>
+      <w:r>
+        <w:t xml:space="preserve"> </w:t>
+      </w:r>
+      <m:oMath>
+        <m:r>
+          <m:t>j</m:t>
+        </m:r>
+      </m:oMath>
+      <w:r>
+        <w:t xml:space="preserve">, mean egg size and egg number were modelled jointly as:</w:t>
+      </w:r>
+    </w:p>
+    <w:p>
+      <w:pPr>
+        <w:pStyle w:val="BodyText"/>
+      </w:pPr>
+      <m:oMathPara>
+        <m:oMathParaPr>
+          <m:jc m:val="center"/>
+        </m:oMathParaPr>
+        <m:oMath>
+          <m:m>
+            <m:mPr>
+              <m:baseJc m:val="center"/>
+              <m:plcHide m:val="on"/>
+              <m:mcs>
+                <m:mc>
+                  <m:mcPr>
+                    <m:mcJc m:val="right"/>
+                    <m:count m:val="1"/>
+                  </m:mcPr>
+                </m:mc>
+                <m:mc>
+                  <m:mcPr>
+                    <m:mcJc m:val="left"/>
+                    <m:count m:val="1"/>
+                  </m:mcPr>
+                </m:mc>
+              </m:mcs>
+            </m:mPr>
+            <m:mr>
+              <m:e>
+                <m:sSub>
+                  <m:e>
+                    <m:r>
+                      <m:rPr>
+                        <m:nor/>
+                        <m:sty m:val="p"/>
+                      </m:rPr>
+                      <m:t>MeanEggSize</m:t>
+                    </m:r>
+                  </m:e>
+                  <m:sub>
+                    <m:r>
+                      <m:t>i</m:t>
+                    </m:r>
+                    <m:r>
+                      <m:t>j</m:t>
+                    </m:r>
+                  </m:sub>
+                </m:sSub>
+              </m:e>
+              <m:e>
+                <m:r>
+                  <m:rPr>
+                    <m:sty m:val="p"/>
+                  </m:rPr>
+                  <m:t>∼</m:t>
+                </m:r>
+                <m:r>
+                  <m:rPr>
+                    <m:sty m:val="p"/>
+                    <m:scr m:val="script"/>
+                  </m:rPr>
+                  <m:t>N</m:t>
+                </m:r>
+                <m:d>
+                  <m:dPr>
+                    <m:begChr m:val="("/>
+                    <m:sepChr m:val=""/>
+                    <m:endChr m:val=")"/>
+                    <m:grow/>
+                  </m:dPr>
+                  <m:e>
+                    <m:sSub>
+                      <m:e>
+                        <m:r>
+                          <m:t>μ</m:t>
+                        </m:r>
+                      </m:e>
+                      <m:sub>
+                        <m:r>
+                          <m:t>1</m:t>
+                        </m:r>
+                        <m:r>
+                          <m:rPr>
+                            <m:sty m:val="p"/>
+                          </m:rPr>
+                          <m:t>,</m:t>
+                        </m:r>
+                        <m:r>
+                          <m:t>i</m:t>
+                        </m:r>
+                        <m:r>
+                          <m:t>j</m:t>
+                        </m:r>
+                      </m:sub>
+                    </m:sSub>
+                    <m:r>
+                      <m:rPr>
+                        <m:sty m:val="p"/>
+                      </m:rPr>
+                      <m:t>,</m:t>
+                    </m:r>
+                    <m:sSubSup>
+                      <m:e>
+                        <m:r>
+                          <m:t>σ</m:t>
+                        </m:r>
+                      </m:e>
+                      <m:sub>
+                        <m:r>
+                          <m:t>1</m:t>
+                        </m:r>
+                      </m:sub>
+                      <m:sup>
+                        <m:r>
+                          <m:t>2</m:t>
+                        </m:r>
+                      </m:sup>
+                    </m:sSubSup>
+                  </m:e>
+                </m:d>
+              </m:e>
+            </m:mr>
+            <m:mr>
+              <m:e>
+                <m:sSub>
+                  <m:e>
+                    <m:r>
+                      <m:t>μ</m:t>
+                    </m:r>
+                  </m:e>
+                  <m:sub>
+                    <m:r>
+                      <m:t>1</m:t>
+                    </m:r>
+                    <m:r>
+                      <m:rPr>
+                        <m:sty m:val="p"/>
+                      </m:rPr>
+                      <m:t>,</m:t>
+                    </m:r>
+                    <m:r>
+                      <m:t>i</m:t>
+                    </m:r>
+                    <m:r>
+                      <m:t>j</m:t>
+                    </m:r>
+                  </m:sub>
+                </m:sSub>
+              </m:e>
+              <m:e>
+                <m:r>
+                  <m:rPr>
+                    <m:sty m:val="p"/>
+                  </m:rPr>
+                  <m:t>=</m:t>
+                </m:r>
+                <m:sSub>
+                  <m:e>
+                    <m:r>
+                      <m:t>β</m:t>
+                    </m:r>
+                  </m:e>
+                  <m:sub>
+                    <m:r>
+                      <m:t>1</m:t>
+                    </m:r>
+                    <m:r>
+                      <m:rPr>
+                        <m:sty m:val="p"/>
+                      </m:rPr>
+                      <m:t>,</m:t>
+                    </m:r>
+                    <m:r>
+                      <m:t>0</m:t>
+                    </m:r>
+                  </m:sub>
+                </m:sSub>
+                <m:r>
+                  <m:rPr>
+                    <m:sty m:val="p"/>
+                  </m:rPr>
+                  <m:t>+</m:t>
+                </m:r>
+                <m:sSub>
+                  <m:e>
+                    <m:r>
+                      <m:t>β</m:t>
+                    </m:r>
+                  </m:e>
+                  <m:sub>
+                    <m:r>
+                      <m:t>1</m:t>
+                    </m:r>
+                    <m:r>
+                      <m:rPr>
+                        <m:sty m:val="p"/>
+                      </m:rPr>
+                      <m:t>,</m:t>
+                    </m:r>
+                    <m:r>
+                      <m:rPr>
+                        <m:nor/>
+                        <m:sty m:val="p"/>
+                      </m:rPr>
+                      <m:t>brood</m:t>
+                    </m:r>
+                  </m:sub>
+                </m:sSub>
+                <m:r>
+                  <m:t> </m:t>
+                </m:r>
+                <m:sSub>
+                  <m:e>
+                    <m:r>
+                      <m:rPr>
+                        <m:nor/>
+                        <m:sty m:val="p"/>
+                      </m:rPr>
+                      <m:t>Brood</m:t>
+                    </m:r>
+                  </m:e>
+                  <m:sub>
+                    <m:r>
+                      <m:t>i</m:t>
+                    </m:r>
+                    <m:r>
+                      <m:t>j</m:t>
+                    </m:r>
+                  </m:sub>
+                </m:sSub>
+                <m:r>
+                  <m:rPr>
+                    <m:sty m:val="p"/>
+                  </m:rPr>
+                  <m:t>+</m:t>
+                </m:r>
+                <m:sSub>
+                  <m:e>
+                    <m:r>
+                      <m:t>b</m:t>
+                    </m:r>
+                  </m:e>
+                  <m:sub>
+                    <m:r>
+                      <m:t>1</m:t>
+                    </m:r>
+                    <m:r>
+                      <m:rPr>
+                        <m:sty m:val="p"/>
+                      </m:rPr>
+                      <m:t>,</m:t>
+                    </m:r>
+                    <m:r>
+                      <m:t>i</m:t>
+                    </m:r>
+                  </m:sub>
+                </m:sSub>
+              </m:e>
+            </m:mr>
+            <m:mr>
+              <m:e/>
+            </m:mr>
+            <m:mr>
+              <m:e>
+                <m:sSub>
+                  <m:e>
+                    <m:r>
+                      <m:rPr>
+                        <m:nor/>
+                        <m:sty m:val="p"/>
+                      </m:rPr>
+                      <m:t>EggNumber</m:t>
+                    </m:r>
+                  </m:e>
+                  <m:sub>
+                    <m:r>
+                      <m:t>i</m:t>
+                    </m:r>
+                    <m:r>
+                      <m:t>j</m:t>
+                    </m:r>
+                  </m:sub>
+                </m:sSub>
+              </m:e>
+              <m:e>
+                <m:r>
+                  <m:rPr>
+                    <m:sty m:val="p"/>
+                  </m:rPr>
+                  <m:t>∼</m:t>
+                </m:r>
+                <m:r>
+                  <m:rPr>
+                    <m:nor/>
+                    <m:sty m:val="p"/>
+                  </m:rPr>
+                  <m:t>Poisson</m:t>
+                </m:r>
+                <m:d>
+                  <m:dPr>
+                    <m:begChr m:val="("/>
+                    <m:sepChr m:val=""/>
+                    <m:endChr m:val=")"/>
+                    <m:grow/>
+                  </m:dPr>
+                  <m:e>
+                    <m:sSub>
+                      <m:e>
+                        <m:r>
+                          <m:t>λ</m:t>
+                        </m:r>
+                      </m:e>
+                      <m:sub>
+                        <m:r>
+                          <m:t>i</m:t>
+                        </m:r>
+                        <m:r>
+                          <m:t>j</m:t>
+                        </m:r>
+                      </m:sub>
+                    </m:sSub>
+                  </m:e>
+                </m:d>
+              </m:e>
+            </m:mr>
+            <m:mr>
+              <m:e>
+                <m:r>
+                  <m:rPr>
+                    <m:sty m:val="p"/>
+                  </m:rPr>
+                  <m:t>log</m:t>
+                </m:r>
+                <m:d>
+                  <m:dPr>
+                    <m:begChr m:val="("/>
+                    <m:sepChr m:val=""/>
+                    <m:endChr m:val=")"/>
+                    <m:grow/>
+                  </m:dPr>
+                  <m:e>
+                    <m:sSub>
+                      <m:e>
+                        <m:r>
+                          <m:t>λ</m:t>
+                        </m:r>
+                      </m:e>
+                      <m:sub>
+                        <m:r>
+                          <m:t>i</m:t>
+                        </m:r>
+                        <m:r>
+                          <m:t>j</m:t>
+                        </m:r>
+                      </m:sub>
+                    </m:sSub>
+                  </m:e>
+                </m:d>
+              </m:e>
+              <m:e>
+                <m:r>
+                  <m:rPr>
+                    <m:sty m:val="p"/>
+                  </m:rPr>
+                  <m:t>=</m:t>
+                </m:r>
+                <m:sSub>
+                  <m:e>
+                    <m:r>
+                      <m:t>β</m:t>
+                    </m:r>
+                  </m:e>
+                  <m:sub>
+                    <m:r>
+                      <m:t>2</m:t>
+                    </m:r>
+                    <m:r>
+                      <m:rPr>
+                        <m:sty m:val="p"/>
+                      </m:rPr>
+                      <m:t>,</m:t>
+                    </m:r>
+                    <m:r>
+                      <m:t>0</m:t>
+                    </m:r>
+                  </m:sub>
+                </m:sSub>
+                <m:r>
+                  <m:rPr>
+                    <m:sty m:val="p"/>
+                  </m:rPr>
+                  <m:t>+</m:t>
+                </m:r>
+                <m:sSub>
+                  <m:e>
+                    <m:r>
+                      <m:t>β</m:t>
+                    </m:r>
+                  </m:e>
+                  <m:sub>
+                    <m:r>
+                      <m:t>2</m:t>
+                    </m:r>
+                    <m:r>
+                      <m:rPr>
+                        <m:sty m:val="p"/>
+                      </m:rPr>
+                      <m:t>,</m:t>
+                    </m:r>
+                    <m:r>
+                      <m:rPr>
+                        <m:nor/>
+                        <m:sty m:val="p"/>
+                      </m:rPr>
+                      <m:t>brood</m:t>
+                    </m:r>
+                  </m:sub>
+                </m:sSub>
+                <m:r>
+                  <m:t> </m:t>
+                </m:r>
+                <m:sSub>
+                  <m:e>
+                    <m:r>
+                      <m:rPr>
+                        <m:nor/>
+                        <m:sty m:val="p"/>
+                      </m:rPr>
+                      <m:t>Brood</m:t>
+                    </m:r>
+                  </m:e>
+                  <m:sub>
+                    <m:r>
+                      <m:t>i</m:t>
+                    </m:r>
+                    <m:r>
+                      <m:t>j</m:t>
+                    </m:r>
+                  </m:sub>
+                </m:sSub>
+                <m:r>
+                  <m:rPr>
+                    <m:sty m:val="p"/>
+                  </m:rPr>
+                  <m:t>+</m:t>
+                </m:r>
+                <m:sSub>
+                  <m:e>
+                    <m:r>
+                      <m:t>b</m:t>
+                    </m:r>
+                  </m:e>
+                  <m:sub>
+                    <m:r>
+                      <m:t>2</m:t>
+                    </m:r>
+                    <m:r>
+                      <m:rPr>
+                        <m:sty m:val="p"/>
+                      </m:rPr>
+                      <m:t>,</m:t>
+                    </m:r>
+                    <m:r>
+                      <m:t>i</m:t>
+                    </m:r>
+                  </m:sub>
+                </m:sSub>
+              </m:e>
+            </m:mr>
+            <m:mr>
+              <m:e/>
+            </m:mr>
+            <m:mr>
+              <m:e>
+                <m:d>
+                  <m:dPr>
+                    <m:begChr m:val="("/>
+                    <m:sepChr m:val=""/>
+                    <m:endChr m:val=")"/>
+                    <m:grow/>
+                  </m:dPr>
+                  <m:e>
+                    <m:m>
+                      <m:mPr>
+                        <m:baseJc m:val="center"/>
+                        <m:plcHide m:val="on"/>
+                        <m:mcs>
+                          <m:mc>
+                            <m:mcPr>
+                              <m:mcJc m:val="center"/>
+                              <m:count m:val="1"/>
+                            </m:mcPr>
+                          </m:mc>
+                        </m:mcs>
+                      </m:mPr>
+                      <m:mr>
+                        <m:e>
+                          <m:sSub>
+                            <m:e>
+                              <m:r>
+                                <m:t>b</m:t>
+                              </m:r>
+                            </m:e>
+                            <m:sub>
+                              <m:r>
+                                <m:t>1</m:t>
+                              </m:r>
+                              <m:r>
+                                <m:rPr>
+                                  <m:sty m:val="p"/>
+                                </m:rPr>
+                                <m:t>,</m:t>
+                              </m:r>
+                              <m:r>
+                                <m:t>i</m:t>
+                              </m:r>
+                            </m:sub>
+                          </m:sSub>
+                        </m:e>
+                      </m:mr>
+                      <m:mr>
+                        <m:e>
+                          <m:sSub>
+                            <m:e>
+                              <m:r>
+                                <m:t>b</m:t>
+                              </m:r>
+                            </m:e>
+                            <m:sub>
+                              <m:r>
+                                <m:t>2</m:t>
+                              </m:r>
+                              <m:r>
+                                <m:rPr>
+                                  <m:sty m:val="p"/>
+                                </m:rPr>
+                                <m:t>,</m:t>
+                              </m:r>
+                              <m:r>
+                                <m:t>i</m:t>
+                              </m:r>
+                            </m:sub>
+                          </m:sSub>
+                        </m:e>
+                      </m:mr>
+                    </m:m>
+                  </m:e>
+                </m:d>
+              </m:e>
+              <m:e>
+                <m:r>
+                  <m:rPr>
+                    <m:sty m:val="p"/>
+                  </m:rPr>
+                  <m:t>∼</m:t>
+                </m:r>
+                <m:r>
+                  <m:rPr>
+                    <m:sty m:val="p"/>
+                    <m:scr m:val="script"/>
+                  </m:rPr>
+                  <m:t>N</m:t>
+                </m:r>
+                <m:d>
+                  <m:dPr>
+                    <m:begChr m:val="("/>
+                    <m:sepChr m:val=""/>
+                    <m:endChr m:val=")"/>
+                    <m:grow/>
+                  </m:dPr>
+                  <m:e>
+                    <m:d>
+                      <m:dPr>
+                        <m:begChr m:val="("/>
+                        <m:sepChr m:val=""/>
+                        <m:endChr m:val=")"/>
+                        <m:grow/>
+                      </m:dPr>
+                      <m:e>
+                        <m:m>
+                          <m:mPr>
+                            <m:baseJc m:val="center"/>
+                            <m:plcHide m:val="on"/>
+                            <m:mcs>
+                              <m:mc>
+                                <m:mcPr>
+                                  <m:mcJc m:val="center"/>
+                                  <m:count m:val="1"/>
+                                </m:mcPr>
+                              </m:mc>
+                            </m:mcs>
+                          </m:mPr>
+                          <m:mr>
+                            <m:e>
+                              <m:r>
+                                <m:t>0</m:t>
+                              </m:r>
+                            </m:e>
+                          </m:mr>
+                          <m:mr>
+                            <m:e>
+                              <m:r>
+                                <m:t>0</m:t>
+                              </m:r>
+                            </m:e>
+                          </m:mr>
+                        </m:m>
+                      </m:e>
+                    </m:d>
+                    <m:r>
+                      <m:rPr>
+                        <m:sty m:val="p"/>
+                      </m:rPr>
+                      <m:t>,</m:t>
+                    </m:r>
+                    <m:sSub>
+                      <m:e>
+                        <m:r>
+                          <m:t>Σ</m:t>
+                        </m:r>
+                      </m:e>
+                      <m:sub>
+                        <m:r>
+                          <m:t>b</m:t>
+                        </m:r>
+                      </m:sub>
+                    </m:sSub>
+                  </m:e>
+                </m:d>
+              </m:e>
+            </m:mr>
+          </m:m>
+        </m:oMath>
+      </m:oMathPara>
+    </w:p>
+    <w:p>
+      <w:pPr>
+        <w:pStyle w:val="FirstParagraph"/>
+      </w:pPr>
+      <w:r>
+        <w:t xml:space="preserve">where</w:t>
+      </w:r>
+      <w:r>
+        <w:t xml:space="preserve"> </w:t>
+      </w:r>
+      <m:oMath>
+        <m:sSub>
+          <m:e>
+            <m:r>
+              <m:t>b</m:t>
+            </m:r>
+          </m:e>
+          <m:sub>
+            <m:r>
+              <m:t>1</m:t>
+            </m:r>
+            <m:r>
+              <m:rPr>
+                <m:sty m:val="p"/>
+              </m:rPr>
+              <m:t>,</m:t>
+            </m:r>
+            <m:r>
+              <m:t>i</m:t>
+            </m:r>
+          </m:sub>
+        </m:sSub>
+      </m:oMath>
+      <w:r>
+        <w:t xml:space="preserve"> </w:t>
+      </w:r>
+      <w:r>
+        <w:t xml:space="preserve">and</w:t>
+      </w:r>
+      <w:r>
+        <w:t xml:space="preserve"> </w:t>
+      </w:r>
+      <m:oMath>
+        <m:sSub>
+          <m:e>
+            <m:r>
+              <m:t>b</m:t>
+            </m:r>
+          </m:e>
+          <m:sub>
+            <m:r>
+              <m:t>2</m:t>
+            </m:r>
+            <m:r>
+              <m:rPr>
+                <m:sty m:val="p"/>
+              </m:rPr>
+              <m:t>,</m:t>
+            </m:r>
+            <m:r>
+              <m:t>i</m:t>
+            </m:r>
+          </m:sub>
+        </m:sSub>
+      </m:oMath>
+      <w:r>
+        <w:t xml:space="preserve"> </w:t>
+      </w:r>
+      <w:r>
+        <w:t xml:space="preserve">are female-specific random intercepts and</w:t>
+      </w:r>
+      <w:r>
+        <w:t xml:space="preserve"> </w:t>
+      </w:r>
+      <m:oMath>
+        <m:sSub>
+          <m:e>
+            <m:r>
+              <m:t>Σ</m:t>
+            </m:r>
+          </m:e>
+          <m:sub>
+            <m:r>
+              <m:t>b</m:t>
+            </m:r>
+          </m:sub>
+        </m:sSub>
+      </m:oMath>
+      <w:r>
+        <w:t xml:space="preserve"> </w:t>
+      </w:r>
+      <w:r>
+        <w:t xml:space="preserve">is the female-level variance–covariance matrix. Residual correlations between traits were not estimated (</w:t>
+      </w:r>
+      <w:r>
+        <w:rPr>
+          <w:rStyle w:val="VerbatimChar"/>
+        </w:rPr>
+        <w:t xml:space="preserve">set_rescor(FALSE)</w:t>
+      </w:r>
+      <w:r>
+        <w:t xml:space="preserve">). Female identity was included as a random effect for both traits to account for repeated measures. This model tested whether egg traits systematically differed between first and second clutches while accounting for among-female variation.</w:t>
+      </w:r>
+    </w:p>
+    <w:bookmarkEnd w:id="24"/>
+    <w:bookmarkStart w:id="28" w:name="multilevel-correlations"/>
+    <w:p>
+      <w:pPr>
+        <w:pStyle w:val="Heading2"/>
+      </w:pPr>
+      <w:r>
+        <w:t xml:space="preserve">Multilevel correlations</w:t>
+      </w:r>
+    </w:p>
+    <w:bookmarkStart w:id="25" w:name="raw-phenotypic-correlation"/>
+    <w:p>
+      <w:pPr>
+        <w:pStyle w:val="Heading3"/>
+      </w:pPr>
+      <w:r>
+        <w:t xml:space="preserve">Raw phenotypic correlation</w:t>
+      </w:r>
+    </w:p>
+    <w:p>
+      <w:pPr>
+        <w:pStyle w:val="FirstParagraph"/>
+      </w:pPr>
+      <w:r>
+        <w:t xml:space="preserve">I first calculated the raw phenotypic association between egg number and egg size across all observations using Pearson’s correlation coefficient (</w:t>
       </w:r>
       <w:r>
         <w:rPr>
@@ -543,140 +1350,1379 @@
         <w:t xml:space="preserve">r</w:t>
       </w:r>
       <w:r>
+        <w:t xml:space="preserve">). This estimate reflects the overall linear association between traits without accounting for repeated measures or hierarchical structure.</w:t>
+      </w:r>
+    </w:p>
+    <w:bookmarkEnd w:id="25"/>
+    <w:bookmarkStart w:id="26" w:name="between-female-correlation"/>
+    <w:p>
+      <w:pPr>
+        <w:pStyle w:val="Heading3"/>
+      </w:pPr>
+      <w:r>
+        <w:t xml:space="preserve">Between-female correlation</w:t>
+      </w:r>
+    </w:p>
+    <w:p>
+      <w:pPr>
+        <w:pStyle w:val="FirstParagraph"/>
+      </w:pPr>
+      <w:r>
+        <w:t xml:space="preserve">To quantify among-female covariation, I calculated the Pearson correlation between female mean egg number and female mean egg size. Female means were calculated across broods. This approach isolates between-female covariance independent of within-female variation.</w:t>
+      </w:r>
+    </w:p>
+    <w:bookmarkEnd w:id="26"/>
+    <w:bookmarkStart w:id="27" w:name="X87e37a818f147ef2a5a26f637cd19304f3671a4"/>
+    <w:p>
+      <w:pPr>
+        <w:pStyle w:val="Heading3"/>
+      </w:pPr>
+      <w:r>
+        <w:t xml:space="preserve">Partitioning among- and residual covariance</w:t>
+      </w:r>
+    </w:p>
+    <w:p>
+      <w:pPr>
+        <w:pStyle w:val="FirstParagraph"/>
+      </w:pPr>
+      <w:r>
+        <w:t xml:space="preserve">To formally partition covariance into among-female and residual components, I fitted a multivariate Gaussian mixed-effects model:</w:t>
+      </w:r>
+    </w:p>
+    <w:p>
+      <w:pPr>
+        <w:pStyle w:val="BodyText"/>
+      </w:pPr>
+      <m:oMathPara>
+        <m:oMathParaPr>
+          <m:jc m:val="center"/>
+        </m:oMathParaPr>
+        <m:oMath>
+          <m:m>
+            <m:mPr>
+              <m:baseJc m:val="center"/>
+              <m:plcHide m:val="on"/>
+              <m:mcs>
+                <m:mc>
+                  <m:mcPr>
+                    <m:mcJc m:val="right"/>
+                    <m:count m:val="1"/>
+                  </m:mcPr>
+                </m:mc>
+                <m:mc>
+                  <m:mcPr>
+                    <m:mcJc m:val="left"/>
+                    <m:count m:val="1"/>
+                  </m:mcPr>
+                </m:mc>
+              </m:mcs>
+            </m:mPr>
+            <m:mr>
+              <m:e>
+                <m:sSub>
+                  <m:e>
+                    <m:r>
+                      <m:rPr>
+                        <m:nor/>
+                        <m:sty m:val="p"/>
+                      </m:rPr>
+                      <m:t>MeanEggSize</m:t>
+                    </m:r>
+                  </m:e>
+                  <m:sub>
+                    <m:r>
+                      <m:t>i</m:t>
+                    </m:r>
+                    <m:r>
+                      <m:t>j</m:t>
+                    </m:r>
+                  </m:sub>
+                </m:sSub>
+              </m:e>
+              <m:e>
+                <m:r>
+                  <m:rPr>
+                    <m:sty m:val="p"/>
+                  </m:rPr>
+                  <m:t>=</m:t>
+                </m:r>
+                <m:sSub>
+                  <m:e>
+                    <m:r>
+                      <m:t>β</m:t>
+                    </m:r>
+                  </m:e>
+                  <m:sub>
+                    <m:r>
+                      <m:t>1</m:t>
+                    </m:r>
+                    <m:r>
+                      <m:rPr>
+                        <m:sty m:val="p"/>
+                      </m:rPr>
+                      <m:t>,</m:t>
+                    </m:r>
+                    <m:r>
+                      <m:t>0</m:t>
+                    </m:r>
+                  </m:sub>
+                </m:sSub>
+                <m:r>
+                  <m:rPr>
+                    <m:sty m:val="p"/>
+                  </m:rPr>
+                  <m:t>+</m:t>
+                </m:r>
+                <m:sSub>
+                  <m:e>
+                    <m:r>
+                      <m:t>b</m:t>
+                    </m:r>
+                  </m:e>
+                  <m:sub>
+                    <m:r>
+                      <m:t>1</m:t>
+                    </m:r>
+                    <m:r>
+                      <m:rPr>
+                        <m:sty m:val="p"/>
+                      </m:rPr>
+                      <m:t>,</m:t>
+                    </m:r>
+                    <m:r>
+                      <m:t>i</m:t>
+                    </m:r>
+                  </m:sub>
+                </m:sSub>
+                <m:r>
+                  <m:rPr>
+                    <m:sty m:val="p"/>
+                  </m:rPr>
+                  <m:t>+</m:t>
+                </m:r>
+                <m:sSub>
+                  <m:e>
+                    <m:r>
+                      <m:t>ε</m:t>
+                    </m:r>
+                  </m:e>
+                  <m:sub>
+                    <m:r>
+                      <m:t>1</m:t>
+                    </m:r>
+                    <m:r>
+                      <m:rPr>
+                        <m:sty m:val="p"/>
+                      </m:rPr>
+                      <m:t>,</m:t>
+                    </m:r>
+                    <m:r>
+                      <m:t>i</m:t>
+                    </m:r>
+                    <m:r>
+                      <m:t>j</m:t>
+                    </m:r>
+                  </m:sub>
+                </m:sSub>
+              </m:e>
+            </m:mr>
+            <m:mr>
+              <m:e/>
+            </m:mr>
+            <m:mr>
+              <m:e>
+                <m:sSub>
+                  <m:e>
+                    <m:r>
+                      <m:rPr>
+                        <m:nor/>
+                        <m:sty m:val="p"/>
+                      </m:rPr>
+                      <m:t>EggNumber</m:t>
+                    </m:r>
+                  </m:e>
+                  <m:sub>
+                    <m:r>
+                      <m:t>i</m:t>
+                    </m:r>
+                    <m:r>
+                      <m:t>j</m:t>
+                    </m:r>
+                  </m:sub>
+                </m:sSub>
+              </m:e>
+              <m:e>
+                <m:r>
+                  <m:rPr>
+                    <m:sty m:val="p"/>
+                  </m:rPr>
+                  <m:t>=</m:t>
+                </m:r>
+                <m:sSub>
+                  <m:e>
+                    <m:r>
+                      <m:t>β</m:t>
+                    </m:r>
+                  </m:e>
+                  <m:sub>
+                    <m:r>
+                      <m:t>2</m:t>
+                    </m:r>
+                    <m:r>
+                      <m:rPr>
+                        <m:sty m:val="p"/>
+                      </m:rPr>
+                      <m:t>,</m:t>
+                    </m:r>
+                    <m:r>
+                      <m:t>0</m:t>
+                    </m:r>
+                  </m:sub>
+                </m:sSub>
+                <m:r>
+                  <m:rPr>
+                    <m:sty m:val="p"/>
+                  </m:rPr>
+                  <m:t>+</m:t>
+                </m:r>
+                <m:sSub>
+                  <m:e>
+                    <m:r>
+                      <m:t>b</m:t>
+                    </m:r>
+                  </m:e>
+                  <m:sub>
+                    <m:r>
+                      <m:t>2</m:t>
+                    </m:r>
+                    <m:r>
+                      <m:rPr>
+                        <m:sty m:val="p"/>
+                      </m:rPr>
+                      <m:t>,</m:t>
+                    </m:r>
+                    <m:r>
+                      <m:t>i</m:t>
+                    </m:r>
+                  </m:sub>
+                </m:sSub>
+                <m:r>
+                  <m:rPr>
+                    <m:sty m:val="p"/>
+                  </m:rPr>
+                  <m:t>+</m:t>
+                </m:r>
+                <m:sSub>
+                  <m:e>
+                    <m:r>
+                      <m:t>ε</m:t>
+                    </m:r>
+                  </m:e>
+                  <m:sub>
+                    <m:r>
+                      <m:t>2</m:t>
+                    </m:r>
+                    <m:r>
+                      <m:rPr>
+                        <m:sty m:val="p"/>
+                      </m:rPr>
+                      <m:t>,</m:t>
+                    </m:r>
+                    <m:r>
+                      <m:t>i</m:t>
+                    </m:r>
+                    <m:r>
+                      <m:t>j</m:t>
+                    </m:r>
+                  </m:sub>
+                </m:sSub>
+              </m:e>
+            </m:mr>
+          </m:m>
+        </m:oMath>
+      </m:oMathPara>
+    </w:p>
+    <w:p>
+      <w:pPr>
+        <w:pStyle w:val="FirstParagraph"/>
+      </w:pPr>
+      <w:r>
+        <w:t xml:space="preserve">with random effects and residuals distributed as:</w:t>
+      </w:r>
+    </w:p>
+    <w:p>
+      <w:pPr>
+        <w:pStyle w:val="BodyText"/>
+      </w:pPr>
+      <m:oMathPara>
+        <m:oMathParaPr>
+          <m:jc m:val="center"/>
+        </m:oMathParaPr>
+        <m:oMath>
+          <m:d>
+            <m:dPr>
+              <m:begChr m:val="("/>
+              <m:sepChr m:val=""/>
+              <m:endChr m:val=")"/>
+              <m:grow/>
+            </m:dPr>
+            <m:e>
+              <m:m>
+                <m:mPr>
+                  <m:baseJc m:val="center"/>
+                  <m:plcHide m:val="on"/>
+                  <m:mcs>
+                    <m:mc>
+                      <m:mcPr>
+                        <m:mcJc m:val="center"/>
+                        <m:count m:val="1"/>
+                      </m:mcPr>
+                    </m:mc>
+                  </m:mcs>
+                </m:mPr>
+                <m:mr>
+                  <m:e>
+                    <m:sSub>
+                      <m:e>
+                        <m:r>
+                          <m:t>b</m:t>
+                        </m:r>
+                      </m:e>
+                      <m:sub>
+                        <m:r>
+                          <m:t>1</m:t>
+                        </m:r>
+                        <m:r>
+                          <m:rPr>
+                            <m:sty m:val="p"/>
+                          </m:rPr>
+                          <m:t>,</m:t>
+                        </m:r>
+                        <m:r>
+                          <m:t>i</m:t>
+                        </m:r>
+                      </m:sub>
+                    </m:sSub>
+                  </m:e>
+                </m:mr>
+                <m:mr>
+                  <m:e>
+                    <m:sSub>
+                      <m:e>
+                        <m:r>
+                          <m:t>b</m:t>
+                        </m:r>
+                      </m:e>
+                      <m:sub>
+                        <m:r>
+                          <m:t>2</m:t>
+                        </m:r>
+                        <m:r>
+                          <m:rPr>
+                            <m:sty m:val="p"/>
+                          </m:rPr>
+                          <m:t>,</m:t>
+                        </m:r>
+                        <m:r>
+                          <m:t>i</m:t>
+                        </m:r>
+                      </m:sub>
+                    </m:sSub>
+                  </m:e>
+                </m:mr>
+              </m:m>
+            </m:e>
+          </m:d>
+          <m:r>
+            <m:rPr>
+              <m:sty m:val="p"/>
+            </m:rPr>
+            <m:t>∼</m:t>
+          </m:r>
+          <m:r>
+            <m:rPr>
+              <m:sty m:val="p"/>
+              <m:scr m:val="script"/>
+            </m:rPr>
+            <m:t>M</m:t>
+          </m:r>
+          <m:r>
+            <m:rPr>
+              <m:sty m:val="p"/>
+              <m:scr m:val="script"/>
+            </m:rPr>
+            <m:t>V</m:t>
+          </m:r>
+          <m:r>
+            <m:rPr>
+              <m:sty m:val="p"/>
+              <m:scr m:val="script"/>
+            </m:rPr>
+            <m:t>N</m:t>
+          </m:r>
+          <m:d>
+            <m:dPr>
+              <m:begChr m:val="("/>
+              <m:sepChr m:val=""/>
+              <m:endChr m:val=")"/>
+              <m:grow/>
+            </m:dPr>
+            <m:e>
+              <m:d>
+                <m:dPr>
+                  <m:begChr m:val="("/>
+                  <m:sepChr m:val=""/>
+                  <m:endChr m:val=")"/>
+                  <m:grow/>
+                </m:dPr>
+                <m:e>
+                  <m:m>
+                    <m:mPr>
+                      <m:baseJc m:val="center"/>
+                      <m:plcHide m:val="on"/>
+                      <m:mcs>
+                        <m:mc>
+                          <m:mcPr>
+                            <m:mcJc m:val="center"/>
+                            <m:count m:val="1"/>
+                          </m:mcPr>
+                        </m:mc>
+                      </m:mcs>
+                    </m:mPr>
+                    <m:mr>
+                      <m:e>
+                        <m:r>
+                          <m:t>0</m:t>
+                        </m:r>
+                      </m:e>
+                    </m:mr>
+                    <m:mr>
+                      <m:e>
+                        <m:r>
+                          <m:t>0</m:t>
+                        </m:r>
+                      </m:e>
+                    </m:mr>
+                  </m:m>
+                </m:e>
+              </m:d>
+              <m:r>
+                <m:rPr>
+                  <m:sty m:val="p"/>
+                </m:rPr>
+                <m:t>,</m:t>
+              </m:r>
+              <m:sSub>
+                <m:e>
+                  <m:r>
+                    <m:t>Σ</m:t>
+                  </m:r>
+                </m:e>
+                <m:sub>
+                  <m:r>
+                    <m:t>b</m:t>
+                  </m:r>
+                </m:sub>
+              </m:sSub>
+            </m:e>
+          </m:d>
+          <m:r>
+            <m:rPr>
+              <m:sty m:val="p"/>
+            </m:rPr>
+            <m:t>,</m:t>
+          </m:r>
+          <m:r>
+            <m:t>  </m:t>
+          </m:r>
+          <m:d>
+            <m:dPr>
+              <m:begChr m:val="("/>
+              <m:sepChr m:val=""/>
+              <m:endChr m:val=")"/>
+              <m:grow/>
+            </m:dPr>
+            <m:e>
+              <m:m>
+                <m:mPr>
+                  <m:baseJc m:val="center"/>
+                  <m:plcHide m:val="on"/>
+                  <m:mcs>
+                    <m:mc>
+                      <m:mcPr>
+                        <m:mcJc m:val="center"/>
+                        <m:count m:val="1"/>
+                      </m:mcPr>
+                    </m:mc>
+                  </m:mcs>
+                </m:mPr>
+                <m:mr>
+                  <m:e>
+                    <m:sSub>
+                      <m:e>
+                        <m:r>
+                          <m:t>ε</m:t>
+                        </m:r>
+                      </m:e>
+                      <m:sub>
+                        <m:r>
+                          <m:t>1</m:t>
+                        </m:r>
+                        <m:r>
+                          <m:rPr>
+                            <m:sty m:val="p"/>
+                          </m:rPr>
+                          <m:t>,</m:t>
+                        </m:r>
+                        <m:r>
+                          <m:t>i</m:t>
+                        </m:r>
+                        <m:r>
+                          <m:t>j</m:t>
+                        </m:r>
+                      </m:sub>
+                    </m:sSub>
+                  </m:e>
+                </m:mr>
+                <m:mr>
+                  <m:e>
+                    <m:sSub>
+                      <m:e>
+                        <m:r>
+                          <m:t>ε</m:t>
+                        </m:r>
+                      </m:e>
+                      <m:sub>
+                        <m:r>
+                          <m:t>2</m:t>
+                        </m:r>
+                        <m:r>
+                          <m:rPr>
+                            <m:sty m:val="p"/>
+                          </m:rPr>
+                          <m:t>,</m:t>
+                        </m:r>
+                        <m:r>
+                          <m:t>i</m:t>
+                        </m:r>
+                        <m:r>
+                          <m:t>j</m:t>
+                        </m:r>
+                      </m:sub>
+                    </m:sSub>
+                  </m:e>
+                </m:mr>
+              </m:m>
+            </m:e>
+          </m:d>
+          <m:r>
+            <m:rPr>
+              <m:sty m:val="p"/>
+            </m:rPr>
+            <m:t>∼</m:t>
+          </m:r>
+          <m:r>
+            <m:rPr>
+              <m:sty m:val="p"/>
+              <m:scr m:val="script"/>
+            </m:rPr>
+            <m:t>M</m:t>
+          </m:r>
+          <m:r>
+            <m:rPr>
+              <m:sty m:val="p"/>
+              <m:scr m:val="script"/>
+            </m:rPr>
+            <m:t>V</m:t>
+          </m:r>
+          <m:r>
+            <m:rPr>
+              <m:sty m:val="p"/>
+              <m:scr m:val="script"/>
+            </m:rPr>
+            <m:t>N</m:t>
+          </m:r>
+          <m:d>
+            <m:dPr>
+              <m:begChr m:val="("/>
+              <m:sepChr m:val=""/>
+              <m:endChr m:val=")"/>
+              <m:grow/>
+            </m:dPr>
+            <m:e>
+              <m:d>
+                <m:dPr>
+                  <m:begChr m:val="("/>
+                  <m:sepChr m:val=""/>
+                  <m:endChr m:val=")"/>
+                  <m:grow/>
+                </m:dPr>
+                <m:e>
+                  <m:m>
+                    <m:mPr>
+                      <m:baseJc m:val="center"/>
+                      <m:plcHide m:val="on"/>
+                      <m:mcs>
+                        <m:mc>
+                          <m:mcPr>
+                            <m:mcJc m:val="center"/>
+                            <m:count m:val="1"/>
+                          </m:mcPr>
+                        </m:mc>
+                      </m:mcs>
+                    </m:mPr>
+                    <m:mr>
+                      <m:e>
+                        <m:r>
+                          <m:t>0</m:t>
+                        </m:r>
+                      </m:e>
+                    </m:mr>
+                    <m:mr>
+                      <m:e>
+                        <m:r>
+                          <m:t>0</m:t>
+                        </m:r>
+                      </m:e>
+                    </m:mr>
+                  </m:m>
+                </m:e>
+              </m:d>
+              <m:r>
+                <m:rPr>
+                  <m:sty m:val="p"/>
+                </m:rPr>
+                <m:t>,</m:t>
+              </m:r>
+              <m:sSub>
+                <m:e>
+                  <m:r>
+                    <m:t>Σ</m:t>
+                  </m:r>
+                </m:e>
+                <m:sub>
+                  <m:r>
+                    <m:t>ε</m:t>
+                  </m:r>
+                </m:sub>
+              </m:sSub>
+            </m:e>
+          </m:d>
+        </m:oMath>
+      </m:oMathPara>
+    </w:p>
+    <w:p>
+      <w:pPr>
+        <w:pStyle w:val="FirstParagraph"/>
+      </w:pPr>
+      <w:r>
+        <w:t xml:space="preserve">The covariance matrix</w:t>
+      </w:r>
+      <w:r>
+        <w:t xml:space="preserve"> </w:t>
+      </w:r>
+      <m:oMath>
+        <m:sSub>
+          <m:e>
+            <m:r>
+              <m:t>Σ</m:t>
+            </m:r>
+          </m:e>
+          <m:sub>
+            <m:r>
+              <m:t>b</m:t>
+            </m:r>
+          </m:sub>
+        </m:sSub>
+      </m:oMath>
+      <w:r>
+        <w:t xml:space="preserve"> </w:t>
+      </w:r>
+      <w:r>
+        <w:t xml:space="preserve">captures among-female covariance, whereas</w:t>
+      </w:r>
+      <w:r>
+        <w:t xml:space="preserve"> </w:t>
+      </w:r>
+      <m:oMath>
+        <m:sSub>
+          <m:e>
+            <m:r>
+              <m:t>Σ</m:t>
+            </m:r>
+          </m:e>
+          <m:sub>
+            <m:r>
+              <m:t>ε</m:t>
+            </m:r>
+          </m:sub>
+        </m:sSub>
+      </m:oMath>
+      <w:r>
+        <w:t xml:space="preserve"> </w:t>
+      </w:r>
+      <w:r>
+        <w:t xml:space="preserve">estimates residual (within-female) covariance after accounting for female identity (</w:t>
+      </w:r>
+      <w:r>
         <w:rPr>
-          <w:vertAlign w:val="subscript"/>
+          <w:rStyle w:val="VerbatimChar"/>
         </w:rPr>
-        <w:t xml:space="preserve">within</w:t>
-      </w:r>
-      <w:r>
-        <w:t xml:space="preserve">) between egg number and egg size. I assumed a Gaussian error distribution for both traits to permit the calculation of within-female residuals. Clutch number (first or second) was entered as a fixed effect to test whether the two clutches differed in egg number or egg size. This model also included female scaled mass as a continuous covariate because body size generally correlates with fecundity in insects</w:t>
-      </w:r>
-      <w:r>
-        <w:t xml:space="preserve"> </w:t>
-      </w:r>
-      <w:r>
-        <w:t xml:space="preserve">(Honek 1993)</w:t>
-      </w:r>
-      <w:r>
-        <w:t xml:space="preserve">. Female ID was included as a random effect via the term (1|a|id), ensuring that random effects were correlated within each female. I assessed which of the four measures of female body size (pronotum length, body mass, PC1, or scaled mass) provided the greatest explanatory power by running three models, each with a different measure, and then comparing them, in addition to a null model without a size measure, using leave-one-out cross-validation (LOO)</w:t>
-      </w:r>
-      <w:r>
-        <w:t xml:space="preserve"> </w:t>
-      </w:r>
-      <w:r>
-        <w:t xml:space="preserve">(Vehtari et al. 2017)</w:t>
-      </w:r>
-      <w:r>
-        <w:t xml:space="preserve">. Pronotum length, body mass, and scaled mass were scaled (mean = 0, sd = 1) before analysis. The model that included pronotum length as a continuous covariate provided the best fit (Expected Log Predictive Density (ELPD) = 8.71). I report the phenotypic (</w:t>
-      </w:r>
-      <w:r>
-        <w:rPr>
-          <w:i/>
-          <w:iCs/>
-        </w:rPr>
-        <w:t xml:space="preserve">r</w:t>
-      </w:r>
-      <w:r>
-        <w:rPr>
-          <w:vertAlign w:val="subscript"/>
-        </w:rPr>
-        <w:t xml:space="preserve">p</w:t>
-      </w:r>
-      <w:r>
-        <w:t xml:space="preserve">), among- (</w:t>
-      </w:r>
-      <w:r>
-        <w:rPr>
-          <w:i/>
-          <w:iCs/>
-        </w:rPr>
-        <w:t xml:space="preserve">r</w:t>
-      </w:r>
-      <w:r>
-        <w:rPr>
-          <w:vertAlign w:val="subscript"/>
-        </w:rPr>
-        <w:t xml:space="preserve">among</w:t>
-      </w:r>
-      <w:r>
-        <w:t xml:space="preserve">) and within- (residual,</w:t>
-      </w:r>
-      <w:r>
-        <w:t xml:space="preserve"> </w:t>
-      </w:r>
-      <w:r>
-        <w:rPr>
-          <w:i/>
-          <w:iCs/>
-        </w:rPr>
-        <w:t xml:space="preserve">r</w:t>
-      </w:r>
-      <w:r>
-        <w:rPr>
-          <w:vertAlign w:val="subscript"/>
-        </w:rPr>
-        <w:t xml:space="preserve">within</w:t>
-      </w:r>
-      <w:r>
-        <w:t xml:space="preserve">) female correlations and associated 95% credible intervals (CrIs) from the model. I also used the among- and within-individuals levels of variation for egg size and egg number from the multivariate model to calculate each trait’s repeatability (</w:t>
-      </w:r>
-      <w:r>
-        <w:rPr>
-          <w:i/>
-          <w:iCs/>
-        </w:rPr>
-        <w:t xml:space="preserve">R</w:t>
+        <w:t xml:space="preserve">set_rescor(TRUE)</w:t>
       </w:r>
       <w:r>
         <w:t xml:space="preserve">).</w:t>
       </w:r>
     </w:p>
+    <w:bookmarkEnd w:id="27"/>
+    <w:bookmarkEnd w:id="28"/>
+    <w:bookmarkStart w:id="29" w:name="withinbetween-fixed-effects-model"/>
+    <w:p>
+      <w:pPr>
+        <w:pStyle w:val="Heading2"/>
+      </w:pPr>
+      <w:r>
+        <w:t xml:space="preserve">Within–Between Fixed Effects Model</w:t>
+      </w:r>
+    </w:p>
+    <w:p>
+      <w:pPr>
+        <w:pStyle w:val="FirstParagraph"/>
+      </w:pPr>
+      <w:r>
+        <w:t xml:space="preserve">To explicitly separate within- and between-female effects of egg number on egg size, egg number was decomposed as:</w:t>
+      </w:r>
+    </w:p>
+    <w:p>
+      <w:pPr>
+        <w:pStyle w:val="Compact"/>
+        <w:numPr>
+          <w:ilvl w:val="0"/>
+          <w:numId w:val="1001"/>
+        </w:numPr>
+      </w:pPr>
+      <w:r>
+        <w:t xml:space="preserve">Within-female deviation</w:t>
+      </w:r>
+    </w:p>
+    <w:p>
+      <w:pPr>
+        <w:pStyle w:val="FirstParagraph"/>
+      </w:pPr>
+      <m:oMathPara>
+        <m:oMathParaPr>
+          <m:jc m:val="center"/>
+        </m:oMathParaPr>
+        <m:oMath>
+          <m:sSub>
+            <m:e>
+              <m:r>
+                <m:rPr>
+                  <m:nor/>
+                  <m:sty m:val="p"/>
+                </m:rPr>
+                <m:t>EggNumber</m:t>
+              </m:r>
+            </m:e>
+            <m:sub>
+              <m:r>
+                <m:rPr>
+                  <m:nor/>
+                  <m:sty m:val="p"/>
+                </m:rPr>
+                <m:t>within</m:t>
+              </m:r>
+              <m:r>
+                <m:rPr>
+                  <m:sty m:val="p"/>
+                </m:rPr>
+                <m:t>,</m:t>
+              </m:r>
+              <m:r>
+                <m:t>i</m:t>
+              </m:r>
+              <m:r>
+                <m:t>j</m:t>
+              </m:r>
+            </m:sub>
+          </m:sSub>
+          <m:r>
+            <m:rPr>
+              <m:sty m:val="p"/>
+            </m:rPr>
+            <m:t>=</m:t>
+          </m:r>
+          <m:sSub>
+            <m:e>
+              <m:r>
+                <m:rPr>
+                  <m:nor/>
+                  <m:sty m:val="p"/>
+                </m:rPr>
+                <m:t>EggNumber</m:t>
+              </m:r>
+            </m:e>
+            <m:sub>
+              <m:r>
+                <m:t>i</m:t>
+              </m:r>
+              <m:r>
+                <m:t>j</m:t>
+              </m:r>
+            </m:sub>
+          </m:sSub>
+          <m:r>
+            <m:rPr>
+              <m:sty m:val="p"/>
+            </m:rPr>
+            <m:t>−</m:t>
+          </m:r>
+          <m:sSub>
+            <m:e>
+              <m:acc>
+                <m:accPr>
+                  <m:chr m:val="‾"/>
+                </m:accPr>
+                <m:e>
+                  <m:r>
+                    <m:rPr>
+                      <m:nor/>
+                      <m:sty m:val="p"/>
+                    </m:rPr>
+                    <m:t>EggNumber</m:t>
+                  </m:r>
+                </m:e>
+              </m:acc>
+            </m:e>
+            <m:sub>
+              <m:r>
+                <m:t>i</m:t>
+              </m:r>
+            </m:sub>
+          </m:sSub>
+        </m:oMath>
+      </m:oMathPara>
+    </w:p>
+    <w:p>
+      <w:pPr>
+        <w:pStyle w:val="Compact"/>
+        <w:numPr>
+          <w:ilvl w:val="0"/>
+          <w:numId w:val="1002"/>
+        </w:numPr>
+      </w:pPr>
+      <w:r>
+        <w:t xml:space="preserve">Between-female component</w:t>
+      </w:r>
+    </w:p>
+    <w:p>
+      <w:pPr>
+        <w:pStyle w:val="FirstParagraph"/>
+      </w:pPr>
+      <m:oMathPara>
+        <m:oMathParaPr>
+          <m:jc m:val="center"/>
+        </m:oMathParaPr>
+        <m:oMath>
+          <m:sSub>
+            <m:e>
+              <m:r>
+                <m:rPr>
+                  <m:nor/>
+                  <m:sty m:val="p"/>
+                </m:rPr>
+                <m:t>EggNumber</m:t>
+              </m:r>
+            </m:e>
+            <m:sub>
+              <m:r>
+                <m:rPr>
+                  <m:nor/>
+                  <m:sty m:val="p"/>
+                </m:rPr>
+                <m:t>between</m:t>
+              </m:r>
+              <m:r>
+                <m:rPr>
+                  <m:sty m:val="p"/>
+                </m:rPr>
+                <m:t>,</m:t>
+              </m:r>
+              <m:r>
+                <m:t>i</m:t>
+              </m:r>
+            </m:sub>
+          </m:sSub>
+          <m:r>
+            <m:rPr>
+              <m:sty m:val="p"/>
+            </m:rPr>
+            <m:t>=</m:t>
+          </m:r>
+          <m:sSub>
+            <m:e>
+              <m:acc>
+                <m:accPr>
+                  <m:chr m:val="‾"/>
+                </m:accPr>
+                <m:e>
+                  <m:r>
+                    <m:rPr>
+                      <m:nor/>
+                      <m:sty m:val="p"/>
+                    </m:rPr>
+                    <m:t>EggNumber</m:t>
+                  </m:r>
+                </m:e>
+              </m:acc>
+            </m:e>
+            <m:sub>
+              <m:r>
+                <m:t>i</m:t>
+              </m:r>
+            </m:sub>
+          </m:sSub>
+          <m:r>
+            <m:rPr>
+              <m:sty m:val="p"/>
+            </m:rPr>
+            <m:t>−</m:t>
+          </m:r>
+          <m:acc>
+            <m:accPr>
+              <m:chr m:val="‾"/>
+            </m:accPr>
+            <m:e>
+              <m:r>
+                <m:rPr>
+                  <m:nor/>
+                  <m:sty m:val="p"/>
+                </m:rPr>
+                <m:t>EggNumber</m:t>
+              </m:r>
+            </m:e>
+          </m:acc>
+        </m:oMath>
+      </m:oMathPara>
+    </w:p>
+    <w:p>
+      <w:pPr>
+        <w:pStyle w:val="FirstParagraph"/>
+      </w:pPr>
+      <w:r>
+        <w:t xml:space="preserve">We then fitted the following linear mixed-effects model:</w:t>
+      </w:r>
+    </w:p>
     <w:p>
       <w:pPr>
         <w:pStyle w:val="BodyText"/>
       </w:pPr>
-      <w:r>
-        <w:t xml:space="preserve">I examined whether the first and second clutches of eggs differed in egg size variation among (</w:t>
-      </w:r>
-      <w:r>
-        <w:rPr>
-          <w:i/>
-          <w:iCs/>
-        </w:rPr>
-        <w:t xml:space="preserve">V</w:t>
-      </w:r>
-      <w:r>
-        <w:rPr>
-          <w:vertAlign w:val="subscript"/>
-        </w:rPr>
-        <w:t xml:space="preserve">among</w:t>
-      </w:r>
-      <w:r>
-        <w:t xml:space="preserve">) and within (</w:t>
-      </w:r>
-      <w:r>
-        <w:rPr>
-          <w:i/>
-          <w:iCs/>
-        </w:rPr>
-        <w:t xml:space="preserve">V</w:t>
-      </w:r>
-      <w:r>
-        <w:rPr>
-          <w:vertAlign w:val="subscript"/>
-        </w:rPr>
-        <w:t xml:space="preserve">within</w:t>
-      </w:r>
-      <w:r>
-        <w:t xml:space="preserve">) females by constructing a univariate hierarchical linear mixed-effects model with scaled mean egg perimeter as the response variable, clutch (first or second) as a fixed effect, and female body size as a continuous covariate. I also included, as random effects, a random slope for each clutch for each female. In the dispersion part of the model, I included clutch as a fixed effect to estimate the within-individual (i.e. residual) variance in egg size for each clutch. I then tested whether the first and second clutch differed in egg size at the among- and within-female levels.</w:t>
+      <m:oMathPara>
+        <m:oMathParaPr>
+          <m:jc m:val="center"/>
+        </m:oMathParaPr>
+        <m:oMath>
+          <m:sSub>
+            <m:e>
+              <m:r>
+                <m:rPr>
+                  <m:nor/>
+                  <m:sty m:val="p"/>
+                </m:rPr>
+                <m:t>MeanEggSize</m:t>
+              </m:r>
+            </m:e>
+            <m:sub>
+              <m:r>
+                <m:t>i</m:t>
+              </m:r>
+              <m:r>
+                <m:t>j</m:t>
+              </m:r>
+            </m:sub>
+          </m:sSub>
+          <m:r>
+            <m:rPr>
+              <m:sty m:val="p"/>
+            </m:rPr>
+            <m:t>=</m:t>
+          </m:r>
+          <m:sSub>
+            <m:e>
+              <m:r>
+                <m:t>β</m:t>
+              </m:r>
+            </m:e>
+            <m:sub>
+              <m:r>
+                <m:t>0</m:t>
+              </m:r>
+            </m:sub>
+          </m:sSub>
+          <m:r>
+            <m:rPr>
+              <m:sty m:val="p"/>
+            </m:rPr>
+            <m:t>+</m:t>
+          </m:r>
+          <m:sSub>
+            <m:e>
+              <m:r>
+                <m:t>β</m:t>
+              </m:r>
+            </m:e>
+            <m:sub>
+              <m:r>
+                <m:t>W</m:t>
+              </m:r>
+            </m:sub>
+          </m:sSub>
+          <m:r>
+            <m:t> </m:t>
+          </m:r>
+          <m:sSub>
+            <m:e>
+              <m:r>
+                <m:rPr>
+                  <m:nor/>
+                  <m:sty m:val="p"/>
+                </m:rPr>
+                <m:t>EggNumber</m:t>
+              </m:r>
+            </m:e>
+            <m:sub>
+              <m:r>
+                <m:rPr>
+                  <m:nor/>
+                  <m:sty m:val="p"/>
+                </m:rPr>
+                <m:t>within</m:t>
+              </m:r>
+              <m:r>
+                <m:rPr>
+                  <m:sty m:val="p"/>
+                </m:rPr>
+                <m:t>,</m:t>
+              </m:r>
+              <m:r>
+                <m:t>i</m:t>
+              </m:r>
+              <m:r>
+                <m:t>j</m:t>
+              </m:r>
+            </m:sub>
+          </m:sSub>
+          <m:r>
+            <m:rPr>
+              <m:sty m:val="p"/>
+            </m:rPr>
+            <m:t>+</m:t>
+          </m:r>
+          <m:sSub>
+            <m:e>
+              <m:r>
+                <m:t>β</m:t>
+              </m:r>
+            </m:e>
+            <m:sub>
+              <m:r>
+                <m:t>B</m:t>
+              </m:r>
+            </m:sub>
+          </m:sSub>
+          <m:r>
+            <m:t> </m:t>
+          </m:r>
+          <m:sSub>
+            <m:e>
+              <m:r>
+                <m:rPr>
+                  <m:nor/>
+                  <m:sty m:val="p"/>
+                </m:rPr>
+                <m:t>EggNumber</m:t>
+              </m:r>
+            </m:e>
+            <m:sub>
+              <m:r>
+                <m:rPr>
+                  <m:nor/>
+                  <m:sty m:val="p"/>
+                </m:rPr>
+                <m:t>between</m:t>
+              </m:r>
+              <m:r>
+                <m:rPr>
+                  <m:sty m:val="p"/>
+                </m:rPr>
+                <m:t>,</m:t>
+              </m:r>
+              <m:r>
+                <m:t>i</m:t>
+              </m:r>
+            </m:sub>
+          </m:sSub>
+          <m:r>
+            <m:rPr>
+              <m:sty m:val="p"/>
+            </m:rPr>
+            <m:t>+</m:t>
+          </m:r>
+          <m:sSub>
+            <m:e>
+              <m:r>
+                <m:t>b</m:t>
+              </m:r>
+            </m:e>
+            <m:sub>
+              <m:r>
+                <m:t>0</m:t>
+              </m:r>
+              <m:r>
+                <m:t>i</m:t>
+              </m:r>
+            </m:sub>
+          </m:sSub>
+          <m:r>
+            <m:rPr>
+              <m:sty m:val="p"/>
+            </m:rPr>
+            <m:t>+</m:t>
+          </m:r>
+          <m:sSub>
+            <m:e>
+              <m:r>
+                <m:t>ε</m:t>
+              </m:r>
+            </m:e>
+            <m:sub>
+              <m:r>
+                <m:t>i</m:t>
+              </m:r>
+              <m:r>
+                <m:t>j</m:t>
+              </m:r>
+            </m:sub>
+          </m:sSub>
+        </m:oMath>
+      </m:oMathPara>
+    </w:p>
+    <w:p>
+      <w:pPr>
+        <w:pStyle w:val="FirstParagraph"/>
+      </w:pPr>
+      <w:r>
+        <w:t xml:space="preserve">with</w:t>
       </w:r>
     </w:p>
     <w:p>
       <w:pPr>
         <w:pStyle w:val="BodyText"/>
       </w:pPr>
-      <w:r>
-        <w:t xml:space="preserve">Bayesian mixed models were run for 10000 iterations (3000 warm-up iterations) across 6 chains, with a thinning interval of 2 (total post-warm-up samples = 21,000). I used weakly informative normal priors (N (0,10)) for fixed effects and positively bound exponential (1) priors for random effects in multivariate models. The univariate hierarchical mixed models were run using default priors. I performed posterior predictive checks to ensure adequate model fits, while trace plots confirmed that models converged with low among-chain variability (</w:t>
+      <m:oMathPara>
+        <m:oMathParaPr>
+          <m:jc m:val="center"/>
+        </m:oMathParaPr>
+        <m:oMath>
+          <m:sSub>
+            <m:e>
+              <m:r>
+                <m:t>b</m:t>
+              </m:r>
+            </m:e>
+            <m:sub>
+              <m:r>
+                <m:t>0</m:t>
+              </m:r>
+              <m:r>
+                <m:t>i</m:t>
+              </m:r>
+            </m:sub>
+          </m:sSub>
+          <m:r>
+            <m:rPr>
+              <m:sty m:val="p"/>
+            </m:rPr>
+            <m:t>∼</m:t>
+          </m:r>
+          <m:r>
+            <m:rPr>
+              <m:sty m:val="p"/>
+              <m:scr m:val="script"/>
+            </m:rPr>
+            <m:t>N</m:t>
+          </m:r>
+          <m:d>
+            <m:dPr>
+              <m:begChr m:val="("/>
+              <m:sepChr m:val=""/>
+              <m:endChr m:val=")"/>
+              <m:grow/>
+            </m:dPr>
+            <m:e>
+              <m:r>
+                <m:t>0</m:t>
+              </m:r>
+              <m:r>
+                <m:rPr>
+                  <m:sty m:val="p"/>
+                </m:rPr>
+                <m:t>,</m:t>
+              </m:r>
+              <m:sSubSup>
+                <m:e>
+                  <m:r>
+                    <m:t>σ</m:t>
+                  </m:r>
+                </m:e>
+                <m:sub>
+                  <m:r>
+                    <m:rPr>
+                      <m:nor/>
+                      <m:sty m:val="p"/>
+                    </m:rPr>
+                    <m:t>id</m:t>
+                  </m:r>
+                </m:sub>
+                <m:sup>
+                  <m:r>
+                    <m:t>2</m:t>
+                  </m:r>
+                </m:sup>
+              </m:sSubSup>
+            </m:e>
+          </m:d>
+          <m:r>
+            <m:rPr>
+              <m:sty m:val="p"/>
+            </m:rPr>
+            <m:t>,</m:t>
+          </m:r>
+          <m:r>
+            <m:t>  </m:t>
+          </m:r>
+          <m:sSub>
+            <m:e>
+              <m:r>
+                <m:t>ε</m:t>
+              </m:r>
+            </m:e>
+            <m:sub>
+              <m:r>
+                <m:t>i</m:t>
+              </m:r>
+              <m:r>
+                <m:t>j</m:t>
+              </m:r>
+            </m:sub>
+          </m:sSub>
+          <m:r>
+            <m:rPr>
+              <m:sty m:val="p"/>
+            </m:rPr>
+            <m:t>∼</m:t>
+          </m:r>
+          <m:r>
+            <m:rPr>
+              <m:sty m:val="p"/>
+              <m:scr m:val="script"/>
+            </m:rPr>
+            <m:t>N</m:t>
+          </m:r>
+          <m:d>
+            <m:dPr>
+              <m:begChr m:val="("/>
+              <m:sepChr m:val=""/>
+              <m:endChr m:val=")"/>
+              <m:grow/>
+            </m:dPr>
+            <m:e>
+              <m:r>
+                <m:t>0</m:t>
+              </m:r>
+              <m:r>
+                <m:rPr>
+                  <m:sty m:val="p"/>
+                </m:rPr>
+                <m:t>,</m:t>
+              </m:r>
+              <m:sSup>
+                <m:e>
+                  <m:r>
+                    <m:t>σ</m:t>
+                  </m:r>
+                </m:e>
+                <m:sup>
+                  <m:r>
+                    <m:t>2</m:t>
+                  </m:r>
+                </m:sup>
+              </m:sSup>
+            </m:e>
+          </m:d>
+        </m:oMath>
+      </m:oMathPara>
+    </w:p>
+    <w:p>
+      <w:pPr>
+        <w:pStyle w:val="FirstParagraph"/>
+      </w:pPr>
+      <w:r>
+        <w:t xml:space="preserve">The coefficient</w:t>
+      </w:r>
+      <w:r>
+        <w:t xml:space="preserve"> </w:t>
+      </w:r>
+      <m:oMath>
+        <m:sSub>
+          <m:e>
+            <m:r>
+              <m:t>β</m:t>
+            </m:r>
+          </m:e>
+          <m:sub>
+            <m:r>
+              <m:t>W</m:t>
+            </m:r>
+          </m:sub>
+        </m:sSub>
+      </m:oMath>
+      <w:r>
+        <w:t xml:space="preserve"> </w:t>
+      </w:r>
+      <w:r>
+        <w:t xml:space="preserve">estimates the within-female (plastic) effect of egg number on egg size, whereas</w:t>
+      </w:r>
+      <w:r>
+        <w:t xml:space="preserve"> </w:t>
+      </w:r>
+      <m:oMath>
+        <m:sSub>
+          <m:e>
+            <m:r>
+              <m:t>β</m:t>
+            </m:r>
+          </m:e>
+          <m:sub>
+            <m:r>
+              <m:t>B</m:t>
+            </m:r>
+          </m:sub>
+        </m:sSub>
+      </m:oMath>
+      <w:r>
+        <w:t xml:space="preserve"> </w:t>
+      </w:r>
+      <w:r>
+        <w:t xml:space="preserve">estimates the between-female (strategic) effect.</w:t>
+      </w:r>
+    </w:p>
+    <w:p>
+      <w:pPr>
+        <w:pStyle w:val="BodyText"/>
+      </w:pPr>
+      <w:r>
+        <w:t xml:space="preserve">Weakly informative priors were specified for all model parameters to regularize estimation while remaining minimally restrictive. Fixed effects were assigned zero-centered normal priors. Standard deviations of random effects were assigned exponential priors to constrain variance parameters to positive values while discouraging unrealistically large estimates. Correlation matrices among random effects were assigned LKJ priors to provide weak regularization of covariance structures.All models were fitted using Markov chain Monte Carlo (MCMC) sampling with four independent chains and 4,000 iterations to ensure adequate posterior exploration. Convergence was evaluated using the potential scale reduction factor (</w:t>
       </w:r>
       <m:oMath>
         <m:acc>
@@ -694,12 +2740,76 @@
         <w:t xml:space="preserve"> </w:t>
       </w:r>
       <w:r>
-        <w:t xml:space="preserve">= 1.00). I report posterior means with 95% credible intervals (CrIs) for all parameter estimates, where inference was based on CrIs that did not include zero.</w:t>
-      </w:r>
-    </w:p>
-    <w:bookmarkEnd w:id="23"/>
-    <w:bookmarkEnd w:id="24"/>
-    <w:bookmarkStart w:id="25" w:name="results"/>
+        <w:t xml:space="preserve">= 1.00), effective sample sizes (bulk and tail ESS), and visual inspection of trace plots. All reported parameters satisfied standard convergence criteria (</w:t>
+      </w:r>
+      <m:oMath>
+        <m:acc>
+          <m:accPr>
+            <m:chr m:val="̂"/>
+          </m:accPr>
+          <m:e>
+            <m:r>
+              <m:t>R</m:t>
+            </m:r>
+          </m:e>
+        </m:acc>
+        <m:r>
+          <m:rPr>
+            <m:sty m:val="p"/>
+          </m:rPr>
+          <m:t>≈</m:t>
+        </m:r>
+        <m:r>
+          <m:t>1.00</m:t>
+        </m:r>
+      </m:oMath>
+      <w:r>
+        <w:t xml:space="preserve">). Parameter estimates are presented as posterior means with 95% credible intervals derived from the posterior distributions. Inference was based on CrIs that did not include zero.</w:t>
+      </w:r>
+    </w:p>
+    <w:p>
+      <w:pPr>
+        <w:pStyle w:val="BodyText"/>
+      </w:pPr>
+      <w:r>
+        <w:t xml:space="preserve">I examined whether the first and second clutches of eggs differed in egg size variation among (</w:t>
+      </w:r>
+      <w:r>
+        <w:rPr>
+          <w:i/>
+          <w:iCs/>
+        </w:rPr>
+        <w:t xml:space="preserve">V</w:t>
+      </w:r>
+      <w:r>
+        <w:rPr>
+          <w:vertAlign w:val="subscript"/>
+        </w:rPr>
+        <w:t xml:space="preserve">among</w:t>
+      </w:r>
+      <w:r>
+        <w:t xml:space="preserve">) and within (</w:t>
+      </w:r>
+      <w:r>
+        <w:rPr>
+          <w:i/>
+          <w:iCs/>
+        </w:rPr>
+        <w:t xml:space="preserve">V</w:t>
+      </w:r>
+      <w:r>
+        <w:rPr>
+          <w:vertAlign w:val="subscript"/>
+        </w:rPr>
+        <w:t xml:space="preserve">within</w:t>
+      </w:r>
+      <w:r>
+        <w:t xml:space="preserve">) females by constructing a univariate hierarchical linear mixed-effects model with scaled mean egg perimeter as the response variable, clutch (first or second) as a fixed effect, and female body size as a continuous covariate. I also included, as random effects, a random slope for each clutch for each female. In the dispersion part of the model, I included clutch as a fixed effect to estimate the within-individual (i.e. residual) variance in egg size for each clutch. I then tested whether the first and second clutch differed in egg size at the among- and within-female levels.</w:t>
+      </w:r>
+    </w:p>
+    <w:bookmarkEnd w:id="29"/>
+    <w:bookmarkEnd w:id="30"/>
+    <w:bookmarkStart w:id="31" w:name="results"/>
     <w:p>
       <w:pPr>
         <w:pStyle w:val="Heading1"/>
@@ -708,8 +2818,112 @@
         <w:t xml:space="preserve">Results</w:t>
       </w:r>
     </w:p>
-    <w:bookmarkEnd w:id="25"/>
-    <w:bookmarkStart w:id="26" w:name="X2adf980c3cdf557e751ed69a8410e917bd83bb9"/>
+    <w:p>
+      <w:pPr>
+        <w:pStyle w:val="FirstParagraph"/>
+      </w:pPr>
+      <w:r>
+        <w:t xml:space="preserve">Results</w:t>
+      </w:r>
+      <w:r>
+        <w:t xml:space="preserve"> </w:t>
+      </w:r>
+      <w:r>
+        <w:t xml:space="preserve">Effect of clutch order on egg size and number</w:t>
+      </w:r>
+      <w:r>
+        <w:t xml:space="preserve"> </w:t>
+      </w:r>
+      <w:r>
+        <w:t xml:space="preserve">Both egg number and egg size declined in the second clutch. In the multivariate Gaussian–Poisson model, egg size was smaller in clutch two (x̄ ± SE = 3.41 ± 0.03) relative to clutch one (3.54 ± 0.03; β = −0.12, 95% CrI [−0.21, −0.04]). Egg number also declined substantially (clutch one: 51.55 ± 2.49; clutch two: 34.14 ± 2.65; log-scale β = −0.41, 95% CrI [−0.48, −0.34]), corresponding to an approximate 34% reduction on the natural scale (e^(−0.41) ≈ 0.66).</w:t>
+      </w:r>
+      <w:r>
+        <w:t xml:space="preserve"> </w:t>
+      </w:r>
+      <w:r>
+        <w:t xml:space="preserve">Among-female variation remained detectable for both egg size (SD = 0.091, 95% CrI [0.009, 0.165]) and egg number (SD = 0.355, 95% CrI [0.273, 0.460]), indicating persistent heterogeneity among females across broods.</w:t>
+      </w:r>
+      <w:r>
+        <w:t xml:space="preserve"> </w:t>
+      </w:r>
+      <w:r>
+        <w:t xml:space="preserve">Correlations between egg number and egg size</w:t>
+      </w:r>
+      <w:r>
+        <w:t xml:space="preserve"> </w:t>
+      </w:r>
+      <w:r>
+        <w:t xml:space="preserve">Across all observations, the raw Pearson correlation between egg number and egg size was weak and close to zero (r_raw = −0.04, 95% CI [−0.25, 0.19]), suggesting no clear phenotypic association when hierarchical structure was ignored.</w:t>
+      </w:r>
+      <w:r>
+        <w:t xml:space="preserve"> </w:t>
+      </w:r>
+      <w:r>
+        <w:t xml:space="preserve">In contrast, the between-female Pearson correlation calculated from female means was moderate and negative (r_between = −0.31, 95% CI [−0.55, −0.02]). Females that produced more eggs on average tended to lay smaller eggs.</w:t>
+      </w:r>
+      <w:r>
+        <w:t xml:space="preserve"> </w:t>
+      </w:r>
+      <w:r>
+        <w:t xml:space="preserve">The multivariate Gaussian model partitioned covariation into among-female and residual components. After accounting for female identity, the residual (within-female) correlation between egg number and egg size was effectively zero and highly uncertain (r_within = 0.0025, 95% CrI [−0.86, 0.85]). Thus, apparent phenotypic independence masked a moderate negative association among females but no detectable clutch-level trade-off within females.</w:t>
+      </w:r>
+      <w:r>
+        <w:t xml:space="preserve"> </w:t>
+      </w:r>
+      <w:r>
+        <w:t xml:space="preserve">Within–between mixed-effects models</w:t>
+      </w:r>
+      <w:r>
+        <w:t xml:space="preserve"> </w:t>
+      </w:r>
+      <w:r>
+        <w:t xml:space="preserve">In the within–between mixed-effects model, egg size varied among females (random-intercept SD = 0.07, 95% CrI [0.00, 0.14]).</w:t>
+      </w:r>
+      <w:r>
+        <w:t xml:space="preserve"> </w:t>
+      </w:r>
+      <w:r>
+        <w:t xml:space="preserve">The within-female effect of egg number on egg size was small and uncertain (β_W = 0.0027, 95% CrI [−0.0006, 0.0057]). On the natural scale, this corresponds to an increase of approximately 0.027 units in egg size for every additional 10 eggs within a female—an effect that was not credibly different from zero.</w:t>
+      </w:r>
+      <w:r>
+        <w:t xml:space="preserve"> </w:t>
+      </w:r>
+      <w:r>
+        <w:t xml:space="preserve">In contrast, the between-female effect was negative (β_B = −0.0038, 95% CrI [−0.0076, 0.0000]). Females differing by 10 eggs in mean clutch size differed by approximately 0.038 units in egg size. Although the credible interval extended to zero, the posterior distribution was predominantly negative, consistent with a modest among-female trade-off.</w:t>
+      </w:r>
+      <w:r>
+        <w:t xml:space="preserve"> </w:t>
+      </w:r>
+      <w:r>
+        <w:t xml:space="preserve">Standardized coefficients reinforced the difference in magnitude between hierarchical levels. The standardized within-female effect was positive but uncertain (β_W,standardized = 0.17, 95% CrI [−0.04, 0.36]), whereas the standardized between-female effect was negative and its credible interval did not overlap zero (β_B,standardized = −0.23, 95% CrI [−0.452, −0.002]). Thus, the negative association was stronger and more consistent among females than within females.</w:t>
+      </w:r>
+      <w:r>
+        <w:t xml:space="preserve"> </w:t>
+      </w:r>
+      <w:r>
+        <w:t xml:space="preserve">Allowing within-female slopes to vary among females produced similar fixed-effect estimates (β_W = 0.0034, 95% CrI [−0.0004, 0.0076]; β_B = −0.0041, 95% CrI [−0.0082, −0.0002]). Variation in within-female slopes was small (SD = 0.0046, 95% CrI [0.0003, 0.0110]), and the intercept–slope correlation was highly uncertain (r = 0.20, 95% CrI [−0.67, 0.85]), indicating no strong evidence that females differed substantially in plastic allocation patterns.</w:t>
+      </w:r>
+      <w:r>
+        <w:t xml:space="preserve"> </w:t>
+      </w:r>
+      <w:r>
+        <w:t xml:space="preserve">Because both egg number and egg size declined across clutches, clutch order was included as an additional fixed effect to test whether it explained the weak positive within-female slope. When clutch order was accounted for, the within-female effect collapsed to zero (β_W = −0.0004, 95% CrI [−0.0045, 0.0035]). Thus, there was no evidence that females plastically traded egg number against egg size within clutches; the apparent association in the initial model was entirely explained by parallel declines from clutch one to clutch two.</w:t>
+      </w:r>
+      <w:r>
+        <w:t xml:space="preserve"> </w:t>
+      </w:r>
+      <w:r>
+        <w:t xml:space="preserve">Summary</w:t>
+      </w:r>
+      <w:r>
+        <w:t xml:space="preserve"> </w:t>
+      </w:r>
+      <w:r>
+        <w:t xml:space="preserve">Overall, egg size and egg number declined substantially between clutches. Persistent differences among females generated a moderate negative association between mean egg size and number, whereas there was no evidence for a consistent within-female trade-off once clutch order was accounted for. These results indicate that apparent number–size trade-offs arise primarily from stable among-female differences rather than dynamic allocation decisions within females.</w:t>
+      </w:r>
+    </w:p>
+    <w:bookmarkEnd w:id="31"/>
+    <w:bookmarkStart w:id="32" w:name="X2adf980c3cdf557e751ed69a8410e917bd83bb9"/>
     <w:p>
       <w:pPr>
         <w:pStyle w:val="Heading1"/>
@@ -723,7 +2937,7 @@
         <w:pStyle w:val="FirstParagraph"/>
       </w:pPr>
       <w:r>
-        <w:t xml:space="preserve">Both egg number and egg size declined in the second clutch In the multivariate Gaussian–Poisson model, egg size was smaller in clutch two (</w:t>
+        <w:t xml:space="preserve">Both egg number and egg size declined in the second clutch. In the multivariate Gaussian–Poisson model, egg size was smaller in clutch two (</w:t>
       </w:r>
       <m:oMath>
         <m:acc>
@@ -864,8 +3078,8 @@
         <w:t xml:space="preserve">). Among-female variation remained detectable for both egg size (SD = 0.091, 95% CrI [0.009, 0.165]) and egg number (SD = 0.355, 95% CrI [0.273, 0.460]), indicating persistent heterogeneity across broods.</w:t>
       </w:r>
     </w:p>
-    <w:bookmarkEnd w:id="26"/>
-    <w:bookmarkStart w:id="27" w:name="correlations"/>
+    <w:bookmarkEnd w:id="32"/>
+    <w:bookmarkStart w:id="33" w:name="correlations"/>
     <w:p>
       <w:pPr>
         <w:pStyle w:val="Heading1"/>
@@ -905,7 +3119,7 @@
         <w:t xml:space="preserve"> </w:t>
       </w:r>
       <w:r>
-        <w:t xml:space="preserve">= -0.04, 95% CI [-0.25, 0.19]). Thus, ignoring hierarchical structure, there was no clear phenotypic association between the two traits.The between-female Pearson correlation calculated using female means was moderate and negative (</w:t>
+        <w:t xml:space="preserve">= -0.04, 95% CI [-0.25, 0.19]). Thus, ignoring hierarchical structure, there was no clear phenotypic association between the two traits. The between-female Pearson correlation calculated using female means was moderate and negative (</w:t>
       </w:r>
       <m:oMath>
         <m:sSub>
@@ -981,8 +3195,8 @@
         <w:t xml:space="preserve">= 0.0025, 95% CI [-0.86, 0.85]). This indicates no evidence for consistent clutch-level covariation beyond hierarchical structure.</w:t>
       </w:r>
     </w:p>
-    <w:bookmarkEnd w:id="27"/>
-    <w:bookmarkStart w:id="28" w:name="withinbetween-fixed-effects-models"/>
+    <w:bookmarkEnd w:id="33"/>
+    <w:bookmarkStart w:id="34" w:name="withinbetween-fixed-effects-models"/>
     <w:p>
       <w:pPr>
         <w:pStyle w:val="Heading1"/>
@@ -996,15 +3210,7 @@
         <w:pStyle w:val="FirstParagraph"/>
       </w:pPr>
       <w:r>
-        <w:t xml:space="preserve">In the within–between mixed-effects model, egg size varied among females (random-intercept SD = 0.07, 95% CrI [0.00, 0.15]).</w:t>
-      </w:r>
-    </w:p>
-    <w:p>
-      <w:pPr>
-        <w:pStyle w:val="BodyText"/>
-      </w:pPr>
-      <w:r>
-        <w:t xml:space="preserve">The within-female effect of egg number on egg size was small and uncertain (</w:t>
+        <w:t xml:space="preserve">In the within–between mixed-effects model, egg size varied among females (random-intercept SD = 0.07, 95% CrI [0.00, 0.14]). The within-female effect of egg number on egg size was small and uncertain (</w:t>
       </w:r>
       <m:oMath>
         <m:sSub>
@@ -1024,7 +3230,7 @@
         <w:t xml:space="preserve"> </w:t>
       </w:r>
       <w:r>
-        <w:t xml:space="preserve">= 0.0027 , 95% CrI [-0.0006, 0.0060]). In contrast, the between-female effect was negative and its credible interval narrowly excluded zero (</w:t>
+        <w:t xml:space="preserve">= 0.0027, 95% CrI [-0.0006, 0.0057]). In contrast, the between-female effect was negative and its credible interval narrowly excluded zero (</w:t>
       </w:r>
       <m:oMath>
         <m:sSub>
@@ -1044,15 +3250,7 @@
         <w:t xml:space="preserve"> </w:t>
       </w:r>
       <w:r>
-        <w:t xml:space="preserve">= -0.0037 , 95% CrI [-0.0075, 0.0001]).</w:t>
-      </w:r>
-    </w:p>
-    <w:p>
-      <w:pPr>
-        <w:pStyle w:val="BodyText"/>
-      </w:pPr>
-      <w:r>
-        <w:t xml:space="preserve">Allowing within-female slopes to vary among females produced similar fixed-effect estimates (</w:t>
+        <w:t xml:space="preserve">= -0.0038, 95% CrI [-0.0076, 0.0000]). Allowing within-female slopes to vary among females produced similar fixed-effect estimates (</w:t>
       </w:r>
       <m:oMath>
         <m:sSub>
@@ -1072,7 +3270,7 @@
         <w:t xml:space="preserve"> </w:t>
       </w:r>
       <w:r>
-        <w:t xml:space="preserve">= 0.0033 , 95% CrI [-0.0004, 0.0071];</w:t>
+        <w:t xml:space="preserve">= 0.0034, 95% CrI [-0.0004, 0.0076];</w:t>
       </w:r>
       <w:r>
         <w:t xml:space="preserve"> </w:t>
@@ -1095,7 +3293,7 @@
         <w:t xml:space="preserve"> </w:t>
       </w:r>
       <w:r>
-        <w:t xml:space="preserve">= -0.0041 , 95% CrI [-0.0079, -0.0002]). The variance in within-female slopes was small (SD = 0.00, 95% CrI [0.00, 0.01]), and the intercept–slope correlation was highly uncertain (</w:t>
+        <w:t xml:space="preserve">= -0.0041, 95% CrI [-0.0082, -0.0002]). The variance in within-female slopes was small (SD = 0.0046, 95% CrI [0.0003, 0.0110]), and the intercept–slope correlation was highly uncertain (</w:t>
       </w:r>
       <w:r>
         <w:rPr>
@@ -1108,7 +3306,7 @@
         <w:t xml:space="preserve"> </w:t>
       </w:r>
       <w:r>
-        <w:t xml:space="preserve">= 0.28, 95% CrI [-0.86, 0.97]).</w:t>
+        <w:t xml:space="preserve">= 0.20, 95% CrI [-0.67, 0.85]).</w:t>
       </w:r>
     </w:p>
     <w:p>
@@ -1116,19 +3314,119 @@
         <w:pStyle w:val="BodyText"/>
       </w:pPr>
       <w:r>
-        <w:t xml:space="preserve">Standardized effects</w:t>
-      </w:r>
-      <w:r>
-        <w:t xml:space="preserve"> </w:t>
-      </w:r>
-      <w:r>
-        <w:t xml:space="preserve">Standardized coefficients confirmed the difference in magnitude between hierarchical levels. The standardized within-female effect was positive but uncertain (β〖_W〗,std = 0.165, 95% CrI [−0.035, 0.362]). The standardized between-female effect was negative and did not overlap zero (β〖_B〗,std = −0.224, 95% CrI [−0.445, −0.005]).</w:t>
-      </w:r>
-      <w:r>
-        <w:t xml:space="preserve"> </w:t>
-      </w:r>
-      <w:r>
-        <w:t xml:space="preserve">Thus, the negative association was stronger and more consistent among females than within females.</w:t>
+        <w:t xml:space="preserve">Standardized coefficients confirmed the difference in magnitude between hierarchical levels. The standardized within-female effect was positive but uncertain (</w:t>
+      </w:r>
+      <m:oMath>
+        <m:sSub>
+          <m:e>
+            <m:r>
+              <m:t>β</m:t>
+            </m:r>
+          </m:e>
+          <m:sub>
+            <m:r>
+              <m:t>W</m:t>
+            </m:r>
+            <m:r>
+              <m:t>s</m:t>
+            </m:r>
+            <m:r>
+              <m:t>t</m:t>
+            </m:r>
+            <m:r>
+              <m:t>a</m:t>
+            </m:r>
+            <m:r>
+              <m:t>n</m:t>
+            </m:r>
+            <m:r>
+              <m:t>d</m:t>
+            </m:r>
+            <m:r>
+              <m:t>a</m:t>
+            </m:r>
+            <m:r>
+              <m:t>r</m:t>
+            </m:r>
+            <m:r>
+              <m:t>d</m:t>
+            </m:r>
+            <m:r>
+              <m:t>i</m:t>
+            </m:r>
+            <m:r>
+              <m:t>z</m:t>
+            </m:r>
+            <m:r>
+              <m:t>e</m:t>
+            </m:r>
+            <m:r>
+              <m:t>d</m:t>
+            </m:r>
+          </m:sub>
+        </m:sSub>
+      </m:oMath>
+      <w:r>
+        <w:t xml:space="preserve"> </w:t>
+      </w:r>
+      <w:r>
+        <w:t xml:space="preserve">= 0.17, 95% CrI [-0.04, 0.36]). The standardized between-female effect was negative and did not overlap zero (</w:t>
+      </w:r>
+      <m:oMath>
+        <m:sSub>
+          <m:e>
+            <m:r>
+              <m:t>β</m:t>
+            </m:r>
+          </m:e>
+          <m:sub>
+            <m:r>
+              <m:t>B</m:t>
+            </m:r>
+            <m:r>
+              <m:t>s</m:t>
+            </m:r>
+            <m:r>
+              <m:t>t</m:t>
+            </m:r>
+            <m:r>
+              <m:t>a</m:t>
+            </m:r>
+            <m:r>
+              <m:t>n</m:t>
+            </m:r>
+            <m:r>
+              <m:t>d</m:t>
+            </m:r>
+            <m:r>
+              <m:t>a</m:t>
+            </m:r>
+            <m:r>
+              <m:t>r</m:t>
+            </m:r>
+            <m:r>
+              <m:t>d</m:t>
+            </m:r>
+            <m:r>
+              <m:t>i</m:t>
+            </m:r>
+            <m:r>
+              <m:t>z</m:t>
+            </m:r>
+            <m:r>
+              <m:t>e</m:t>
+            </m:r>
+            <m:r>
+              <m:t>d</m:t>
+            </m:r>
+          </m:sub>
+        </m:sSub>
+      </m:oMath>
+      <w:r>
+        <w:t xml:space="preserve"> </w:t>
+      </w:r>
+      <w:r>
+        <w:t xml:space="preserve">= -0.23, 95% CrI [-0.452, -0.002]). Thus, the negative association was stronger and more consistent among females than within females, a finding that supports the between-female Pearson correlation.</w:t>
       </w:r>
     </w:p>
     <w:p>
@@ -1136,23 +3434,31 @@
         <w:pStyle w:val="BodyText"/>
       </w:pPr>
       <w:r>
-        <w:t xml:space="preserve">Brood-adjusted within–between model</w:t>
-      </w:r>
-      <w:r>
-        <w:t xml:space="preserve"> </w:t>
-      </w:r>
-      <w:r>
-        <w:t xml:space="preserve">Because both egg number and egg size declined across broods, we evaluated whether brood order explained the within-female association. When brood was included as a fixed effect, the within-female slope collapsed to zero (β〖_W〗 = −0.00043, 95% CrI [−0.0045, 0.0037]).</w:t>
-      </w:r>
-      <w:r>
-        <w:t xml:space="preserve"> </w:t>
-      </w:r>
-      <w:r>
-        <w:t xml:space="preserve">This indicates that the small positive within-female association observed in the initial model was driven by parallel brood-order declines in both traits rather than plastic allocation within females.</w:t>
-      </w:r>
-    </w:p>
-    <w:bookmarkEnd w:id="28"/>
-    <w:bookmarkStart w:id="29" w:name="discussion"/>
+        <w:t xml:space="preserve">Because both egg number and egg size declined across clutches, I evaluated whether clutch order explained the within-female association. When clutch-order was included as a fixed effect, the within-female slope collapsed to zero (</w:t>
+      </w:r>
+      <m:oMath>
+        <m:sSub>
+          <m:e>
+            <m:r>
+              <m:t>β</m:t>
+            </m:r>
+          </m:e>
+          <m:sub>
+            <m:r>
+              <m:t>W</m:t>
+            </m:r>
+          </m:sub>
+        </m:sSub>
+      </m:oMath>
+      <w:r>
+        <w:t xml:space="preserve"> </w:t>
+      </w:r>
+      <w:r>
+        <w:t xml:space="preserve">= -0.0004, 95% CrI [-0.0045, 0.0035]). This indicates that the small positive within-female association observed in the initial model was driven by parallel clutch-order declines in both traits rather than plastic allocation within females.</w:t>
+      </w:r>
+    </w:p>
+    <w:bookmarkEnd w:id="34"/>
+    <w:bookmarkStart w:id="35" w:name="discussion"/>
     <w:p>
       <w:pPr>
         <w:pStyle w:val="Heading1"/>
@@ -1626,8 +3932,8 @@
         <w:t xml:space="preserve">In conclusion, by partitioning variance into its among- and within-individual components, I found that female European earwigs do not trade off clutch and egg size. Instead, I found a positive correlation between egg number and size and some evidence for an among-female trade-off. I also discovered that second clutches consist of eggs with a more variable size than first clutches, but the among-female variation in average egg size was similar between the two clutches.</w:t>
       </w:r>
     </w:p>
-    <w:bookmarkEnd w:id="29"/>
-    <w:bookmarkStart w:id="30" w:name="data-availability"/>
+    <w:bookmarkEnd w:id="35"/>
+    <w:bookmarkStart w:id="36" w:name="data-availability"/>
     <w:p>
       <w:pPr>
         <w:pStyle w:val="Heading1"/>
@@ -1644,8 +3950,8 @@
         <w:t xml:space="preserve">Data are available through the OSF repository at 10.17605/OSF.IO/KWCS8.</w:t>
       </w:r>
     </w:p>
-    <w:bookmarkEnd w:id="30"/>
-    <w:bookmarkStart w:id="31" w:name="author-contributions"/>
+    <w:bookmarkEnd w:id="36"/>
+    <w:bookmarkStart w:id="37" w:name="author-contributions"/>
     <w:p>
       <w:pPr>
         <w:pStyle w:val="Heading1"/>
@@ -1662,8 +3968,8 @@
         <w:t xml:space="preserve">CDK collected and analyzed the data, and wrote the manuscript.</w:t>
       </w:r>
     </w:p>
-    <w:bookmarkEnd w:id="31"/>
-    <w:bookmarkStart w:id="32" w:name="funding"/>
+    <w:bookmarkEnd w:id="37"/>
+    <w:bookmarkStart w:id="38" w:name="funding"/>
     <w:p>
       <w:pPr>
         <w:pStyle w:val="Heading1"/>
@@ -1680,8 +3986,8 @@
         <w:t xml:space="preserve">The study was funded by a Discovery Grant from the Natural Sciences and Engineering Research Council of Canada (NSERC).</w:t>
       </w:r>
     </w:p>
-    <w:bookmarkEnd w:id="32"/>
-    <w:bookmarkStart w:id="33" w:name="conflict-of-interest"/>
+    <w:bookmarkEnd w:id="38"/>
+    <w:bookmarkStart w:id="39" w:name="conflict-of-interest"/>
     <w:p>
       <w:pPr>
         <w:pStyle w:val="Heading1"/>
@@ -1698,8 +4004,8 @@
         <w:t xml:space="preserve">I declare no conflict of interest.</w:t>
       </w:r>
     </w:p>
-    <w:bookmarkEnd w:id="33"/>
-    <w:bookmarkStart w:id="34" w:name="acknowledgements"/>
+    <w:bookmarkEnd w:id="39"/>
+    <w:bookmarkStart w:id="40" w:name="acknowledgements"/>
     <w:p>
       <w:pPr>
         <w:pStyle w:val="Heading1"/>
@@ -1721,8 +4027,8 @@
         <w:br w:type="page"/>
       </w:r>
     </w:p>
-    <w:bookmarkEnd w:id="34"/>
-    <w:bookmarkStart w:id="89" w:name="references"/>
+    <w:bookmarkEnd w:id="40"/>
+    <w:bookmarkStart w:id="92" w:name="references"/>
     <w:p>
       <w:pPr>
         <w:pStyle w:val="Heading1"/>
@@ -1731,8 +4037,8 @@
         <w:t xml:space="preserve">References</w:t>
       </w:r>
     </w:p>
-    <w:bookmarkStart w:id="80" w:name="refs"/>
-    <w:bookmarkStart w:id="35" w:name="ref-bernardo1996"/>
+    <w:bookmarkStart w:id="83" w:name="refs"/>
+    <w:bookmarkStart w:id="41" w:name="ref-bernardo1996"/>
     <w:p>
       <w:pPr>
         <w:pStyle w:val="Bibliography"/>
@@ -1741,8 +4047,8 @@
         <w:t xml:space="preserve">Bernardo, J. 1996. The particular maternal effect of propagule size, especially egg size: Patterns, models, quality of evidence and interpretations. Am Zool 36:216–236.</w:t>
       </w:r>
     </w:p>
-    <w:bookmarkEnd w:id="35"/>
-    <w:bookmarkStart w:id="36" w:name="ref-boos2014"/>
+    <w:bookmarkEnd w:id="41"/>
+    <w:bookmarkStart w:id="42" w:name="ref-boos2014"/>
     <w:p>
       <w:pPr>
         <w:pStyle w:val="Bibliography"/>
@@ -1751,23 +4057,232 @@
         <w:t xml:space="preserve">Boos, S., J. Meunier, S. Pichon, and M. Kölliker. 2014. Maternal care provides antifungal protection to eggs in the european earwig. Behav Ecol 25:754–761.</w:t>
       </w:r>
     </w:p>
-    <w:bookmarkEnd w:id="36"/>
-    <w:bookmarkStart w:id="37" w:name="ref-burkner2017"/>
+    <w:bookmarkEnd w:id="42"/>
+    <w:bookmarkStart w:id="43" w:name="ref-careau2017"/>
     <w:p>
       <w:pPr>
         <w:pStyle w:val="Bibliography"/>
       </w:pPr>
       <w:r>
-        <w:t xml:space="preserve">Bürkner, P.-C. 2017.</w:t>
-      </w:r>
-      <w:r>
-        <w:t xml:space="preserve"> </w:t>
-      </w:r>
-      <w:r>
-        <w:t xml:space="preserve">brms</w:t>
-      </w:r>
-      <w:r>
-        <w:t xml:space="preserve">: An</w:t>
+        <w:t xml:space="preserve">Careau, V., and R. Wilson. 2017. Of uberfleas and krakens: Detecting trade-offs using mixed models. Integr Comp Biol 57:362–371.</w:t>
+      </w:r>
+    </w:p>
+    <w:bookmarkEnd w:id="43"/>
+    <w:bookmarkStart w:id="44" w:name="ref-cavaleiro2014"/>
+    <w:p>
+      <w:pPr>
+        <w:pStyle w:val="Bibliography"/>
+      </w:pPr>
+      <w:r>
+        <w:t xml:space="preserve">Cavaleiro, F. I., and M. J. Santos. 2014. Egg number-egg size: An important trade-off in parasite life history strategies. Int J Parasitol 44:173–182.</w:t>
+      </w:r>
+    </w:p>
+    <w:bookmarkEnd w:id="44"/>
+    <w:bookmarkStart w:id="45" w:name="ref-church2019"/>
+    <w:p>
+      <w:pPr>
+        <w:pStyle w:val="Bibliography"/>
+      </w:pPr>
+      <w:r>
+        <w:t xml:space="preserve">Church, S. H., S. Donoughe, B. A. S. de Medeiros, and C. G. Extavour. 2019. Insect egg size and shape evolve with ecology but not developmental rate. Nature 571:58–62.</w:t>
+      </w:r>
+    </w:p>
+    <w:bookmarkEnd w:id="45"/>
+    <w:bookmarkStart w:id="46" w:name="ref-clutton-brock1984"/>
+    <w:p>
+      <w:pPr>
+        <w:pStyle w:val="Bibliography"/>
+      </w:pPr>
+      <w:r>
+        <w:t xml:space="preserve">Clutton-Brock, T. H. 1984. Reproductive effort and terminal investment in iteroparous animals. Am Nat 123:212–229.</w:t>
+      </w:r>
+    </w:p>
+    <w:bookmarkEnd w:id="46"/>
+    <w:bookmarkStart w:id="47" w:name="ref-clutton-brock1991"/>
+    <w:p>
+      <w:pPr>
+        <w:pStyle w:val="Bibliography"/>
+      </w:pPr>
+      <w:r>
+        <w:t xml:space="preserve">Clutton-Brock, T. H. 1991.</w:t>
+      </w:r>
+      <w:r>
+        <w:t xml:space="preserve"> </w:t>
+      </w:r>
+      <w:r>
+        <w:t xml:space="preserve">The Evolution of Parental Care</w:t>
+      </w:r>
+      <w:r>
+        <w:t xml:space="preserve">. Princeton University Press.</w:t>
+      </w:r>
+    </w:p>
+    <w:bookmarkEnd w:id="47"/>
+    <w:bookmarkStart w:id="48" w:name="ref-einum2000"/>
+    <w:p>
+      <w:pPr>
+        <w:pStyle w:val="Bibliography"/>
+      </w:pPr>
+      <w:r>
+        <w:t xml:space="preserve">Einum, S., and I. A. Fleming. 2000. Highly fecund mothers sacrifice offspring survival to maximize fitness. Nature 405:565–567.</w:t>
+      </w:r>
+    </w:p>
+    <w:bookmarkEnd w:id="48"/>
+    <w:bookmarkStart w:id="49" w:name="ref-falconer1996"/>
+    <w:p>
+      <w:pPr>
+        <w:pStyle w:val="Bibliography"/>
+      </w:pPr>
+      <w:r>
+        <w:t xml:space="preserve">Falconer, D. S., and T. F. C. MacKay. 1996.</w:t>
+      </w:r>
+      <w:r>
+        <w:t xml:space="preserve"> </w:t>
+      </w:r>
+      <w:r>
+        <w:t xml:space="preserve">An Introduction Quantitative Genetics</w:t>
+      </w:r>
+      <w:r>
+        <w:t xml:space="preserve">. Pearson Education Limited, Essex, England.</w:t>
+      </w:r>
+    </w:p>
+    <w:bookmarkEnd w:id="49"/>
+    <w:bookmarkStart w:id="50" w:name="ref-ficetola2009"/>
+    <w:p>
+      <w:pPr>
+        <w:pStyle w:val="Bibliography"/>
+      </w:pPr>
+      <w:r>
+        <w:t xml:space="preserve">Ficetola, G. F., and F. De Bernardi. 2009. Offspring size and survival in the frog rana latastei: From among-population to within-clutch variation. Biol J Linn Soc 97:845–853.</w:t>
+      </w:r>
+    </w:p>
+    <w:bookmarkEnd w:id="50"/>
+    <w:bookmarkStart w:id="51" w:name="ref-fox2000"/>
+    <w:p>
+      <w:pPr>
+        <w:pStyle w:val="Bibliography"/>
+      </w:pPr>
+      <w:r>
+        <w:t xml:space="preserve">Fox, C. W., and M. E. Czesak. 2000. Evolutionary ecology of progeny size in arthropods. Annu Rev Entomol 45:341–369.</w:t>
+      </w:r>
+    </w:p>
+    <w:bookmarkEnd w:id="51"/>
+    <w:bookmarkStart w:id="52" w:name="ref-hargitai2005"/>
+    <w:p>
+      <w:pPr>
+        <w:pStyle w:val="Bibliography"/>
+      </w:pPr>
+      <w:r>
+        <w:t xml:space="preserve">Hargitai, R., J. Török, L. Tóth, G. Hegyi, B. Rosivall, B. Szigeti, and E. Szöllősi. 2005. Effects of environmental conditions and parental quality on inter-and intraclutch egg-size variation in the collared flycatcher (ficedula albicollis). The Auk 122:509–522.</w:t>
+      </w:r>
+    </w:p>
+    <w:bookmarkEnd w:id="52"/>
+    <w:bookmarkStart w:id="53" w:name="ref-harvey1983"/>
+    <w:p>
+      <w:pPr>
+        <w:pStyle w:val="Bibliography"/>
+      </w:pPr>
+      <w:r>
+        <w:t xml:space="preserve">Harvey, G. T. 1983. Environmental and genetic effects on mean egg weight in spruce budworm (lepidoptera: tortricidae). The Canadian Entomologist 115:1109–1117.</w:t>
+      </w:r>
+    </w:p>
+    <w:bookmarkEnd w:id="53"/>
+    <w:bookmarkStart w:id="54" w:name="ref-kelly2014"/>
+    <w:p>
+      <w:pPr>
+        <w:pStyle w:val="Bibliography"/>
+      </w:pPr>
+      <w:r>
+        <w:t xml:space="preserve">Kelly, C. D., B. Tawes, and A. Worthington. 2014. Evaluating indices of body condition in two cricket species. Ecology and Evolution 4:4476–4487.</w:t>
+      </w:r>
+    </w:p>
+    <w:bookmarkEnd w:id="54"/>
+    <w:bookmarkStart w:id="55" w:name="ref-koch2014"/>
+    <w:p>
+      <w:pPr>
+        <w:pStyle w:val="Bibliography"/>
+      </w:pPr>
+      <w:r>
+        <w:t xml:space="preserve">Koch, L. K., and J. Meunier. 2014. Mother and offspring fitness in an insect with maternal care: Phenotypic trade-offs between egg number, egg mass and egg care. BMC Evol Biol 14:125.</w:t>
+      </w:r>
+    </w:p>
+    <w:bookmarkEnd w:id="55"/>
+    <w:bookmarkStart w:id="56" w:name="ref-kolliker2007"/>
+    <w:p>
+      <w:pPr>
+        <w:pStyle w:val="Bibliography"/>
+      </w:pPr>
+      <w:r>
+        <w:t xml:space="preserve">Kölliker, M. 2007. Benefits and costs of earwig (forficula auricularia) family life. Behav Ecol Sociobiol 61:1489–1497.</w:t>
+      </w:r>
+    </w:p>
+    <w:bookmarkEnd w:id="56"/>
+    <w:bookmarkStart w:id="57" w:name="ref-meunier2024"/>
+    <w:p>
+      <w:pPr>
+        <w:pStyle w:val="Bibliography"/>
+      </w:pPr>
+      <w:r>
+        <w:t xml:space="preserve">Meunier, J. 2024. The biology and social life of earwigs (dermaptera). Annu Rev Entomol 69:259–276.</w:t>
+      </w:r>
+    </w:p>
+    <w:bookmarkEnd w:id="57"/>
+    <w:bookmarkStart w:id="58" w:name="ref-nelson2004"/>
+    <w:p>
+      <w:pPr>
+        <w:pStyle w:val="Bibliography"/>
+      </w:pPr>
+      <w:r>
+        <w:t xml:space="preserve">Nelson, N. J., M. B. Thompson, S. Pledger, S. N. Keall, and C. H. Daugherty. 2004. Egg mass determines hatchling size, and incubation temperature influences post‐hatching growth, of tuatara sphenodon punctatus. J Zool 263:77–87.</w:t>
+      </w:r>
+    </w:p>
+    <w:bookmarkEnd w:id="58"/>
+    <w:bookmarkStart w:id="59" w:name="ref-nilsson1993"/>
+    <w:p>
+      <w:pPr>
+        <w:pStyle w:val="Bibliography"/>
+      </w:pPr>
+      <w:r>
+        <w:t xml:space="preserve">Nilsson, J. ‐Å., and E. Svensson. 1993. Causes and consequences of egg mass variation between and within blue tit clutches. J Zool 230:469–481.</w:t>
+      </w:r>
+    </w:p>
+    <w:bookmarkEnd w:id="59"/>
+    <w:bookmarkStart w:id="60" w:name="ref-parker1982"/>
+    <w:p>
+      <w:pPr>
+        <w:pStyle w:val="Bibliography"/>
+      </w:pPr>
+      <w:r>
+        <w:t xml:space="preserve">Parker, G. A. 1982. Why are there so many tiny sperm? Sperm competition and the maintenance of two sexes. J Theor Biol 96:281–294.</w:t>
+      </w:r>
+    </w:p>
+    <w:bookmarkEnd w:id="60"/>
+    <w:bookmarkStart w:id="61" w:name="ref-peig2009"/>
+    <w:p>
+      <w:pPr>
+        <w:pStyle w:val="Bibliography"/>
+      </w:pPr>
+      <w:r>
+        <w:t xml:space="preserve">Peig, J., and A. J. Green. 2009. New perspectives for estimating body condition from mass/length data: The scaled mass index as an alternative method. Oikos 118:1883–1891.</w:t>
+      </w:r>
+    </w:p>
+    <w:bookmarkEnd w:id="61"/>
+    <w:bookmarkStart w:id="62" w:name="ref-peig2010"/>
+    <w:p>
+      <w:pPr>
+        <w:pStyle w:val="Bibliography"/>
+      </w:pPr>
+      <w:r>
+        <w:t xml:space="preserve">Peig, J., and A. J. Green. 2010. The paradigm of body condition: A critical reappraisal of current methods based on mass and length. Funct Ecol 24:1323–1332.</w:t>
+      </w:r>
+    </w:p>
+    <w:bookmarkEnd w:id="62"/>
+    <w:bookmarkStart w:id="63" w:name="ref-r2013"/>
+    <w:p>
+      <w:pPr>
+        <w:pStyle w:val="Bibliography"/>
+      </w:pPr>
+      <w:r>
+        <w:t xml:space="preserve">R Core Team. 2025.</w:t>
       </w:r>
       <w:r>
         <w:t xml:space="preserve"> </w:t>
@@ -1776,392 +4291,124 @@
         <w:t xml:space="preserve">R</w:t>
       </w:r>
       <w:r>
-        <w:t xml:space="preserve"> </w:t>
-      </w:r>
-      <w:r>
-        <w:t xml:space="preserve">package for</w:t>
-      </w:r>
-      <w:r>
-        <w:t xml:space="preserve"> </w:t>
-      </w:r>
-      <w:r>
-        <w:t xml:space="preserve">B</w:t>
-      </w:r>
-      <w:r>
-        <w:t xml:space="preserve">ayesian multilevel models using</w:t>
-      </w:r>
-      <w:r>
-        <w:t xml:space="preserve"> </w:t>
-      </w:r>
-      <w:r>
-        <w:t xml:space="preserve">S</w:t>
-      </w:r>
-      <w:r>
-        <w:t xml:space="preserve">tan. Journal of Statistical Software 80:4308.</w:t>
-      </w:r>
-    </w:p>
-    <w:bookmarkEnd w:id="37"/>
-    <w:bookmarkStart w:id="38" w:name="ref-careau2017"/>
+        <w:t xml:space="preserve">:</w:t>
+      </w:r>
+      <w:r>
+        <w:t xml:space="preserve"> </w:t>
+      </w:r>
+      <w:r>
+        <w:t xml:space="preserve">A</w:t>
+      </w:r>
+      <w:r>
+        <w:t xml:space="preserve"> </w:t>
+      </w:r>
+      <w:r>
+        <w:t xml:space="preserve">language and environment for statistical computing. Vienna, Austria.</w:t>
+      </w:r>
+    </w:p>
+    <w:bookmarkEnd w:id="63"/>
+    <w:bookmarkStart w:id="64" w:name="ref-reznick2000"/>
     <w:p>
       <w:pPr>
         <w:pStyle w:val="Bibliography"/>
       </w:pPr>
       <w:r>
-        <w:t xml:space="preserve">Careau, V., and R. Wilson. 2017. Of uberfleas and krakens: Detecting trade-offs using mixed models. Integr Comp Biol 57:362–371.</w:t>
-      </w:r>
-    </w:p>
-    <w:bookmarkEnd w:id="38"/>
-    <w:bookmarkStart w:id="39" w:name="ref-cavaleiro2014"/>
+        <w:t xml:space="preserve">Reznick, D., L. Nunney, and A. Tessier. 2000. Big houses, big cars, superfleas and the costs of reproduction. Trends Ecol Evol 15:421–425.</w:t>
+      </w:r>
+    </w:p>
+    <w:bookmarkEnd w:id="64"/>
+    <w:bookmarkStart w:id="65" w:name="ref-roff1992a"/>
     <w:p>
       <w:pPr>
         <w:pStyle w:val="Bibliography"/>
       </w:pPr>
       <w:r>
-        <w:t xml:space="preserve">Cavaleiro, F. I., and M. J. Santos. 2014. Egg number-egg size: An important trade-off in parasite life history strategies. Int J Parasitol 44:173–182.</w:t>
-      </w:r>
-    </w:p>
-    <w:bookmarkEnd w:id="39"/>
-    <w:bookmarkStart w:id="40" w:name="ref-church2019"/>
+        <w:t xml:space="preserve">Roff, D. 1992.</w:t>
+      </w:r>
+      <w:r>
+        <w:t xml:space="preserve"> </w:t>
+      </w:r>
+      <w:r>
+        <w:t xml:space="preserve">Evolution of Life Histories: Theory and Analysis</w:t>
+      </w:r>
+      <w:r>
+        <w:t xml:space="preserve">. Chapman &amp; Hall, Inc., New York, NY.</w:t>
+      </w:r>
+    </w:p>
+    <w:bookmarkEnd w:id="65"/>
+    <w:bookmarkStart w:id="66" w:name="ref-schindelin2012"/>
     <w:p>
       <w:pPr>
         <w:pStyle w:val="Bibliography"/>
       </w:pPr>
       <w:r>
-        <w:t xml:space="preserve">Church, S. H., S. Donoughe, B. A. S. de Medeiros, and C. G. Extavour. 2019. Insect egg size and shape evolve with ecology but not developmental rate. Nature 571:58–62.</w:t>
-      </w:r>
-    </w:p>
-    <w:bookmarkEnd w:id="40"/>
-    <w:bookmarkStart w:id="41" w:name="ref-clutton-brock1984"/>
+        <w:t xml:space="preserve">Schindelin, J., I. Arganda-Carreras, E. Frise, V. Kaynig, M. Longair, T. Pietzsch, S. Preibisch, C. Rueden, S. Saalfeld, B. Schmid, J.-Y. Tinevez, D. J. White, V. Hartenstein, K. Eliceiri, P. Tomancak, and A. Cardona. 2012. Fiji: An open-source platform for biological-image analysis. Nat Methods 9:676–682. Max Planck Institute of Molecular Cell Biology; Genetics, Dresden, Germany.</w:t>
+      </w:r>
+    </w:p>
+    <w:bookmarkEnd w:id="66"/>
+    <w:bookmarkStart w:id="67" w:name="ref-seko2006"/>
     <w:p>
       <w:pPr>
         <w:pStyle w:val="Bibliography"/>
       </w:pPr>
       <w:r>
-        <w:t xml:space="preserve">Clutton-Brock, T. H. 1984. Reproductive effort and terminal investment in iteroparous animals. Am Nat 123:212–229.</w:t>
-      </w:r>
-    </w:p>
-    <w:bookmarkEnd w:id="41"/>
-    <w:bookmarkStart w:id="42" w:name="ref-clutton-brock1991"/>
+        <w:t xml:space="preserve">Seko, T., T. Miyatake, S. Fujioka, and F. Nakasuji. 2006. Genetic and environmental sources of egg size, fecundity and body size in the migrant skipper, parnara guttata guttata (lepidoptera: hesperiidae). Popul Ecol 48:225–232.</w:t>
+      </w:r>
+    </w:p>
+    <w:bookmarkEnd w:id="67"/>
+    <w:bookmarkStart w:id="68" w:name="ref-shine1978"/>
     <w:p>
       <w:pPr>
         <w:pStyle w:val="Bibliography"/>
       </w:pPr>
       <w:r>
-        <w:t xml:space="preserve">Clutton-Brock, T. H. 1991.</w:t>
-      </w:r>
-      <w:r>
-        <w:t xml:space="preserve"> </w:t>
-      </w:r>
-      <w:r>
-        <w:t xml:space="preserve">The Evolution of Parental Care</w:t>
-      </w:r>
-      <w:r>
-        <w:t xml:space="preserve">. Princeton University Press.</w:t>
-      </w:r>
-    </w:p>
-    <w:bookmarkEnd w:id="42"/>
-    <w:bookmarkStart w:id="43" w:name="ref-einum2000"/>
+        <w:t xml:space="preserve">Shine, R. 1978. Propagule size and parental care: The</w:t>
+      </w:r>
+      <w:r>
+        <w:t xml:space="preserve"> </w:t>
+      </w:r>
+      <w:r>
+        <w:t xml:space="preserve">“safe harbor”</w:t>
+      </w:r>
+      <w:r>
+        <w:t xml:space="preserve"> </w:t>
+      </w:r>
+      <w:r>
+        <w:t xml:space="preserve">hypothesis. J Theor Biol 75:417–424.</w:t>
+      </w:r>
+    </w:p>
+    <w:bookmarkEnd w:id="68"/>
+    <w:bookmarkStart w:id="69" w:name="ref-simpson1951"/>
     <w:p>
       <w:pPr>
         <w:pStyle w:val="Bibliography"/>
       </w:pPr>
       <w:r>
-        <w:t xml:space="preserve">Einum, S., and I. A. Fleming. 2000. Highly fecund mothers sacrifice offspring survival to maximize fitness. Nature 405:565–567.</w:t>
-      </w:r>
-    </w:p>
-    <w:bookmarkEnd w:id="43"/>
-    <w:bookmarkStart w:id="44" w:name="ref-falconer1996"/>
+        <w:t xml:space="preserve">Simpson, E. H. 1951. The interpretation of interaction in contingency tables. Journal of the Royal Statistical Society: Series B (Methodological) 13:238–241.</w:t>
+      </w:r>
+    </w:p>
+    <w:bookmarkEnd w:id="69"/>
+    <w:bookmarkStart w:id="70" w:name="ref-slagsvold1984"/>
     <w:p>
       <w:pPr>
         <w:pStyle w:val="Bibliography"/>
       </w:pPr>
       <w:r>
-        <w:t xml:space="preserve">Falconer, D. S., and T. F. C. MacKay. 1996.</w:t>
-      </w:r>
-      <w:r>
-        <w:t xml:space="preserve"> </w:t>
-      </w:r>
-      <w:r>
-        <w:t xml:space="preserve">An Introduction Quantitative Genetics</w:t>
-      </w:r>
-      <w:r>
-        <w:t xml:space="preserve">. Pearson Education Limited, Essex, England.</w:t>
-      </w:r>
-    </w:p>
-    <w:bookmarkEnd w:id="44"/>
-    <w:bookmarkStart w:id="45" w:name="ref-ficetola2009"/>
+        <w:t xml:space="preserve">Slagsvold, T., J. Sandvik, G. Rofstad, Ö. Lorentsen, and M. Husby. 1984. On the adaptive value of intraclutch egg-size variation in birds. The Auk 101:685–697.</w:t>
+      </w:r>
+    </w:p>
+    <w:bookmarkEnd w:id="70"/>
+    <w:bookmarkStart w:id="71" w:name="ref-smith1974"/>
     <w:p>
       <w:pPr>
         <w:pStyle w:val="Bibliography"/>
       </w:pPr>
       <w:r>
-        <w:t xml:space="preserve">Ficetola, G. F., and F. De Bernardi. 2009. Offspring size and survival in the frog rana latastei: From among-population to within-clutch variation. Biol J Linn Soc 97:845–853.</w:t>
-      </w:r>
-    </w:p>
-    <w:bookmarkEnd w:id="45"/>
-    <w:bookmarkStart w:id="46" w:name="ref-fox2000"/>
-    <w:p>
-      <w:pPr>
-        <w:pStyle w:val="Bibliography"/>
-      </w:pPr>
-      <w:r>
-        <w:t xml:space="preserve">Fox, C. W., and M. E. Czesak. 2000. Evolutionary ecology of progeny size in arthropods. Annu Rev Entomol 45:341–369.</w:t>
-      </w:r>
-    </w:p>
-    <w:bookmarkEnd w:id="46"/>
-    <w:bookmarkStart w:id="47" w:name="ref-hargitai2005"/>
-    <w:p>
-      <w:pPr>
-        <w:pStyle w:val="Bibliography"/>
-      </w:pPr>
-      <w:r>
-        <w:t xml:space="preserve">Hargitai, R., J. Török, L. Tóth, G. Hegyi, B. Rosivall, B. Szigeti, and E. Szöllősi. 2005. Effects of environmental conditions and parental quality on inter-and intraclutch egg-size variation in the collared flycatcher (ficedula albicollis). The Auk 122:509–522.</w:t>
-      </w:r>
-    </w:p>
-    <w:bookmarkEnd w:id="47"/>
-    <w:bookmarkStart w:id="48" w:name="ref-harvey1983"/>
-    <w:p>
-      <w:pPr>
-        <w:pStyle w:val="Bibliography"/>
-      </w:pPr>
-      <w:r>
-        <w:t xml:space="preserve">Harvey, G. T. 1983. Environmental and genetic effects on mean egg weight in spruce budworm (lepidoptera: tortricidae). The Canadian Entomologist 115:1109–1117.</w:t>
-      </w:r>
-    </w:p>
-    <w:bookmarkEnd w:id="48"/>
-    <w:bookmarkStart w:id="49" w:name="ref-honek1993"/>
-    <w:p>
-      <w:pPr>
-        <w:pStyle w:val="Bibliography"/>
-      </w:pPr>
-      <w:r>
-        <w:t xml:space="preserve">Honek, A. 1993. Intraspecific variation in body size and fecundity in insects: A general relationship. Oikos 483–492.</w:t>
-      </w:r>
-    </w:p>
-    <w:bookmarkEnd w:id="49"/>
-    <w:bookmarkStart w:id="50" w:name="ref-kelly2014"/>
-    <w:p>
-      <w:pPr>
-        <w:pStyle w:val="Bibliography"/>
-      </w:pPr>
-      <w:r>
-        <w:t xml:space="preserve">Kelly, C. D., B. Tawes, and A. Worthington. 2014. Evaluating indices of body condition in two cricket species. Ecology and Evolution 4:4476–4487.</w:t>
-      </w:r>
-    </w:p>
-    <w:bookmarkEnd w:id="50"/>
-    <w:bookmarkStart w:id="51" w:name="ref-koch2014"/>
-    <w:p>
-      <w:pPr>
-        <w:pStyle w:val="Bibliography"/>
-      </w:pPr>
-      <w:r>
-        <w:t xml:space="preserve">Koch, L. K., and J. Meunier. 2014. Mother and offspring fitness in an insect with maternal care: Phenotypic trade-offs between egg number, egg mass and egg care. BMC Evol Biol 14:125.</w:t>
-      </w:r>
-    </w:p>
-    <w:bookmarkEnd w:id="51"/>
-    <w:bookmarkStart w:id="52" w:name="ref-kolliker2007"/>
-    <w:p>
-      <w:pPr>
-        <w:pStyle w:val="Bibliography"/>
-      </w:pPr>
-      <w:r>
-        <w:t xml:space="preserve">Kölliker, M. 2007. Benefits and costs of earwig (forficula auricularia) family life. Behav Ecol Sociobiol 61:1489–1497.</w:t>
-      </w:r>
-    </w:p>
-    <w:bookmarkEnd w:id="52"/>
-    <w:bookmarkStart w:id="53" w:name="ref-meunier2024"/>
-    <w:p>
-      <w:pPr>
-        <w:pStyle w:val="Bibliography"/>
-      </w:pPr>
-      <w:r>
-        <w:t xml:space="preserve">Meunier, J. 2024. The biology and social life of earwigs (dermaptera). Annu Rev Entomol 69:259–276.</w:t>
-      </w:r>
-    </w:p>
-    <w:bookmarkEnd w:id="53"/>
-    <w:bookmarkStart w:id="54" w:name="ref-nelson2004"/>
-    <w:p>
-      <w:pPr>
-        <w:pStyle w:val="Bibliography"/>
-      </w:pPr>
-      <w:r>
-        <w:t xml:space="preserve">Nelson, N. J., M. B. Thompson, S. Pledger, S. N. Keall, and C. H. Daugherty. 2004. Egg mass determines hatchling size, and incubation temperature influences post‐hatching growth, of tuatara sphenodon punctatus. J Zool 263:77–87.</w:t>
-      </w:r>
-    </w:p>
-    <w:bookmarkEnd w:id="54"/>
-    <w:bookmarkStart w:id="55" w:name="ref-nilsson1993"/>
-    <w:p>
-      <w:pPr>
-        <w:pStyle w:val="Bibliography"/>
-      </w:pPr>
-      <w:r>
-        <w:t xml:space="preserve">Nilsson, J. ‐Å., and E. Svensson. 1993. Causes and consequences of egg mass variation between and within blue tit clutches. J Zool 230:469–481.</w:t>
-      </w:r>
-    </w:p>
-    <w:bookmarkEnd w:id="55"/>
-    <w:bookmarkStart w:id="56" w:name="ref-parker1982"/>
-    <w:p>
-      <w:pPr>
-        <w:pStyle w:val="Bibliography"/>
-      </w:pPr>
-      <w:r>
-        <w:t xml:space="preserve">Parker, G. A. 1982. Why are there so many tiny sperm? Sperm competition and the maintenance of two sexes. J Theor Biol 96:281–294.</w:t>
-      </w:r>
-    </w:p>
-    <w:bookmarkEnd w:id="56"/>
-    <w:bookmarkStart w:id="57" w:name="ref-peig2009"/>
-    <w:p>
-      <w:pPr>
-        <w:pStyle w:val="Bibliography"/>
-      </w:pPr>
-      <w:r>
-        <w:t xml:space="preserve">Peig, J., and A. J. Green. 2009. New perspectives for estimating body condition from mass/length data: The scaled mass index as an alternative method. Oikos 118:1883–1891.</w:t>
-      </w:r>
-    </w:p>
-    <w:bookmarkEnd w:id="57"/>
-    <w:bookmarkStart w:id="58" w:name="ref-peig2010"/>
-    <w:p>
-      <w:pPr>
-        <w:pStyle w:val="Bibliography"/>
-      </w:pPr>
-      <w:r>
-        <w:t xml:space="preserve">Peig, J., and A. J. Green. 2010. The paradigm of body condition: A critical reappraisal of current methods based on mass and length. Funct Ecol 24:1323–1332.</w:t>
-      </w:r>
-    </w:p>
-    <w:bookmarkEnd w:id="58"/>
-    <w:bookmarkStart w:id="59" w:name="ref-r2013"/>
-    <w:p>
-      <w:pPr>
-        <w:pStyle w:val="Bibliography"/>
-      </w:pPr>
-      <w:r>
-        <w:t xml:space="preserve">R Core Team. 2025.</w:t>
-      </w:r>
-      <w:r>
-        <w:t xml:space="preserve"> </w:t>
-      </w:r>
-      <w:r>
-        <w:t xml:space="preserve">R</w:t>
-      </w:r>
-      <w:r>
-        <w:t xml:space="preserve">:</w:t>
-      </w:r>
-      <w:r>
-        <w:t xml:space="preserve"> </w:t>
-      </w:r>
-      <w:r>
-        <w:t xml:space="preserve">A</w:t>
-      </w:r>
-      <w:r>
-        <w:t xml:space="preserve"> </w:t>
-      </w:r>
-      <w:r>
-        <w:t xml:space="preserve">language and environment for statistical computing. Vienna, Austria.</w:t>
-      </w:r>
-    </w:p>
-    <w:bookmarkEnd w:id="59"/>
-    <w:bookmarkStart w:id="60" w:name="ref-reznick2000"/>
-    <w:p>
-      <w:pPr>
-        <w:pStyle w:val="Bibliography"/>
-      </w:pPr>
-      <w:r>
-        <w:t xml:space="preserve">Reznick, D., L. Nunney, and A. Tessier. 2000. Big houses, big cars, superfleas and the costs of reproduction. Trends Ecol Evol 15:421–425.</w:t>
-      </w:r>
-    </w:p>
-    <w:bookmarkEnd w:id="60"/>
-    <w:bookmarkStart w:id="61" w:name="ref-roff1992a"/>
-    <w:p>
-      <w:pPr>
-        <w:pStyle w:val="Bibliography"/>
-      </w:pPr>
-      <w:r>
-        <w:t xml:space="preserve">Roff, D. 1992.</w:t>
-      </w:r>
-      <w:r>
-        <w:t xml:space="preserve"> </w:t>
-      </w:r>
-      <w:r>
-        <w:t xml:space="preserve">Evolution of Life Histories: Theory and Analysis</w:t>
-      </w:r>
-      <w:r>
-        <w:t xml:space="preserve">. Chapman &amp; Hall, Inc., New York, NY.</w:t>
-      </w:r>
-    </w:p>
-    <w:bookmarkEnd w:id="61"/>
-    <w:bookmarkStart w:id="62" w:name="ref-schindelin2012"/>
-    <w:p>
-      <w:pPr>
-        <w:pStyle w:val="Bibliography"/>
-      </w:pPr>
-      <w:r>
-        <w:t xml:space="preserve">Schindelin, J., I. Arganda-Carreras, E. Frise, V. Kaynig, M. Longair, T. Pietzsch, S. Preibisch, C. Rueden, S. Saalfeld, B. Schmid, J.-Y. Tinevez, D. J. White, V. Hartenstein, K. Eliceiri, P. Tomancak, and A. Cardona. 2012. Fiji: An open-source platform for biological-image analysis. Nat Methods 9:676–682. Max Planck Institute of Molecular Cell Biology; Genetics, Dresden, Germany.</w:t>
-      </w:r>
-    </w:p>
-    <w:bookmarkEnd w:id="62"/>
-    <w:bookmarkStart w:id="63" w:name="ref-seko2006"/>
-    <w:p>
-      <w:pPr>
-        <w:pStyle w:val="Bibliography"/>
-      </w:pPr>
-      <w:r>
-        <w:t xml:space="preserve">Seko, T., T. Miyatake, S. Fujioka, and F. Nakasuji. 2006. Genetic and environmental sources of egg size, fecundity and body size in the migrant skipper, parnara guttata guttata (lepidoptera: hesperiidae). Popul Ecol 48:225–232.</w:t>
-      </w:r>
-    </w:p>
-    <w:bookmarkEnd w:id="63"/>
-    <w:bookmarkStart w:id="64" w:name="ref-shine1978"/>
-    <w:p>
-      <w:pPr>
-        <w:pStyle w:val="Bibliography"/>
-      </w:pPr>
-      <w:r>
-        <w:t xml:space="preserve">Shine, R. 1978. Propagule size and parental care: The</w:t>
-      </w:r>
-      <w:r>
-        <w:t xml:space="preserve"> </w:t>
-      </w:r>
-      <w:r>
-        <w:t xml:space="preserve">“safe harbor”</w:t>
-      </w:r>
-      <w:r>
-        <w:t xml:space="preserve"> </w:t>
-      </w:r>
-      <w:r>
-        <w:t xml:space="preserve">hypothesis. J Theor Biol 75:417–424.</w:t>
-      </w:r>
-    </w:p>
-    <w:bookmarkEnd w:id="64"/>
-    <w:bookmarkStart w:id="65" w:name="ref-simpson1951"/>
-    <w:p>
-      <w:pPr>
-        <w:pStyle w:val="Bibliography"/>
-      </w:pPr>
-      <w:r>
-        <w:t xml:space="preserve">Simpson, E. H. 1951. The interpretation of interaction in contingency tables. Journal of the Royal Statistical Society: Series B (Methodological) 13:238–241.</w:t>
-      </w:r>
-    </w:p>
-    <w:bookmarkEnd w:id="65"/>
-    <w:bookmarkStart w:id="66" w:name="ref-slagsvold1984"/>
-    <w:p>
-      <w:pPr>
-        <w:pStyle w:val="Bibliography"/>
-      </w:pPr>
-      <w:r>
-        <w:t xml:space="preserve">Slagsvold, T., J. Sandvik, G. Rofstad, Ö. Lorentsen, and M. Husby. 1984. On the adaptive value of intraclutch egg-size variation in birds. The Auk 101:685–697.</w:t>
-      </w:r>
-    </w:p>
-    <w:bookmarkEnd w:id="66"/>
-    <w:bookmarkStart w:id="67" w:name="ref-smith1974"/>
-    <w:p>
-      <w:pPr>
-        <w:pStyle w:val="Bibliography"/>
-      </w:pPr>
-      <w:r>
         <w:t xml:space="preserve">Smith, C. C., and S. D. Fretwell. 1974. The optimal balance between size and number of offspring. Am Nat 108:499–506.</w:t>
       </w:r>
     </w:p>
-    <w:bookmarkEnd w:id="67"/>
-    <w:bookmarkStart w:id="68" w:name="ref-staerkle2008"/>
+    <w:bookmarkEnd w:id="71"/>
+    <w:bookmarkStart w:id="72" w:name="ref-staerkle2008"/>
     <w:p>
       <w:pPr>
         <w:pStyle w:val="Bibliography"/>
@@ -2180,8 +4427,8 @@
         <w:t xml:space="preserve">). Ethology 114:844–850.</w:t>
       </w:r>
     </w:p>
-    <w:bookmarkEnd w:id="68"/>
-    <w:bookmarkStart w:id="69" w:name="ref-stearns1992"/>
+    <w:bookmarkEnd w:id="72"/>
+    <w:bookmarkStart w:id="73" w:name="ref-stearns1992"/>
     <w:p>
       <w:pPr>
         <w:pStyle w:val="Bibliography"/>
@@ -2199,8 +4446,8 @@
         <w:t xml:space="preserve">. Oxford University Press.</w:t>
       </w:r>
     </w:p>
-    <w:bookmarkEnd w:id="69"/>
-    <w:bookmarkStart w:id="70" w:name="ref-stoffel2017"/>
+    <w:bookmarkEnd w:id="73"/>
+    <w:bookmarkStart w:id="74" w:name="ref-stoffel2017"/>
     <w:p>
       <w:pPr>
         <w:pStyle w:val="Bibliography"/>
@@ -2215,8 +4462,8 @@
         <w:t xml:space="preserve">: Repeatability estimation and variance decomposition by generalized linear mixed‐effects models. Methods Ecol Evol 8:1639–1644.</w:t>
       </w:r>
     </w:p>
-    <w:bookmarkEnd w:id="70"/>
-    <w:bookmarkStart w:id="71" w:name="ref-torres-vila2012"/>
+    <w:bookmarkEnd w:id="74"/>
+    <w:bookmarkStart w:id="75" w:name="ref-torres-vila2012"/>
     <w:p>
       <w:pPr>
         <w:pStyle w:val="Bibliography"/>
@@ -2241,8 +4488,8 @@
         <w:t xml:space="preserve">L. Cauterruccio, ed. Moths: Types, ecological significance and control methods. Nova Science Publishers, New York, NY.</w:t>
       </w:r>
     </w:p>
-    <w:bookmarkEnd w:id="71"/>
-    <w:bookmarkStart w:id="72" w:name="ref-tourneur2018"/>
+    <w:bookmarkEnd w:id="75"/>
+    <w:bookmarkStart w:id="76" w:name="ref-tourneur2018"/>
     <w:p>
       <w:pPr>
         <w:pStyle w:val="Bibliography"/>
@@ -2267,8 +4514,8 @@
         <w:t xml:space="preserve">(dermaptera: Forficulidae) in three climatologically different zones of north america. The Canadian Entomologist 150:511–519.</w:t>
       </w:r>
     </w:p>
-    <w:bookmarkEnd w:id="72"/>
-    <w:bookmarkStart w:id="73" w:name="ref-tourneur1992"/>
+    <w:bookmarkEnd w:id="76"/>
+    <w:bookmarkStart w:id="77" w:name="ref-tourneur1992"/>
     <w:p>
       <w:pPr>
         <w:pStyle w:val="Bibliography"/>
@@ -2338,8 +4585,8 @@
         <w:t xml:space="preserve">orficulidae). The Canadian Entomologist 124:1055–1061.</w:t>
       </w:r>
     </w:p>
-    <w:bookmarkEnd w:id="73"/>
-    <w:bookmarkStart w:id="74" w:name="ref-vannoordwijk1986"/>
+    <w:bookmarkEnd w:id="77"/>
+    <w:bookmarkStart w:id="78" w:name="ref-vannoordwijk1986"/>
     <w:p>
       <w:pPr>
         <w:pStyle w:val="Bibliography"/>
@@ -2348,76 +4595,48 @@
         <w:t xml:space="preserve">Van Noordwijk, A. J., and G. de Jong. 1986. Acquisition and allocation of resources: Their influence on variation in life history tactics. Am Nat 128:137–142.</w:t>
       </w:r>
     </w:p>
-    <w:bookmarkEnd w:id="74"/>
-    <w:bookmarkStart w:id="75" w:name="ref-vehtari2017"/>
+    <w:bookmarkEnd w:id="78"/>
+    <w:bookmarkStart w:id="79" w:name="ref-williams1994"/>
     <w:p>
       <w:pPr>
         <w:pStyle w:val="Bibliography"/>
       </w:pPr>
       <w:r>
-        <w:t xml:space="preserve">Vehtari, A., A. Gelman, and J. Gabry. 2017. Practical</w:t>
-      </w:r>
-      <w:r>
-        <w:t xml:space="preserve"> </w:t>
-      </w:r>
-      <w:r>
-        <w:t xml:space="preserve">B</w:t>
-      </w:r>
-      <w:r>
-        <w:t xml:space="preserve">ayesian model evaluation using leave-one-out cross-validation and</w:t>
-      </w:r>
-      <w:r>
-        <w:t xml:space="preserve"> </w:t>
-      </w:r>
-      <w:r>
-        <w:t xml:space="preserve">WAIC</w:t>
-      </w:r>
-      <w:r>
-        <w:t xml:space="preserve">. Statistics and Computing 27:1413–1432.</w:t>
-      </w:r>
-    </w:p>
-    <w:bookmarkEnd w:id="75"/>
-    <w:bookmarkStart w:id="76" w:name="ref-williams1994"/>
+        <w:t xml:space="preserve">Williams, T. D. 1994. Intraspecific variation in egg size and egg composition in birds: Effects on offspring fitness. Biol Rev Camb Philos Soc 69:35–59.</w:t>
+      </w:r>
+    </w:p>
+    <w:bookmarkEnd w:id="79"/>
+    <w:bookmarkStart w:id="80" w:name="ref-winkler1987"/>
     <w:p>
       <w:pPr>
         <w:pStyle w:val="Bibliography"/>
       </w:pPr>
       <w:r>
-        <w:t xml:space="preserve">Williams, T. D. 1994. Intraspecific variation in egg size and egg composition in birds: Effects on offspring fitness. Biol Rev Camb Philos Soc 69:35–59.</w:t>
-      </w:r>
-    </w:p>
-    <w:bookmarkEnd w:id="76"/>
-    <w:bookmarkStart w:id="77" w:name="ref-winkler1987"/>
+        <w:t xml:space="preserve">Winkler, D. W., and K. Wallin. 1987. Offspring size and number: A life history model linking effort per offspring and total effort. Am Nat 129:708–720.</w:t>
+      </w:r>
+    </w:p>
+    <w:bookmarkEnd w:id="80"/>
+    <w:bookmarkStart w:id="81" w:name="ref-yanagi2006"/>
     <w:p>
       <w:pPr>
         <w:pStyle w:val="Bibliography"/>
       </w:pPr>
       <w:r>
-        <w:t xml:space="preserve">Winkler, D. W., and K. Wallin. 1987. Offspring size and number: A life history model linking effort per offspring and total effort. Am Nat 129:708–720.</w:t>
-      </w:r>
-    </w:p>
-    <w:bookmarkEnd w:id="77"/>
-    <w:bookmarkStart w:id="78" w:name="ref-yanagi2006"/>
+        <w:t xml:space="preserve">Yanagi, S., T. Oikawa, and T. Miyatake. 2006. Heritability and genetic correlation estimates for egg size and number in callosobruchus chinensis (coleoptera: bruchidae). Ann Entomol Soc Am 99:364–368.</w:t>
+      </w:r>
+    </w:p>
+    <w:bookmarkEnd w:id="81"/>
+    <w:bookmarkStart w:id="82" w:name="ref-yosef2008"/>
     <w:p>
       <w:pPr>
         <w:pStyle w:val="Bibliography"/>
       </w:pPr>
       <w:r>
-        <w:t xml:space="preserve">Yanagi, S., T. Oikawa, and T. Miyatake. 2006. Heritability and genetic correlation estimates for egg size and number in callosobruchus chinensis (coleoptera: bruchidae). Ann Entomol Soc Am 99:364–368.</w:t>
-      </w:r>
-    </w:p>
-    <w:bookmarkEnd w:id="78"/>
-    <w:bookmarkStart w:id="79" w:name="ref-yosef2008"/>
-    <w:p>
-      <w:pPr>
-        <w:pStyle w:val="Bibliography"/>
-      </w:pPr>
-      <w:r>
         <w:t xml:space="preserve">Yosef, R., and P. Zduniak. 2008. Variation in clutch size, egg size variability and reproductive output in the desert finch (rhodospiza obsoleta). J Arid Environ 72:1631–1635.</w:t>
       </w:r>
     </w:p>
-    <w:bookmarkEnd w:id="79"/>
-    <w:bookmarkEnd w:id="80"/>
+    <w:bookmarkEnd w:id="82"/>
+    <w:bookmarkEnd w:id="83"/>
     <w:p>
       <w:pPr>
         <w:pStyle w:val="BodyText"/>
@@ -2447,7 +4666,7 @@
       <w:tr>
         <w:tc>
           <w:tcPr/>
-          <w:bookmarkStart w:id="84" w:name="fig-one"/>
+          <w:bookmarkStart w:id="87" w:name="fig-one"/>
           <w:p>
             <w:pPr>
               <w:pStyle w:val="Compact"/>
@@ -2458,18 +4677,18 @@
                 <wp:inline>
                   <wp:extent cx="3810000" cy="2540000"/>
                   <wp:effectExtent b="0" l="0" r="0" t="0"/>
-                  <wp:docPr descr="" title="" id="82" name="Picture"/>
+                  <wp:docPr descr="" title="" id="85" name="Picture"/>
                   <a:graphic>
                     <a:graphicData uri="http://schemas.openxmlformats.org/drawingml/2006/picture">
                       <pic:pic>
                         <pic:nvPicPr>
-                          <pic:cNvPr descr="figure_1.jpg" id="83" name="Picture"/>
+                          <pic:cNvPr descr="figure_1.jpg" id="86" name="Picture"/>
                           <pic:cNvPicPr>
                             <a:picLocks noChangeArrowheads="1" noChangeAspect="1"/>
                           </pic:cNvPicPr>
                         </pic:nvPicPr>
                         <pic:blipFill>
-                          <a:blip r:embed="rId81"/>
+                          <a:blip r:embed="rId84"/>
                           <a:stretch>
                             <a:fillRect/>
                           </a:stretch>
@@ -2519,7 +4738,7 @@
               <w:t xml:space="preserve">). Data are raw values.</w:t>
             </w:r>
           </w:p>
-          <w:bookmarkEnd w:id="84"/>
+          <w:bookmarkEnd w:id="87"/>
         </w:tc>
       </w:tr>
     </w:tbl>
@@ -2544,7 +4763,7 @@
       <w:tr>
         <w:tc>
           <w:tcPr/>
-          <w:bookmarkStart w:id="88" w:name="fig-two"/>
+          <w:bookmarkStart w:id="91" w:name="fig-two"/>
           <w:p>
             <w:pPr>
               <w:pStyle w:val="Compact"/>
@@ -2555,18 +4774,18 @@
                 <wp:inline>
                   <wp:extent cx="3810000" cy="2540000"/>
                   <wp:effectExtent b="0" l="0" r="0" t="0"/>
-                  <wp:docPr descr="" title="" id="86" name="Picture"/>
+                  <wp:docPr descr="" title="" id="89" name="Picture"/>
                   <a:graphic>
                     <a:graphicData uri="http://schemas.openxmlformats.org/drawingml/2006/picture">
                       <pic:pic>
                         <pic:nvPicPr>
-                          <pic:cNvPr descr="figure_2.jpg" id="87" name="Picture"/>
+                          <pic:cNvPr descr="figure_2.jpg" id="90" name="Picture"/>
                           <pic:cNvPicPr>
                             <a:picLocks noChangeArrowheads="1" noChangeAspect="1"/>
                           </pic:cNvPicPr>
                         </pic:nvPicPr>
                         <pic:blipFill>
-                          <a:blip r:embed="rId85"/>
+                          <a:blip r:embed="rId88"/>
                           <a:stretch>
                             <a:fillRect/>
                           </a:stretch>
@@ -2616,11 +4835,11 @@
               <w:t xml:space="preserve">).</w:t>
             </w:r>
           </w:p>
-          <w:bookmarkEnd w:id="88"/>
+          <w:bookmarkEnd w:id="91"/>
         </w:tc>
       </w:tr>
     </w:tbl>
-    <w:bookmarkEnd w:id="89"/>
+    <w:bookmarkEnd w:id="92"/>
     <w:sectPr>
       <w:headerReference r:id="rId10" w:type="even"/>
       <w:headerReference r:id="rId9" w:type="default"/>
@@ -3387,6 +5606,176 @@
       </w:pPr>
     </w:lvl>
   </w:abstractNum>
+  <w:abstractNum w:abstractNumId="99411">
+    <w:nsid w:val="00A99411"/>
+    <w:multiLevelType w:val="multilevel"/>
+    <w:lvl w:ilvl="0">
+      <w:start w:val="1"/>
+      <w:numFmt w:val="decimal"/>
+      <w:lvlText w:val="%1."/>
+      <w:lvlJc w:val="left"/>
+      <w:pPr>
+        <w:ind w:left="720" w:hanging="360"/>
+      </w:pPr>
+    </w:lvl>
+    <w:lvl w:ilvl="1">
+      <w:start w:val="1"/>
+      <w:numFmt w:val="decimal"/>
+      <w:lvlText w:val="%2."/>
+      <w:lvlJc w:val="left"/>
+      <w:pPr>
+        <w:ind w:left="1440" w:hanging="360"/>
+      </w:pPr>
+    </w:lvl>
+    <w:lvl w:ilvl="2">
+      <w:start w:val="1"/>
+      <w:numFmt w:val="decimal"/>
+      <w:lvlText w:val="%3."/>
+      <w:lvlJc w:val="left"/>
+      <w:pPr>
+        <w:ind w:left="2160" w:hanging="360"/>
+      </w:pPr>
+    </w:lvl>
+    <w:lvl w:ilvl="3">
+      <w:start w:val="1"/>
+      <w:numFmt w:val="decimal"/>
+      <w:lvlText w:val="%4."/>
+      <w:lvlJc w:val="left"/>
+      <w:pPr>
+        <w:ind w:left="2880" w:hanging="360"/>
+      </w:pPr>
+    </w:lvl>
+    <w:lvl w:ilvl="4">
+      <w:start w:val="1"/>
+      <w:numFmt w:val="decimal"/>
+      <w:lvlText w:val="%5."/>
+      <w:lvlJc w:val="left"/>
+      <w:pPr>
+        <w:ind w:left="3600" w:hanging="360"/>
+      </w:pPr>
+    </w:lvl>
+    <w:lvl w:ilvl="5">
+      <w:start w:val="1"/>
+      <w:numFmt w:val="decimal"/>
+      <w:lvlText w:val="%6."/>
+      <w:lvlJc w:val="left"/>
+      <w:pPr>
+        <w:ind w:left="4320" w:hanging="360"/>
+      </w:pPr>
+    </w:lvl>
+    <w:lvl w:ilvl="6">
+      <w:start w:val="1"/>
+      <w:numFmt w:val="decimal"/>
+      <w:lvlText w:val="%7."/>
+      <w:lvlJc w:val="left"/>
+      <w:pPr>
+        <w:ind w:left="5040" w:hanging="360"/>
+      </w:pPr>
+    </w:lvl>
+    <w:lvl w:ilvl="7">
+      <w:start w:val="1"/>
+      <w:numFmt w:val="decimal"/>
+      <w:lvlText w:val="%8."/>
+      <w:lvlJc w:val="left"/>
+      <w:pPr>
+        <w:ind w:left="5760" w:hanging="360"/>
+      </w:pPr>
+    </w:lvl>
+    <w:lvl w:ilvl="8">
+      <w:start w:val="1"/>
+      <w:numFmt w:val="decimal"/>
+      <w:lvlText w:val="%9."/>
+      <w:lvlJc w:val="left"/>
+      <w:pPr>
+        <w:ind w:left="6480" w:hanging="360"/>
+      </w:pPr>
+    </w:lvl>
+  </w:abstractNum>
+  <w:abstractNum w:abstractNumId="99412">
+    <w:nsid w:val="00A99412"/>
+    <w:multiLevelType w:val="multilevel"/>
+    <w:lvl w:ilvl="0">
+      <w:start w:val="2"/>
+      <w:numFmt w:val="decimal"/>
+      <w:lvlText w:val="%1."/>
+      <w:lvlJc w:val="left"/>
+      <w:pPr>
+        <w:ind w:left="720" w:hanging="360"/>
+      </w:pPr>
+    </w:lvl>
+    <w:lvl w:ilvl="1">
+      <w:start w:val="2"/>
+      <w:numFmt w:val="decimal"/>
+      <w:lvlText w:val="%2."/>
+      <w:lvlJc w:val="left"/>
+      <w:pPr>
+        <w:ind w:left="1440" w:hanging="360"/>
+      </w:pPr>
+    </w:lvl>
+    <w:lvl w:ilvl="2">
+      <w:start w:val="2"/>
+      <w:numFmt w:val="decimal"/>
+      <w:lvlText w:val="%3."/>
+      <w:lvlJc w:val="left"/>
+      <w:pPr>
+        <w:ind w:left="2160" w:hanging="360"/>
+      </w:pPr>
+    </w:lvl>
+    <w:lvl w:ilvl="3">
+      <w:start w:val="2"/>
+      <w:numFmt w:val="decimal"/>
+      <w:lvlText w:val="%4."/>
+      <w:lvlJc w:val="left"/>
+      <w:pPr>
+        <w:ind w:left="2880" w:hanging="360"/>
+      </w:pPr>
+    </w:lvl>
+    <w:lvl w:ilvl="4">
+      <w:start w:val="2"/>
+      <w:numFmt w:val="decimal"/>
+      <w:lvlText w:val="%5."/>
+      <w:lvlJc w:val="left"/>
+      <w:pPr>
+        <w:ind w:left="3600" w:hanging="360"/>
+      </w:pPr>
+    </w:lvl>
+    <w:lvl w:ilvl="5">
+      <w:start w:val="2"/>
+      <w:numFmt w:val="decimal"/>
+      <w:lvlText w:val="%6."/>
+      <w:lvlJc w:val="left"/>
+      <w:pPr>
+        <w:ind w:left="4320" w:hanging="360"/>
+      </w:pPr>
+    </w:lvl>
+    <w:lvl w:ilvl="6">
+      <w:start w:val="2"/>
+      <w:numFmt w:val="decimal"/>
+      <w:lvlText w:val="%7."/>
+      <w:lvlJc w:val="left"/>
+      <w:pPr>
+        <w:ind w:left="5040" w:hanging="360"/>
+      </w:pPr>
+    </w:lvl>
+    <w:lvl w:ilvl="7">
+      <w:start w:val="2"/>
+      <w:numFmt w:val="decimal"/>
+      <w:lvlText w:val="%8."/>
+      <w:lvlJc w:val="left"/>
+      <w:pPr>
+        <w:ind w:left="5760" w:hanging="360"/>
+      </w:pPr>
+    </w:lvl>
+    <w:lvl w:ilvl="8">
+      <w:start w:val="2"/>
+      <w:numFmt w:val="decimal"/>
+      <w:lvlText w:val="%9."/>
+      <w:lvlJc w:val="left"/>
+      <w:pPr>
+        <w:ind w:left="6480" w:hanging="360"/>
+      </w:pPr>
+    </w:lvl>
+  </w:abstractNum>
   <w:num w16cid:durableId="1845054215" w:numId="1">
     <w:abstractNumId w:val="10"/>
   </w:num>
@@ -3428,6 +5817,66 @@
   </w:num>
   <w:num w:numId="1000">
     <w:abstractNumId w:val="990"/>
+  </w:num>
+  <w:num w:numId="1001">
+    <w:abstractNumId w:val="99411"/>
+    <w:lvlOverride w:ilvl="0">
+      <w:startOverride w:val="1"/>
+    </w:lvlOverride>
+    <w:lvlOverride w:ilvl="1">
+      <w:startOverride w:val="1"/>
+    </w:lvlOverride>
+    <w:lvlOverride w:ilvl="2">
+      <w:startOverride w:val="1"/>
+    </w:lvlOverride>
+    <w:lvlOverride w:ilvl="3">
+      <w:startOverride w:val="1"/>
+    </w:lvlOverride>
+    <w:lvlOverride w:ilvl="4">
+      <w:startOverride w:val="1"/>
+    </w:lvlOverride>
+    <w:lvlOverride w:ilvl="5">
+      <w:startOverride w:val="1"/>
+    </w:lvlOverride>
+    <w:lvlOverride w:ilvl="6">
+      <w:startOverride w:val="1"/>
+    </w:lvlOverride>
+    <w:lvlOverride w:ilvl="7">
+      <w:startOverride w:val="1"/>
+    </w:lvlOverride>
+    <w:lvlOverride w:ilvl="8">
+      <w:startOverride w:val="1"/>
+    </w:lvlOverride>
+  </w:num>
+  <w:num w:numId="1002">
+    <w:abstractNumId w:val="99412"/>
+    <w:lvlOverride w:ilvl="0">
+      <w:startOverride w:val="2"/>
+    </w:lvlOverride>
+    <w:lvlOverride w:ilvl="1">
+      <w:startOverride w:val="2"/>
+    </w:lvlOverride>
+    <w:lvlOverride w:ilvl="2">
+      <w:startOverride w:val="2"/>
+    </w:lvlOverride>
+    <w:lvlOverride w:ilvl="3">
+      <w:startOverride w:val="2"/>
+    </w:lvlOverride>
+    <w:lvlOverride w:ilvl="4">
+      <w:startOverride w:val="2"/>
+    </w:lvlOverride>
+    <w:lvlOverride w:ilvl="5">
+      <w:startOverride w:val="2"/>
+    </w:lvlOverride>
+    <w:lvlOverride w:ilvl="6">
+      <w:startOverride w:val="2"/>
+    </w:lvlOverride>
+    <w:lvlOverride w:ilvl="7">
+      <w:startOverride w:val="2"/>
+    </w:lvlOverride>
+    <w:lvlOverride w:ilvl="8">
+      <w:startOverride w:val="2"/>
+    </w:lvlOverride>
   </w:num>
 </w:numbering>
 </file>

</xml_diff>

<commit_message>
Methods and Results are done.
</commit_message>
<xml_diff>
--- a/2025_earwig_fecundity_revised/Backup of 2025_earwig_fecundity_revised.docx
+++ b/2025_earwig_fecundity_revised/Backup of 2025_earwig_fecundity_revised.docx
@@ -169,7 +169,7 @@
         <w:t xml:space="preserve"> </w:t>
       </w:r>
       <w:r>
-        <w:t xml:space="preserve">explained that whether we observe positive or negative correlations between fitness-related traits (e.g., egg number or egg size) depends on whether some individuals in a population can acquire more resources than others and thus possess a larger resource pool that can be partitioned to competing traits. Consequently, such variation in acquisition can lead to a positive correlation between traits (e.g., egg number vs. egg size) when measured across individuals within a population, while masking allocation trade-offs within individuals</w:t>
+        <w:t xml:space="preserve">explained that whether I observe positive or negative correlations between fitness-related traits (e.g., egg number or egg size) depends on whether some individuals in a population can acquire more resources than others and thus possess a larger resource pool that can be partitioned to competing traits. Consequently, such variation in acquisition can lead to a positive correlation between traits (e.g., egg number vs. egg size) when measured across individuals within a population, while masking allocation trade-offs within individuals</w:t>
       </w:r>
       <w:r>
         <w:t xml:space="preserve"> </w:t>
@@ -303,7 +303,7 @@
       </w:r>
     </w:p>
     <w:bookmarkEnd w:id="22"/>
-    <w:bookmarkStart w:id="32" w:name="methods"/>
+    <w:bookmarkStart w:id="24" w:name="methods"/>
     <w:p>
       <w:pPr>
         <w:pStyle w:val="Heading1"/>
@@ -348,7 +348,7 @@
         <w:t xml:space="preserve">to measure the length of the female pronotum and the perimeter of each egg to the nearest 0.001 mm. Both traits were measured three times, with each measurement separated by 4 days.</w:t>
       </w:r>
     </w:p>
-    <w:bookmarkStart w:id="31" w:name="statistical-analysis"/>
+    <w:bookmarkStart w:id="23" w:name="statistical-analysis"/>
     <w:p>
       <w:pPr>
         <w:pStyle w:val="Heading3"/>
@@ -445,39 +445,15 @@
         <w:t xml:space="preserve"> </w:t>
       </w:r>
       <w:r>
-        <w:t xml:space="preserve">[95% CI] = 0.93 [0.926, 0.937] ), I calculated each egg’s average perimeter and then used these values to calculate the mean egg size for each clutch for each female. I reduced the two measurements representing body size (pronotum length and body mass) to a single value (PC1) by performing a principal components analysis (PCA) on the correlation matrix of standardized measurements using the</w:t>
-      </w:r>
-      <w:r>
-        <w:t xml:space="preserve"> </w:t>
-      </w:r>
-      <w:r>
-        <w:rPr>
-          <w:i/>
-          <w:iCs/>
-        </w:rPr>
-        <w:t xml:space="preserve">prcomp</w:t>
-      </w:r>
-      <w:r>
-        <w:t xml:space="preserve"> </w:t>
-      </w:r>
-      <w:r>
-        <w:t xml:space="preserve">function in the R</w:t>
-      </w:r>
-      <w:r>
-        <w:t xml:space="preserve"> </w:t>
-      </w:r>
-      <w:r>
-        <w:rPr>
-          <w:i/>
-          <w:iCs/>
-        </w:rPr>
-        <w:t xml:space="preserve">stats</w:t>
-      </w:r>
-      <w:r>
-        <w:t xml:space="preserve"> </w:t>
-      </w:r>
-      <w:r>
-        <w:t xml:space="preserve">package</w:t>
+        <w:t xml:space="preserve">[95% CI] = 0.93 [0.926, 0.937] ), I calculated each egg’s average perimeter and then used these values to calculate the mean egg size for each clutch for each female.</w:t>
+      </w:r>
+    </w:p>
+    <w:p>
+      <w:pPr>
+        <w:pStyle w:val="BodyText"/>
+      </w:pPr>
+      <w:r>
+        <w:t xml:space="preserve">To reduce the two correlated measures of body size (pronotum length and body mass) to a single structural size metric, I performed a principal components analysis (PCA) on the correlation matrix of standardized variables using the prcomp function in the R stats package</w:t>
       </w:r>
       <w:r>
         <w:t xml:space="preserve"> </w:t>
@@ -486,7 +462,7 @@
         <w:t xml:space="preserve">(R Core Team 2025)</w:t>
       </w:r>
       <w:r>
-        <w:t xml:space="preserve">. The first PC accounted for 60.8% of the variation. I also standardised female body mass relative to structural body size (i.e. pronotum length) using the scaled mass index procedure of Peig and Green</w:t>
+        <w:t xml:space="preserve">. The first principal component (PC1) explained 60.8% of the total variance and was used as an index of structural body size. In addition, female body condition was estimated using the scaled mass index (SMI) following Peig and Green</w:t>
       </w:r>
       <w:r>
         <w:t xml:space="preserve"> </w:t>
@@ -495,7 +471,7 @@
         <w:t xml:space="preserve">(2009, 2010; see also Kelly et al. 2014)</w:t>
       </w:r>
       <w:r>
-        <w:t xml:space="preserve">.</w:t>
+        <w:t xml:space="preserve">, which standardizes body mass relative to structural size (pronotum length).</w:t>
       </w:r>
     </w:p>
     <w:p>
@@ -503,7 +479,7 @@
         <w:pStyle w:val="BodyText"/>
       </w:pPr>
       <w:r>
-        <w:t xml:space="preserve">The following analyses were conducted in a Bayesian framework using the</w:t>
+        <w:t xml:space="preserve">All subsequent analyses were conducted in a Bayesian framework using the</w:t>
       </w:r>
       <w:r>
         <w:t xml:space="preserve"> </w:t>
@@ -531,2587 +507,7 @@
         <w:t xml:space="preserve"> </w:t>
       </w:r>
       <w:r>
-        <w:t xml:space="preserve">in R.</w:t>
-      </w:r>
-    </w:p>
-    <w:p>
-      <w:pPr>
-        <w:pStyle w:val="BodyText"/>
-      </w:pPr>
-      <w:r>
-        <w:t xml:space="preserve">I tested whether egg number and egg size changed across successive clutches by fitting a multivariate Bayesian mixed-effects model including clutch order (first vs. second clutch) as a fixed effect for both traits. Egg size was modelled using a Gaussian distribution with an identity link, whereas egg number was modelled using a Poisson distribution with a log link.</w:t>
-      </w:r>
-    </w:p>
-    <w:p>
-      <w:pPr>
-        <w:pStyle w:val="BodyText"/>
-      </w:pPr>
-      <w:r>
-        <w:t xml:space="preserve">For female</w:t>
-      </w:r>
-      <w:r>
-        <w:t xml:space="preserve"> </w:t>
-      </w:r>
-      <m:oMath>
-        <m:r>
-          <m:t>i</m:t>
-        </m:r>
-      </m:oMath>
-      <w:r>
-        <w:t xml:space="preserve"> </w:t>
-      </w:r>
-      <w:r>
-        <w:t xml:space="preserve">and clutch</w:t>
-      </w:r>
-      <w:r>
-        <w:t xml:space="preserve"> </w:t>
-      </w:r>
-      <m:oMath>
-        <m:r>
-          <m:t>j</m:t>
-        </m:r>
-      </m:oMath>
-      <w:r>
-        <w:t xml:space="preserve">, mean egg size and egg number were modelled jointly as:</w:t>
-      </w:r>
-    </w:p>
-    <w:p>
-      <w:pPr>
-        <w:pStyle w:val="BodyText"/>
-      </w:pPr>
-      <w:bookmarkStart w:id="23" w:name="eq-clutchorder"/>
-      <m:oMathPara>
-        <m:oMathParaPr>
-          <m:jc m:val="center"/>
-        </m:oMathParaPr>
-        <m:oMath>
-          <m:m>
-            <m:mPr>
-              <m:baseJc m:val="center"/>
-              <m:plcHide m:val="on"/>
-              <m:mcs>
-                <m:mc>
-                  <m:mcPr>
-                    <m:mcJc m:val="right"/>
-                    <m:count m:val="1"/>
-                  </m:mcPr>
-                </m:mc>
-                <m:mc>
-                  <m:mcPr>
-                    <m:mcJc m:val="left"/>
-                    <m:count m:val="1"/>
-                  </m:mcPr>
-                </m:mc>
-              </m:mcs>
-            </m:mPr>
-            <m:mr>
-              <m:e>
-                <m:sSub>
-                  <m:e>
-                    <m:r>
-                      <m:rPr>
-                        <m:nor/>
-                        <m:sty m:val="p"/>
-                      </m:rPr>
-                      <m:t>MeanEggSize</m:t>
-                    </m:r>
-                  </m:e>
-                  <m:sub>
-                    <m:r>
-                      <m:t>i</m:t>
-                    </m:r>
-                    <m:r>
-                      <m:t>j</m:t>
-                    </m:r>
-                  </m:sub>
-                </m:sSub>
-              </m:e>
-              <m:e>
-                <m:r>
-                  <m:rPr>
-                    <m:sty m:val="p"/>
-                  </m:rPr>
-                  <m:t>∼</m:t>
-                </m:r>
-                <m:r>
-                  <m:rPr>
-                    <m:sty m:val="p"/>
-                    <m:scr m:val="script"/>
-                  </m:rPr>
-                  <m:t>N</m:t>
-                </m:r>
-                <m:d>
-                  <m:dPr>
-                    <m:begChr m:val="("/>
-                    <m:sepChr m:val=""/>
-                    <m:endChr m:val=")"/>
-                    <m:grow/>
-                  </m:dPr>
-                  <m:e>
-                    <m:sSub>
-                      <m:e>
-                        <m:r>
-                          <m:t>μ</m:t>
-                        </m:r>
-                      </m:e>
-                      <m:sub>
-                        <m:r>
-                          <m:t>1</m:t>
-                        </m:r>
-                        <m:r>
-                          <m:rPr>
-                            <m:sty m:val="p"/>
-                          </m:rPr>
-                          <m:t>,</m:t>
-                        </m:r>
-                        <m:r>
-                          <m:t>i</m:t>
-                        </m:r>
-                        <m:r>
-                          <m:t>j</m:t>
-                        </m:r>
-                      </m:sub>
-                    </m:sSub>
-                    <m:r>
-                      <m:rPr>
-                        <m:sty m:val="p"/>
-                      </m:rPr>
-                      <m:t>,</m:t>
-                    </m:r>
-                    <m:sSubSup>
-                      <m:e>
-                        <m:r>
-                          <m:t>σ</m:t>
-                        </m:r>
-                      </m:e>
-                      <m:sub>
-                        <m:r>
-                          <m:t>1</m:t>
-                        </m:r>
-                      </m:sub>
-                      <m:sup>
-                        <m:r>
-                          <m:t>2</m:t>
-                        </m:r>
-                      </m:sup>
-                    </m:sSubSup>
-                  </m:e>
-                </m:d>
-              </m:e>
-            </m:mr>
-            <m:mr>
-              <m:e>
-                <m:sSub>
-                  <m:e>
-                    <m:r>
-                      <m:t>μ</m:t>
-                    </m:r>
-                  </m:e>
-                  <m:sub>
-                    <m:r>
-                      <m:t>1</m:t>
-                    </m:r>
-                    <m:r>
-                      <m:rPr>
-                        <m:sty m:val="p"/>
-                      </m:rPr>
-                      <m:t>,</m:t>
-                    </m:r>
-                    <m:r>
-                      <m:t>i</m:t>
-                    </m:r>
-                    <m:r>
-                      <m:t>j</m:t>
-                    </m:r>
-                  </m:sub>
-                </m:sSub>
-              </m:e>
-              <m:e>
-                <m:r>
-                  <m:rPr>
-                    <m:sty m:val="p"/>
-                  </m:rPr>
-                  <m:t>=</m:t>
-                </m:r>
-                <m:sSub>
-                  <m:e>
-                    <m:r>
-                      <m:t>β</m:t>
-                    </m:r>
-                  </m:e>
-                  <m:sub>
-                    <m:r>
-                      <m:t>1</m:t>
-                    </m:r>
-                    <m:r>
-                      <m:rPr>
-                        <m:sty m:val="p"/>
-                      </m:rPr>
-                      <m:t>,</m:t>
-                    </m:r>
-                    <m:r>
-                      <m:t>0</m:t>
-                    </m:r>
-                  </m:sub>
-                </m:sSub>
-                <m:r>
-                  <m:rPr>
-                    <m:sty m:val="p"/>
-                  </m:rPr>
-                  <m:t>+</m:t>
-                </m:r>
-                <m:sSub>
-                  <m:e>
-                    <m:r>
-                      <m:t>β</m:t>
-                    </m:r>
-                  </m:e>
-                  <m:sub>
-                    <m:r>
-                      <m:t>1</m:t>
-                    </m:r>
-                    <m:r>
-                      <m:rPr>
-                        <m:sty m:val="p"/>
-                      </m:rPr>
-                      <m:t>,</m:t>
-                    </m:r>
-                    <m:r>
-                      <m:rPr>
-                        <m:nor/>
-                        <m:sty m:val="p"/>
-                      </m:rPr>
-                      <m:t>brood</m:t>
-                    </m:r>
-                  </m:sub>
-                </m:sSub>
-                <m:r>
-                  <m:t> </m:t>
-                </m:r>
-                <m:sSub>
-                  <m:e>
-                    <m:r>
-                      <m:rPr>
-                        <m:nor/>
-                        <m:sty m:val="p"/>
-                      </m:rPr>
-                      <m:t>Brood</m:t>
-                    </m:r>
-                  </m:e>
-                  <m:sub>
-                    <m:r>
-                      <m:t>i</m:t>
-                    </m:r>
-                    <m:r>
-                      <m:t>j</m:t>
-                    </m:r>
-                  </m:sub>
-                </m:sSub>
-                <m:r>
-                  <m:rPr>
-                    <m:sty m:val="p"/>
-                  </m:rPr>
-                  <m:t>+</m:t>
-                </m:r>
-                <m:sSub>
-                  <m:e>
-                    <m:r>
-                      <m:t>b</m:t>
-                    </m:r>
-                  </m:e>
-                  <m:sub>
-                    <m:r>
-                      <m:t>1</m:t>
-                    </m:r>
-                    <m:r>
-                      <m:rPr>
-                        <m:sty m:val="p"/>
-                      </m:rPr>
-                      <m:t>,</m:t>
-                    </m:r>
-                    <m:r>
-                      <m:t>i</m:t>
-                    </m:r>
-                  </m:sub>
-                </m:sSub>
-              </m:e>
-            </m:mr>
-            <m:mr>
-              <m:e/>
-            </m:mr>
-            <m:mr>
-              <m:e>
-                <m:sSub>
-                  <m:e>
-                    <m:r>
-                      <m:rPr>
-                        <m:nor/>
-                        <m:sty m:val="p"/>
-                      </m:rPr>
-                      <m:t>EggNumber</m:t>
-                    </m:r>
-                  </m:e>
-                  <m:sub>
-                    <m:r>
-                      <m:t>i</m:t>
-                    </m:r>
-                    <m:r>
-                      <m:t>j</m:t>
-                    </m:r>
-                  </m:sub>
-                </m:sSub>
-              </m:e>
-              <m:e>
-                <m:r>
-                  <m:rPr>
-                    <m:sty m:val="p"/>
-                  </m:rPr>
-                  <m:t>∼</m:t>
-                </m:r>
-                <m:r>
-                  <m:rPr>
-                    <m:nor/>
-                    <m:sty m:val="p"/>
-                  </m:rPr>
-                  <m:t>Poisson</m:t>
-                </m:r>
-                <m:d>
-                  <m:dPr>
-                    <m:begChr m:val="("/>
-                    <m:sepChr m:val=""/>
-                    <m:endChr m:val=")"/>
-                    <m:grow/>
-                  </m:dPr>
-                  <m:e>
-                    <m:sSub>
-                      <m:e>
-                        <m:r>
-                          <m:t>λ</m:t>
-                        </m:r>
-                      </m:e>
-                      <m:sub>
-                        <m:r>
-                          <m:t>i</m:t>
-                        </m:r>
-                        <m:r>
-                          <m:t>j</m:t>
-                        </m:r>
-                      </m:sub>
-                    </m:sSub>
-                  </m:e>
-                </m:d>
-              </m:e>
-            </m:mr>
-            <m:mr>
-              <m:e>
-                <m:r>
-                  <m:rPr>
-                    <m:sty m:val="p"/>
-                  </m:rPr>
-                  <m:t>log</m:t>
-                </m:r>
-                <m:d>
-                  <m:dPr>
-                    <m:begChr m:val="("/>
-                    <m:sepChr m:val=""/>
-                    <m:endChr m:val=")"/>
-                    <m:grow/>
-                  </m:dPr>
-                  <m:e>
-                    <m:sSub>
-                      <m:e>
-                        <m:r>
-                          <m:t>λ</m:t>
-                        </m:r>
-                      </m:e>
-                      <m:sub>
-                        <m:r>
-                          <m:t>i</m:t>
-                        </m:r>
-                        <m:r>
-                          <m:t>j</m:t>
-                        </m:r>
-                      </m:sub>
-                    </m:sSub>
-                  </m:e>
-                </m:d>
-              </m:e>
-              <m:e>
-                <m:r>
-                  <m:rPr>
-                    <m:sty m:val="p"/>
-                  </m:rPr>
-                  <m:t>=</m:t>
-                </m:r>
-                <m:sSub>
-                  <m:e>
-                    <m:r>
-                      <m:t>β</m:t>
-                    </m:r>
-                  </m:e>
-                  <m:sub>
-                    <m:r>
-                      <m:t>2</m:t>
-                    </m:r>
-                    <m:r>
-                      <m:rPr>
-                        <m:sty m:val="p"/>
-                      </m:rPr>
-                      <m:t>,</m:t>
-                    </m:r>
-                    <m:r>
-                      <m:t>0</m:t>
-                    </m:r>
-                  </m:sub>
-                </m:sSub>
-                <m:r>
-                  <m:rPr>
-                    <m:sty m:val="p"/>
-                  </m:rPr>
-                  <m:t>+</m:t>
-                </m:r>
-                <m:sSub>
-                  <m:e>
-                    <m:r>
-                      <m:t>β</m:t>
-                    </m:r>
-                  </m:e>
-                  <m:sub>
-                    <m:r>
-                      <m:t>2</m:t>
-                    </m:r>
-                    <m:r>
-                      <m:rPr>
-                        <m:sty m:val="p"/>
-                      </m:rPr>
-                      <m:t>,</m:t>
-                    </m:r>
-                    <m:r>
-                      <m:rPr>
-                        <m:nor/>
-                        <m:sty m:val="p"/>
-                      </m:rPr>
-                      <m:t>brood</m:t>
-                    </m:r>
-                  </m:sub>
-                </m:sSub>
-                <m:r>
-                  <m:t> </m:t>
-                </m:r>
-                <m:sSub>
-                  <m:e>
-                    <m:r>
-                      <m:rPr>
-                        <m:nor/>
-                        <m:sty m:val="p"/>
-                      </m:rPr>
-                      <m:t>Brood</m:t>
-                    </m:r>
-                  </m:e>
-                  <m:sub>
-                    <m:r>
-                      <m:t>i</m:t>
-                    </m:r>
-                    <m:r>
-                      <m:t>j</m:t>
-                    </m:r>
-                  </m:sub>
-                </m:sSub>
-                <m:r>
-                  <m:rPr>
-                    <m:sty m:val="p"/>
-                  </m:rPr>
-                  <m:t>+</m:t>
-                </m:r>
-                <m:sSub>
-                  <m:e>
-                    <m:r>
-                      <m:t>b</m:t>
-                    </m:r>
-                  </m:e>
-                  <m:sub>
-                    <m:r>
-                      <m:t>2</m:t>
-                    </m:r>
-                    <m:r>
-                      <m:rPr>
-                        <m:sty m:val="p"/>
-                      </m:rPr>
-                      <m:t>,</m:t>
-                    </m:r>
-                    <m:r>
-                      <m:t>i</m:t>
-                    </m:r>
-                  </m:sub>
-                </m:sSub>
-              </m:e>
-            </m:mr>
-            <m:mr>
-              <m:e/>
-            </m:mr>
-            <m:mr>
-              <m:e>
-                <m:d>
-                  <m:dPr>
-                    <m:begChr m:val="("/>
-                    <m:sepChr m:val=""/>
-                    <m:endChr m:val=")"/>
-                    <m:grow/>
-                  </m:dPr>
-                  <m:e>
-                    <m:m>
-                      <m:mPr>
-                        <m:baseJc m:val="center"/>
-                        <m:plcHide m:val="on"/>
-                        <m:mcs>
-                          <m:mc>
-                            <m:mcPr>
-                              <m:mcJc m:val="center"/>
-                              <m:count m:val="1"/>
-                            </m:mcPr>
-                          </m:mc>
-                        </m:mcs>
-                      </m:mPr>
-                      <m:mr>
-                        <m:e>
-                          <m:sSub>
-                            <m:e>
-                              <m:r>
-                                <m:t>b</m:t>
-                              </m:r>
-                            </m:e>
-                            <m:sub>
-                              <m:r>
-                                <m:t>1</m:t>
-                              </m:r>
-                              <m:r>
-                                <m:rPr>
-                                  <m:sty m:val="p"/>
-                                </m:rPr>
-                                <m:t>,</m:t>
-                              </m:r>
-                              <m:r>
-                                <m:t>i</m:t>
-                              </m:r>
-                            </m:sub>
-                          </m:sSub>
-                        </m:e>
-                      </m:mr>
-                      <m:mr>
-                        <m:e>
-                          <m:sSub>
-                            <m:e>
-                              <m:r>
-                                <m:t>b</m:t>
-                              </m:r>
-                            </m:e>
-                            <m:sub>
-                              <m:r>
-                                <m:t>2</m:t>
-                              </m:r>
-                              <m:r>
-                                <m:rPr>
-                                  <m:sty m:val="p"/>
-                                </m:rPr>
-                                <m:t>,</m:t>
-                              </m:r>
-                              <m:r>
-                                <m:t>i</m:t>
-                              </m:r>
-                            </m:sub>
-                          </m:sSub>
-                        </m:e>
-                      </m:mr>
-                    </m:m>
-                  </m:e>
-                </m:d>
-              </m:e>
-              <m:e>
-                <m:r>
-                  <m:rPr>
-                    <m:sty m:val="p"/>
-                  </m:rPr>
-                  <m:t>∼</m:t>
-                </m:r>
-                <m:r>
-                  <m:rPr>
-                    <m:sty m:val="p"/>
-                    <m:scr m:val="script"/>
-                  </m:rPr>
-                  <m:t>N</m:t>
-                </m:r>
-                <m:d>
-                  <m:dPr>
-                    <m:begChr m:val="("/>
-                    <m:sepChr m:val=""/>
-                    <m:endChr m:val=")"/>
-                    <m:grow/>
-                  </m:dPr>
-                  <m:e>
-                    <m:d>
-                      <m:dPr>
-                        <m:begChr m:val="("/>
-                        <m:sepChr m:val=""/>
-                        <m:endChr m:val=")"/>
-                        <m:grow/>
-                      </m:dPr>
-                      <m:e>
-                        <m:m>
-                          <m:mPr>
-                            <m:baseJc m:val="center"/>
-                            <m:plcHide m:val="on"/>
-                            <m:mcs>
-                              <m:mc>
-                                <m:mcPr>
-                                  <m:mcJc m:val="center"/>
-                                  <m:count m:val="1"/>
-                                </m:mcPr>
-                              </m:mc>
-                            </m:mcs>
-                          </m:mPr>
-                          <m:mr>
-                            <m:e>
-                              <m:r>
-                                <m:t>0</m:t>
-                              </m:r>
-                            </m:e>
-                          </m:mr>
-                          <m:mr>
-                            <m:e>
-                              <m:r>
-                                <m:t>0</m:t>
-                              </m:r>
-                            </m:e>
-                          </m:mr>
-                        </m:m>
-                      </m:e>
-                    </m:d>
-                    <m:r>
-                      <m:rPr>
-                        <m:sty m:val="p"/>
-                      </m:rPr>
-                      <m:t>,</m:t>
-                    </m:r>
-                    <m:sSub>
-                      <m:e>
-                        <m:r>
-                          <m:t>Σ</m:t>
-                        </m:r>
-                      </m:e>
-                      <m:sub>
-                        <m:r>
-                          <m:t>b</m:t>
-                        </m:r>
-                      </m:sub>
-                    </m:sSub>
-                  </m:e>
-                </m:d>
-              </m:e>
-            </m:mr>
-          </m:m>
-          <m:r>
-            <m:t>  </m:t>
-          </m:r>
-          <m:d>
-            <m:dPr>
-              <m:begChr m:val="("/>
-              <m:sepChr m:val=""/>
-              <m:endChr m:val=")"/>
-              <m:grow/>
-            </m:dPr>
-            <m:e>
-              <m:r>
-                <m:t>1</m:t>
-              </m:r>
-            </m:e>
-          </m:d>
-        </m:oMath>
-      </m:oMathPara>
-      <w:bookmarkEnd w:id="23"/>
-    </w:p>
-    <w:p>
-      <w:pPr>
-        <w:pStyle w:val="FirstParagraph"/>
-      </w:pPr>
-      <w:r>
-        <w:t xml:space="preserve">where</w:t>
-      </w:r>
-      <w:r>
-        <w:t xml:space="preserve"> </w:t>
-      </w:r>
-      <m:oMath>
-        <m:sSub>
-          <m:e>
-            <m:r>
-              <m:t>b</m:t>
-            </m:r>
-          </m:e>
-          <m:sub>
-            <m:r>
-              <m:t>1</m:t>
-            </m:r>
-            <m:r>
-              <m:rPr>
-                <m:sty m:val="p"/>
-              </m:rPr>
-              <m:t>,</m:t>
-            </m:r>
-            <m:r>
-              <m:t>i</m:t>
-            </m:r>
-          </m:sub>
-        </m:sSub>
-      </m:oMath>
-      <w:r>
-        <w:t xml:space="preserve"> </w:t>
-      </w:r>
-      <w:r>
-        <w:t xml:space="preserve">and</w:t>
-      </w:r>
-      <w:r>
-        <w:t xml:space="preserve"> </w:t>
-      </w:r>
-      <m:oMath>
-        <m:sSub>
-          <m:e>
-            <m:r>
-              <m:t>b</m:t>
-            </m:r>
-          </m:e>
-          <m:sub>
-            <m:r>
-              <m:t>2</m:t>
-            </m:r>
-            <m:r>
-              <m:rPr>
-                <m:sty m:val="p"/>
-              </m:rPr>
-              <m:t>,</m:t>
-            </m:r>
-            <m:r>
-              <m:t>i</m:t>
-            </m:r>
-          </m:sub>
-        </m:sSub>
-      </m:oMath>
-      <w:r>
-        <w:t xml:space="preserve"> </w:t>
-      </w:r>
-      <w:r>
-        <w:t xml:space="preserve">are female-specific random intercepts and</w:t>
-      </w:r>
-      <w:r>
-        <w:t xml:space="preserve"> </w:t>
-      </w:r>
-      <m:oMath>
-        <m:sSub>
-          <m:e>
-            <m:r>
-              <m:t>Σ</m:t>
-            </m:r>
-          </m:e>
-          <m:sub>
-            <m:r>
-              <m:t>b</m:t>
-            </m:r>
-          </m:sub>
-        </m:sSub>
-      </m:oMath>
-      <w:r>
-        <w:t xml:space="preserve"> </w:t>
-      </w:r>
-      <w:r>
-        <w:t xml:space="preserve">is the female-level variance–covariance matrix. Residual correlations between traits were not estimated (</w:t>
-      </w:r>
-      <w:r>
-        <w:rPr>
-          <w:rStyle w:val="VerbatimChar"/>
-        </w:rPr>
-        <w:t xml:space="preserve">set_rescor(FALSE)</w:t>
-      </w:r>
-      <w:r>
-        <w:t xml:space="preserve">). Female identity was included as a random effect for both traits to account for repeated measures. This model tested whether egg traits systematically differed between first and second clutches while accounting for among-female variation.</w:t>
-      </w:r>
-    </w:p>
-    <w:p>
-      <w:pPr>
-        <w:pStyle w:val="BodyText"/>
-      </w:pPr>
-      <w:r>
-        <w:t xml:space="preserve">I first calculated the raw phenotypic association between egg number and egg size across all observations using Pearson’s correlation coefficient (</w:t>
-      </w:r>
-      <w:r>
-        <w:rPr>
-          <w:i/>
-          <w:iCs/>
-        </w:rPr>
-        <w:t xml:space="preserve">r</w:t>
-      </w:r>
-      <w:r>
-        <w:t xml:space="preserve">). This estimate reflects the overall linear association between traits without accounting for repeated measures or hierarchical structure. To quantify among-female covariation, I calculated the Pearson correlation between female mean egg number and female mean egg size. Female means were calculated across broods. This approach isolates between-female covariance independent of within-female variation. To formally partition covariance into among-female and residual components, I fitted a multivariate mixed-effects model in which both traits were modelled as Gaussian responses with female identity included as a random intercept, and residual correlations were estimated (</w:t>
-      </w:r>
-      <w:r>
-        <w:rPr>
-          <w:rStyle w:val="VerbatimChar"/>
-        </w:rPr>
-        <w:t xml:space="preserve">set_rescor(TRUE)</w:t>
-      </w:r>
-      <w:r>
-        <w:t xml:space="preserve">).</w:t>
-      </w:r>
-    </w:p>
-    <w:p>
-      <w:pPr>
-        <w:pStyle w:val="BodyText"/>
-      </w:pPr>
-      <w:r>
-        <w:t xml:space="preserve">I modelled egg size and egg number jointly as:</w:t>
-      </w:r>
-    </w:p>
-    <w:p>
-      <w:pPr>
-        <w:pStyle w:val="BodyText"/>
-      </w:pPr>
-      <w:bookmarkStart w:id="24" w:name="eq-residual"/>
-      <m:oMathPara>
-        <m:oMathParaPr>
-          <m:jc m:val="center"/>
-        </m:oMathParaPr>
-        <m:oMath>
-          <m:m>
-            <m:mPr>
-              <m:baseJc m:val="center"/>
-              <m:plcHide m:val="on"/>
-              <m:mcs>
-                <m:mc>
-                  <m:mcPr>
-                    <m:mcJc m:val="right"/>
-                    <m:count m:val="1"/>
-                  </m:mcPr>
-                </m:mc>
-                <m:mc>
-                  <m:mcPr>
-                    <m:mcJc m:val="left"/>
-                    <m:count m:val="1"/>
-                  </m:mcPr>
-                </m:mc>
-              </m:mcs>
-            </m:mPr>
-            <m:mr>
-              <m:e>
-                <m:sSub>
-                  <m:e>
-                    <m:r>
-                      <m:rPr>
-                        <m:nor/>
-                        <m:sty m:val="p"/>
-                      </m:rPr>
-                      <m:t>mean_egg_size</m:t>
-                    </m:r>
-                  </m:e>
-                  <m:sub>
-                    <m:r>
-                      <m:t>i</m:t>
-                    </m:r>
-                    <m:r>
-                      <m:t>j</m:t>
-                    </m:r>
-                  </m:sub>
-                </m:sSub>
-              </m:e>
-              <m:e>
-                <m:r>
-                  <m:rPr>
-                    <m:sty m:val="p"/>
-                  </m:rPr>
-                  <m:t>=</m:t>
-                </m:r>
-                <m:sSub>
-                  <m:e>
-                    <m:r>
-                      <m:t>α</m:t>
-                    </m:r>
-                  </m:e>
-                  <m:sub>
-                    <m:r>
-                      <m:rPr>
-                        <m:nor/>
-                        <m:sty m:val="p"/>
-                      </m:rPr>
-                      <m:t>size</m:t>
-                    </m:r>
-                  </m:sub>
-                </m:sSub>
-                <m:r>
-                  <m:rPr>
-                    <m:sty m:val="p"/>
-                  </m:rPr>
-                  <m:t>+</m:t>
-                </m:r>
-                <m:sSub>
-                  <m:e>
-                    <m:r>
-                      <m:t>u</m:t>
-                    </m:r>
-                  </m:e>
-                  <m:sub>
-                    <m:r>
-                      <m:rPr>
-                        <m:nor/>
-                        <m:sty m:val="p"/>
-                      </m:rPr>
-                      <m:t>size</m:t>
-                    </m:r>
-                    <m:r>
-                      <m:rPr>
-                        <m:sty m:val="p"/>
-                      </m:rPr>
-                      <m:t>,</m:t>
-                    </m:r>
-                    <m:r>
-                      <m:t>i</m:t>
-                    </m:r>
-                  </m:sub>
-                </m:sSub>
-                <m:r>
-                  <m:rPr>
-                    <m:sty m:val="p"/>
-                  </m:rPr>
-                  <m:t>+</m:t>
-                </m:r>
-                <m:sSub>
-                  <m:e>
-                    <m:r>
-                      <m:t>ε</m:t>
-                    </m:r>
-                  </m:e>
-                  <m:sub>
-                    <m:r>
-                      <m:rPr>
-                        <m:nor/>
-                        <m:sty m:val="p"/>
-                      </m:rPr>
-                      <m:t>size</m:t>
-                    </m:r>
-                    <m:r>
-                      <m:rPr>
-                        <m:sty m:val="p"/>
-                      </m:rPr>
-                      <m:t>,</m:t>
-                    </m:r>
-                    <m:r>
-                      <m:t>i</m:t>
-                    </m:r>
-                    <m:r>
-                      <m:t>j</m:t>
-                    </m:r>
-                  </m:sub>
-                </m:sSub>
-              </m:e>
-            </m:mr>
-            <m:mr>
-              <m:e>
-                <m:sSub>
-                  <m:e>
-                    <m:r>
-                      <m:rPr>
-                        <m:nor/>
-                        <m:sty m:val="p"/>
-                      </m:rPr>
-                      <m:t>egg_number</m:t>
-                    </m:r>
-                  </m:e>
-                  <m:sub>
-                    <m:r>
-                      <m:t>i</m:t>
-                    </m:r>
-                    <m:r>
-                      <m:t>j</m:t>
-                    </m:r>
-                  </m:sub>
-                </m:sSub>
-              </m:e>
-              <m:e>
-                <m:r>
-                  <m:rPr>
-                    <m:sty m:val="p"/>
-                  </m:rPr>
-                  <m:t>=</m:t>
-                </m:r>
-                <m:sSub>
-                  <m:e>
-                    <m:r>
-                      <m:t>α</m:t>
-                    </m:r>
-                  </m:e>
-                  <m:sub>
-                    <m:r>
-                      <m:rPr>
-                        <m:nor/>
-                        <m:sty m:val="p"/>
-                      </m:rPr>
-                      <m:t>number</m:t>
-                    </m:r>
-                  </m:sub>
-                </m:sSub>
-                <m:r>
-                  <m:rPr>
-                    <m:sty m:val="p"/>
-                  </m:rPr>
-                  <m:t>+</m:t>
-                </m:r>
-                <m:sSub>
-                  <m:e>
-                    <m:r>
-                      <m:t>u</m:t>
-                    </m:r>
-                  </m:e>
-                  <m:sub>
-                    <m:r>
-                      <m:rPr>
-                        <m:nor/>
-                        <m:sty m:val="p"/>
-                      </m:rPr>
-                      <m:t>number</m:t>
-                    </m:r>
-                    <m:r>
-                      <m:rPr>
-                        <m:sty m:val="p"/>
-                      </m:rPr>
-                      <m:t>,</m:t>
-                    </m:r>
-                    <m:r>
-                      <m:t>i</m:t>
-                    </m:r>
-                  </m:sub>
-                </m:sSub>
-                <m:r>
-                  <m:rPr>
-                    <m:sty m:val="p"/>
-                  </m:rPr>
-                  <m:t>+</m:t>
-                </m:r>
-                <m:sSub>
-                  <m:e>
-                    <m:r>
-                      <m:t>ε</m:t>
-                    </m:r>
-                  </m:e>
-                  <m:sub>
-                    <m:r>
-                      <m:rPr>
-                        <m:nor/>
-                        <m:sty m:val="p"/>
-                      </m:rPr>
-                      <m:t>number</m:t>
-                    </m:r>
-                    <m:r>
-                      <m:rPr>
-                        <m:sty m:val="p"/>
-                      </m:rPr>
-                      <m:t>,</m:t>
-                    </m:r>
-                    <m:r>
-                      <m:t>i</m:t>
-                    </m:r>
-                    <m:r>
-                      <m:t>j</m:t>
-                    </m:r>
-                  </m:sub>
-                </m:sSub>
-              </m:e>
-            </m:mr>
-          </m:m>
-          <m:r>
-            <m:t>  </m:t>
-          </m:r>
-          <m:d>
-            <m:dPr>
-              <m:begChr m:val="("/>
-              <m:sepChr m:val=""/>
-              <m:endChr m:val=")"/>
-              <m:grow/>
-            </m:dPr>
-            <m:e>
-              <m:r>
-                <m:t>2</m:t>
-              </m:r>
-            </m:e>
-          </m:d>
-        </m:oMath>
-      </m:oMathPara>
-      <w:bookmarkEnd w:id="24"/>
-    </w:p>
-    <w:p>
-      <w:pPr>
-        <w:pStyle w:val="FirstParagraph"/>
-      </w:pPr>
-      <w:r>
-        <w:t xml:space="preserve">where</w:t>
-      </w:r>
-      <w:r>
-        <w:t xml:space="preserve"> </w:t>
-      </w:r>
-      <m:oMath>
-        <m:sSub>
-          <m:e>
-            <m:r>
-              <m:t>u</m:t>
-            </m:r>
-          </m:e>
-          <m:sub>
-            <m:r>
-              <m:t>i</m:t>
-            </m:r>
-          </m:sub>
-        </m:sSub>
-      </m:oMath>
-      <w:r>
-        <w:t xml:space="preserve"> </w:t>
-      </w:r>
-      <w:r>
-        <w:t xml:space="preserve">represents female-specific random intercepts (with an estimated correlation between traits), and</w:t>
-      </w:r>
-      <w:r>
-        <w:t xml:space="preserve"> </w:t>
-      </w:r>
-      <m:oMath>
-        <m:sSub>
-          <m:e>
-            <m:r>
-              <m:t>ε</m:t>
-            </m:r>
-          </m:e>
-          <m:sub>
-            <m:r>
-              <m:t>i</m:t>
-            </m:r>
-            <m:r>
-              <m:t>j</m:t>
-            </m:r>
-          </m:sub>
-        </m:sSub>
-      </m:oMath>
-      <w:r>
-        <w:t xml:space="preserve"> </w:t>
-      </w:r>
-      <w:r>
-        <w:t xml:space="preserve">represents residual errors (with an estimated residual correlation).</w:t>
-      </w:r>
-    </w:p>
-    <w:p>
-      <w:pPr>
-        <w:pStyle w:val="BodyText"/>
-      </w:pPr>
-      <w:r>
-        <w:t xml:space="preserve">In addition to calculating correlations between egg number and size at multiple levels, I also explicitly separated within- and between-female effects of egg number on egg size following van de Pol &amp; Wright</w:t>
-      </w:r>
-      <w:r>
-        <w:t xml:space="preserve"> </w:t>
-      </w:r>
-      <w:r>
-        <w:t xml:space="preserve">(</w:t>
-      </w:r>
-      <w:r>
-        <w:rPr>
-          <w:b/>
-          <w:bCs/>
-        </w:rPr>
-        <w:t xml:space="preserve">vandepol2009?</w:t>
-      </w:r>
-      <w:r>
-        <w:t xml:space="preserve">)</w:t>
-      </w:r>
-      <w:r>
-        <w:t xml:space="preserve"> </w:t>
-      </w:r>
-      <w:r>
-        <w:t xml:space="preserve">by decomposing egg number as:</w:t>
-      </w:r>
-    </w:p>
-    <w:p>
-      <w:pPr>
-        <w:pStyle w:val="Compact"/>
-        <w:numPr>
-          <w:ilvl w:val="0"/>
-          <w:numId w:val="1001"/>
-        </w:numPr>
-      </w:pPr>
-      <w:r>
-        <w:t xml:space="preserve">Within-female deviation</w:t>
-      </w:r>
-    </w:p>
-    <w:p>
-      <w:pPr>
-        <w:pStyle w:val="FirstParagraph"/>
-      </w:pPr>
-      <w:bookmarkStart w:id="25" w:name="eq-within"/>
-      <m:oMathPara>
-        <m:oMathParaPr>
-          <m:jc m:val="center"/>
-        </m:oMathParaPr>
-        <m:oMath>
-          <m:sSub>
-            <m:e>
-              <m:r>
-                <m:rPr>
-                  <m:nor/>
-                  <m:sty m:val="p"/>
-                </m:rPr>
-                <m:t>EggNumber</m:t>
-              </m:r>
-            </m:e>
-            <m:sub>
-              <m:r>
-                <m:rPr>
-                  <m:nor/>
-                  <m:sty m:val="p"/>
-                </m:rPr>
-                <m:t>within</m:t>
-              </m:r>
-              <m:r>
-                <m:rPr>
-                  <m:sty m:val="p"/>
-                </m:rPr>
-                <m:t>,</m:t>
-              </m:r>
-              <m:r>
-                <m:t>i</m:t>
-              </m:r>
-              <m:r>
-                <m:t>j</m:t>
-              </m:r>
-            </m:sub>
-          </m:sSub>
-          <m:r>
-            <m:rPr>
-              <m:sty m:val="p"/>
-            </m:rPr>
-            <m:t>=</m:t>
-          </m:r>
-          <m:sSub>
-            <m:e>
-              <m:r>
-                <m:rPr>
-                  <m:nor/>
-                  <m:sty m:val="p"/>
-                </m:rPr>
-                <m:t>EggNumber</m:t>
-              </m:r>
-            </m:e>
-            <m:sub>
-              <m:r>
-                <m:t>i</m:t>
-              </m:r>
-              <m:r>
-                <m:t>j</m:t>
-              </m:r>
-            </m:sub>
-          </m:sSub>
-          <m:r>
-            <m:rPr>
-              <m:sty m:val="p"/>
-            </m:rPr>
-            <m:t>−</m:t>
-          </m:r>
-          <m:sSub>
-            <m:e>
-              <m:acc>
-                <m:accPr>
-                  <m:chr m:val="‾"/>
-                </m:accPr>
-                <m:e>
-                  <m:r>
-                    <m:rPr>
-                      <m:nor/>
-                      <m:sty m:val="p"/>
-                    </m:rPr>
-                    <m:t>EggNumber</m:t>
-                  </m:r>
-                </m:e>
-              </m:acc>
-            </m:e>
-            <m:sub>
-              <m:r>
-                <m:t>i</m:t>
-              </m:r>
-            </m:sub>
-          </m:sSub>
-          <m:r>
-            <m:t>  </m:t>
-          </m:r>
-          <m:d>
-            <m:dPr>
-              <m:begChr m:val="("/>
-              <m:sepChr m:val=""/>
-              <m:endChr m:val=")"/>
-              <m:grow/>
-            </m:dPr>
-            <m:e>
-              <m:r>
-                <m:t>3</m:t>
-              </m:r>
-            </m:e>
-          </m:d>
-        </m:oMath>
-      </m:oMathPara>
-      <w:bookmarkEnd w:id="25"/>
-    </w:p>
-    <w:p>
-      <w:pPr>
-        <w:pStyle w:val="Compact"/>
-        <w:numPr>
-          <w:ilvl w:val="0"/>
-          <w:numId w:val="1002"/>
-        </w:numPr>
-      </w:pPr>
-      <w:r>
-        <w:t xml:space="preserve">Between-female component</w:t>
-      </w:r>
-    </w:p>
-    <w:p>
-      <w:pPr>
-        <w:pStyle w:val="FirstParagraph"/>
-      </w:pPr>
-      <w:bookmarkStart w:id="26" w:name="eq-between"/>
-      <m:oMathPara>
-        <m:oMathParaPr>
-          <m:jc m:val="center"/>
-        </m:oMathParaPr>
-        <m:oMath>
-          <m:sSub>
-            <m:e>
-              <m:r>
-                <m:rPr>
-                  <m:nor/>
-                  <m:sty m:val="p"/>
-                </m:rPr>
-                <m:t>EggNumber</m:t>
-              </m:r>
-            </m:e>
-            <m:sub>
-              <m:r>
-                <m:rPr>
-                  <m:nor/>
-                  <m:sty m:val="p"/>
-                </m:rPr>
-                <m:t>between</m:t>
-              </m:r>
-              <m:r>
-                <m:rPr>
-                  <m:sty m:val="p"/>
-                </m:rPr>
-                <m:t>,</m:t>
-              </m:r>
-              <m:r>
-                <m:t>i</m:t>
-              </m:r>
-            </m:sub>
-          </m:sSub>
-          <m:r>
-            <m:rPr>
-              <m:sty m:val="p"/>
-            </m:rPr>
-            <m:t>=</m:t>
-          </m:r>
-          <m:sSub>
-            <m:e>
-              <m:acc>
-                <m:accPr>
-                  <m:chr m:val="‾"/>
-                </m:accPr>
-                <m:e>
-                  <m:r>
-                    <m:rPr>
-                      <m:nor/>
-                      <m:sty m:val="p"/>
-                    </m:rPr>
-                    <m:t>EggNumber</m:t>
-                  </m:r>
-                </m:e>
-              </m:acc>
-            </m:e>
-            <m:sub>
-              <m:r>
-                <m:t>i</m:t>
-              </m:r>
-            </m:sub>
-          </m:sSub>
-          <m:r>
-            <m:rPr>
-              <m:sty m:val="p"/>
-            </m:rPr>
-            <m:t>−</m:t>
-          </m:r>
-          <m:acc>
-            <m:accPr>
-              <m:chr m:val="‾"/>
-            </m:accPr>
-            <m:e>
-              <m:r>
-                <m:rPr>
-                  <m:nor/>
-                  <m:sty m:val="p"/>
-                </m:rPr>
-                <m:t>EggNumber</m:t>
-              </m:r>
-            </m:e>
-          </m:acc>
-          <m:r>
-            <m:t>  </m:t>
-          </m:r>
-          <m:d>
-            <m:dPr>
-              <m:begChr m:val="("/>
-              <m:sepChr m:val=""/>
-              <m:endChr m:val=")"/>
-              <m:grow/>
-            </m:dPr>
-            <m:e>
-              <m:r>
-                <m:t>4</m:t>
-              </m:r>
-            </m:e>
-          </m:d>
-        </m:oMath>
-      </m:oMathPara>
-      <w:bookmarkEnd w:id="26"/>
-    </w:p>
-    <w:p>
-      <w:pPr>
-        <w:pStyle w:val="FirstParagraph"/>
-      </w:pPr>
-      <w:r>
-        <w:t xml:space="preserve">I then fitted the following linear mixed-effects model:</w:t>
-      </w:r>
-    </w:p>
-    <w:p>
-      <w:pPr>
-        <w:pStyle w:val="BodyText"/>
-      </w:pPr>
-      <w:bookmarkStart w:id="27" w:name="eq-withinbetween"/>
-      <m:oMathPara>
-        <m:oMathParaPr>
-          <m:jc m:val="center"/>
-        </m:oMathParaPr>
-        <m:oMath>
-          <m:sSub>
-            <m:e>
-              <m:r>
-                <m:rPr>
-                  <m:nor/>
-                  <m:sty m:val="p"/>
-                </m:rPr>
-                <m:t>MeanEggSize</m:t>
-              </m:r>
-            </m:e>
-            <m:sub>
-              <m:r>
-                <m:t>i</m:t>
-              </m:r>
-              <m:r>
-                <m:t>j</m:t>
-              </m:r>
-            </m:sub>
-          </m:sSub>
-          <m:r>
-            <m:rPr>
-              <m:sty m:val="p"/>
-            </m:rPr>
-            <m:t>=</m:t>
-          </m:r>
-          <m:sSub>
-            <m:e>
-              <m:r>
-                <m:t>β</m:t>
-              </m:r>
-            </m:e>
-            <m:sub>
-              <m:r>
-                <m:t>0</m:t>
-              </m:r>
-            </m:sub>
-          </m:sSub>
-          <m:r>
-            <m:rPr>
-              <m:sty m:val="p"/>
-            </m:rPr>
-            <m:t>+</m:t>
-          </m:r>
-          <m:sSub>
-            <m:e>
-              <m:r>
-                <m:t>β</m:t>
-              </m:r>
-            </m:e>
-            <m:sub>
-              <m:r>
-                <m:t>W</m:t>
-              </m:r>
-            </m:sub>
-          </m:sSub>
-          <m:r>
-            <m:t> </m:t>
-          </m:r>
-          <m:sSub>
-            <m:e>
-              <m:r>
-                <m:rPr>
-                  <m:nor/>
-                  <m:sty m:val="p"/>
-                </m:rPr>
-                <m:t>EggNumber</m:t>
-              </m:r>
-            </m:e>
-            <m:sub>
-              <m:r>
-                <m:rPr>
-                  <m:nor/>
-                  <m:sty m:val="p"/>
-                </m:rPr>
-                <m:t>within</m:t>
-              </m:r>
-              <m:r>
-                <m:rPr>
-                  <m:sty m:val="p"/>
-                </m:rPr>
-                <m:t>,</m:t>
-              </m:r>
-              <m:r>
-                <m:t>i</m:t>
-              </m:r>
-              <m:r>
-                <m:t>j</m:t>
-              </m:r>
-            </m:sub>
-          </m:sSub>
-          <m:r>
-            <m:rPr>
-              <m:sty m:val="p"/>
-            </m:rPr>
-            <m:t>+</m:t>
-          </m:r>
-          <m:sSub>
-            <m:e>
-              <m:r>
-                <m:t>β</m:t>
-              </m:r>
-            </m:e>
-            <m:sub>
-              <m:r>
-                <m:t>B</m:t>
-              </m:r>
-            </m:sub>
-          </m:sSub>
-          <m:r>
-            <m:t> </m:t>
-          </m:r>
-          <m:sSub>
-            <m:e>
-              <m:r>
-                <m:rPr>
-                  <m:nor/>
-                  <m:sty m:val="p"/>
-                </m:rPr>
-                <m:t>EggNumber</m:t>
-              </m:r>
-            </m:e>
-            <m:sub>
-              <m:r>
-                <m:rPr>
-                  <m:nor/>
-                  <m:sty m:val="p"/>
-                </m:rPr>
-                <m:t>between</m:t>
-              </m:r>
-              <m:r>
-                <m:rPr>
-                  <m:sty m:val="p"/>
-                </m:rPr>
-                <m:t>,</m:t>
-              </m:r>
-              <m:r>
-                <m:t>i</m:t>
-              </m:r>
-            </m:sub>
-          </m:sSub>
-          <m:r>
-            <m:rPr>
-              <m:sty m:val="p"/>
-            </m:rPr>
-            <m:t>+</m:t>
-          </m:r>
-          <m:sSub>
-            <m:e>
-              <m:r>
-                <m:t>b</m:t>
-              </m:r>
-            </m:e>
-            <m:sub>
-              <m:r>
-                <m:t>0</m:t>
-              </m:r>
-              <m:r>
-                <m:t>i</m:t>
-              </m:r>
-            </m:sub>
-          </m:sSub>
-          <m:r>
-            <m:rPr>
-              <m:sty m:val="p"/>
-            </m:rPr>
-            <m:t>+</m:t>
-          </m:r>
-          <m:sSub>
-            <m:e>
-              <m:r>
-                <m:t>ε</m:t>
-              </m:r>
-            </m:e>
-            <m:sub>
-              <m:r>
-                <m:t>i</m:t>
-              </m:r>
-              <m:r>
-                <m:t>j</m:t>
-              </m:r>
-            </m:sub>
-          </m:sSub>
-          <m:r>
-            <m:t>  </m:t>
-          </m:r>
-          <m:d>
-            <m:dPr>
-              <m:begChr m:val="("/>
-              <m:sepChr m:val=""/>
-              <m:endChr m:val=")"/>
-              <m:grow/>
-            </m:dPr>
-            <m:e>
-              <m:r>
-                <m:t>5</m:t>
-              </m:r>
-            </m:e>
-          </m:d>
-        </m:oMath>
-      </m:oMathPara>
-      <w:bookmarkEnd w:id="27"/>
-    </w:p>
-    <w:p>
-      <w:pPr>
-        <w:pStyle w:val="FirstParagraph"/>
-      </w:pPr>
-      <w:r>
-        <w:t xml:space="preserve">with</w:t>
-      </w:r>
-    </w:p>
-    <w:p>
-      <w:pPr>
-        <w:pStyle w:val="BodyText"/>
-      </w:pPr>
-      <m:oMathPara>
-        <m:oMathParaPr>
-          <m:jc m:val="center"/>
-        </m:oMathParaPr>
-        <m:oMath>
-          <m:sSub>
-            <m:e>
-              <m:r>
-                <m:t>b</m:t>
-              </m:r>
-            </m:e>
-            <m:sub>
-              <m:r>
-                <m:t>0</m:t>
-              </m:r>
-              <m:r>
-                <m:t>i</m:t>
-              </m:r>
-            </m:sub>
-          </m:sSub>
-          <m:r>
-            <m:rPr>
-              <m:sty m:val="p"/>
-            </m:rPr>
-            <m:t>∼</m:t>
-          </m:r>
-          <m:r>
-            <m:rPr>
-              <m:sty m:val="p"/>
-              <m:scr m:val="script"/>
-            </m:rPr>
-            <m:t>N</m:t>
-          </m:r>
-          <m:d>
-            <m:dPr>
-              <m:begChr m:val="("/>
-              <m:sepChr m:val=""/>
-              <m:endChr m:val=")"/>
-              <m:grow/>
-            </m:dPr>
-            <m:e>
-              <m:r>
-                <m:t>0</m:t>
-              </m:r>
-              <m:r>
-                <m:rPr>
-                  <m:sty m:val="p"/>
-                </m:rPr>
-                <m:t>,</m:t>
-              </m:r>
-              <m:sSubSup>
-                <m:e>
-                  <m:r>
-                    <m:t>σ</m:t>
-                  </m:r>
-                </m:e>
-                <m:sub>
-                  <m:r>
-                    <m:rPr>
-                      <m:nor/>
-                      <m:sty m:val="p"/>
-                    </m:rPr>
-                    <m:t>id</m:t>
-                  </m:r>
-                </m:sub>
-                <m:sup>
-                  <m:r>
-                    <m:t>2</m:t>
-                  </m:r>
-                </m:sup>
-              </m:sSubSup>
-            </m:e>
-          </m:d>
-          <m:r>
-            <m:rPr>
-              <m:sty m:val="p"/>
-            </m:rPr>
-            <m:t>,</m:t>
-          </m:r>
-          <m:r>
-            <m:t>  </m:t>
-          </m:r>
-          <m:sSub>
-            <m:e>
-              <m:r>
-                <m:t>ε</m:t>
-              </m:r>
-            </m:e>
-            <m:sub>
-              <m:r>
-                <m:t>i</m:t>
-              </m:r>
-              <m:r>
-                <m:t>j</m:t>
-              </m:r>
-            </m:sub>
-          </m:sSub>
-          <m:r>
-            <m:rPr>
-              <m:sty m:val="p"/>
-            </m:rPr>
-            <m:t>∼</m:t>
-          </m:r>
-          <m:r>
-            <m:rPr>
-              <m:sty m:val="p"/>
-              <m:scr m:val="script"/>
-            </m:rPr>
-            <m:t>N</m:t>
-          </m:r>
-          <m:d>
-            <m:dPr>
-              <m:begChr m:val="("/>
-              <m:sepChr m:val=""/>
-              <m:endChr m:val=")"/>
-              <m:grow/>
-            </m:dPr>
-            <m:e>
-              <m:r>
-                <m:t>0</m:t>
-              </m:r>
-              <m:r>
-                <m:rPr>
-                  <m:sty m:val="p"/>
-                </m:rPr>
-                <m:t>,</m:t>
-              </m:r>
-              <m:sSup>
-                <m:e>
-                  <m:r>
-                    <m:t>σ</m:t>
-                  </m:r>
-                </m:e>
-                <m:sup>
-                  <m:r>
-                    <m:t>2</m:t>
-                  </m:r>
-                </m:sup>
-              </m:sSup>
-            </m:e>
-          </m:d>
-        </m:oMath>
-      </m:oMathPara>
-    </w:p>
-    <w:p>
-      <w:pPr>
-        <w:pStyle w:val="FirstParagraph"/>
-      </w:pPr>
-      <w:r>
-        <w:t xml:space="preserve">The coefficient</w:t>
-      </w:r>
-      <w:r>
-        <w:t xml:space="preserve"> </w:t>
-      </w:r>
-      <m:oMath>
-        <m:sSub>
-          <m:e>
-            <m:r>
-              <m:t>β</m:t>
-            </m:r>
-          </m:e>
-          <m:sub>
-            <m:r>
-              <m:t>W</m:t>
-            </m:r>
-          </m:sub>
-        </m:sSub>
-      </m:oMath>
-      <w:r>
-        <w:t xml:space="preserve"> </w:t>
-      </w:r>
-      <w:r>
-        <w:t xml:space="preserve">estimates the within-female (plastic) effect of egg number on egg size, whereas</w:t>
-      </w:r>
-      <w:r>
-        <w:t xml:space="preserve"> </w:t>
-      </w:r>
-      <m:oMath>
-        <m:sSub>
-          <m:e>
-            <m:r>
-              <m:t>β</m:t>
-            </m:r>
-          </m:e>
-          <m:sub>
-            <m:r>
-              <m:t>B</m:t>
-            </m:r>
-          </m:sub>
-        </m:sSub>
-      </m:oMath>
-      <w:r>
-        <w:t xml:space="preserve"> </w:t>
-      </w:r>
-      <w:r>
-        <w:t xml:space="preserve">estimates the between-female (strategic) effect.</w:t>
-      </w:r>
-    </w:p>
-    <w:p>
-      <w:pPr>
-        <w:pStyle w:val="BodyText"/>
-      </w:pPr>
-      <w:r>
-        <w:t xml:space="preserve">To facilitate comparison of effect sizes, continuous predictors were standardized by subtracting the mean and dividing by the standard deviation:</w:t>
-      </w:r>
-    </w:p>
-    <w:p>
-      <w:pPr>
-        <w:pStyle w:val="BodyText"/>
-      </w:pPr>
-      <w:bookmarkStart w:id="28" w:name="eq-standardization"/>
-      <m:oMathPara>
-        <m:oMathParaPr>
-          <m:jc m:val="center"/>
-        </m:oMathParaPr>
-        <m:oMath>
-          <m:sSub>
-            <m:e>
-              <m:r>
-                <m:t>X</m:t>
-              </m:r>
-            </m:e>
-            <m:sub>
-              <m:r>
-                <m:rPr>
-                  <m:nor/>
-                  <m:sty m:val="p"/>
-                </m:rPr>
-                <m:t>std</m:t>
-              </m:r>
-            </m:sub>
-          </m:sSub>
-          <m:r>
-            <m:rPr>
-              <m:sty m:val="p"/>
-            </m:rPr>
-            <m:t>=</m:t>
-          </m:r>
-          <m:f>
-            <m:fPr>
-              <m:type m:val="bar"/>
-            </m:fPr>
-            <m:num>
-              <m:r>
-                <m:t>X</m:t>
-              </m:r>
-              <m:r>
-                <m:rPr>
-                  <m:sty m:val="p"/>
-                </m:rPr>
-                <m:t>−</m:t>
-              </m:r>
-              <m:acc>
-                <m:accPr>
-                  <m:chr m:val="‾"/>
-                </m:accPr>
-                <m:e>
-                  <m:r>
-                    <m:t>X</m:t>
-                  </m:r>
-                </m:e>
-              </m:acc>
-            </m:num>
-            <m:den>
-              <m:r>
-                <m:rPr>
-                  <m:sty m:val="p"/>
-                </m:rPr>
-                <m:t>S</m:t>
-              </m:r>
-              <m:r>
-                <m:rPr>
-                  <m:sty m:val="p"/>
-                </m:rPr>
-                <m:t>D</m:t>
-              </m:r>
-              <m:d>
-                <m:dPr>
-                  <m:begChr m:val="("/>
-                  <m:sepChr m:val=""/>
-                  <m:endChr m:val=")"/>
-                  <m:grow/>
-                </m:dPr>
-                <m:e>
-                  <m:r>
-                    <m:t>X</m:t>
-                  </m:r>
-                </m:e>
-              </m:d>
-            </m:den>
-          </m:f>
-          <m:r>
-            <m:t>  </m:t>
-          </m:r>
-          <m:d>
-            <m:dPr>
-              <m:begChr m:val="("/>
-              <m:sepChr m:val=""/>
-              <m:endChr m:val=")"/>
-              <m:grow/>
-            </m:dPr>
-            <m:e>
-              <m:r>
-                <m:t>6</m:t>
-              </m:r>
-            </m:e>
-          </m:d>
-        </m:oMath>
-      </m:oMathPara>
-      <w:bookmarkEnd w:id="28"/>
-    </w:p>
-    <w:p>
-      <w:pPr>
-        <w:pStyle w:val="FirstParagraph"/>
-      </w:pPr>
-      <w:r>
-        <w:t xml:space="preserve">The within-female and between-female components were standardized across their respective distributions. When estimating standardized regression coefficients, the response variable was also scaled to unit standard deviation. Standardized coefficients therefore represent the expected change (in standard deviation units) in egg size per one standard deviation change in the predictor.</w:t>
-      </w:r>
-    </w:p>
-    <w:p>
-      <w:pPr>
-        <w:pStyle w:val="BodyText"/>
-      </w:pPr>
-      <w:r>
-        <w:t xml:space="preserve">To test whether females differed in their propensity to trade off egg size against egg number, I fitted a random-slopes model allowing the within-female effect of egg number to vary among females:</w:t>
-      </w:r>
-    </w:p>
-    <w:p>
-      <w:pPr>
-        <w:pStyle w:val="BodyText"/>
-      </w:pPr>
-      <w:bookmarkStart w:id="29" w:name="eq-randomslopes"/>
-      <m:oMathPara>
-        <m:oMathParaPr>
-          <m:jc m:val="center"/>
-        </m:oMathParaPr>
-        <m:oMath>
-          <m:sSub>
-            <m:e>
-              <m:r>
-                <m:rPr>
-                  <m:nor/>
-                  <m:sty m:val="p"/>
-                </m:rPr>
-                <m:t>mean egg size</m:t>
-              </m:r>
-            </m:e>
-            <m:sub>
-              <m:r>
-                <m:t>i</m:t>
-              </m:r>
-              <m:r>
-                <m:t>j</m:t>
-              </m:r>
-            </m:sub>
-          </m:sSub>
-          <m:r>
-            <m:rPr>
-              <m:sty m:val="p"/>
-            </m:rPr>
-            <m:t>=</m:t>
-          </m:r>
-          <m:sSub>
-            <m:e>
-              <m:r>
-                <m:t>β</m:t>
-              </m:r>
-            </m:e>
-            <m:sub>
-              <m:r>
-                <m:t>0</m:t>
-              </m:r>
-            </m:sub>
-          </m:sSub>
-          <m:r>
-            <m:rPr>
-              <m:sty m:val="p"/>
-            </m:rPr>
-            <m:t>+</m:t>
-          </m:r>
-          <m:sSub>
-            <m:e>
-              <m:r>
-                <m:t>β</m:t>
-              </m:r>
-            </m:e>
-            <m:sub>
-              <m:r>
-                <m:t>W</m:t>
-              </m:r>
-            </m:sub>
-          </m:sSub>
-          <m:r>
-            <m:t> </m:t>
-          </m:r>
-          <m:sSub>
-            <m:e>
-              <m:r>
-                <m:rPr>
-                  <m:nor/>
-                  <m:sty m:val="p"/>
-                </m:rPr>
-                <m:t>egg_number</m:t>
-              </m:r>
-            </m:e>
-            <m:sub>
-              <m:r>
-                <m:rPr>
-                  <m:nor/>
-                  <m:sty m:val="p"/>
-                </m:rPr>
-                <m:t>within</m:t>
-              </m:r>
-              <m:r>
-                <m:rPr>
-                  <m:sty m:val="p"/>
-                </m:rPr>
-                <m:t>,</m:t>
-              </m:r>
-              <m:r>
-                <m:t>i</m:t>
-              </m:r>
-              <m:r>
-                <m:t>j</m:t>
-              </m:r>
-            </m:sub>
-          </m:sSub>
-          <m:r>
-            <m:rPr>
-              <m:sty m:val="p"/>
-            </m:rPr>
-            <m:t>+</m:t>
-          </m:r>
-          <m:sSub>
-            <m:e>
-              <m:r>
-                <m:t>β</m:t>
-              </m:r>
-            </m:e>
-            <m:sub>
-              <m:r>
-                <m:t>B</m:t>
-              </m:r>
-            </m:sub>
-          </m:sSub>
-          <m:r>
-            <m:t> </m:t>
-          </m:r>
-          <m:sSub>
-            <m:e>
-              <m:r>
-                <m:rPr>
-                  <m:nor/>
-                  <m:sty m:val="p"/>
-                </m:rPr>
-                <m:t>egg_number</m:t>
-              </m:r>
-            </m:e>
-            <m:sub>
-              <m:r>
-                <m:rPr>
-                  <m:nor/>
-                  <m:sty m:val="p"/>
-                </m:rPr>
-                <m:t>between</m:t>
-              </m:r>
-              <m:r>
-                <m:rPr>
-                  <m:sty m:val="p"/>
-                </m:rPr>
-                <m:t>,</m:t>
-              </m:r>
-              <m:r>
-                <m:t>i</m:t>
-              </m:r>
-            </m:sub>
-          </m:sSub>
-          <m:r>
-            <m:rPr>
-              <m:sty m:val="p"/>
-            </m:rPr>
-            <m:t>+</m:t>
-          </m:r>
-          <m:d>
-            <m:dPr>
-              <m:begChr m:val="("/>
-              <m:sepChr m:val=""/>
-              <m:endChr m:val=")"/>
-              <m:grow/>
-            </m:dPr>
-            <m:e>
-              <m:r>
-                <m:t>1</m:t>
-              </m:r>
-              <m:r>
-                <m:rPr>
-                  <m:sty m:val="p"/>
-                </m:rPr>
-                <m:t>+</m:t>
-              </m:r>
-              <m:sSub>
-                <m:e>
-                  <m:r>
-                    <m:rPr>
-                      <m:nor/>
-                      <m:sty m:val="p"/>
-                    </m:rPr>
-                    <m:t>egg_number</m:t>
-                  </m:r>
-                </m:e>
-                <m:sub>
-                  <m:r>
-                    <m:rPr>
-                      <m:nor/>
-                      <m:sty m:val="p"/>
-                    </m:rPr>
-                    <m:t>within</m:t>
-                  </m:r>
-                </m:sub>
-              </m:sSub>
-              <m:r>
-                <m:rPr>
-                  <m:sty m:val="p"/>
-                </m:rPr>
-                <m:t>∣</m:t>
-              </m:r>
-              <m:r>
-                <m:rPr>
-                  <m:nor/>
-                  <m:sty m:val="p"/>
-                </m:rPr>
-                <m:t>id</m:t>
-              </m:r>
-            </m:e>
-          </m:d>
-          <m:r>
-            <m:rPr>
-              <m:sty m:val="p"/>
-            </m:rPr>
-            <m:t>+</m:t>
-          </m:r>
-          <m:sSub>
-            <m:e>
-              <m:r>
-                <m:t>ε</m:t>
-              </m:r>
-            </m:e>
-            <m:sub>
-              <m:r>
-                <m:t>i</m:t>
-              </m:r>
-              <m:r>
-                <m:t>j</m:t>
-              </m:r>
-            </m:sub>
-          </m:sSub>
-          <m:r>
-            <m:t>  </m:t>
-          </m:r>
-          <m:d>
-            <m:dPr>
-              <m:begChr m:val="("/>
-              <m:sepChr m:val=""/>
-              <m:endChr m:val=")"/>
-              <m:grow/>
-            </m:dPr>
-            <m:e>
-              <m:r>
-                <m:t>7</m:t>
-              </m:r>
-            </m:e>
-          </m:d>
-        </m:oMath>
-      </m:oMathPara>
-      <w:bookmarkEnd w:id="29"/>
-    </w:p>
-    <w:p>
-      <w:pPr>
-        <w:pStyle w:val="FirstParagraph"/>
-      </w:pPr>
-      <w:r>
-        <w:t xml:space="preserve">This model estimates variance in within-female slopes as well as the intercept–slope correlation, thereby quantifying heterogeneity in allocation strategies. Specifically, it allows assessment of whether females with larger average egg size differ systematically in the strength or direction of their within-female trade-off. This model was used to quantify individual variation in slopes but not to derive standardized fixed effects.</w:t>
-      </w:r>
-    </w:p>
-    <w:p>
-      <w:pPr>
-        <w:pStyle w:val="BodyText"/>
-      </w:pPr>
-      <w:r>
-        <w:t xml:space="preserve">Because both egg number and egg size varied systematically across clutches, we tested whether clutch order explained the within-female association by including clutch as a fixed effect in the within–between model:</w:t>
-      </w:r>
-    </w:p>
-    <w:p>
-      <w:pPr>
-        <w:pStyle w:val="BodyText"/>
-      </w:pPr>
-      <w:bookmarkStart w:id="30" w:name="eq-clutchorderwithinbetween"/>
-      <m:oMathPara>
-        <m:oMathParaPr>
-          <m:jc m:val="center"/>
-        </m:oMathParaPr>
-        <m:oMath>
-          <m:sSub>
-            <m:e>
-              <m:r>
-                <m:rPr>
-                  <m:nor/>
-                  <m:sty m:val="p"/>
-                </m:rPr>
-                <m:t>mean egg size</m:t>
-              </m:r>
-            </m:e>
-            <m:sub>
-              <m:r>
-                <m:t>i</m:t>
-              </m:r>
-              <m:r>
-                <m:t>j</m:t>
-              </m:r>
-            </m:sub>
-          </m:sSub>
-          <m:r>
-            <m:rPr>
-              <m:sty m:val="p"/>
-            </m:rPr>
-            <m:t>=</m:t>
-          </m:r>
-          <m:sSub>
-            <m:e>
-              <m:r>
-                <m:t>β</m:t>
-              </m:r>
-            </m:e>
-            <m:sub>
-              <m:r>
-                <m:t>0</m:t>
-              </m:r>
-            </m:sub>
-          </m:sSub>
-          <m:r>
-            <m:rPr>
-              <m:sty m:val="p"/>
-            </m:rPr>
-            <m:t>+</m:t>
-          </m:r>
-          <m:sSub>
-            <m:e>
-              <m:r>
-                <m:t>β</m:t>
-              </m:r>
-            </m:e>
-            <m:sub>
-              <m:r>
-                <m:t>W</m:t>
-              </m:r>
-            </m:sub>
-          </m:sSub>
-          <m:r>
-            <m:t> </m:t>
-          </m:r>
-          <m:sSub>
-            <m:e>
-              <m:r>
-                <m:rPr>
-                  <m:nor/>
-                  <m:sty m:val="p"/>
-                </m:rPr>
-                <m:t>egg_number</m:t>
-              </m:r>
-            </m:e>
-            <m:sub>
-              <m:r>
-                <m:rPr>
-                  <m:nor/>
-                  <m:sty m:val="p"/>
-                </m:rPr>
-                <m:t>within</m:t>
-              </m:r>
-              <m:r>
-                <m:rPr>
-                  <m:sty m:val="p"/>
-                </m:rPr>
-                <m:t>,</m:t>
-              </m:r>
-              <m:r>
-                <m:t>i</m:t>
-              </m:r>
-              <m:r>
-                <m:t>j</m:t>
-              </m:r>
-            </m:sub>
-          </m:sSub>
-          <m:r>
-            <m:rPr>
-              <m:sty m:val="p"/>
-            </m:rPr>
-            <m:t>+</m:t>
-          </m:r>
-          <m:sSub>
-            <m:e>
-              <m:r>
-                <m:t>β</m:t>
-              </m:r>
-            </m:e>
-            <m:sub>
-              <m:r>
-                <m:t>B</m:t>
-              </m:r>
-            </m:sub>
-          </m:sSub>
-          <m:r>
-            <m:t> </m:t>
-          </m:r>
-          <m:sSub>
-            <m:e>
-              <m:r>
-                <m:rPr>
-                  <m:nor/>
-                  <m:sty m:val="p"/>
-                </m:rPr>
-                <m:t>egg_number</m:t>
-              </m:r>
-            </m:e>
-            <m:sub>
-              <m:r>
-                <m:rPr>
-                  <m:nor/>
-                  <m:sty m:val="p"/>
-                </m:rPr>
-                <m:t>between</m:t>
-              </m:r>
-              <m:r>
-                <m:rPr>
-                  <m:sty m:val="p"/>
-                </m:rPr>
-                <m:t>,</m:t>
-              </m:r>
-              <m:r>
-                <m:t>i</m:t>
-              </m:r>
-            </m:sub>
-          </m:sSub>
-          <m:r>
-            <m:rPr>
-              <m:sty m:val="p"/>
-            </m:rPr>
-            <m:t>+</m:t>
-          </m:r>
-          <m:sSub>
-            <m:e>
-              <m:r>
-                <m:t>β</m:t>
-              </m:r>
-            </m:e>
-            <m:sub>
-              <m:r>
-                <m:rPr>
-                  <m:nor/>
-                  <m:sty m:val="p"/>
-                </m:rPr>
-                <m:t>brood</m:t>
-              </m:r>
-            </m:sub>
-          </m:sSub>
-          <m:r>
-            <m:t> </m:t>
-          </m:r>
-          <m:sSub>
-            <m:e>
-              <m:r>
-                <m:rPr>
-                  <m:nor/>
-                  <m:sty m:val="p"/>
-                </m:rPr>
-                <m:t>brood</m:t>
-              </m:r>
-            </m:e>
-            <m:sub>
-              <m:r>
-                <m:t>i</m:t>
-              </m:r>
-              <m:r>
-                <m:t>j</m:t>
-              </m:r>
-            </m:sub>
-          </m:sSub>
-          <m:r>
-            <m:rPr>
-              <m:sty m:val="p"/>
-            </m:rPr>
-            <m:t>+</m:t>
-          </m:r>
-          <m:sSub>
-            <m:e>
-              <m:r>
-                <m:t>b</m:t>
-              </m:r>
-            </m:e>
-            <m:sub>
-              <m:r>
-                <m:t>0</m:t>
-              </m:r>
-              <m:r>
-                <m:t>i</m:t>
-              </m:r>
-            </m:sub>
-          </m:sSub>
-          <m:r>
-            <m:rPr>
-              <m:sty m:val="p"/>
-            </m:rPr>
-            <m:t>+</m:t>
-          </m:r>
-          <m:sSub>
-            <m:e>
-              <m:r>
-                <m:t>ε</m:t>
-              </m:r>
-            </m:e>
-            <m:sub>
-              <m:r>
-                <m:t>i</m:t>
-              </m:r>
-              <m:r>
-                <m:t>j</m:t>
-              </m:r>
-            </m:sub>
-          </m:sSub>
-          <m:r>
-            <m:t>  </m:t>
-          </m:r>
-          <m:d>
-            <m:dPr>
-              <m:begChr m:val="("/>
-              <m:sepChr m:val=""/>
-              <m:endChr m:val=")"/>
-              <m:grow/>
-            </m:dPr>
-            <m:e>
-              <m:r>
-                <m:t>8</m:t>
-              </m:r>
-            </m:e>
-          </m:d>
-        </m:oMath>
-      </m:oMathPara>
-      <w:bookmarkEnd w:id="30"/>
-    </w:p>
-    <w:p>
-      <w:pPr>
-        <w:pStyle w:val="FirstParagraph"/>
-      </w:pPr>
-      <w:r>
-        <w:t xml:space="preserve">This model evaluates whether the within-female slope persists after accounting for systematic clutch-related shifts in reproductive output. A reduction of</w:t>
-      </w:r>
-      <w:r>
-        <w:t xml:space="preserve"> </w:t>
-      </w:r>
-      <m:oMath>
-        <m:sSub>
-          <m:e>
-            <m:r>
-              <m:t>β</m:t>
-            </m:r>
-          </m:e>
-          <m:sub>
-            <m:r>
-              <m:t>W</m:t>
-            </m:r>
-          </m:sub>
-        </m:sSub>
-      </m:oMath>
-      <w:r>
-        <w:t xml:space="preserve"> </w:t>
-      </w:r>
-      <w:r>
-        <w:t xml:space="preserve">toward zero indicates that any apparent within-female association was driven by parallel clutch-order changes rather than plastic allocation per se.</w:t>
-      </w:r>
-    </w:p>
-    <w:p>
-      <w:pPr>
-        <w:pStyle w:val="BodyText"/>
-      </w:pPr>
-      <w:r>
-        <w:t xml:space="preserve">Weakly informative priors were specified for all model parameters to regularize estimation while remaining minimally restrictive. All models were fitted using Markov chain Monte Carlo (MCMC) sampling with four independent chains and 4,000 iterations to ensure adequate posterior exploration. Convergence was evaluated using the potential scale reduction factor (</w:t>
-      </w:r>
-      <m:oMath>
-        <m:acc>
-          <m:accPr>
-            <m:chr m:val="̂"/>
-          </m:accPr>
-          <m:e>
-            <m:r>
-              <m:t>R</m:t>
-            </m:r>
-          </m:e>
-        </m:acc>
-      </m:oMath>
-      <w:r>
-        <w:t xml:space="preserve"> </w:t>
-      </w:r>
-      <w:r>
-        <w:t xml:space="preserve">= 1.00), effective sample sizes (bulk and tail ESS), and visual inspection of trace plots. All reported parameters satisfied standard convergence criteria (</w:t>
+        <w:t xml:space="preserve">in R. Models were fitted using Hamiltonian Monte Carlo sampling with four independent chains and 4,000 iterations per chain. Weakly informative priors were specified for all parameters to regularize estimation while remaining minimally restrictive. Convergence was evaluated using the potential scale reduction factor (</w:t>
       </w:r>
       <m:oMath>
         <m:acc>
@@ -3135,7 +531,7 @@
         </m:r>
       </m:oMath>
       <w:r>
-        <w:t xml:space="preserve">). Parameter estimates are presented as posterior means with 95% credible intervals derived from the posterior distributions. Inference was based on CrIs that did not include zero.</w:t>
+        <w:t xml:space="preserve">), effective sample sizes (bulk and tail ESS), and visual inspection of trace plots. All reported parameters met standard convergence criteria. Unless otherwise noted, parameter estimates are presented as posterior means with 95% credible intervals (CrIs), and effects were considered supported when CrIs did not include zero.</w:t>
       </w:r>
     </w:p>
     <w:p>
@@ -3143,39 +539,95 @@
         <w:pStyle w:val="BodyText"/>
       </w:pPr>
       <w:r>
-        <w:t xml:space="preserve">I examined whether the first and second clutches of eggs differed in egg size variation among (</w:t>
+        <w:t xml:space="preserve">To test whether egg size and egg number differed between first and second clutches, I fitted a multivariate Bayesian mixed-effects model. Mean egg size was modelled assuming a Gaussian error distribution with an identity link, whereas egg number was modelled using a Poisson distribution with a log link. Both traits were modelled jointly to account for covariance at the female level. For each response variable, the model included a fixed intercept and clutch order (first versus second clutch) as a fixed effect. Female identity was included as a random intercept for both egg size and egg number to account for repeated measures across clutches. The female-level random intercepts for the two traits were allowed to covary, thereby estimating the among-female variance–covariance structure between egg size and egg number. Residual correlations were not estimated (</w:t>
       </w:r>
       <w:r>
         <w:rPr>
-          <w:i/>
-          <w:iCs/>
+          <w:rStyle w:val="VerbatimChar"/>
         </w:rPr>
-        <w:t xml:space="preserve">V</w:t>
+        <w:t xml:space="preserve">set_rescor(FALSE)</w:t>
+      </w:r>
+      <w:r>
+        <w:t xml:space="preserve">), such that covariance between traits was modelled exclusively at the female level. This model therefore tested whether egg size and egg number differed systematically between clutches while accounting for repeated measures and among-female variation.</w:t>
+      </w:r>
+    </w:p>
+    <w:p>
+      <w:pPr>
+        <w:pStyle w:val="BodyText"/>
+      </w:pPr>
+      <w:r>
+        <w:t xml:space="preserve">The raw phenotypic association between egg number and egg size was calculated using Pearson’s correlation coefficient across all observations. This estimate reflects the overall linear association between traits without accounting for repeated measures or hierarchical structure. To estimate among-female covariation, I calculated the Pearson correlation between female mean egg number and female mean egg size, averaging across broods. This approach isolates between-female covariance independent of within-female variation. To formally partition covariance into among-female and within-female components, I fitted a multivariate Gaussian mixed-effects model including egg size and egg number as joint responses. Female identity was included as a random intercept for both traits, and both female-level and residual correlations were estimated (</w:t>
       </w:r>
       <w:r>
         <w:rPr>
-          <w:vertAlign w:val="subscript"/>
+          <w:rStyle w:val="VerbatimChar"/>
         </w:rPr>
-        <w:t xml:space="preserve">among</w:t>
-      </w:r>
-      <w:r>
-        <w:t xml:space="preserve">) and within (</w:t>
+        <w:t xml:space="preserve">set_rescor(TRUE)</w:t>
+      </w:r>
+      <w:r>
+        <w:t xml:space="preserve">). The correlation between female-specific intercepts quantified the among-female association, whereas the residual correlation quantified the within-female (clutch-level) association between egg number and egg size.</w:t>
+      </w:r>
+    </w:p>
+    <w:p>
+      <w:pPr>
+        <w:pStyle w:val="BodyText"/>
+      </w:pPr>
+      <w:r>
+        <w:t xml:space="preserve">To distinguish plastic from strategic effects, I followed van de Pol and Wright</w:t>
+      </w:r>
+      <w:r>
+        <w:t xml:space="preserve"> </w:t>
+      </w:r>
+      <w:r>
+        <w:t xml:space="preserve">(</w:t>
       </w:r>
       <w:r>
         <w:rPr>
-          <w:i/>
-          <w:iCs/>
+          <w:b/>
+          <w:bCs/>
         </w:rPr>
-        <w:t xml:space="preserve">V</w:t>
-      </w:r>
-      <w:r>
-        <w:rPr>
-          <w:vertAlign w:val="subscript"/>
-        </w:rPr>
-        <w:t xml:space="preserve">within</w:t>
-      </w:r>
-      <w:r>
-        <w:t xml:space="preserve">) females by constructing a univariate hierarchical linear mixed-effects model with scaled mean egg perimeter as the response variable, clutch (first or second) as a fixed effect, and female body size as a continuous covariate. I also included, as random effects, a random slope for each clutch for each female. In the dispersion part of the model, I included clutch as a fixed effect to estimate the within-individual (i.e. residual) variance in egg size for each clutch. I then tested whether the first and second clutch differed in egg size at the among- and within-female levels. Data were visualized using</w:t>
+        <w:t xml:space="preserve">vandepol2009?</w:t>
+      </w:r>
+      <w:r>
+        <w:t xml:space="preserve">)</w:t>
+      </w:r>
+      <w:r>
+        <w:t xml:space="preserve"> </w:t>
+      </w:r>
+      <w:r>
+        <w:t xml:space="preserve">by decomposing egg number into two components. The within-female component represented the deviation of each observation from a female’s own mean egg number, and the between-female component represented each female’s mean egg number relative to the population mean. I then fitted alinear mixed-effects model with mean egg size as the response variable, including both components as fixed effects and female identity as a random intercept. In this framework, the within-female coefficient estimates the plastic allocation response, whereas the between-female coefficient estimates the among-female (strategic) association. Continuous predictors were standardized by centering them on their mean and scaling by their standard deviation. The within- and between-female components were each standardized using the mean and standard deviation of their respective distributions. When estimating standardized regression coefficients, the response variable was also scaled to have a standard deviation of one. Standardized coefficients therefore represent the expected change in egg size, measured in standard deviation units, associated with a one standard deviation change in the predictor.</w:t>
+      </w:r>
+    </w:p>
+    <w:p>
+      <w:pPr>
+        <w:pStyle w:val="BodyText"/>
+      </w:pPr>
+      <w:r>
+        <w:t xml:space="preserve">To test whether females differed in their propensity to trade off egg size against egg number, I fitted a mixed-effects model allowing the within-female effect of egg number to vary among females. Mean egg size was included as the response variable, and egg number was partitioned into within-female and between-female components as described above. The within-female component was included as both a fixed effect and a random slope, while the between-female component was included as a fixed effect. Female identity was included as a random effect with both intercepts and random slopes for the within-female component. This parameterisation estimates among-female variation in within-female slopes and the correlation between intercepts and slopes, thereby quantifying heterogeneity in allocation strategies and testing whether females with larger average egg size differ systematically in the strength or direction of their within-female trade-off.</w:t>
+      </w:r>
+    </w:p>
+    <w:p>
+      <w:pPr>
+        <w:pStyle w:val="BodyText"/>
+      </w:pPr>
+      <w:r>
+        <w:t xml:space="preserve">Because egg number and egg size both changed systematically across clutches, I tested whether clutch order explained the observed within-female association by adding clutch order as an additional fixed effect to the within–between model. In this extended model, mean egg size was predicted by the within-female deviation in egg number, the between-female mean egg number, and clutch order, while female identity was retained as a random intercept. If the within-female slope was reduced toward zero after including clutch order, this would indicate that the apparent within-female association was largely driven by parallel shifts between first and second clutches rather than by plastic allocation within females.</w:t>
+      </w:r>
+    </w:p>
+    <w:p>
+      <w:pPr>
+        <w:pStyle w:val="BodyText"/>
+      </w:pPr>
+      <w:r>
+        <w:t xml:space="preserve">To compare clutch-specific variance components independently of random-slope parameterisation, I fitted a hierarchical Gaussian model in which female effects were estimated separately for first and second clutches. Scaled egg size was modelled as a function of clutch order with clutch-specific random intercepts for female identity. This parameterisation estimated separate among-female variance components for clutch 1 and clutch 2, as well as their correlation, allowing direct comparison of female-level variation across reproductive events. Residual standard deviations were also allowed to differ between clutches. Clutch-specific variance components were derived from posterior samples, and differences between clutches were evaluated using posterior contrasts.</w:t>
+      </w:r>
+    </w:p>
+    <w:p>
+      <w:pPr>
+        <w:pStyle w:val="BodyText"/>
+      </w:pPr>
+      <w:r>
+        <w:t xml:space="preserve">Data were visualized using</w:t>
       </w:r>
       <w:r>
         <w:t xml:space="preserve"> </w:t>
@@ -3207,9 +659,9 @@
         <w:t xml:space="preserve">.</w:t>
       </w:r>
     </w:p>
-    <w:bookmarkEnd w:id="31"/>
-    <w:bookmarkEnd w:id="32"/>
-    <w:bookmarkStart w:id="36" w:name="results"/>
+    <w:bookmarkEnd w:id="23"/>
+    <w:bookmarkEnd w:id="24"/>
+    <w:bookmarkStart w:id="29" w:name="results"/>
     <w:p>
       <w:pPr>
         <w:pStyle w:val="Heading1"/>
@@ -3218,7 +670,7 @@
         <w:t xml:space="preserve">Results</w:t>
       </w:r>
     </w:p>
-    <w:bookmarkStart w:id="33" w:name="X2adf980c3cdf557e751ed69a8410e917bd83bb9"/>
+    <w:bookmarkStart w:id="25" w:name="X2adf980c3cdf557e751ed69a8410e917bd83bb9"/>
     <w:p>
       <w:pPr>
         <w:pStyle w:val="Heading3"/>
@@ -3338,7 +790,7 @@
         <w:t xml:space="preserve"> </w:t>
       </w:r>
       <w:r>
-        <w:t xml:space="preserve">= -0.41, 95% CrI (-0.48, -0.34)), corresponding to an approximate 34% reduction on the natural scale (</w:t>
+        <w:t xml:space="preserve">= -0.41, 95% CrI (-0.48, -0.34), corresponding to an approximate 34% reduction on the natural scale (</w:t>
       </w:r>
       <m:oMath>
         <m:sSup>
@@ -3373,8 +825,8 @@
         <w:t xml:space="preserve">). Among-female variation remained detectable for both egg size (SD = 0.091, 95% CrI [0.009, 0.165]) and egg number (SD = 0.355, 95% CrI [0.273, 0.460]), indicating persistent heterogeneity across broods.</w:t>
       </w:r>
     </w:p>
-    <w:bookmarkEnd w:id="33"/>
-    <w:bookmarkStart w:id="34" w:name="X8f40dbed1f2515dba178cdbe2247c63c8a0b998"/>
+    <w:bookmarkEnd w:id="25"/>
+    <w:bookmarkStart w:id="26" w:name="X8f40dbed1f2515dba178cdbe2247c63c8a0b998"/>
     <w:p>
       <w:pPr>
         <w:pStyle w:val="Heading3"/>
@@ -3518,8 +970,8 @@
         <w:t xml:space="preserve">). Thus, apparent phenotypic independence masked a moderate negative association among females but no detectable clutch-level trade-off within females.</w:t>
       </w:r>
     </w:p>
-    <w:bookmarkEnd w:id="34"/>
-    <w:bookmarkStart w:id="35" w:name="withinbetween-mixed-effects-models"/>
+    <w:bookmarkEnd w:id="26"/>
+    <w:bookmarkStart w:id="28" w:name="withinbetween-mixed-effects-models"/>
     <w:p>
       <w:pPr>
         <w:pStyle w:val="Heading3"/>
@@ -3830,9 +1282,46 @@
         <w:t xml:space="preserve">= -0.0004, 95% CrI [-0.0045, 0.0035]). Thus, there was no evidence that females plastically traded egg number against egg size within clutches; the apparent association in the initial model was entirely explained by parallel declines from clutch one to clutch two.</w:t>
       </w:r>
     </w:p>
-    <w:bookmarkEnd w:id="35"/>
-    <w:bookmarkEnd w:id="36"/>
-    <w:bookmarkStart w:id="37" w:name="discussion"/>
+    <w:bookmarkStart w:id="27" w:name="Xa0713afe1a0937a4c359af3d72eeaa97e62c984"/>
+    <w:p>
+      <w:pPr>
+        <w:pStyle w:val="Heading4"/>
+      </w:pPr>
+      <w:r>
+        <w:t xml:space="preserve">Egg size variation between females and within clutches</w:t>
+      </w:r>
+    </w:p>
+    <w:p>
+      <w:pPr>
+        <w:pStyle w:val="FirstParagraph"/>
+      </w:pPr>
+      <w:r>
+        <w:t xml:space="preserve">Egg size exhibited substantial variation at both the between-female and within-clutch levels (</w:t>
+      </w:r>
+      <w:hyperlink w:anchor="fig-four">
+        <w:r>
+          <w:rPr>
+            <w:rStyle w:val="Hyperlink"/>
+          </w:rPr>
+          <w:t xml:space="preserve">Figure 4</w:t>
+        </w:r>
+      </w:hyperlink>
+      <w:r>
+        <w:t xml:space="preserve">). Between-female variance was similar across reproductive events, with a median of 0.77 (95% CrI: 0.52, 1.23) in first clutches and 0.64 (95% CrI: 0.42, 1.00) in second clutches. The posterior median difference (second − first) was -0.14 (95% CrI: -0.60, 0.29), and the posterior probability that between-female variance was greater in second clutches was 0.26, indicating no clear evidence of a difference. In contrast, within-clutch (egg-to-egg) variance was substantially higher in second clutches (median = 0.35 (95% CrI: 0.33, 0.38) than in first clutches (median = 0.21 (95% CrI: 0.20, 0.22). The posterior median difference was 0.14 (95% CrI: 0.12, 0.17), with a posterior probability of 1.00, that within-clutch variance was greater in second clutches.</w:t>
+      </w:r>
+    </w:p>
+    <w:p>
+      <w:pPr>
+        <w:pStyle w:val="BodyText"/>
+      </w:pPr>
+      <w:r>
+        <w:t xml:space="preserve">Egg size was highly repeatable in both broods, but repeatability was higher in first broods (R = 0.64 [95% CrI: 0.54, 0.74]) than in second broods (R = 0.79 [95% CrI: 0.71, 0.86]), indicating greater within-female variance in egg size expression during second reproductive attempts.</w:t>
+      </w:r>
+    </w:p>
+    <w:bookmarkEnd w:id="27"/>
+    <w:bookmarkEnd w:id="28"/>
+    <w:bookmarkEnd w:id="29"/>
+    <w:bookmarkStart w:id="30" w:name="discussion"/>
     <w:p>
       <w:pPr>
         <w:pStyle w:val="Heading1"/>
@@ -3845,6 +1334,12 @@
       <w:pPr>
         <w:pStyle w:val="FirstParagraph"/>
       </w:pPr>
+      <w:r>
+        <w:t xml:space="preserve">Egg size is more tightly structured among females in first broods and more flexible in second broods.</w:t>
+      </w:r>
+      <w:r>
+        <w:t xml:space="preserve"> </w:t>
+      </w:r>
       <w:r>
         <w:t xml:space="preserve">Summary</w:t>
       </w:r>
@@ -4320,148 +1815,406 @@
         <w:t xml:space="preserve">In conclusion, by partitioning variance into its among- and within-individual components, I found that female European earwigs do not trade off clutch and egg size. Instead, I found a positive correlation between egg number and size and some evidence for an among-female trade-off. I also discovered that second clutches consist of eggs with a more variable size than first clutches, but the among-female variation in average egg size was similar between the two clutches.</w:t>
       </w:r>
     </w:p>
+    <w:bookmarkEnd w:id="30"/>
+    <w:bookmarkStart w:id="31" w:name="data-availability"/>
+    <w:p>
+      <w:pPr>
+        <w:pStyle w:val="Heading1"/>
+      </w:pPr>
+      <w:r>
+        <w:t xml:space="preserve">Data availability</w:t>
+      </w:r>
+    </w:p>
+    <w:p>
+      <w:pPr>
+        <w:pStyle w:val="FirstParagraph"/>
+      </w:pPr>
+      <w:r>
+        <w:t xml:space="preserve">Data are available through the OSF repository at 10.17605/OSF.IO/KWCS8.</w:t>
+      </w:r>
+    </w:p>
+    <w:bookmarkEnd w:id="31"/>
+    <w:bookmarkStart w:id="32" w:name="author-contributions"/>
+    <w:p>
+      <w:pPr>
+        <w:pStyle w:val="Heading1"/>
+      </w:pPr>
+      <w:r>
+        <w:t xml:space="preserve">Author contributions</w:t>
+      </w:r>
+    </w:p>
+    <w:p>
+      <w:pPr>
+        <w:pStyle w:val="FirstParagraph"/>
+      </w:pPr>
+      <w:r>
+        <w:t xml:space="preserve">CDK collected and analyzed the data, and wrote the manuscript.</w:t>
+      </w:r>
+    </w:p>
+    <w:bookmarkEnd w:id="32"/>
+    <w:bookmarkStart w:id="33" w:name="funding"/>
+    <w:p>
+      <w:pPr>
+        <w:pStyle w:val="Heading1"/>
+      </w:pPr>
+      <w:r>
+        <w:t xml:space="preserve">Funding</w:t>
+      </w:r>
+    </w:p>
+    <w:p>
+      <w:pPr>
+        <w:pStyle w:val="FirstParagraph"/>
+      </w:pPr>
+      <w:r>
+        <w:t xml:space="preserve">The study was funded by a Discovery Grant from the Natural Sciences and Engineering Research Council of Canada (NSERC).</w:t>
+      </w:r>
+    </w:p>
+    <w:bookmarkEnd w:id="33"/>
+    <w:bookmarkStart w:id="34" w:name="conflict-of-interest"/>
+    <w:p>
+      <w:pPr>
+        <w:pStyle w:val="Heading1"/>
+      </w:pPr>
+      <w:r>
+        <w:t xml:space="preserve">Conflict of Interest</w:t>
+      </w:r>
+    </w:p>
+    <w:p>
+      <w:pPr>
+        <w:pStyle w:val="FirstParagraph"/>
+      </w:pPr>
+      <w:r>
+        <w:t xml:space="preserve">I declare no conflict of interest.</w:t>
+      </w:r>
+    </w:p>
+    <w:bookmarkEnd w:id="34"/>
+    <w:bookmarkStart w:id="35" w:name="acknowledgements"/>
+    <w:p>
+      <w:pPr>
+        <w:pStyle w:val="Heading1"/>
+      </w:pPr>
+      <w:r>
+        <w:t xml:space="preserve">Acknowledgements</w:t>
+      </w:r>
+    </w:p>
+    <w:p>
+      <w:pPr>
+        <w:pStyle w:val="FirstParagraph"/>
+      </w:pPr>
+      <w:r>
+        <w:t xml:space="preserve">I thank Andréanne Nault and Clara Smythe for assistance in animal care and data collection.</w:t>
+      </w:r>
+    </w:p>
+    <w:p>
+      <w:r>
+        <w:br w:type="page"/>
+      </w:r>
+    </w:p>
+    <w:bookmarkEnd w:id="35"/>
+    <w:bookmarkStart w:id="96" w:name="references"/>
+    <w:p>
+      <w:pPr>
+        <w:pStyle w:val="Heading1"/>
+      </w:pPr>
+      <w:r>
+        <w:t xml:space="preserve">References</w:t>
+      </w:r>
+    </w:p>
+    <w:bookmarkStart w:id="79" w:name="refs"/>
+    <w:bookmarkStart w:id="36" w:name="ref-bernardo1996"/>
+    <w:p>
+      <w:pPr>
+        <w:pStyle w:val="Bibliography"/>
+      </w:pPr>
+      <w:r>
+        <w:t xml:space="preserve">Bernardo, J. 1996. The particular maternal effect of propagule size, especially egg size: Patterns, models, quality of evidence and interpretations. Am Zool 36:216–236.</w:t>
+      </w:r>
+    </w:p>
+    <w:bookmarkEnd w:id="36"/>
+    <w:bookmarkStart w:id="37" w:name="ref-boos2014"/>
+    <w:p>
+      <w:pPr>
+        <w:pStyle w:val="Bibliography"/>
+      </w:pPr>
+      <w:r>
+        <w:t xml:space="preserve">Boos, S., J. Meunier, S. Pichon, and M. Kölliker. 2014. Maternal care provides antifungal protection to eggs in the european earwig. Behav Ecol 25:754–761.</w:t>
+      </w:r>
+    </w:p>
     <w:bookmarkEnd w:id="37"/>
-    <w:bookmarkStart w:id="38" w:name="data-availability"/>
-    <w:p>
-      <w:pPr>
-        <w:pStyle w:val="Heading1"/>
-      </w:pPr>
-      <w:r>
-        <w:t xml:space="preserve">Data availability</w:t>
-      </w:r>
-    </w:p>
-    <w:p>
-      <w:pPr>
-        <w:pStyle w:val="FirstParagraph"/>
-      </w:pPr>
-      <w:r>
-        <w:t xml:space="preserve">Data are available through the OSF repository at 10.17605/OSF.IO/KWCS8.</w:t>
+    <w:bookmarkStart w:id="38" w:name="ref-burkner2017"/>
+    <w:p>
+      <w:pPr>
+        <w:pStyle w:val="Bibliography"/>
+      </w:pPr>
+      <w:r>
+        <w:t xml:space="preserve">Bürkner, P.-C. 2017.</w:t>
+      </w:r>
+      <w:r>
+        <w:t xml:space="preserve"> </w:t>
+      </w:r>
+      <w:r>
+        <w:t xml:space="preserve">brms</w:t>
+      </w:r>
+      <w:r>
+        <w:t xml:space="preserve">: An</w:t>
+      </w:r>
+      <w:r>
+        <w:t xml:space="preserve"> </w:t>
+      </w:r>
+      <w:r>
+        <w:t xml:space="preserve">R</w:t>
+      </w:r>
+      <w:r>
+        <w:t xml:space="preserve"> </w:t>
+      </w:r>
+      <w:r>
+        <w:t xml:space="preserve">package for</w:t>
+      </w:r>
+      <w:r>
+        <w:t xml:space="preserve"> </w:t>
+      </w:r>
+      <w:r>
+        <w:t xml:space="preserve">B</w:t>
+      </w:r>
+      <w:r>
+        <w:t xml:space="preserve">ayesian multilevel models using</w:t>
+      </w:r>
+      <w:r>
+        <w:t xml:space="preserve"> </w:t>
+      </w:r>
+      <w:r>
+        <w:t xml:space="preserve">S</w:t>
+      </w:r>
+      <w:r>
+        <w:t xml:space="preserve">tan. Journal of Statistical Software 80:4308.</w:t>
       </w:r>
     </w:p>
     <w:bookmarkEnd w:id="38"/>
-    <w:bookmarkStart w:id="39" w:name="author-contributions"/>
-    <w:p>
-      <w:pPr>
-        <w:pStyle w:val="Heading1"/>
-      </w:pPr>
-      <w:r>
-        <w:t xml:space="preserve">Author contributions</w:t>
-      </w:r>
-    </w:p>
-    <w:p>
-      <w:pPr>
-        <w:pStyle w:val="FirstParagraph"/>
-      </w:pPr>
-      <w:r>
-        <w:t xml:space="preserve">CDK collected and analyzed the data, and wrote the manuscript.</w:t>
+    <w:bookmarkStart w:id="39" w:name="ref-careau2017"/>
+    <w:p>
+      <w:pPr>
+        <w:pStyle w:val="Bibliography"/>
+      </w:pPr>
+      <w:r>
+        <w:t xml:space="preserve">Careau, V., and R. Wilson. 2017. Of uberfleas and krakens: Detecting trade-offs using mixed models. Integr Comp Biol 57:362–371.</w:t>
       </w:r>
     </w:p>
     <w:bookmarkEnd w:id="39"/>
-    <w:bookmarkStart w:id="40" w:name="funding"/>
-    <w:p>
-      <w:pPr>
-        <w:pStyle w:val="Heading1"/>
-      </w:pPr>
-      <w:r>
-        <w:t xml:space="preserve">Funding</w:t>
-      </w:r>
-    </w:p>
-    <w:p>
-      <w:pPr>
-        <w:pStyle w:val="FirstParagraph"/>
-      </w:pPr>
-      <w:r>
-        <w:t xml:space="preserve">The study was funded by a Discovery Grant from the Natural Sciences and Engineering Research Council of Canada (NSERC).</w:t>
+    <w:bookmarkStart w:id="40" w:name="ref-cavaleiro2014"/>
+    <w:p>
+      <w:pPr>
+        <w:pStyle w:val="Bibliography"/>
+      </w:pPr>
+      <w:r>
+        <w:t xml:space="preserve">Cavaleiro, F. I., and M. J. Santos. 2014. Egg number-egg size: An important trade-off in parasite life history strategies. Int J Parasitol 44:173–182.</w:t>
       </w:r>
     </w:p>
     <w:bookmarkEnd w:id="40"/>
-    <w:bookmarkStart w:id="41" w:name="conflict-of-interest"/>
-    <w:p>
-      <w:pPr>
-        <w:pStyle w:val="Heading1"/>
-      </w:pPr>
-      <w:r>
-        <w:t xml:space="preserve">Conflict of Interest</w:t>
-      </w:r>
-    </w:p>
-    <w:p>
-      <w:pPr>
-        <w:pStyle w:val="FirstParagraph"/>
-      </w:pPr>
-      <w:r>
-        <w:t xml:space="preserve">I declare no conflict of interest.</w:t>
+    <w:bookmarkStart w:id="41" w:name="ref-church2019"/>
+    <w:p>
+      <w:pPr>
+        <w:pStyle w:val="Bibliography"/>
+      </w:pPr>
+      <w:r>
+        <w:t xml:space="preserve">Church, S. H., S. Donoughe, B. A. S. de Medeiros, and C. G. Extavour. 2019. Insect egg size and shape evolve with ecology but not developmental rate. Nature 571:58–62.</w:t>
       </w:r>
     </w:p>
     <w:bookmarkEnd w:id="41"/>
-    <w:bookmarkStart w:id="42" w:name="acknowledgements"/>
-    <w:p>
-      <w:pPr>
-        <w:pStyle w:val="Heading1"/>
-      </w:pPr>
-      <w:r>
-        <w:t xml:space="preserve">Acknowledgements</w:t>
-      </w:r>
-    </w:p>
-    <w:p>
-      <w:pPr>
-        <w:pStyle w:val="FirstParagraph"/>
-      </w:pPr>
-      <w:r>
-        <w:t xml:space="preserve">I thank Andréanne Nault and Clara Smythe for assistance in animal care and data collection.</w:t>
-      </w:r>
-    </w:p>
-    <w:p>
-      <w:r>
-        <w:br w:type="page"/>
+    <w:bookmarkStart w:id="42" w:name="ref-clutton-brock1984"/>
+    <w:p>
+      <w:pPr>
+        <w:pStyle w:val="Bibliography"/>
+      </w:pPr>
+      <w:r>
+        <w:t xml:space="preserve">Clutton-Brock, T. H. 1984. Reproductive effort and terminal investment in iteroparous animals. Am Nat 123:212–229.</w:t>
       </w:r>
     </w:p>
     <w:bookmarkEnd w:id="42"/>
-    <w:bookmarkStart w:id="99" w:name="references"/>
-    <w:p>
-      <w:pPr>
-        <w:pStyle w:val="Heading1"/>
-      </w:pPr>
-      <w:r>
-        <w:t xml:space="preserve">References</w:t>
-      </w:r>
-    </w:p>
-    <w:bookmarkStart w:id="86" w:name="refs"/>
-    <w:bookmarkStart w:id="43" w:name="ref-bernardo1996"/>
+    <w:bookmarkStart w:id="43" w:name="ref-clutton-brock1991"/>
     <w:p>
       <w:pPr>
         <w:pStyle w:val="Bibliography"/>
       </w:pPr>
       <w:r>
-        <w:t xml:space="preserve">Bernardo, J. 1996. The particular maternal effect of propagule size, especially egg size: Patterns, models, quality of evidence and interpretations. Am Zool 36:216–236.</w:t>
+        <w:t xml:space="preserve">Clutton-Brock, T. H. 1991.</w:t>
+      </w:r>
+      <w:r>
+        <w:t xml:space="preserve"> </w:t>
+      </w:r>
+      <w:r>
+        <w:t xml:space="preserve">The Evolution of Parental Care</w:t>
+      </w:r>
+      <w:r>
+        <w:t xml:space="preserve">. Princeton University Press.</w:t>
       </w:r>
     </w:p>
     <w:bookmarkEnd w:id="43"/>
-    <w:bookmarkStart w:id="44" w:name="ref-boos2014"/>
+    <w:bookmarkStart w:id="44" w:name="ref-einum2000"/>
     <w:p>
       <w:pPr>
         <w:pStyle w:val="Bibliography"/>
       </w:pPr>
       <w:r>
-        <w:t xml:space="preserve">Boos, S., J. Meunier, S. Pichon, and M. Kölliker. 2014. Maternal care provides antifungal protection to eggs in the european earwig. Behav Ecol 25:754–761.</w:t>
+        <w:t xml:space="preserve">Einum, S., and I. A. Fleming. 2000. Highly fecund mothers sacrifice offspring survival to maximize fitness. Nature 405:565–567.</w:t>
       </w:r>
     </w:p>
     <w:bookmarkEnd w:id="44"/>
-    <w:bookmarkStart w:id="45" w:name="ref-burkner2017"/>
+    <w:bookmarkStart w:id="45" w:name="ref-falconer1996"/>
     <w:p>
       <w:pPr>
         <w:pStyle w:val="Bibliography"/>
       </w:pPr>
       <w:r>
-        <w:t xml:space="preserve">Bürkner, P.-C. 2017.</w:t>
-      </w:r>
-      <w:r>
-        <w:t xml:space="preserve"> </w:t>
-      </w:r>
-      <w:r>
-        <w:t xml:space="preserve">brms</w:t>
-      </w:r>
-      <w:r>
-        <w:t xml:space="preserve">: An</w:t>
+        <w:t xml:space="preserve">Falconer, D. S., and T. F. C. MacKay. 1996.</w:t>
+      </w:r>
+      <w:r>
+        <w:t xml:space="preserve"> </w:t>
+      </w:r>
+      <w:r>
+        <w:t xml:space="preserve">An Introduction Quantitative Genetics</w:t>
+      </w:r>
+      <w:r>
+        <w:t xml:space="preserve">. Pearson Education Limited, Essex, England.</w:t>
+      </w:r>
+    </w:p>
+    <w:bookmarkEnd w:id="45"/>
+    <w:bookmarkStart w:id="46" w:name="ref-ficetola2009"/>
+    <w:p>
+      <w:pPr>
+        <w:pStyle w:val="Bibliography"/>
+      </w:pPr>
+      <w:r>
+        <w:t xml:space="preserve">Ficetola, G. F., and F. De Bernardi. 2009. Offspring size and survival in the frog rana latastei: From among-population to within-clutch variation. Biol J Linn Soc 97:845–853.</w:t>
+      </w:r>
+    </w:p>
+    <w:bookmarkEnd w:id="46"/>
+    <w:bookmarkStart w:id="47" w:name="ref-fox2000"/>
+    <w:p>
+      <w:pPr>
+        <w:pStyle w:val="Bibliography"/>
+      </w:pPr>
+      <w:r>
+        <w:t xml:space="preserve">Fox, C. W., and M. E. Czesak. 2000. Evolutionary ecology of progeny size in arthropods. Annu Rev Entomol 45:341–369.</w:t>
+      </w:r>
+    </w:p>
+    <w:bookmarkEnd w:id="47"/>
+    <w:bookmarkStart w:id="48" w:name="ref-hargitai2005"/>
+    <w:p>
+      <w:pPr>
+        <w:pStyle w:val="Bibliography"/>
+      </w:pPr>
+      <w:r>
+        <w:t xml:space="preserve">Hargitai, R., J. Török, L. Tóth, G. Hegyi, B. Rosivall, B. Szigeti, and E. Szöllősi. 2005. Effects of environmental conditions and parental quality on inter-and intraclutch egg-size variation in the collared flycatcher (ficedula albicollis). The Auk 122:509–522.</w:t>
+      </w:r>
+    </w:p>
+    <w:bookmarkEnd w:id="48"/>
+    <w:bookmarkStart w:id="49" w:name="ref-harvey1983"/>
+    <w:p>
+      <w:pPr>
+        <w:pStyle w:val="Bibliography"/>
+      </w:pPr>
+      <w:r>
+        <w:t xml:space="preserve">Harvey, G. T. 1983. Environmental and genetic effects on mean egg weight in spruce budworm (lepidoptera: tortricidae). The Canadian Entomologist 115:1109–1117.</w:t>
+      </w:r>
+    </w:p>
+    <w:bookmarkEnd w:id="49"/>
+    <w:bookmarkStart w:id="50" w:name="ref-kelly2014"/>
+    <w:p>
+      <w:pPr>
+        <w:pStyle w:val="Bibliography"/>
+      </w:pPr>
+      <w:r>
+        <w:t xml:space="preserve">Kelly, C. D., B. Tawes, and A. Worthington. 2014. Evaluating indices of body condition in two cricket species. Ecology and Evolution 4:4476–4487.</w:t>
+      </w:r>
+    </w:p>
+    <w:bookmarkEnd w:id="50"/>
+    <w:bookmarkStart w:id="51" w:name="ref-koch2014"/>
+    <w:p>
+      <w:pPr>
+        <w:pStyle w:val="Bibliography"/>
+      </w:pPr>
+      <w:r>
+        <w:t xml:space="preserve">Koch, L. K., and J. Meunier. 2014. Mother and offspring fitness in an insect with maternal care: Phenotypic trade-offs between egg number, egg mass and egg care. BMC Evol Biol 14:125.</w:t>
+      </w:r>
+    </w:p>
+    <w:bookmarkEnd w:id="51"/>
+    <w:bookmarkStart w:id="52" w:name="ref-kolliker2007"/>
+    <w:p>
+      <w:pPr>
+        <w:pStyle w:val="Bibliography"/>
+      </w:pPr>
+      <w:r>
+        <w:t xml:space="preserve">Kölliker, M. 2007. Benefits and costs of earwig (forficula auricularia) family life. Behav Ecol Sociobiol 61:1489–1497.</w:t>
+      </w:r>
+    </w:p>
+    <w:bookmarkEnd w:id="52"/>
+    <w:bookmarkStart w:id="53" w:name="ref-meunier2024"/>
+    <w:p>
+      <w:pPr>
+        <w:pStyle w:val="Bibliography"/>
+      </w:pPr>
+      <w:r>
+        <w:t xml:space="preserve">Meunier, J. 2024. The biology and social life of earwigs (dermaptera). Annu Rev Entomol 69:259–276.</w:t>
+      </w:r>
+    </w:p>
+    <w:bookmarkEnd w:id="53"/>
+    <w:bookmarkStart w:id="54" w:name="ref-nelson2004"/>
+    <w:p>
+      <w:pPr>
+        <w:pStyle w:val="Bibliography"/>
+      </w:pPr>
+      <w:r>
+        <w:t xml:space="preserve">Nelson, N. J., M. B. Thompson, S. Pledger, S. N. Keall, and C. H. Daugherty. 2004. Egg mass determines hatchling size, and incubation temperature influences post‐hatching growth, of tuatara sphenodon punctatus. J Zool 263:77–87.</w:t>
+      </w:r>
+    </w:p>
+    <w:bookmarkEnd w:id="54"/>
+    <w:bookmarkStart w:id="55" w:name="ref-nilsson1993"/>
+    <w:p>
+      <w:pPr>
+        <w:pStyle w:val="Bibliography"/>
+      </w:pPr>
+      <w:r>
+        <w:t xml:space="preserve">Nilsson, J. ‐Å., and E. Svensson. 1993. Causes and consequences of egg mass variation between and within blue tit clutches. J Zool 230:469–481.</w:t>
+      </w:r>
+    </w:p>
+    <w:bookmarkEnd w:id="55"/>
+    <w:bookmarkStart w:id="56" w:name="ref-parker1982"/>
+    <w:p>
+      <w:pPr>
+        <w:pStyle w:val="Bibliography"/>
+      </w:pPr>
+      <w:r>
+        <w:t xml:space="preserve">Parker, G. A. 1982. Why are there so many tiny sperm? Sperm competition and the maintenance of two sexes. J Theor Biol 96:281–294.</w:t>
+      </w:r>
+    </w:p>
+    <w:bookmarkEnd w:id="56"/>
+    <w:bookmarkStart w:id="57" w:name="ref-peig2009"/>
+    <w:p>
+      <w:pPr>
+        <w:pStyle w:val="Bibliography"/>
+      </w:pPr>
+      <w:r>
+        <w:t xml:space="preserve">Peig, J., and A. J. Green. 2009. New perspectives for estimating body condition from mass/length data: The scaled mass index as an alternative method. Oikos 118:1883–1891.</w:t>
+      </w:r>
+    </w:p>
+    <w:bookmarkEnd w:id="57"/>
+    <w:bookmarkStart w:id="58" w:name="ref-peig2010"/>
+    <w:p>
+      <w:pPr>
+        <w:pStyle w:val="Bibliography"/>
+      </w:pPr>
+      <w:r>
+        <w:t xml:space="preserve">Peig, J., and A. J. Green. 2010. The paradigm of body condition: A critical reappraisal of current methods based on mass and length. Funct Ecol 24:1323–1332.</w:t>
+      </w:r>
+    </w:p>
+    <w:bookmarkEnd w:id="58"/>
+    <w:bookmarkStart w:id="59" w:name="ref-r2013"/>
+    <w:p>
+      <w:pPr>
+        <w:pStyle w:val="Bibliography"/>
+      </w:pPr>
+      <w:r>
+        <w:t xml:space="preserve">R Core Team. 2025.</w:t>
       </w:r>
       <w:r>
         <w:t xml:space="preserve"> </w:t>
@@ -4470,382 +2223,124 @@
         <w:t xml:space="preserve">R</w:t>
       </w:r>
       <w:r>
-        <w:t xml:space="preserve"> </w:t>
-      </w:r>
-      <w:r>
-        <w:t xml:space="preserve">package for</w:t>
-      </w:r>
-      <w:r>
-        <w:t xml:space="preserve"> </w:t>
-      </w:r>
-      <w:r>
-        <w:t xml:space="preserve">B</w:t>
-      </w:r>
-      <w:r>
-        <w:t xml:space="preserve">ayesian multilevel models using</w:t>
-      </w:r>
-      <w:r>
-        <w:t xml:space="preserve"> </w:t>
-      </w:r>
-      <w:r>
-        <w:t xml:space="preserve">S</w:t>
-      </w:r>
-      <w:r>
-        <w:t xml:space="preserve">tan. Journal of Statistical Software 80:4308.</w:t>
-      </w:r>
-    </w:p>
-    <w:bookmarkEnd w:id="45"/>
-    <w:bookmarkStart w:id="46" w:name="ref-careau2017"/>
+        <w:t xml:space="preserve">:</w:t>
+      </w:r>
+      <w:r>
+        <w:t xml:space="preserve"> </w:t>
+      </w:r>
+      <w:r>
+        <w:t xml:space="preserve">A</w:t>
+      </w:r>
+      <w:r>
+        <w:t xml:space="preserve"> </w:t>
+      </w:r>
+      <w:r>
+        <w:t xml:space="preserve">language and environment for statistical computing. Vienna, Austria.</w:t>
+      </w:r>
+    </w:p>
+    <w:bookmarkEnd w:id="59"/>
+    <w:bookmarkStart w:id="60" w:name="ref-reznick2000"/>
     <w:p>
       <w:pPr>
         <w:pStyle w:val="Bibliography"/>
       </w:pPr>
       <w:r>
-        <w:t xml:space="preserve">Careau, V., and R. Wilson. 2017. Of uberfleas and krakens: Detecting trade-offs using mixed models. Integr Comp Biol 57:362–371.</w:t>
-      </w:r>
-    </w:p>
-    <w:bookmarkEnd w:id="46"/>
-    <w:bookmarkStart w:id="47" w:name="ref-cavaleiro2014"/>
+        <w:t xml:space="preserve">Reznick, D., L. Nunney, and A. Tessier. 2000. Big houses, big cars, superfleas and the costs of reproduction. Trends Ecol Evol 15:421–425.</w:t>
+      </w:r>
+    </w:p>
+    <w:bookmarkEnd w:id="60"/>
+    <w:bookmarkStart w:id="61" w:name="ref-roff1992a"/>
     <w:p>
       <w:pPr>
         <w:pStyle w:val="Bibliography"/>
       </w:pPr>
       <w:r>
-        <w:t xml:space="preserve">Cavaleiro, F. I., and M. J. Santos. 2014. Egg number-egg size: An important trade-off in parasite life history strategies. Int J Parasitol 44:173–182.</w:t>
-      </w:r>
-    </w:p>
-    <w:bookmarkEnd w:id="47"/>
-    <w:bookmarkStart w:id="48" w:name="ref-church2019"/>
+        <w:t xml:space="preserve">Roff, D. 1992.</w:t>
+      </w:r>
+      <w:r>
+        <w:t xml:space="preserve"> </w:t>
+      </w:r>
+      <w:r>
+        <w:t xml:space="preserve">Evolution of Life Histories: Theory and Analysis</w:t>
+      </w:r>
+      <w:r>
+        <w:t xml:space="preserve">. Chapman &amp; Hall, Inc., New York, NY.</w:t>
+      </w:r>
+    </w:p>
+    <w:bookmarkEnd w:id="61"/>
+    <w:bookmarkStart w:id="62" w:name="ref-schindelin2012"/>
     <w:p>
       <w:pPr>
         <w:pStyle w:val="Bibliography"/>
       </w:pPr>
       <w:r>
-        <w:t xml:space="preserve">Church, S. H., S. Donoughe, B. A. S. de Medeiros, and C. G. Extavour. 2019. Insect egg size and shape evolve with ecology but not developmental rate. Nature 571:58–62.</w:t>
-      </w:r>
-    </w:p>
-    <w:bookmarkEnd w:id="48"/>
-    <w:bookmarkStart w:id="49" w:name="ref-clutton-brock1984"/>
+        <w:t xml:space="preserve">Schindelin, J., I. Arganda-Carreras, E. Frise, V. Kaynig, M. Longair, T. Pietzsch, S. Preibisch, C. Rueden, S. Saalfeld, B. Schmid, J.-Y. Tinevez, D. J. White, V. Hartenstein, K. Eliceiri, P. Tomancak, and A. Cardona. 2012. Fiji: An open-source platform for biological-image analysis. Nat Methods 9:676–682. Max Planck Institute of Molecular Cell Biology; Genetics, Dresden, Germany.</w:t>
+      </w:r>
+    </w:p>
+    <w:bookmarkEnd w:id="62"/>
+    <w:bookmarkStart w:id="63" w:name="ref-seko2006"/>
     <w:p>
       <w:pPr>
         <w:pStyle w:val="Bibliography"/>
       </w:pPr>
       <w:r>
-        <w:t xml:space="preserve">Clutton-Brock, T. H. 1984. Reproductive effort and terminal investment in iteroparous animals. Am Nat 123:212–229.</w:t>
-      </w:r>
-    </w:p>
-    <w:bookmarkEnd w:id="49"/>
-    <w:bookmarkStart w:id="50" w:name="ref-clutton-brock1991"/>
+        <w:t xml:space="preserve">Seko, T., T. Miyatake, S. Fujioka, and F. Nakasuji. 2006. Genetic and environmental sources of egg size, fecundity and body size in the migrant skipper, parnara guttata guttata (lepidoptera: hesperiidae). Popul Ecol 48:225–232.</w:t>
+      </w:r>
+    </w:p>
+    <w:bookmarkEnd w:id="63"/>
+    <w:bookmarkStart w:id="64" w:name="ref-shine1978"/>
     <w:p>
       <w:pPr>
         <w:pStyle w:val="Bibliography"/>
       </w:pPr>
       <w:r>
-        <w:t xml:space="preserve">Clutton-Brock, T. H. 1991.</w:t>
-      </w:r>
-      <w:r>
-        <w:t xml:space="preserve"> </w:t>
-      </w:r>
-      <w:r>
-        <w:t xml:space="preserve">The Evolution of Parental Care</w:t>
-      </w:r>
-      <w:r>
-        <w:t xml:space="preserve">. Princeton University Press.</w:t>
-      </w:r>
-    </w:p>
-    <w:bookmarkEnd w:id="50"/>
-    <w:bookmarkStart w:id="51" w:name="ref-einum2000"/>
+        <w:t xml:space="preserve">Shine, R. 1978. Propagule size and parental care: The</w:t>
+      </w:r>
+      <w:r>
+        <w:t xml:space="preserve"> </w:t>
+      </w:r>
+      <w:r>
+        <w:t xml:space="preserve">“safe harbor”</w:t>
+      </w:r>
+      <w:r>
+        <w:t xml:space="preserve"> </w:t>
+      </w:r>
+      <w:r>
+        <w:t xml:space="preserve">hypothesis. J Theor Biol 75:417–424.</w:t>
+      </w:r>
+    </w:p>
+    <w:bookmarkEnd w:id="64"/>
+    <w:bookmarkStart w:id="65" w:name="ref-simpson1951"/>
     <w:p>
       <w:pPr>
         <w:pStyle w:val="Bibliography"/>
       </w:pPr>
       <w:r>
-        <w:t xml:space="preserve">Einum, S., and I. A. Fleming. 2000. Highly fecund mothers sacrifice offspring survival to maximize fitness. Nature 405:565–567.</w:t>
-      </w:r>
-    </w:p>
-    <w:bookmarkEnd w:id="51"/>
-    <w:bookmarkStart w:id="52" w:name="ref-falconer1996"/>
+        <w:t xml:space="preserve">Simpson, E. H. 1951. The interpretation of interaction in contingency tables. Journal of the Royal Statistical Society: Series B (Methodological) 13:238–241.</w:t>
+      </w:r>
+    </w:p>
+    <w:bookmarkEnd w:id="65"/>
+    <w:bookmarkStart w:id="66" w:name="ref-slagsvold1984"/>
     <w:p>
       <w:pPr>
         <w:pStyle w:val="Bibliography"/>
       </w:pPr>
       <w:r>
-        <w:t xml:space="preserve">Falconer, D. S., and T. F. C. MacKay. 1996.</w:t>
-      </w:r>
-      <w:r>
-        <w:t xml:space="preserve"> </w:t>
-      </w:r>
-      <w:r>
-        <w:t xml:space="preserve">An Introduction Quantitative Genetics</w:t>
-      </w:r>
-      <w:r>
-        <w:t xml:space="preserve">. Pearson Education Limited, Essex, England.</w:t>
-      </w:r>
-    </w:p>
-    <w:bookmarkEnd w:id="52"/>
-    <w:bookmarkStart w:id="53" w:name="ref-ficetola2009"/>
+        <w:t xml:space="preserve">Slagsvold, T., J. Sandvik, G. Rofstad, Ö. Lorentsen, and M. Husby. 1984. On the adaptive value of intraclutch egg-size variation in birds. The Auk 101:685–697.</w:t>
+      </w:r>
+    </w:p>
+    <w:bookmarkEnd w:id="66"/>
+    <w:bookmarkStart w:id="67" w:name="ref-smith1974"/>
     <w:p>
       <w:pPr>
         <w:pStyle w:val="Bibliography"/>
       </w:pPr>
       <w:r>
-        <w:t xml:space="preserve">Ficetola, G. F., and F. De Bernardi. 2009. Offspring size and survival in the frog rana latastei: From among-population to within-clutch variation. Biol J Linn Soc 97:845–853.</w:t>
-      </w:r>
-    </w:p>
-    <w:bookmarkEnd w:id="53"/>
-    <w:bookmarkStart w:id="54" w:name="ref-fox2000"/>
-    <w:p>
-      <w:pPr>
-        <w:pStyle w:val="Bibliography"/>
-      </w:pPr>
-      <w:r>
-        <w:t xml:space="preserve">Fox, C. W., and M. E. Czesak. 2000. Evolutionary ecology of progeny size in arthropods. Annu Rev Entomol 45:341–369.</w:t>
-      </w:r>
-    </w:p>
-    <w:bookmarkEnd w:id="54"/>
-    <w:bookmarkStart w:id="55" w:name="ref-hargitai2005"/>
-    <w:p>
-      <w:pPr>
-        <w:pStyle w:val="Bibliography"/>
-      </w:pPr>
-      <w:r>
-        <w:t xml:space="preserve">Hargitai, R., J. Török, L. Tóth, G. Hegyi, B. Rosivall, B. Szigeti, and E. Szöllősi. 2005. Effects of environmental conditions and parental quality on inter-and intraclutch egg-size variation in the collared flycatcher (ficedula albicollis). The Auk 122:509–522.</w:t>
-      </w:r>
-    </w:p>
-    <w:bookmarkEnd w:id="55"/>
-    <w:bookmarkStart w:id="56" w:name="ref-harvey1983"/>
-    <w:p>
-      <w:pPr>
-        <w:pStyle w:val="Bibliography"/>
-      </w:pPr>
-      <w:r>
-        <w:t xml:space="preserve">Harvey, G. T. 1983. Environmental and genetic effects on mean egg weight in spruce budworm (lepidoptera: tortricidae). The Canadian Entomologist 115:1109–1117.</w:t>
-      </w:r>
-    </w:p>
-    <w:bookmarkEnd w:id="56"/>
-    <w:bookmarkStart w:id="57" w:name="ref-kelly2014"/>
-    <w:p>
-      <w:pPr>
-        <w:pStyle w:val="Bibliography"/>
-      </w:pPr>
-      <w:r>
-        <w:t xml:space="preserve">Kelly, C. D., B. Tawes, and A. Worthington. 2014. Evaluating indices of body condition in two cricket species. Ecology and Evolution 4:4476–4487.</w:t>
-      </w:r>
-    </w:p>
-    <w:bookmarkEnd w:id="57"/>
-    <w:bookmarkStart w:id="58" w:name="ref-koch2014"/>
-    <w:p>
-      <w:pPr>
-        <w:pStyle w:val="Bibliography"/>
-      </w:pPr>
-      <w:r>
-        <w:t xml:space="preserve">Koch, L. K., and J. Meunier. 2014. Mother and offspring fitness in an insect with maternal care: Phenotypic trade-offs between egg number, egg mass and egg care. BMC Evol Biol 14:125.</w:t>
-      </w:r>
-    </w:p>
-    <w:bookmarkEnd w:id="58"/>
-    <w:bookmarkStart w:id="59" w:name="ref-kolliker2007"/>
-    <w:p>
-      <w:pPr>
-        <w:pStyle w:val="Bibliography"/>
-      </w:pPr>
-      <w:r>
-        <w:t xml:space="preserve">Kölliker, M. 2007. Benefits and costs of earwig (forficula auricularia) family life. Behav Ecol Sociobiol 61:1489–1497.</w:t>
-      </w:r>
-    </w:p>
-    <w:bookmarkEnd w:id="59"/>
-    <w:bookmarkStart w:id="60" w:name="ref-meunier2024"/>
-    <w:p>
-      <w:pPr>
-        <w:pStyle w:val="Bibliography"/>
-      </w:pPr>
-      <w:r>
-        <w:t xml:space="preserve">Meunier, J. 2024. The biology and social life of earwigs (dermaptera). Annu Rev Entomol 69:259–276.</w:t>
-      </w:r>
-    </w:p>
-    <w:bookmarkEnd w:id="60"/>
-    <w:bookmarkStart w:id="61" w:name="ref-nelson2004"/>
-    <w:p>
-      <w:pPr>
-        <w:pStyle w:val="Bibliography"/>
-      </w:pPr>
-      <w:r>
-        <w:t xml:space="preserve">Nelson, N. J., M. B. Thompson, S. Pledger, S. N. Keall, and C. H. Daugherty. 2004. Egg mass determines hatchling size, and incubation temperature influences post‐hatching growth, of tuatara sphenodon punctatus. J Zool 263:77–87.</w:t>
-      </w:r>
-    </w:p>
-    <w:bookmarkEnd w:id="61"/>
-    <w:bookmarkStart w:id="62" w:name="ref-nilsson1993"/>
-    <w:p>
-      <w:pPr>
-        <w:pStyle w:val="Bibliography"/>
-      </w:pPr>
-      <w:r>
-        <w:t xml:space="preserve">Nilsson, J. ‐Å., and E. Svensson. 1993. Causes and consequences of egg mass variation between and within blue tit clutches. J Zool 230:469–481.</w:t>
-      </w:r>
-    </w:p>
-    <w:bookmarkEnd w:id="62"/>
-    <w:bookmarkStart w:id="63" w:name="ref-parker1982"/>
-    <w:p>
-      <w:pPr>
-        <w:pStyle w:val="Bibliography"/>
-      </w:pPr>
-      <w:r>
-        <w:t xml:space="preserve">Parker, G. A. 1982. Why are there so many tiny sperm? Sperm competition and the maintenance of two sexes. J Theor Biol 96:281–294.</w:t>
-      </w:r>
-    </w:p>
-    <w:bookmarkEnd w:id="63"/>
-    <w:bookmarkStart w:id="64" w:name="ref-peig2009"/>
-    <w:p>
-      <w:pPr>
-        <w:pStyle w:val="Bibliography"/>
-      </w:pPr>
-      <w:r>
-        <w:t xml:space="preserve">Peig, J., and A. J. Green. 2009. New perspectives for estimating body condition from mass/length data: The scaled mass index as an alternative method. Oikos 118:1883–1891.</w:t>
-      </w:r>
-    </w:p>
-    <w:bookmarkEnd w:id="64"/>
-    <w:bookmarkStart w:id="65" w:name="ref-peig2010"/>
-    <w:p>
-      <w:pPr>
-        <w:pStyle w:val="Bibliography"/>
-      </w:pPr>
-      <w:r>
-        <w:t xml:space="preserve">Peig, J., and A. J. Green. 2010. The paradigm of body condition: A critical reappraisal of current methods based on mass and length. Funct Ecol 24:1323–1332.</w:t>
-      </w:r>
-    </w:p>
-    <w:bookmarkEnd w:id="65"/>
-    <w:bookmarkStart w:id="66" w:name="ref-r2013"/>
-    <w:p>
-      <w:pPr>
-        <w:pStyle w:val="Bibliography"/>
-      </w:pPr>
-      <w:r>
-        <w:t xml:space="preserve">R Core Team. 2025.</w:t>
-      </w:r>
-      <w:r>
-        <w:t xml:space="preserve"> </w:t>
-      </w:r>
-      <w:r>
-        <w:t xml:space="preserve">R</w:t>
-      </w:r>
-      <w:r>
-        <w:t xml:space="preserve">:</w:t>
-      </w:r>
-      <w:r>
-        <w:t xml:space="preserve"> </w:t>
-      </w:r>
-      <w:r>
-        <w:t xml:space="preserve">A</w:t>
-      </w:r>
-      <w:r>
-        <w:t xml:space="preserve"> </w:t>
-      </w:r>
-      <w:r>
-        <w:t xml:space="preserve">language and environment for statistical computing. Vienna, Austria.</w:t>
-      </w:r>
-    </w:p>
-    <w:bookmarkEnd w:id="66"/>
-    <w:bookmarkStart w:id="67" w:name="ref-reznick2000"/>
-    <w:p>
-      <w:pPr>
-        <w:pStyle w:val="Bibliography"/>
-      </w:pPr>
-      <w:r>
-        <w:t xml:space="preserve">Reznick, D., L. Nunney, and A. Tessier. 2000. Big houses, big cars, superfleas and the costs of reproduction. Trends Ecol Evol 15:421–425.</w:t>
+        <w:t xml:space="preserve">Smith, C. C., and S. D. Fretwell. 1974. The optimal balance between size and number of offspring. Am Nat 108:499–506.</w:t>
       </w:r>
     </w:p>
     <w:bookmarkEnd w:id="67"/>
-    <w:bookmarkStart w:id="68" w:name="ref-roff1992a"/>
-    <w:p>
-      <w:pPr>
-        <w:pStyle w:val="Bibliography"/>
-      </w:pPr>
-      <w:r>
-        <w:t xml:space="preserve">Roff, D. 1992.</w:t>
-      </w:r>
-      <w:r>
-        <w:t xml:space="preserve"> </w:t>
-      </w:r>
-      <w:r>
-        <w:t xml:space="preserve">Evolution of Life Histories: Theory and Analysis</w:t>
-      </w:r>
-      <w:r>
-        <w:t xml:space="preserve">. Chapman &amp; Hall, Inc., New York, NY.</w:t>
-      </w:r>
-    </w:p>
-    <w:bookmarkEnd w:id="68"/>
-    <w:bookmarkStart w:id="69" w:name="ref-schindelin2012"/>
-    <w:p>
-      <w:pPr>
-        <w:pStyle w:val="Bibliography"/>
-      </w:pPr>
-      <w:r>
-        <w:t xml:space="preserve">Schindelin, J., I. Arganda-Carreras, E. Frise, V. Kaynig, M. Longair, T. Pietzsch, S. Preibisch, C. Rueden, S. Saalfeld, B. Schmid, J.-Y. Tinevez, D. J. White, V. Hartenstein, K. Eliceiri, P. Tomancak, and A. Cardona. 2012. Fiji: An open-source platform for biological-image analysis. Nat Methods 9:676–682. Max Planck Institute of Molecular Cell Biology; Genetics, Dresden, Germany.</w:t>
-      </w:r>
-    </w:p>
-    <w:bookmarkEnd w:id="69"/>
-    <w:bookmarkStart w:id="70" w:name="ref-seko2006"/>
-    <w:p>
-      <w:pPr>
-        <w:pStyle w:val="Bibliography"/>
-      </w:pPr>
-      <w:r>
-        <w:t xml:space="preserve">Seko, T., T. Miyatake, S. Fujioka, and F. Nakasuji. 2006. Genetic and environmental sources of egg size, fecundity and body size in the migrant skipper, parnara guttata guttata (lepidoptera: hesperiidae). Popul Ecol 48:225–232.</w:t>
-      </w:r>
-    </w:p>
-    <w:bookmarkEnd w:id="70"/>
-    <w:bookmarkStart w:id="71" w:name="ref-shine1978"/>
-    <w:p>
-      <w:pPr>
-        <w:pStyle w:val="Bibliography"/>
-      </w:pPr>
-      <w:r>
-        <w:t xml:space="preserve">Shine, R. 1978. Propagule size and parental care: The</w:t>
-      </w:r>
-      <w:r>
-        <w:t xml:space="preserve"> </w:t>
-      </w:r>
-      <w:r>
-        <w:t xml:space="preserve">“safe harbor”</w:t>
-      </w:r>
-      <w:r>
-        <w:t xml:space="preserve"> </w:t>
-      </w:r>
-      <w:r>
-        <w:t xml:space="preserve">hypothesis. J Theor Biol 75:417–424.</w:t>
-      </w:r>
-    </w:p>
-    <w:bookmarkEnd w:id="71"/>
-    <w:bookmarkStart w:id="72" w:name="ref-simpson1951"/>
-    <w:p>
-      <w:pPr>
-        <w:pStyle w:val="Bibliography"/>
-      </w:pPr>
-      <w:r>
-        <w:t xml:space="preserve">Simpson, E. H. 1951. The interpretation of interaction in contingency tables. Journal of the Royal Statistical Society: Series B (Methodological) 13:238–241.</w:t>
-      </w:r>
-    </w:p>
-    <w:bookmarkEnd w:id="72"/>
-    <w:bookmarkStart w:id="73" w:name="ref-slagsvold1984"/>
-    <w:p>
-      <w:pPr>
-        <w:pStyle w:val="Bibliography"/>
-      </w:pPr>
-      <w:r>
-        <w:t xml:space="preserve">Slagsvold, T., J. Sandvik, G. Rofstad, Ö. Lorentsen, and M. Husby. 1984. On the adaptive value of intraclutch egg-size variation in birds. The Auk 101:685–697.</w:t>
-      </w:r>
-    </w:p>
-    <w:bookmarkEnd w:id="73"/>
-    <w:bookmarkStart w:id="74" w:name="ref-smith1974"/>
-    <w:p>
-      <w:pPr>
-        <w:pStyle w:val="Bibliography"/>
-      </w:pPr>
-      <w:r>
-        <w:t xml:space="preserve">Smith, C. C., and S. D. Fretwell. 1974. The optimal balance between size and number of offspring. Am Nat 108:499–506.</w:t>
-      </w:r>
-    </w:p>
-    <w:bookmarkEnd w:id="74"/>
-    <w:bookmarkStart w:id="75" w:name="ref-staerkle2008"/>
+    <w:bookmarkStart w:id="68" w:name="ref-staerkle2008"/>
     <w:p>
       <w:pPr>
         <w:pStyle w:val="Bibliography"/>
@@ -4864,8 +2359,8 @@
         <w:t xml:space="preserve">). Ethology 114:844–850.</w:t>
       </w:r>
     </w:p>
-    <w:bookmarkEnd w:id="75"/>
-    <w:bookmarkStart w:id="76" w:name="ref-stearns1992"/>
+    <w:bookmarkEnd w:id="68"/>
+    <w:bookmarkStart w:id="69" w:name="ref-stearns1992"/>
     <w:p>
       <w:pPr>
         <w:pStyle w:val="Bibliography"/>
@@ -4883,8 +2378,8 @@
         <w:t xml:space="preserve">. Oxford University Press.</w:t>
       </w:r>
     </w:p>
-    <w:bookmarkEnd w:id="76"/>
-    <w:bookmarkStart w:id="77" w:name="ref-stoffel2017"/>
+    <w:bookmarkEnd w:id="69"/>
+    <w:bookmarkStart w:id="70" w:name="ref-stoffel2017"/>
     <w:p>
       <w:pPr>
         <w:pStyle w:val="Bibliography"/>
@@ -4899,8 +2394,8 @@
         <w:t xml:space="preserve">: Repeatability estimation and variance decomposition by generalized linear mixed‐effects models. Methods Ecol Evol 8:1639–1644.</w:t>
       </w:r>
     </w:p>
-    <w:bookmarkEnd w:id="77"/>
-    <w:bookmarkStart w:id="78" w:name="ref-torres-vila2012"/>
+    <w:bookmarkEnd w:id="70"/>
+    <w:bookmarkStart w:id="71" w:name="ref-torres-vila2012"/>
     <w:p>
       <w:pPr>
         <w:pStyle w:val="Bibliography"/>
@@ -4925,8 +2420,8 @@
         <w:t xml:space="preserve">L. Cauterruccio, ed. Moths: Types, ecological significance and control methods. Nova Science Publishers, New York, NY.</w:t>
       </w:r>
     </w:p>
-    <w:bookmarkEnd w:id="78"/>
-    <w:bookmarkStart w:id="79" w:name="ref-tourneur2018"/>
+    <w:bookmarkEnd w:id="71"/>
+    <w:bookmarkStart w:id="72" w:name="ref-tourneur2018"/>
     <w:p>
       <w:pPr>
         <w:pStyle w:val="Bibliography"/>
@@ -4951,8 +2446,8 @@
         <w:t xml:space="preserve">(dermaptera: Forficulidae) in three climatologically different zones of north america. The Canadian Entomologist 150:511–519.</w:t>
       </w:r>
     </w:p>
-    <w:bookmarkEnd w:id="79"/>
-    <w:bookmarkStart w:id="80" w:name="ref-tourneur1992"/>
+    <w:bookmarkEnd w:id="72"/>
+    <w:bookmarkStart w:id="73" w:name="ref-tourneur1992"/>
     <w:p>
       <w:pPr>
         <w:pStyle w:val="Bibliography"/>
@@ -5022,8 +2517,8 @@
         <w:t xml:space="preserve">orficulidae). The Canadian Entomologist 124:1055–1061.</w:t>
       </w:r>
     </w:p>
-    <w:bookmarkEnd w:id="80"/>
-    <w:bookmarkStart w:id="81" w:name="ref-vannoordwijk1986"/>
+    <w:bookmarkEnd w:id="73"/>
+    <w:bookmarkStart w:id="74" w:name="ref-vannoordwijk1986"/>
     <w:p>
       <w:pPr>
         <w:pStyle w:val="Bibliography"/>
@@ -5032,8 +2527,8 @@
         <w:t xml:space="preserve">Van Noordwijk, A. J., and G. de Jong. 1986. Acquisition and allocation of resources: Their influence on variation in life history tactics. Am Nat 128:137–142.</w:t>
       </w:r>
     </w:p>
-    <w:bookmarkEnd w:id="81"/>
-    <w:bookmarkStart w:id="82" w:name="ref-williams1994"/>
+    <w:bookmarkEnd w:id="74"/>
+    <w:bookmarkStart w:id="75" w:name="ref-williams1994"/>
     <w:p>
       <w:pPr>
         <w:pStyle w:val="Bibliography"/>
@@ -5042,8 +2537,8 @@
         <w:t xml:space="preserve">Williams, T. D. 1994. Intraspecific variation in egg size and egg composition in birds: Effects on offspring fitness. Biol Rev Camb Philos Soc 69:35–59.</w:t>
       </w:r>
     </w:p>
-    <w:bookmarkEnd w:id="82"/>
-    <w:bookmarkStart w:id="83" w:name="ref-winkler1987"/>
+    <w:bookmarkEnd w:id="75"/>
+    <w:bookmarkStart w:id="76" w:name="ref-winkler1987"/>
     <w:p>
       <w:pPr>
         <w:pStyle w:val="Bibliography"/>
@@ -5052,8 +2547,8 @@
         <w:t xml:space="preserve">Winkler, D. W., and K. Wallin. 1987. Offspring size and number: A life history model linking effort per offspring and total effort. Am Nat 129:708–720.</w:t>
       </w:r>
     </w:p>
-    <w:bookmarkEnd w:id="83"/>
-    <w:bookmarkStart w:id="84" w:name="ref-yanagi2006"/>
+    <w:bookmarkEnd w:id="76"/>
+    <w:bookmarkStart w:id="77" w:name="ref-yanagi2006"/>
     <w:p>
       <w:pPr>
         <w:pStyle w:val="Bibliography"/>
@@ -5062,8 +2557,8 @@
         <w:t xml:space="preserve">Yanagi, S., T. Oikawa, and T. Miyatake. 2006. Heritability and genetic correlation estimates for egg size and number in callosobruchus chinensis (coleoptera: bruchidae). Ann Entomol Soc Am 99:364–368.</w:t>
       </w:r>
     </w:p>
-    <w:bookmarkEnd w:id="84"/>
-    <w:bookmarkStart w:id="85" w:name="ref-yosef2008"/>
+    <w:bookmarkEnd w:id="77"/>
+    <w:bookmarkStart w:id="78" w:name="ref-yosef2008"/>
     <w:p>
       <w:pPr>
         <w:pStyle w:val="Bibliography"/>
@@ -5072,8 +2567,8 @@
         <w:t xml:space="preserve">Yosef, R., and P. Zduniak. 2008. Variation in clutch size, egg size variability and reproductive output in the desert finch (rhodospiza obsoleta). J Arid Environ 72:1631–1635.</w:t>
       </w:r>
     </w:p>
-    <w:bookmarkEnd w:id="85"/>
-    <w:bookmarkEnd w:id="86"/>
+    <w:bookmarkEnd w:id="78"/>
+    <w:bookmarkEnd w:id="79"/>
     <w:p>
       <w:pPr>
         <w:pStyle w:val="BodyText"/>
@@ -5103,7 +2598,7 @@
       <w:tr>
         <w:tc>
           <w:tcPr/>
-          <w:bookmarkStart w:id="90" w:name="fig-one"/>
+          <w:bookmarkStart w:id="83" w:name="fig-one"/>
           <w:p>
             <w:pPr>
               <w:pStyle w:val="Compact"/>
@@ -5114,18 +2609,18 @@
                 <wp:inline>
                   <wp:extent cx="3810000" cy="2540000"/>
                   <wp:effectExtent b="0" l="0" r="0" t="0"/>
-                  <wp:docPr descr="" title="" id="88" name="Picture"/>
+                  <wp:docPr descr="" title="" id="81" name="Picture"/>
                   <a:graphic>
                     <a:graphicData uri="http://schemas.openxmlformats.org/drawingml/2006/picture">
                       <pic:pic>
                         <pic:nvPicPr>
-                          <pic:cNvPr descr="figure_1.jpg" id="89" name="Picture"/>
+                          <pic:cNvPr descr="figure_1.jpg" id="82" name="Picture"/>
                           <pic:cNvPicPr>
                             <a:picLocks noChangeArrowheads="1" noChangeAspect="1"/>
                           </pic:cNvPicPr>
                         </pic:nvPicPr>
                         <pic:blipFill>
-                          <a:blip r:embed="rId87"/>
+                          <a:blip r:embed="rId80"/>
                           <a:stretch>
                             <a:fillRect/>
                           </a:stretch>
@@ -5162,7 +2657,7 @@
               <w:pStyle w:val="ImageCaption"/>
             </w:pPr>
             <w:r>
-              <w:t xml:space="preserve">Figure 1: Relationship between mean egg number per female and mean egg size per female. Each point represents a single female (averaged across clutches). The solid black line shows the posterior mean regression from the within–between mixed-effects model,</w:t>
+              <w:t xml:space="preserve">Figure 1: Relationship between mean egg number per female and mean egg size per female. Each point represents a single female (average of both clutches). The solid black line shows the posterior mean regression from the within–between mixed-effects model,</w:t>
             </w:r>
             <w:r>
               <w:t xml:space="preserve"> </w:t>
@@ -5229,7 +2724,7 @@
               <w:t xml:space="preserve">= -0.31, 95% CI [-0.55, -0.02]).</w:t>
             </w:r>
           </w:p>
-          <w:bookmarkEnd w:id="90"/>
+          <w:bookmarkEnd w:id="83"/>
         </w:tc>
       </w:tr>
     </w:tbl>
@@ -5254,7 +2749,7 @@
       <w:tr>
         <w:tc>
           <w:tcPr/>
-          <w:bookmarkStart w:id="94" w:name="fig-two"/>
+          <w:bookmarkStart w:id="87" w:name="fig-two"/>
           <w:p>
             <w:pPr>
               <w:pStyle w:val="Compact"/>
@@ -5265,18 +2760,18 @@
                 <wp:inline>
                   <wp:extent cx="3810000" cy="2540000"/>
                   <wp:effectExtent b="0" l="0" r="0" t="0"/>
-                  <wp:docPr descr="" title="" id="92" name="Picture"/>
+                  <wp:docPr descr="" title="" id="85" name="Picture"/>
                   <a:graphic>
                     <a:graphicData uri="http://schemas.openxmlformats.org/drawingml/2006/picture">
                       <pic:pic>
                         <pic:nvPicPr>
-                          <pic:cNvPr descr="figure_2.jpg" id="93" name="Picture"/>
+                          <pic:cNvPr descr="figure_2.jpg" id="86" name="Picture"/>
                           <pic:cNvPicPr>
                             <a:picLocks noChangeArrowheads="1" noChangeAspect="1"/>
                           </pic:cNvPicPr>
                         </pic:nvPicPr>
                         <pic:blipFill>
-                          <a:blip r:embed="rId91"/>
+                          <a:blip r:embed="rId84"/>
                           <a:stretch>
                             <a:fillRect/>
                           </a:stretch>
@@ -5338,24 +2833,36 @@
               <w:t xml:space="preserve">set_rescor(TRUE)</w:t>
             </w:r>
             <w:r>
-              <w:t xml:space="preserve">). Residuals therefore represent variation remaining after accounting for all fixed and random effects specified in</w:t>
+              <w:t xml:space="preserve">). Residuals therefore represent variation remaining after accounting for the random effects specified in</w:t>
             </w:r>
             <w:r>
               <w:t xml:space="preserve"> </w:t>
             </w:r>
-            <w:hyperlink w:anchor="eq-residual">
-              <w:r>
-                <w:rPr>
-                  <w:rStyle w:val="Hyperlink"/>
-                </w:rPr>
-                <w:t xml:space="preserve">Equation 2</w:t>
-              </w:r>
-            </w:hyperlink>
             <w:r>
-              <w:t xml:space="preserve">, isolating within-female covariance between traits. The solid black line shows the linear regression fit to the residual values for visualization (0.0066). The shallow slope is consistent with the posterior residual correlation estimated by the model (mean and 95% credible interval reported in text), indicating little evidence for a within-female trade-off between egg number and egg size.</w:t>
+              <w:rPr>
+                <w:b/>
+                <w:bCs/>
+              </w:rPr>
+              <w:t xml:space="preserve">?@eq-residual</w:t>
+            </w:r>
+            <w:r>
+              <w:t xml:space="preserve">, isolating within-female covariance between traits. The solid black line shows the linear regression fit to the residual values for visualization. The shallow slope is consistent with the posterior residual correlation estimated by the model (</w:t>
+            </w:r>
+            <w:r>
+              <w:rPr>
+                <w:i/>
+                <w:iCs/>
+              </w:rPr>
+              <w:t xml:space="preserve">r</w:t>
+            </w:r>
+            <w:r>
+              <w:t xml:space="preserve"> </w:t>
+            </w:r>
+            <w:r>
+              <w:t xml:space="preserve">= 0.0066 [-0.2018, 0.2299]), indicating little evidence for a within-female trade-off between egg number and egg size.</w:t>
             </w:r>
           </w:p>
-          <w:bookmarkEnd w:id="94"/>
+          <w:bookmarkEnd w:id="87"/>
         </w:tc>
       </w:tr>
     </w:tbl>
@@ -5380,7 +2887,7 @@
       <w:tr>
         <w:tc>
           <w:tcPr/>
-          <w:bookmarkStart w:id="98" w:name="fig-three"/>
+          <w:bookmarkStart w:id="91" w:name="fig-three"/>
           <w:p>
             <w:pPr>
               <w:pStyle w:val="Compact"/>
@@ -5391,18 +2898,18 @@
                 <wp:inline>
                   <wp:extent cx="3810000" cy="2540000"/>
                   <wp:effectExtent b="0" l="0" r="0" t="0"/>
-                  <wp:docPr descr="" title="" id="96" name="Picture"/>
+                  <wp:docPr descr="" title="" id="89" name="Picture"/>
                   <a:graphic>
                     <a:graphicData uri="http://schemas.openxmlformats.org/drawingml/2006/picture">
                       <pic:pic>
                         <pic:nvPicPr>
-                          <pic:cNvPr descr="figure_3.jpg" id="97" name="Picture"/>
+                          <pic:cNvPr descr="figure_3.jpg" id="90" name="Picture"/>
                           <pic:cNvPicPr>
                             <a:picLocks noChangeArrowheads="1" noChangeAspect="1"/>
                           </pic:cNvPicPr>
                         </pic:nvPicPr>
                         <pic:blipFill>
-                          <a:blip r:embed="rId95"/>
+                          <a:blip r:embed="rId88"/>
                           <a:stretch>
                             <a:fillRect/>
                           </a:stretch>
@@ -5439,14 +2946,101 @@
               <w:pStyle w:val="ImageCaption"/>
             </w:pPr>
             <w:r>
-              <w:t xml:space="preserve">Figure 3: Mean egg size plotted against within-female deviation in egg number (clutch size minus each female’s mean). Points represent individual broods, and thin gray lines connect successive broods from the same female. The solid black line shows the posterior mean population-level effect of within-female egg-number deviation estimated from the mixed-effects model. The shaded ribbon represents the 95% credible interval of the posterior expected value (random effects excluded). Positive values on the x-axis indicate broods in which a female laid more eggs than her average, whereas negative values indicate broods with fewer eggs than her average. Note that second clutches (blue points) tend to negatively deviate from zero whereas first clutches (salmon points) tend to positively deviate from zero.The slope of the population-level line reflects the estimated within-female plastic response of egg size to changes in egg number 0.]</w:t>
+              <w:t xml:space="preserve">Figure 3: Mean egg size plotted against within-female deviation in egg number (clutch size minus each female’s mean). Points represent individual clutches, and thin gray lines connect successive clutches from the same female. The solid black line shows the posterior mean population-level effect of within-female egg-number deviation estimated from the mixed-effects model. The shaded ribbon represents the 95% credible interval of the posterior expected value (random effects excluded). Positive values on the x-axis indicate broods in which a female laid more eggs than her average, whereas negative values indicate broods with fewer eggs than her average. Note that second clutches (blue points) tend to negatively deviate from zero whereas first clutches (salmon points) tend to positively deviate from zero. The slope of the population-level line reflects the estimated within-female plastic response of egg size to changes in egg number 0.</w:t>
             </w:r>
           </w:p>
-          <w:bookmarkEnd w:id="98"/>
+          <w:bookmarkEnd w:id="91"/>
         </w:tc>
       </w:tr>
     </w:tbl>
-    <w:bookmarkEnd w:id="99"/>
+    <w:p>
+      <w:pPr>
+        <w:pStyle w:val="BodyText"/>
+      </w:pPr>
+      <w:r>
+        <w:t xml:space="preserve"> </w:t>
+      </w:r>
+    </w:p>
+    <w:tbl>
+      <w:tblPr>
+        <w:tblStyle w:val="Table"/>
+        <w:tblW w:type="pct" w:w="5000"/>
+        <w:tblLayout w:type="fixed"/>
+        <w:tblLook w:firstRow="0" w:lastRow="0" w:firstColumn="0" w:lastColumn="0" w:noHBand="0" w:noVBand="0" w:val="0000"/>
+      </w:tblPr>
+      <w:tblGrid>
+        <w:gridCol w:w="7920"/>
+      </w:tblGrid>
+      <w:tr>
+        <w:tc>
+          <w:tcPr/>
+          <w:bookmarkStart w:id="95" w:name="fig-four"/>
+          <w:p>
+            <w:pPr>
+              <w:pStyle w:val="Compact"/>
+              <w:jc w:val="center"/>
+            </w:pPr>
+            <w:r>
+              <w:drawing>
+                <wp:inline>
+                  <wp:extent cx="3810000" cy="2540000"/>
+                  <wp:effectExtent b="0" l="0" r="0" t="0"/>
+                  <wp:docPr descr="" title="" id="93" name="Picture"/>
+                  <a:graphic>
+                    <a:graphicData uri="http://schemas.openxmlformats.org/drawingml/2006/picture">
+                      <pic:pic>
+                        <pic:nvPicPr>
+                          <pic:cNvPr descr="figure_4.jpg" id="94" name="Picture"/>
+                          <pic:cNvPicPr>
+                            <a:picLocks noChangeArrowheads="1" noChangeAspect="1"/>
+                          </pic:cNvPicPr>
+                        </pic:nvPicPr>
+                        <pic:blipFill>
+                          <a:blip r:embed="rId92"/>
+                          <a:stretch>
+                            <a:fillRect/>
+                          </a:stretch>
+                        </pic:blipFill>
+                        <pic:spPr bwMode="auto">
+                          <a:xfrm>
+                            <a:off x="0" y="0"/>
+                            <a:ext cx="3810000" cy="2540000"/>
+                          </a:xfrm>
+                          <a:prstGeom prst="rect">
+                            <a:avLst/>
+                          </a:prstGeom>
+                          <a:noFill/>
+                          <a:ln w="9525">
+                            <a:noFill/>
+                            <a:headEnd/>
+                            <a:tailEnd/>
+                          </a:ln>
+                        </pic:spPr>
+                      </pic:pic>
+                    </a:graphicData>
+                  </a:graphic>
+                </wp:inline>
+              </w:drawing>
+            </w:r>
+          </w:p>
+          <w:p>
+            <w:pPr>
+              <w:jc w:val="center"/>
+            </w:pPr>
+            <w:pPr>
+              <w:jc w:val="left"/>
+              <w:spacing w:before="200"/>
+              <w:pStyle w:val="ImageCaption"/>
+            </w:pPr>
+            <w:r>
+              <w:t xml:space="preserve">Figure 4: Clutch-specific variance components of egg size. (a) Between-female variance in egg size for first and second clutches, estimated from a hierarchical Bayesian model with clutch-specific female effects. (b) Within-clutch (egg-to-egg) variance for first and second clutches. Grey points represent posterior draws, black points indicate posterior medians, and vertical lines denote 95% credible intervals. Between-female variance did not differ clearly between clutches, whereas within-clutch variance was greater in second clutches.</w:t>
+            </w:r>
+          </w:p>
+          <w:bookmarkEnd w:id="95"/>
+        </w:tc>
+      </w:tr>
+    </w:tbl>
+    <w:bookmarkEnd w:id="96"/>
     <w:sectPr>
       <w:headerReference r:id="rId10" w:type="even"/>
       <w:headerReference r:id="rId9" w:type="default"/>
@@ -6213,176 +3807,6 @@
       </w:pPr>
     </w:lvl>
   </w:abstractNum>
-  <w:abstractNum w:abstractNumId="99411">
-    <w:nsid w:val="00A99411"/>
-    <w:multiLevelType w:val="multilevel"/>
-    <w:lvl w:ilvl="0">
-      <w:start w:val="1"/>
-      <w:numFmt w:val="decimal"/>
-      <w:lvlText w:val="%1."/>
-      <w:lvlJc w:val="left"/>
-      <w:pPr>
-        <w:ind w:left="720" w:hanging="360"/>
-      </w:pPr>
-    </w:lvl>
-    <w:lvl w:ilvl="1">
-      <w:start w:val="1"/>
-      <w:numFmt w:val="decimal"/>
-      <w:lvlText w:val="%2."/>
-      <w:lvlJc w:val="left"/>
-      <w:pPr>
-        <w:ind w:left="1440" w:hanging="360"/>
-      </w:pPr>
-    </w:lvl>
-    <w:lvl w:ilvl="2">
-      <w:start w:val="1"/>
-      <w:numFmt w:val="decimal"/>
-      <w:lvlText w:val="%3."/>
-      <w:lvlJc w:val="left"/>
-      <w:pPr>
-        <w:ind w:left="2160" w:hanging="360"/>
-      </w:pPr>
-    </w:lvl>
-    <w:lvl w:ilvl="3">
-      <w:start w:val="1"/>
-      <w:numFmt w:val="decimal"/>
-      <w:lvlText w:val="%4."/>
-      <w:lvlJc w:val="left"/>
-      <w:pPr>
-        <w:ind w:left="2880" w:hanging="360"/>
-      </w:pPr>
-    </w:lvl>
-    <w:lvl w:ilvl="4">
-      <w:start w:val="1"/>
-      <w:numFmt w:val="decimal"/>
-      <w:lvlText w:val="%5."/>
-      <w:lvlJc w:val="left"/>
-      <w:pPr>
-        <w:ind w:left="3600" w:hanging="360"/>
-      </w:pPr>
-    </w:lvl>
-    <w:lvl w:ilvl="5">
-      <w:start w:val="1"/>
-      <w:numFmt w:val="decimal"/>
-      <w:lvlText w:val="%6."/>
-      <w:lvlJc w:val="left"/>
-      <w:pPr>
-        <w:ind w:left="4320" w:hanging="360"/>
-      </w:pPr>
-    </w:lvl>
-    <w:lvl w:ilvl="6">
-      <w:start w:val="1"/>
-      <w:numFmt w:val="decimal"/>
-      <w:lvlText w:val="%7."/>
-      <w:lvlJc w:val="left"/>
-      <w:pPr>
-        <w:ind w:left="5040" w:hanging="360"/>
-      </w:pPr>
-    </w:lvl>
-    <w:lvl w:ilvl="7">
-      <w:start w:val="1"/>
-      <w:numFmt w:val="decimal"/>
-      <w:lvlText w:val="%8."/>
-      <w:lvlJc w:val="left"/>
-      <w:pPr>
-        <w:ind w:left="5760" w:hanging="360"/>
-      </w:pPr>
-    </w:lvl>
-    <w:lvl w:ilvl="8">
-      <w:start w:val="1"/>
-      <w:numFmt w:val="decimal"/>
-      <w:lvlText w:val="%9."/>
-      <w:lvlJc w:val="left"/>
-      <w:pPr>
-        <w:ind w:left="6480" w:hanging="360"/>
-      </w:pPr>
-    </w:lvl>
-  </w:abstractNum>
-  <w:abstractNum w:abstractNumId="99412">
-    <w:nsid w:val="00A99412"/>
-    <w:multiLevelType w:val="multilevel"/>
-    <w:lvl w:ilvl="0">
-      <w:start w:val="2"/>
-      <w:numFmt w:val="decimal"/>
-      <w:lvlText w:val="%1."/>
-      <w:lvlJc w:val="left"/>
-      <w:pPr>
-        <w:ind w:left="720" w:hanging="360"/>
-      </w:pPr>
-    </w:lvl>
-    <w:lvl w:ilvl="1">
-      <w:start w:val="2"/>
-      <w:numFmt w:val="decimal"/>
-      <w:lvlText w:val="%2."/>
-      <w:lvlJc w:val="left"/>
-      <w:pPr>
-        <w:ind w:left="1440" w:hanging="360"/>
-      </w:pPr>
-    </w:lvl>
-    <w:lvl w:ilvl="2">
-      <w:start w:val="2"/>
-      <w:numFmt w:val="decimal"/>
-      <w:lvlText w:val="%3."/>
-      <w:lvlJc w:val="left"/>
-      <w:pPr>
-        <w:ind w:left="2160" w:hanging="360"/>
-      </w:pPr>
-    </w:lvl>
-    <w:lvl w:ilvl="3">
-      <w:start w:val="2"/>
-      <w:numFmt w:val="decimal"/>
-      <w:lvlText w:val="%4."/>
-      <w:lvlJc w:val="left"/>
-      <w:pPr>
-        <w:ind w:left="2880" w:hanging="360"/>
-      </w:pPr>
-    </w:lvl>
-    <w:lvl w:ilvl="4">
-      <w:start w:val="2"/>
-      <w:numFmt w:val="decimal"/>
-      <w:lvlText w:val="%5."/>
-      <w:lvlJc w:val="left"/>
-      <w:pPr>
-        <w:ind w:left="3600" w:hanging="360"/>
-      </w:pPr>
-    </w:lvl>
-    <w:lvl w:ilvl="5">
-      <w:start w:val="2"/>
-      <w:numFmt w:val="decimal"/>
-      <w:lvlText w:val="%6."/>
-      <w:lvlJc w:val="left"/>
-      <w:pPr>
-        <w:ind w:left="4320" w:hanging="360"/>
-      </w:pPr>
-    </w:lvl>
-    <w:lvl w:ilvl="6">
-      <w:start w:val="2"/>
-      <w:numFmt w:val="decimal"/>
-      <w:lvlText w:val="%7."/>
-      <w:lvlJc w:val="left"/>
-      <w:pPr>
-        <w:ind w:left="5040" w:hanging="360"/>
-      </w:pPr>
-    </w:lvl>
-    <w:lvl w:ilvl="7">
-      <w:start w:val="2"/>
-      <w:numFmt w:val="decimal"/>
-      <w:lvlText w:val="%8."/>
-      <w:lvlJc w:val="left"/>
-      <w:pPr>
-        <w:ind w:left="5760" w:hanging="360"/>
-      </w:pPr>
-    </w:lvl>
-    <w:lvl w:ilvl="8">
-      <w:start w:val="2"/>
-      <w:numFmt w:val="decimal"/>
-      <w:lvlText w:val="%9."/>
-      <w:lvlJc w:val="left"/>
-      <w:pPr>
-        <w:ind w:left="6480" w:hanging="360"/>
-      </w:pPr>
-    </w:lvl>
-  </w:abstractNum>
   <w:num w16cid:durableId="1845054215" w:numId="1">
     <w:abstractNumId w:val="10"/>
   </w:num>
@@ -6424,66 +3848,6 @@
   </w:num>
   <w:num w:numId="1000">
     <w:abstractNumId w:val="990"/>
-  </w:num>
-  <w:num w:numId="1001">
-    <w:abstractNumId w:val="99411"/>
-    <w:lvlOverride w:ilvl="0">
-      <w:startOverride w:val="1"/>
-    </w:lvlOverride>
-    <w:lvlOverride w:ilvl="1">
-      <w:startOverride w:val="1"/>
-    </w:lvlOverride>
-    <w:lvlOverride w:ilvl="2">
-      <w:startOverride w:val="1"/>
-    </w:lvlOverride>
-    <w:lvlOverride w:ilvl="3">
-      <w:startOverride w:val="1"/>
-    </w:lvlOverride>
-    <w:lvlOverride w:ilvl="4">
-      <w:startOverride w:val="1"/>
-    </w:lvlOverride>
-    <w:lvlOverride w:ilvl="5">
-      <w:startOverride w:val="1"/>
-    </w:lvlOverride>
-    <w:lvlOverride w:ilvl="6">
-      <w:startOverride w:val="1"/>
-    </w:lvlOverride>
-    <w:lvlOverride w:ilvl="7">
-      <w:startOverride w:val="1"/>
-    </w:lvlOverride>
-    <w:lvlOverride w:ilvl="8">
-      <w:startOverride w:val="1"/>
-    </w:lvlOverride>
-  </w:num>
-  <w:num w:numId="1002">
-    <w:abstractNumId w:val="99412"/>
-    <w:lvlOverride w:ilvl="0">
-      <w:startOverride w:val="2"/>
-    </w:lvlOverride>
-    <w:lvlOverride w:ilvl="1">
-      <w:startOverride w:val="2"/>
-    </w:lvlOverride>
-    <w:lvlOverride w:ilvl="2">
-      <w:startOverride w:val="2"/>
-    </w:lvlOverride>
-    <w:lvlOverride w:ilvl="3">
-      <w:startOverride w:val="2"/>
-    </w:lvlOverride>
-    <w:lvlOverride w:ilvl="4">
-      <w:startOverride w:val="2"/>
-    </w:lvlOverride>
-    <w:lvlOverride w:ilvl="5">
-      <w:startOverride w:val="2"/>
-    </w:lvlOverride>
-    <w:lvlOverride w:ilvl="6">
-      <w:startOverride w:val="2"/>
-    </w:lvlOverride>
-    <w:lvlOverride w:ilvl="7">
-      <w:startOverride w:val="2"/>
-    </w:lvlOverride>
-    <w:lvlOverride w:ilvl="8">
-      <w:startOverride w:val="2"/>
-    </w:lvlOverride>
   </w:num>
 </w:numbering>
 </file>

</xml_diff>

<commit_message>
Re-did figures and Supp Mat has been revised with only two tables.
</commit_message>
<xml_diff>
--- a/2025_earwig_fecundity_revised/Backup of 2025_earwig_fecundity_revised.docx
+++ b/2025_earwig_fecundity_revised/Backup of 2025_earwig_fecundity_revised.docx
@@ -509,355 +509,484 @@
         <w:pStyle w:val="BodyText"/>
       </w:pPr>
       <w:r>
-        <w:t xml:space="preserve">All subsequent analyses were conducted in a Bayesian framework using the</w:t>
-      </w:r>
-      <w:r>
-        <w:t xml:space="preserve"> </w:t>
-      </w:r>
-      <w:r>
-        <w:rPr>
-          <w:i/>
-          <w:iCs/>
-        </w:rPr>
-        <w:t xml:space="preserve">brms</w:t>
-      </w:r>
-      <w:r>
-        <w:t xml:space="preserve"> </w:t>
-      </w:r>
-      <w:r>
-        <w:t xml:space="preserve">package</w:t>
-      </w:r>
-      <w:r>
-        <w:t xml:space="preserve"> </w:t>
-      </w:r>
-      <w:r>
-        <w:t xml:space="preserve">(Bürkner 2017)</w:t>
-      </w:r>
-      <w:r>
-        <w:t xml:space="preserve"> </w:t>
-      </w:r>
-      <w:r>
-        <w:t xml:space="preserve">in R. Models were fitted using Hamiltonian Monte Carlo sampling with four independent chains and 4,000 iterations per chain. Weakly informative priors were specified for all parameters to regularize estimation while remaining minimally restrictive. Convergence was evaluated using the potential scale reduction factor (</w:t>
+        <w:t xml:space="preserve">We first quantified associations among reproductive traits using raw phenotypic correlations. Pearson correlation coefficients were calculated using individual-level trait values, thereby capturing total phenotypic covariation across all sources of variation. These correlations reflect the combined contribution of consistent differences among females, within-clutch variation, and residual effects. Consequently, raw phenotypic correlations provide a descriptive estimate of overall trait associations but do not distinguish whether covariation arises from stable female differences or from within-clutch processes.</w:t>
+      </w:r>
+    </w:p>
+    <w:p>
+      <w:pPr>
+        <w:pStyle w:val="BodyText"/>
+      </w:pPr>
+      <w:r>
+        <w:t xml:space="preserve">To distinguish covariance arising from within-female plasticity from covariance attributable to consistent among-female differences, I followed the within–between decomposition approach of van de Pol and Wright (2009). For focal predictors that varied across clutches, each trait was decomposed into two components. The within-female component represented the deviation of each observation from that female’s own mean value, thereby capturing clutch-level deviations within individuals. The between-female component represented each female’s mean value relative to the population mean, capturing stable differences among females. Although mean-centering has been shown to impose assumptions about underlying biological processes (Westneat et al. 2020), these assumptions are appropriate here because the biological question concerns how reproductive allocation varies within females across clutches versus how females differ consistently in allocation strategy.</w:t>
+      </w:r>
+      <w:r>
+        <w:t xml:space="preserve"> </w:t>
+      </w:r>
+      <w:r>
+        <w:t xml:space="preserve">I fitted a Bayesian multivariate mixed-effects model in which multiple reproductive traits were modelled jointly. Continuous response variables were modelled assuming Gaussian error distributions with identity link functions, whereas count responses were modelled using negative binomial error distributions to account for overdispersion. The within- and between-female components of focal predictors were included simultaneously as fixed effects. Female identity was included as a random intercept across response variables, allowing estimation of among-female variance for each trait as well as covariance among traits at the female level. This multivariate framework partitions total phenotypic covariance into covariance attributable to consistent differences among females and covariance arising from within-female deviations across clutches.</w:t>
+      </w:r>
+    </w:p>
+    <w:p>
+      <w:pPr>
+        <w:pStyle w:val="BodyText"/>
+      </w:pPr>
+      <w:r>
+        <w:t xml:space="preserve">Within this model, the coefficient associated with the within-female component estimates the plastic response of a trait to clutch-level deviations in the predictor, whereas the coefficient associated with the between-female component estimates the among-female (strategic) association between traits. Because traits were modelled jointly, covariance among traits was estimated simultaneously at both the female and residual levels, thereby accounting for non-independence among reproductive traits and providing biologically interpretable estimates of trait correlations at each hierarchical level.</w:t>
+      </w:r>
+    </w:p>
+    <w:p>
+      <w:pPr>
+        <w:pStyle w:val="BodyText"/>
+      </w:pPr>
+      <w:r>
+        <w:t xml:space="preserve">Continuous predictors were standardized by centering on their mean and scaling by their standard deviation prior to analysis. The within- and between-female components were each standardized using the mean and standard deviation of their respective distributions. When estimating standardized regression coefficients, response variables were also scaled to have a standard deviation of one. Standardized coefficients therefore represent the expected change in the response trait, measured in standard deviation units, associated with a one standard deviation change in the predictor, facilitating comparison of effect sizes across traits measured on different scales.</w:t>
+      </w:r>
+      <w:r>
+        <w:t xml:space="preserve"> </w:t>
+      </w:r>
+      <w:r>
+        <w:t xml:space="preserve">To quantify the structure of egg size variation specifically, we fitted a univariate mixed-effects model in which egg size (standardised mean egg perimeter) was modelled as a Gaussian response with female identity included as a random intercept. This formulation partitions total phenotypic variance in egg size into variance attributable to differences among females and variance occurring within females among eggs within clutches. The among-female variance component represents consistent maternal differences in allocation to egg size, whereas the within-female component captures heterogeneity in provisioning within clutches as well as residual variation.</w:t>
+      </w:r>
+    </w:p>
+    <w:p>
+      <w:pPr>
+        <w:pStyle w:val="BodyText"/>
+      </w:pPr>
+      <w:r>
+        <w:t xml:space="preserve">Repeatability was estimated separately for each trait. Repeatability for egg size was derived from the univariate variance-partitioning model. For egg number, which was modelled under a negative binomial distribution within the multivariate framework, repeatability was calculated from the corresponding variance components of that model. Repeatability was estimated as the proportion of total phenotypic variance attributable to consistent differences among females. For both traits, repeatability was calculated from posterior samples of variance components, and uncertainty was quantified using 95% credible intervals. Because egg number was modelled using a negative binomial distribution, repeatability was calculated explicitly on the observation scale, ensuring that distribution-specific variance was included in the denominator. For egg size, which was modelled under a Gaussian error distribution, total phenotypic variance is the sum of among-female variance and residual variance. Observation-scale repeatability for egg size was therefore calculated as:</w:t>
+      </w:r>
+    </w:p>
+    <w:p>
+      <w:pPr>
+        <w:pStyle w:val="BodyText"/>
+      </w:pPr>
+      <m:oMathPara>
+        <m:oMathParaPr>
+          <m:jc m:val="center"/>
+        </m:oMathParaPr>
+        <m:oMath>
+          <m:sSub>
+            <m:e>
+              <m:r>
+                <m:t>R</m:t>
+              </m:r>
+            </m:e>
+            <m:sub>
+              <m:r>
+                <m:rPr>
+                  <m:nor/>
+                  <m:sty m:val="p"/>
+                </m:rPr>
+                <m:t>egg size</m:t>
+              </m:r>
+            </m:sub>
+          </m:sSub>
+          <m:r>
+            <m:rPr>
+              <m:sty m:val="p"/>
+            </m:rPr>
+            <m:t>=</m:t>
+          </m:r>
+          <m:f>
+            <m:fPr>
+              <m:type m:val="bar"/>
+            </m:fPr>
+            <m:num>
+              <m:sSub>
+                <m:e>
+                  <m:r>
+                    <m:t>V</m:t>
+                  </m:r>
+                </m:e>
+                <m:sub>
+                  <m:r>
+                    <m:t>F</m:t>
+                  </m:r>
+                </m:sub>
+              </m:sSub>
+            </m:num>
+            <m:den>
+              <m:sSub>
+                <m:e>
+                  <m:r>
+                    <m:t>V</m:t>
+                  </m:r>
+                </m:e>
+                <m:sub>
+                  <m:r>
+                    <m:t>F</m:t>
+                  </m:r>
+                </m:sub>
+              </m:sSub>
+              <m:r>
+                <m:rPr>
+                  <m:sty m:val="p"/>
+                </m:rPr>
+                <m:t>+</m:t>
+              </m:r>
+              <m:sSub>
+                <m:e>
+                  <m:r>
+                    <m:t>V</m:t>
+                  </m:r>
+                </m:e>
+                <m:sub>
+                  <m:r>
+                    <m:t>R</m:t>
+                  </m:r>
+                </m:sub>
+              </m:sSub>
+            </m:den>
+          </m:f>
+        </m:oMath>
+      </m:oMathPara>
+    </w:p>
+    <w:p>
+      <w:pPr>
+        <w:pStyle w:val="FirstParagraph"/>
+      </w:pPr>
+      <w:r>
+        <w:t xml:space="preserve">where</w:t>
+      </w:r>
+      <w:r>
+        <w:t xml:space="preserve"> </w:t>
       </w:r>
       <m:oMath>
-        <m:acc>
-          <m:accPr>
-            <m:chr m:val="̂"/>
-          </m:accPr>
+        <m:sSub>
           <m:e>
+            <m:r>
+              <m:t>V</m:t>
+            </m:r>
+          </m:e>
+          <m:sub>
+            <m:r>
+              <m:t>F</m:t>
+            </m:r>
+          </m:sub>
+        </m:sSub>
+      </m:oMath>
+      <w:r>
+        <w:t xml:space="preserve"> </w:t>
+      </w:r>
+      <w:r>
+        <w:t xml:space="preserve">is the among-female variance (i.e., variance of the female random intercept) and</w:t>
+      </w:r>
+      <w:r>
+        <w:t xml:space="preserve"> </w:t>
+      </w:r>
+      <m:oMath>
+        <m:sSub>
+          <m:e>
+            <m:r>
+              <m:t>V</m:t>
+            </m:r>
+          </m:e>
+          <m:sub>
             <m:r>
               <m:t>R</m:t>
             </m:r>
+          </m:sub>
+        </m:sSub>
+      </m:oMath>
+      <w:r>
+        <w:t xml:space="preserve"> </w:t>
+      </w:r>
+      <w:r>
+        <w:t xml:space="preserve">is the residual variance. Because the Gaussian model is parameterized directly on the observation scale, this formulation corresponds to both latent- and observation-scale repeatability.</w:t>
+      </w:r>
+      <w:r>
+        <w:t xml:space="preserve"> </w:t>
+      </w:r>
+      <w:r>
+        <w:t xml:space="preserve">For egg number, which was modelled using a negative binomial distribution, the variance depends on both the mean and the dispersion (shape) parameter. Under the negative binomial parameterization used in brms, the observation-level variance is given by:</w:t>
+      </w:r>
+    </w:p>
+    <w:p>
+      <w:pPr>
+        <w:pStyle w:val="BodyText"/>
+      </w:pPr>
+      <m:oMathPara>
+        <m:oMathParaPr>
+          <m:jc m:val="center"/>
+        </m:oMathParaPr>
+        <m:oMath>
+          <m:r>
+            <m:rPr>
+              <m:sty m:val="p"/>
+            </m:rPr>
+            <m:t>V</m:t>
+          </m:r>
+          <m:r>
+            <m:rPr>
+              <m:sty m:val="p"/>
+            </m:rPr>
+            <m:t>a</m:t>
+          </m:r>
+          <m:r>
+            <m:rPr>
+              <m:sty m:val="p"/>
+            </m:rPr>
+            <m:t>r</m:t>
+          </m:r>
+          <m:d>
+            <m:dPr>
+              <m:begChr m:val="("/>
+              <m:sepChr m:val=""/>
+              <m:endChr m:val=")"/>
+              <m:grow/>
+            </m:dPr>
+            <m:e>
+              <m:r>
+                <m:t>Y</m:t>
+              </m:r>
+            </m:e>
+          </m:d>
+          <m:r>
+            <m:rPr>
+              <m:sty m:val="p"/>
+            </m:rPr>
+            <m:t>=</m:t>
+          </m:r>
+          <m:r>
+            <m:t>μ</m:t>
+          </m:r>
+          <m:r>
+            <m:rPr>
+              <m:sty m:val="p"/>
+            </m:rPr>
+            <m:t>+</m:t>
+          </m:r>
+          <m:f>
+            <m:fPr>
+              <m:type m:val="bar"/>
+            </m:fPr>
+            <m:num>
+              <m:sSup>
+                <m:e>
+                  <m:r>
+                    <m:t>μ</m:t>
+                  </m:r>
+                </m:e>
+                <m:sup>
+                  <m:r>
+                    <m:t>2</m:t>
+                  </m:r>
+                </m:sup>
+              </m:sSup>
+            </m:num>
+            <m:den>
+              <m:r>
+                <m:t>θ</m:t>
+              </m:r>
+            </m:den>
+          </m:f>
+        </m:oMath>
+      </m:oMathPara>
+    </w:p>
+    <w:p>
+      <w:pPr>
+        <w:pStyle w:val="FirstParagraph"/>
+      </w:pPr>
+      <w:r>
+        <w:t xml:space="preserve">where</w:t>
+      </w:r>
+      <w:r>
+        <w:t xml:space="preserve"> </w:t>
+      </w:r>
+      <m:oMath>
+        <m:r>
+          <m:t>μ</m:t>
+        </m:r>
+      </m:oMath>
+      <w:r>
+        <w:t xml:space="preserve"> </w:t>
+      </w:r>
+      <w:r>
+        <w:t xml:space="preserve">is the expected mean egg number and</w:t>
+      </w:r>
+      <w:r>
+        <w:t xml:space="preserve"> </w:t>
+      </w:r>
+      <m:oMath>
+        <m:r>
+          <m:t>θ</m:t>
+        </m:r>
+      </m:oMath>
+      <w:r>
+        <w:t xml:space="preserve"> </w:t>
+      </w:r>
+      <w:r>
+        <w:t xml:space="preserve">is the dispersion (shape) parameter. Observation-scale repeatability for egg number was therefore calculated as:</w:t>
+      </w:r>
+    </w:p>
+    <w:p>
+      <w:pPr>
+        <w:pStyle w:val="BodyText"/>
+      </w:pPr>
+      <m:oMathPara>
+        <m:oMathParaPr>
+          <m:jc m:val="center"/>
+        </m:oMathParaPr>
+        <m:oMath>
+          <m:sSub>
+            <m:e>
+              <m:r>
+                <m:t>R</m:t>
+              </m:r>
+            </m:e>
+            <m:sub>
+              <m:r>
+                <m:rPr>
+                  <m:nor/>
+                  <m:sty m:val="p"/>
+                </m:rPr>
+                <m:t>egg number</m:t>
+              </m:r>
+            </m:sub>
+          </m:sSub>
+          <m:r>
+            <m:rPr>
+              <m:sty m:val="p"/>
+            </m:rPr>
+            <m:t>=</m:t>
+          </m:r>
+          <m:f>
+            <m:fPr>
+              <m:type m:val="bar"/>
+            </m:fPr>
+            <m:num>
+              <m:sSub>
+                <m:e>
+                  <m:r>
+                    <m:t>V</m:t>
+                  </m:r>
+                </m:e>
+                <m:sub>
+                  <m:r>
+                    <m:t>F</m:t>
+                  </m:r>
+                </m:sub>
+              </m:sSub>
+            </m:num>
+            <m:den>
+              <m:sSub>
+                <m:e>
+                  <m:r>
+                    <m:t>V</m:t>
+                  </m:r>
+                </m:e>
+                <m:sub>
+                  <m:r>
+                    <m:t>F</m:t>
+                  </m:r>
+                </m:sub>
+              </m:sSub>
+              <m:r>
+                <m:rPr>
+                  <m:sty m:val="p"/>
+                </m:rPr>
+                <m:t>+</m:t>
+              </m:r>
+              <m:d>
+                <m:dPr>
+                  <m:begChr m:val="("/>
+                  <m:sepChr m:val=""/>
+                  <m:endChr m:val=")"/>
+                  <m:grow/>
+                </m:dPr>
+                <m:e>
+                  <m:r>
+                    <m:t>μ</m:t>
+                  </m:r>
+                  <m:r>
+                    <m:rPr>
+                      <m:sty m:val="p"/>
+                    </m:rPr>
+                    <m:t>+</m:t>
+                  </m:r>
+                  <m:f>
+                    <m:fPr>
+                      <m:type m:val="bar"/>
+                    </m:fPr>
+                    <m:num>
+                      <m:sSup>
+                        <m:e>
+                          <m:r>
+                            <m:t>μ</m:t>
+                          </m:r>
+                        </m:e>
+                        <m:sup>
+                          <m:r>
+                            <m:t>2</m:t>
+                          </m:r>
+                        </m:sup>
+                      </m:sSup>
+                    </m:num>
+                    <m:den>
+                      <m:r>
+                        <m:t>θ</m:t>
+                      </m:r>
+                    </m:den>
+                  </m:f>
+                </m:e>
+              </m:d>
+            </m:den>
+          </m:f>
+        </m:oMath>
+      </m:oMathPara>
+    </w:p>
+    <w:p>
+      <w:pPr>
+        <w:pStyle w:val="FirstParagraph"/>
+      </w:pPr>
+      <w:r>
+        <w:t xml:space="preserve">where</w:t>
+      </w:r>
+      <w:r>
+        <w:t xml:space="preserve"> </w:t>
+      </w:r>
+      <m:oMath>
+        <m:sSub>
+          <m:e>
+            <m:r>
+              <m:t>V</m:t>
+            </m:r>
           </m:e>
-        </m:acc>
+          <m:sub>
+            <m:r>
+              <m:t>F</m:t>
+            </m:r>
+          </m:sub>
+        </m:sSub>
+      </m:oMath>
+      <w:r>
+        <w:t xml:space="preserve"> </w:t>
+      </w:r>
+      <w:r>
+        <w:t xml:space="preserve">is the among-female variance estimated from the random intercept. The distribution-specific variance term</w:t>
+      </w:r>
+      <w:r>
+        <w:t xml:space="preserve"> </w:t>
+      </w:r>
+      <m:oMath>
+        <m:r>
+          <m:t>μ</m:t>
+        </m:r>
         <m:r>
           <m:rPr>
             <m:sty m:val="p"/>
           </m:rPr>
-          <m:t>≈</m:t>
+          <m:t>+</m:t>
         </m:r>
-        <m:r>
-          <m:t>1.00</m:t>
-        </m:r>
-      </m:oMath>
-      <w:r>
-        <w:t xml:space="preserve">), effective sample sizes (bulk and tail ESS), and visual inspection of trace plots. All reported parameters met standard convergence criteria. Unless otherwise noted, parameter estimates are presented as posterior means with 95% credible intervals (CrIs), and effects were considered supported when CrIs did not include zero.</w:t>
-      </w:r>
-    </w:p>
-    <w:p>
-      <w:pPr>
-        <w:pStyle w:val="BodyText"/>
-      </w:pPr>
-      <w:r>
-        <w:t xml:space="preserve">To test whether egg size and egg number differed between first and second clutches, I fitted a multivariate Bayesian mixed-effects model. Mean egg size was modelled assuming a Gaussian error distribution with an identity link, whereas egg number was modelled using a Poisson distribution with a log link. Both traits were modelled jointly to account for covariance at the female level. For each response variable, the model included a fixed intercept and clutch order (first versus second clutch) as a fixed effect. Female identity was included as a random intercept for both egg size and egg number to account for repeated measures across clutches. The female-level random intercepts for the two traits were allowed to covary, thereby estimating the among-female variance–covariance structure between egg size and egg number. Residual correlations were not estimated (</w:t>
-      </w:r>
-      <w:r>
-        <w:rPr>
-          <w:rStyle w:val="VerbatimChar"/>
-        </w:rPr>
-        <w:t xml:space="preserve">set_rescor(FALSE)</w:t>
-      </w:r>
-      <w:r>
-        <w:t xml:space="preserve">), such that covariance between traits was modelled exclusively at the female level. This model therefore tested whether egg size and egg number differed systematically between clutches while accounting for repeated measures and among-female variation.</w:t>
-      </w:r>
-    </w:p>
-    <w:p>
-      <w:pPr>
-        <w:pStyle w:val="BodyText"/>
-      </w:pPr>
-      <w:r>
-        <w:t xml:space="preserve">I used two approaches to test the prediction that females will exhibit negative within-female and positive between-female covariance between egg number and size. The raw phenotypic association between egg number and egg size was calculated using Pearson’s correlation coefficient across all observations. This estimate reflects the overall linear association between traits without accounting for repeated measures or hierarchical structure. To estimate among-female covariation, I calculated the Pearson correlation between female mean egg number and female mean egg size, averaging across broods. This approach isolates between-female covariance independent of within-female variation. To formally partition covariance into among-female and within-female components, I fitted a multivariate Gaussian mixed-effects model including egg size and egg number as joint responses. Female identity was included as a random intercept for both traits, and both female-level and residual correlations were estimated (</w:t>
-      </w:r>
-      <w:r>
-        <w:rPr>
-          <w:rStyle w:val="VerbatimChar"/>
-        </w:rPr>
-        <w:t xml:space="preserve">set_rescor(TRUE)</w:t>
-      </w:r>
-      <w:r>
-        <w:t xml:space="preserve">). The correlation between female-specific intercepts quantified the among-female association, whereas the residual correlation quantified the within-female (clutch-level) association between egg number and egg size.</w:t>
-      </w:r>
-    </w:p>
-    <w:p>
-      <w:pPr>
-        <w:pStyle w:val="BodyText"/>
-      </w:pPr>
-      <w:r>
-        <w:t xml:space="preserve">To distinguish plastic from strategic effects, I followed van de Pol and Wright</w:t>
-      </w:r>
-      <w:r>
-        <w:t xml:space="preserve"> </w:t>
-      </w:r>
-      <w:r>
-        <w:t xml:space="preserve">(2009)</w:t>
-      </w:r>
-      <w:r>
-        <w:t xml:space="preserve"> </w:t>
-      </w:r>
-      <w:r>
-        <w:t xml:space="preserve">by decomposing egg number into two components. The within-female component represented the deviation of each observation from a female’s own mean egg number, and the between-female component represented each female’s mean egg number relative to the population mean. Although mean-centering has been shown to impose assumptions about biological process</w:t>
-      </w:r>
-      <w:r>
-        <w:t xml:space="preserve"> </w:t>
-      </w:r>
-      <w:r>
-        <w:t xml:space="preserve">(Westneat et al. 2020)</w:t>
-      </w:r>
-      <w:r>
-        <w:t xml:space="preserve">, these assumptions align with my biological question, which concerns deviations in reproductive allocation within females across clutches. I fitted a linear mixed-effects model with mean egg size as the response variable, including both components as fixed effects and female identity as a random intercept. In this framework, the within-female coefficient estimates the plastic allocation response, whereas the between-female coefficient estimates the among-female (strategic) association. Continuous predictors were standardized by centering them on their mean and scaling by their standard deviation. The within- and between-female components were each standardized using the mean and standard deviation of their respective distributions. When estimating standardized regression coefficients, the response variable was also scaled to have a standard deviation of one. Standardized coefficients therefore represent the expected change in egg size, measured in standard deviation units, associated with a one standard deviation change in the predictor.</w:t>
-      </w:r>
-    </w:p>
-    <w:p>
-      <w:pPr>
-        <w:pStyle w:val="BodyText"/>
-      </w:pPr>
-      <w:r>
-        <w:t xml:space="preserve">To test whether females differed in their propensity to trade off egg size against egg number, I fitted a mixed-effects random-slopes model allowing the within-female effect of egg number to vary among females</w:t>
-      </w:r>
-      <w:r>
-        <w:t xml:space="preserve"> </w:t>
-      </w:r>
-      <w:r>
-        <w:t xml:space="preserve">(see Pol and Wright 2009)</w:t>
-      </w:r>
-      <w:r>
-        <w:t xml:space="preserve">. Mean egg size was included as the response variable, and egg number was partitioned into within-female and between-female components as described above. The within-female component was included as both a fixed effect and a random slope, while the between-female component was included as a fixed effect. Female identity was included as a random effect with both intercepts and random slopes for the within-female component. This parameterisation estimates among-female variation in within-female slopes and the correlation between intercepts and slopes, thereby quantifying heterogeneity in allocation strategies and testing whether females with larger average egg size differ systematically in the strength or direction of their within-female trade-off.</w:t>
-      </w:r>
-    </w:p>
-    <w:p>
-      <w:pPr>
-        <w:pStyle w:val="BodyText"/>
-      </w:pPr>
-      <w:r>
-        <w:t xml:space="preserve">Because egg number and egg size both changed systematically across clutches, I tested whether clutch order explained the observed within-female association by adding clutch order as an additional fixed effect to the within–between model. In this extended model, mean egg size was predicted by the within-female deviation in egg number, the between-female mean egg number, and clutch order, while female identity was retained as a random intercept. If the within-female slope was reduced toward zero after including clutch order, this would indicate that the apparent within-female association was largely driven by parallel shifts between first and second clutches rather than by plastic allocation within females.</w:t>
-      </w:r>
-    </w:p>
-    <w:p>
-      <w:pPr>
-        <w:pStyle w:val="BodyText"/>
-      </w:pPr>
-      <w:r>
-        <w:t xml:space="preserve">To compare clutch-specific variance components independently of random-slope parameterisation, I fitted a hierarchical Gaussian model in which female effects were estimated separately for first and second clutches. Scaled egg size was modelled as a function of clutch order with clutch-specific random intercepts for female identity. This parameterisation estimated separate among-female variance components for clutch 1 and clutch 2, as well as their correlation, allowing direct comparison of female-level variation across reproductive events. Residual standard deviations were also allowed to differ between clutches. Clutch-specific variance components were derived from posterior samples, and differences between clutches were evaluated using posterior contrasts.</w:t>
-      </w:r>
-    </w:p>
-    <w:p>
-      <w:pPr>
-        <w:pStyle w:val="BodyText"/>
-      </w:pPr>
-      <w:r>
-        <w:t xml:space="preserve">Data were visualized using</w:t>
-      </w:r>
-      <w:r>
-        <w:t xml:space="preserve"> </w:t>
-      </w:r>
-      <w:r>
-        <w:rPr>
-          <w:i/>
-          <w:iCs/>
-        </w:rPr>
-        <w:t xml:space="preserve">ggplot</w:t>
-      </w:r>
-      <w:r>
-        <w:t xml:space="preserve"> </w:t>
-      </w:r>
-      <w:r>
-        <w:t xml:space="preserve">(Wickham 2016)</w:t>
-      </w:r>
-      <w:r>
-        <w:t xml:space="preserve"> </w:t>
-      </w:r>
-      <w:r>
-        <w:t xml:space="preserve">and</w:t>
-      </w:r>
-      <w:r>
-        <w:t xml:space="preserve"> </w:t>
-      </w:r>
-      <w:r>
-        <w:rPr>
-          <w:i/>
-          <w:iCs/>
-        </w:rPr>
-        <w:t xml:space="preserve">tidybayes</w:t>
-      </w:r>
-      <w:r>
-        <w:t xml:space="preserve"> </w:t>
-      </w:r>
-      <w:r>
-        <w:t xml:space="preserve">(Kay 2020)</w:t>
-      </w:r>
-      <w:r>
-        <w:t xml:space="preserve">.</w:t>
-      </w:r>
-    </w:p>
-    <w:bookmarkEnd w:id="23"/>
-    <w:bookmarkEnd w:id="24"/>
-    <w:bookmarkStart w:id="29" w:name="results"/>
-    <w:p>
-      <w:pPr>
-        <w:pStyle w:val="Heading1"/>
-      </w:pPr>
-      <w:r>
-        <w:t xml:space="preserve">Results</w:t>
-      </w:r>
-    </w:p>
-    <w:bookmarkStart w:id="25" w:name="X2adf980c3cdf557e751ed69a8410e917bd83bb9"/>
-    <w:p>
-      <w:pPr>
-        <w:pStyle w:val="Heading3"/>
-      </w:pPr>
-      <w:r>
-        <w:t xml:space="preserve">Effect of clutch order on egg size and number</w:t>
-      </w:r>
-    </w:p>
-    <w:p>
-      <w:pPr>
-        <w:pStyle w:val="FirstParagraph"/>
-      </w:pPr>
-      <w:r>
-        <w:t xml:space="preserve">Both egg number and egg size declined in the second clutch. In the multivariate Gaussian–Poisson model, egg size was smaller in clutch two (</w:t>
-      </w:r>
-      <m:oMath>
-        <m:acc>
-          <m:accPr>
-            <m:chr m:val="‾"/>
-          </m:accPr>
-          <m:e>
-            <m:r>
-              <m:t>x</m:t>
-            </m:r>
-          </m:e>
-        </m:acc>
-      </m:oMath>
-      <w:r>
-        <w:t xml:space="preserve"> </w:t>
-      </w:r>
-      <w:r>
-        <w:t xml:space="preserve">± SE = 3.41 ± 0.03) relative to clutch one (</w:t>
-      </w:r>
-      <m:oMath>
-        <m:acc>
-          <m:accPr>
-            <m:chr m:val="‾"/>
-          </m:accPr>
-          <m:e>
-            <m:r>
-              <m:t>x</m:t>
-            </m:r>
-          </m:e>
-        </m:acc>
-      </m:oMath>
-      <w:r>
-        <w:t xml:space="preserve"> </w:t>
-      </w:r>
-      <w:r>
-        <w:t xml:space="preserve">= 3.54 ± 0.03;</w:t>
-      </w:r>
-      <w:r>
-        <w:t xml:space="preserve"> </w:t>
-      </w:r>
-      <m:oMath>
-        <m:r>
-          <m:t>β</m:t>
-        </m:r>
-      </m:oMath>
-      <w:r>
-        <w:t xml:space="preserve"> </w:t>
-      </w:r>
-      <w:r>
-        <w:t xml:space="preserve">= -0.12, 95% CrI (-0.21, -0.04). Egg number also declined significantly (clutch one:</w:t>
-      </w:r>
-      <w:r>
-        <w:t xml:space="preserve"> </w:t>
-      </w:r>
-      <m:oMath>
-        <m:acc>
-          <m:accPr>
-            <m:chr m:val="‾"/>
-          </m:accPr>
-          <m:e>
-            <m:r>
-              <m:t>x</m:t>
-            </m:r>
-          </m:e>
-        </m:acc>
-      </m:oMath>
-      <w:r>
-        <w:t xml:space="preserve"> </w:t>
-      </w:r>
-      <w:r>
-        <w:t xml:space="preserve">= 51.55 ± 2.49; clutch two:</w:t>
-      </w:r>
-      <w:r>
-        <w:t xml:space="preserve"> </w:t>
-      </w:r>
-      <m:oMath>
-        <m:acc>
-          <m:accPr>
-            <m:chr m:val="‾"/>
-          </m:accPr>
-          <m:e>
-            <m:r>
-              <m:t>x</m:t>
-            </m:r>
-          </m:e>
-        </m:acc>
-      </m:oMath>
-      <w:r>
-        <w:t xml:space="preserve"> </w:t>
-      </w:r>
-      <w:r>
-        <w:t xml:space="preserve">= 34.14 ± 2.65; log-scale</w:t>
-      </w:r>
-      <w:r>
-        <w:t xml:space="preserve"> </w:t>
-      </w:r>
-      <m:oMath>
-        <m:r>
-          <m:t>β</m:t>
-        </m:r>
-      </m:oMath>
-      <w:r>
-        <w:t xml:space="preserve"> </w:t>
-      </w:r>
-      <w:r>
-        <w:t xml:space="preserve">= -0.41, 95% CrI (-0.48, -0.34), corresponding to an approximate 34% reduction on the natural scale (</w:t>
-      </w:r>
-      <m:oMath>
         <m:sSup>
           <m:e>
             <m:r>
-              <m:t>e</m:t>
+              <m:t>μ</m:t>
             </m:r>
           </m:e>
           <m:sup>
             <m:r>
-              <m:rPr>
-                <m:sty m:val="p"/>
-              </m:rPr>
-              <m:t>−</m:t>
-            </m:r>
-            <m:r>
-              <m:t>0.410</m:t>
+              <m:t>2</m:t>
             </m:r>
           </m:sup>
         </m:sSup>
@@ -865,24 +994,117 @@
           <m:rPr>
             <m:sty m:val="p"/>
           </m:rPr>
-          <m:t>≈</m:t>
+          <m:t>/</m:t>
         </m:r>
         <m:r>
-          <m:t>0.66</m:t>
+          <m:t>θ</m:t>
         </m:r>
       </m:oMath>
       <w:r>
-        <w:t xml:space="preserve">). Among-female variation remained detectable for both egg size (SD = 0.091, 95% CrI [0.009, 0.165]) and egg number (SD = 0.355, 95% CrI [0.273, 0.460]), indicating persistent heterogeneity across broods.</w:t>
-      </w:r>
-    </w:p>
-    <w:bookmarkEnd w:id="25"/>
-    <w:bookmarkStart w:id="26" w:name="X8f40dbed1f2515dba178cdbe2247c63c8a0b998"/>
-    <w:p>
-      <w:pPr>
-        <w:pStyle w:val="Heading3"/>
-      </w:pPr>
-      <w:r>
-        <w:t xml:space="preserve">Multilevel correlations between egg number and egg size</w:t>
+        <w:t xml:space="preserve"> </w:t>
+      </w:r>
+      <w:r>
+        <w:t xml:space="preserve">was calculated for each posterior draw using the corresponding posterior samples of</w:t>
+      </w:r>
+      <w:r>
+        <w:t xml:space="preserve"> </w:t>
+      </w:r>
+      <m:oMath>
+        <m:r>
+          <m:t>μ</m:t>
+        </m:r>
+      </m:oMath>
+      <w:r>
+        <w:t xml:space="preserve"> </w:t>
+      </w:r>
+      <w:r>
+        <w:t xml:space="preserve">and</w:t>
+      </w:r>
+      <w:r>
+        <w:t xml:space="preserve"> </w:t>
+      </w:r>
+      <m:oMath>
+        <m:r>
+          <m:t>θ</m:t>
+        </m:r>
+      </m:oMath>
+      <w:r>
+        <w:t xml:space="preserve">, thereby generating a posterior distribution of repeatability. By calculating repeatability on the observation scale for both traits, these estimates represent the proportion of total phenotypic variance in the observed trait that is attributable to consistent differences among females.</w:t>
+      </w:r>
+    </w:p>
+    <w:p>
+      <w:pPr>
+        <w:pStyle w:val="BodyText"/>
+      </w:pPr>
+      <w:r>
+        <w:t xml:space="preserve">All models were fitted using weakly informative priors on regression coefficients and variance parameters. Posterior distributions were obtained using six Markov chains with 4,000 iterations per chain, including 1,000 warm-up iterations, and convergence was assessed using R ̂ statistics, effective sample sizes, and inspection of trace plots. Posterior distributions are summarised as posterior means with 95% credible intervals.</w:t>
+      </w:r>
+      <w:r>
+        <w:t xml:space="preserve"> </w:t>
+      </w:r>
+      <w:r>
+        <w:t xml:space="preserve">Data were visualized using</w:t>
+      </w:r>
+      <w:r>
+        <w:t xml:space="preserve"> </w:t>
+      </w:r>
+      <w:r>
+        <w:rPr>
+          <w:i/>
+          <w:iCs/>
+        </w:rPr>
+        <w:t xml:space="preserve">ggplot</w:t>
+      </w:r>
+      <w:r>
+        <w:t xml:space="preserve"> </w:t>
+      </w:r>
+      <w:r>
+        <w:t xml:space="preserve">(Wickham 2016)</w:t>
+      </w:r>
+      <w:r>
+        <w:t xml:space="preserve"> </w:t>
+      </w:r>
+      <w:r>
+        <w:t xml:space="preserve">and</w:t>
+      </w:r>
+      <w:r>
+        <w:t xml:space="preserve"> </w:t>
+      </w:r>
+      <w:r>
+        <w:rPr>
+          <w:i/>
+          <w:iCs/>
+        </w:rPr>
+        <w:t xml:space="preserve">tidybayes</w:t>
+      </w:r>
+      <w:r>
+        <w:t xml:space="preserve"> </w:t>
+      </w:r>
+      <w:r>
+        <w:t xml:space="preserve">(Kay 2020)</w:t>
+      </w:r>
+      <w:r>
+        <w:t xml:space="preserve">.</w:t>
+      </w:r>
+    </w:p>
+    <w:bookmarkEnd w:id="23"/>
+    <w:bookmarkEnd w:id="24"/>
+    <w:bookmarkStart w:id="27" w:name="results"/>
+    <w:p>
+      <w:pPr>
+        <w:pStyle w:val="Heading1"/>
+      </w:pPr>
+      <w:r>
+        <w:t xml:space="preserve">Results</w:t>
+      </w:r>
+    </w:p>
+    <w:bookmarkStart w:id="25" w:name="between-and-within-female-correlations"/>
+    <w:p>
+      <w:pPr>
+        <w:pStyle w:val="Heading4"/>
+      </w:pPr>
+      <w:r>
+        <w:t xml:space="preserve">Between and within female correlations</w:t>
       </w:r>
     </w:p>
     <w:p>
@@ -890,7 +1112,7 @@
         <w:pStyle w:val="FirstParagraph"/>
       </w:pPr>
       <w:r>
-        <w:t xml:space="preserve">Across all observations, the raw Pearson correlation between egg number and egg size was weak and close to zero (</w:t>
+        <w:t xml:space="preserve">Across all clutches, the raw phenotypic correlation between egg number and egg size was weak and close to zero (</w:t>
       </w:r>
       <m:oMath>
         <m:sSub>
@@ -916,126 +1138,191 @@
         <w:t xml:space="preserve"> </w:t>
       </w:r>
       <w:r>
-        <w:t xml:space="preserve">= -0.04, 95% CI [-0.25, 0.19]), suggesting no clear phenotypic association when hierarchical structure was ignored. In contrast, the between-female Pearson correlation calculated from female means was moderate and negative (</w:t>
+        <w:t xml:space="preserve">= -0.04, 95% CI [-0.25, 0.19]), indicating no clear population-level association when hierarchical structure was ignored.</w:t>
+      </w:r>
+    </w:p>
+    <w:p>
+      <w:pPr>
+        <w:pStyle w:val="BodyText"/>
+      </w:pPr>
+      <w:r>
+        <w:t xml:space="preserve">Egg number (clutch one:</w:t>
+      </w:r>
+      <w:r>
+        <w:t xml:space="preserve"> </w:t>
       </w:r>
       <m:oMath>
-        <m:sSub>
+        <m:acc>
+          <m:accPr>
+            <m:chr m:val="‾"/>
+          </m:accPr>
           <m:e>
             <m:r>
-              <m:t>r</m:t>
+              <m:t>x</m:t>
             </m:r>
           </m:e>
-          <m:sub>
+        </m:acc>
+      </m:oMath>
+      <w:r>
+        <w:t xml:space="preserve"> </w:t>
+      </w:r>
+      <w:r>
+        <w:t xml:space="preserve">= 51.55 ± 2.49; clutch two:</w:t>
+      </w:r>
+      <w:r>
+        <w:t xml:space="preserve"> </w:t>
+      </w:r>
+      <m:oMath>
+        <m:acc>
+          <m:accPr>
+            <m:chr m:val="‾"/>
+          </m:accPr>
+          <m:e>
             <m:r>
-              <m:t>b</m:t>
+              <m:t>x</m:t>
             </m:r>
+          </m:e>
+        </m:acc>
+      </m:oMath>
+      <w:r>
+        <w:t xml:space="preserve"> </w:t>
+      </w:r>
+      <w:r>
+        <w:t xml:space="preserve">= 34.14 ± 2.65) and egg size (first clutch:</w:t>
+      </w:r>
+      <w:r>
+        <w:t xml:space="preserve"> </w:t>
+      </w:r>
+      <m:oMath>
+        <m:acc>
+          <m:accPr>
+            <m:chr m:val="‾"/>
+          </m:accPr>
+          <m:e>
+            <m:r>
+              <m:t>x</m:t>
+            </m:r>
+          </m:e>
+        </m:acc>
+      </m:oMath>
+      <w:r>
+        <w:t xml:space="preserve"> </w:t>
+      </w:r>
+      <w:r>
+        <w:t xml:space="preserve">= 3.54 ± 0.03; second clutch:</w:t>
+      </w:r>
+      <w:r>
+        <w:t xml:space="preserve"> </w:t>
+      </w:r>
+      <m:oMath>
+        <m:acc>
+          <m:accPr>
+            <m:chr m:val="‾"/>
+          </m:accPr>
+          <m:e>
+            <m:r>
+              <m:t>x</m:t>
+            </m:r>
+          </m:e>
+        </m:acc>
+      </m:oMath>
+      <w:r>
+        <w:t xml:space="preserve"> </w:t>
+      </w:r>
+      <w:r>
+        <w:t xml:space="preserve">± SE = 3.41 ± 0.03) both declined in second clutches (second clutch:</w:t>
+      </w:r>
+      <w:r>
+        <w:t xml:space="preserve"> </w:t>
+      </w:r>
+      <m:oMath>
+        <m:acc>
+          <m:accPr>
+            <m:chr m:val="‾"/>
+          </m:accPr>
+          <m:e>
+            <m:r>
+              <m:t>x</m:t>
+            </m:r>
+          </m:e>
+        </m:acc>
+      </m:oMath>
+      <w:r>
+        <w:t xml:space="preserve"> </w:t>
+      </w:r>
+      <w:r>
+        <w:t xml:space="preserve">± SE = 3.41 ± 0.03). Clutch size was substantially lower in brood two (log-scale</w:t>
+      </w:r>
+      <w:r>
+        <w:t xml:space="preserve"> </w:t>
+      </w:r>
+      <m:oMath>
+        <m:r>
+          <m:t>β</m:t>
+        </m:r>
+      </m:oMath>
+      <w:r>
+        <w:t xml:space="preserve"> </w:t>
+      </w:r>
+      <w:r>
+        <w:t xml:space="preserve">= -0.41, 95% CrI (-0.64, -0.19), corresponding to an approximate 34% reduction in egg number on the natural scale (</w:t>
+      </w:r>
+      <m:oMath>
+        <m:sSup>
+          <m:e>
             <m:r>
               <m:t>e</m:t>
             </m:r>
+          </m:e>
+          <m:sup>
             <m:r>
-              <m:t>t</m:t>
+              <m:rPr>
+                <m:sty m:val="p"/>
+              </m:rPr>
+              <m:t>−</m:t>
             </m:r>
             <m:r>
-              <m:t>w</m:t>
+              <m:t>0.413</m:t>
             </m:r>
-            <m:r>
-              <m:t>e</m:t>
-            </m:r>
-            <m:r>
-              <m:t>e</m:t>
-            </m:r>
-            <m:r>
-              <m:t>n</m:t>
-            </m:r>
-          </m:sub>
-        </m:sSub>
+          </m:sup>
+        </m:sSup>
+        <m:r>
+          <m:rPr>
+            <m:sty m:val="p"/>
+          </m:rPr>
+          <m:t>≈</m:t>
+        </m:r>
+        <m:r>
+          <m:rPr>
+            <m:sty m:val="p"/>
+          </m:rPr>
+          <m:t>−</m:t>
+        </m:r>
+        <m:r>
+          <m:t>0.41</m:t>
+        </m:r>
       </m:oMath>
       <w:r>
-        <w:t xml:space="preserve"> </w:t>
-      </w:r>
-      <w:r>
-        <w:t xml:space="preserve">= -0.31, 95% CI [-0.55, -0.02];</w:t>
-      </w:r>
-      <w:r>
-        <w:t xml:space="preserve"> </w:t>
-      </w:r>
-      <w:hyperlink w:anchor="fig-one">
-        <w:r>
-          <w:rPr>
-            <w:rStyle w:val="Hyperlink"/>
-          </w:rPr>
-          <w:t xml:space="preserve">Figure 1</w:t>
-        </w:r>
-      </w:hyperlink>
-      <w:r>
-        <w:t xml:space="preserve">). Females that produced more eggs on average tended to lay smaller eggs. The multivariate Gaussian model partitioned covariation into among-female and residual components. After accounting for female identity, the residual (within-female) correlation between egg number and egg size was effectively zero and highly uncertain (</w:t>
+        <w:t xml:space="preserve">). Mean egg size also decreased in brood two (</w:t>
       </w:r>
       <m:oMath>
-        <m:sSub>
-          <m:e>
-            <m:r>
-              <m:t>r</m:t>
-            </m:r>
-          </m:e>
-          <m:sub>
-            <m:r>
-              <m:t>w</m:t>
-            </m:r>
-            <m:r>
-              <m:t>i</m:t>
-            </m:r>
-            <m:r>
-              <m:t>t</m:t>
-            </m:r>
-            <m:r>
-              <m:t>h</m:t>
-            </m:r>
-            <m:r>
-              <m:t>i</m:t>
-            </m:r>
-            <m:r>
-              <m:t>n</m:t>
-            </m:r>
-          </m:sub>
-        </m:sSub>
+        <m:r>
+          <m:t>β</m:t>
+        </m:r>
       </m:oMath>
       <w:r>
         <w:t xml:space="preserve"> </w:t>
       </w:r>
       <w:r>
-        <w:t xml:space="preserve">= 0.0066, 95% CI [-0.20, 0.23];</w:t>
-      </w:r>
-      <w:r>
-        <w:t xml:space="preserve"> </w:t>
-      </w:r>
-      <w:hyperlink w:anchor="fig-two">
-        <w:r>
-          <w:rPr>
-            <w:rStyle w:val="Hyperlink"/>
-          </w:rPr>
-          <w:t xml:space="preserve">Figure 2</w:t>
-        </w:r>
-      </w:hyperlink>
-      <w:r>
-        <w:t xml:space="preserve">). Thus, apparent phenotypic independence masked a moderate negative association among females but no detectable clutch-level trade-off within females. From this model I also calculated egg number repeatability, which was effectively zero (R = 0.0017 [95% CrI: 0.0000, 0.0589]), indicating that most variation occurred within rather than among females. For completeness I also calculated the repeatability of egg size, which was low (R = 0.12 [95% CrI: 0.00, 0.43]), with the proviso that this estimate is based on mean egg size per female; better estimate of egg size repeatability is given below.</w:t>
-      </w:r>
-    </w:p>
-    <w:bookmarkEnd w:id="26"/>
-    <w:bookmarkStart w:id="28" w:name="withinbetween-mixed-effects-models"/>
-    <w:p>
-      <w:pPr>
-        <w:pStyle w:val="Heading3"/>
-      </w:pPr>
-      <w:r>
-        <w:t xml:space="preserve">Within–between mixed-effects models</w:t>
-      </w:r>
-    </w:p>
-    <w:p>
-      <w:pPr>
-        <w:pStyle w:val="FirstParagraph"/>
-      </w:pPr>
-      <w:r>
-        <w:t xml:space="preserve">In the within–between mixed-effects model, egg size varied among females (random-intercept SD = 0.07, 95% CrI [0.00, 0.15]). The within-female effect of egg number on egg size was small and uncertain (</w:t>
+        <w:t xml:space="preserve">= -0.13, 95% CrI (-0.24, -0.02).</w:t>
+      </w:r>
+    </w:p>
+    <w:p>
+      <w:pPr>
+        <w:pStyle w:val="BodyText"/>
+      </w:pPr>
+      <w:r>
+        <w:t xml:space="preserve">There was no evidence of a within-female plastic trade-off between egg number and egg size. The within-female effect of clutch-size deviation on egg size was small and highly uncertain (</w:t>
       </w:r>
       <m:oMath>
         <m:sSub>
@@ -1055,21 +1342,15 @@
         <w:t xml:space="preserve"> </w:t>
       </w:r>
       <w:r>
-        <w:t xml:space="preserve">= 0.0028, 95% CrI [-0.0005, 0.0061];</w:t>
-      </w:r>
-      <w:r>
-        <w:t xml:space="preserve"> </w:t>
-      </w:r>
-      <w:hyperlink w:anchor="fig-three">
-        <w:r>
-          <w:rPr>
-            <w:rStyle w:val="Hyperlink"/>
-          </w:rPr>
-          <w:t xml:space="preserve">Figure 3</w:t>
-        </w:r>
-      </w:hyperlink>
-      <w:r>
-        <w:t xml:space="preserve">). On the natural scale, this corresponds to an increase of approximately 0.027 units in egg size for every additional 10 eggs within a female — an effect that was not credibly different from zero. In contrast, the between-female effect was negative (</w:t>
+        <w:t xml:space="preserve">= -0.01, 95% CrI (-0.06, 0.05), indicating that females did not adjust egg size in response to producing more or fewer eggs relative to their own mean.</w:t>
+      </w:r>
+    </w:p>
+    <w:p>
+      <w:pPr>
+        <w:pStyle w:val="BodyText"/>
+      </w:pPr>
+      <w:r>
+        <w:t xml:space="preserve">In contrast, the between-female component revealed a negative association between mean egg size and egg number. Females that produced more eggs on average tended to lay smaller eggs (</w:t>
       </w:r>
       <m:oMath>
         <m:sSub>
@@ -1089,21 +1370,7 @@
         <w:t xml:space="preserve"> </w:t>
       </w:r>
       <w:r>
-        <w:t xml:space="preserve">= -0.0039, 95% CrI [-0.0076, -0.0001];</w:t>
-      </w:r>
-      <w:r>
-        <w:t xml:space="preserve"> </w:t>
-      </w:r>
-      <w:hyperlink w:anchor="fig-one">
-        <w:r>
-          <w:rPr>
-            <w:rStyle w:val="Hyperlink"/>
-          </w:rPr>
-          <w:t xml:space="preserve">Figure 1</w:t>
-        </w:r>
-      </w:hyperlink>
-      <w:r>
-        <w:t xml:space="preserve">). Females differing by 10 eggs in mean clutch size differed by approximately 0.038 units in egg size. Although the credible interval extended to zero, the posterior distribution was predominantly negative, consistent with a modest among-female trade-off. No measure of female size/condition was positively correlated with the number of eggs in the first brood (pronotum length:</w:t>
+        <w:t xml:space="preserve">= -0.05, 95% CrI (-0.10, 0.00), consistent with a moderate among-female allocation trade-off. The estimated correlation between female-level intercepts for egg number and egg size was highly uncertain (median ≈ -0.02, 95% CrI: -0.81, 0.82), reflecting limited information for estimating latent covariance with only two clutches per female. Together, these results show that the size–number trade-off is not apparent at the raw phenotypic level, but emerges when variation is partitioned among females, while no evidence for dynamic within-female reallocation was detected. No measure of female size/condition was positively correlated with the number of eggs in the first brood (pronotum length:</w:t>
       </w:r>
       <w:r>
         <w:t xml:space="preserve"> </w:t>
@@ -1177,233 +1444,8 @@
         <w:t xml:space="preserve">= -0.02, 95% CI [-0.35, 0.33]) suggesting that larger females or those in better condition produce more eggs. I therefore did not inlcude a measure of size/condition in this model.</w:t>
       </w:r>
     </w:p>
-    <w:p>
-      <w:pPr>
-        <w:pStyle w:val="BodyText"/>
-      </w:pPr>
-      <w:r>
-        <w:t xml:space="preserve">Standardized coefficients reinforced the difference in magnitude between hierarchical levels. The standardized within-female effect was positive but uncertain (</w:t>
-      </w:r>
-      <m:oMath>
-        <m:sSub>
-          <m:e>
-            <m:r>
-              <m:t>β</m:t>
-            </m:r>
-          </m:e>
-          <m:sub>
-            <m:r>
-              <m:t>W</m:t>
-            </m:r>
-            <m:r>
-              <m:t>s</m:t>
-            </m:r>
-            <m:r>
-              <m:t>t</m:t>
-            </m:r>
-            <m:r>
-              <m:t>a</m:t>
-            </m:r>
-            <m:r>
-              <m:t>n</m:t>
-            </m:r>
-            <m:r>
-              <m:t>d</m:t>
-            </m:r>
-            <m:r>
-              <m:t>a</m:t>
-            </m:r>
-            <m:r>
-              <m:t>r</m:t>
-            </m:r>
-            <m:r>
-              <m:t>d</m:t>
-            </m:r>
-            <m:r>
-              <m:t>i</m:t>
-            </m:r>
-            <m:r>
-              <m:t>z</m:t>
-            </m:r>
-            <m:r>
-              <m:t>e</m:t>
-            </m:r>
-            <m:r>
-              <m:t>d</m:t>
-            </m:r>
-          </m:sub>
-        </m:sSub>
-      </m:oMath>
-      <w:r>
-        <w:t xml:space="preserve"> </w:t>
-      </w:r>
-      <w:r>
-        <w:t xml:space="preserve">= 0.17, 95% CrI [-0.03, 0.38]), whereas the standardized between-female effect was negative and its credible interval did not overlap zero (</w:t>
-      </w:r>
-      <m:oMath>
-        <m:sSub>
-          <m:e>
-            <m:r>
-              <m:t>β</m:t>
-            </m:r>
-          </m:e>
-          <m:sub>
-            <m:r>
-              <m:t>B</m:t>
-            </m:r>
-            <m:r>
-              <m:t>s</m:t>
-            </m:r>
-            <m:r>
-              <m:t>t</m:t>
-            </m:r>
-            <m:r>
-              <m:t>a</m:t>
-            </m:r>
-            <m:r>
-              <m:t>n</m:t>
-            </m:r>
-            <m:r>
-              <m:t>d</m:t>
-            </m:r>
-            <m:r>
-              <m:t>a</m:t>
-            </m:r>
-            <m:r>
-              <m:t>r</m:t>
-            </m:r>
-            <m:r>
-              <m:t>d</m:t>
-            </m:r>
-            <m:r>
-              <m:t>i</m:t>
-            </m:r>
-            <m:r>
-              <m:t>z</m:t>
-            </m:r>
-            <m:r>
-              <m:t>e</m:t>
-            </m:r>
-            <m:r>
-              <m:t>d</m:t>
-            </m:r>
-          </m:sub>
-        </m:sSub>
-      </m:oMath>
-      <w:r>
-        <w:t xml:space="preserve"> </w:t>
-      </w:r>
-      <w:r>
-        <w:t xml:space="preserve">= -0.23, 95% CrI [-0.455, -0.006]). Thus, the negative association was stronger and more consistent among females than within females.</w:t>
-      </w:r>
-    </w:p>
-    <w:p>
-      <w:pPr>
-        <w:pStyle w:val="BodyText"/>
-      </w:pPr>
-      <w:r>
-        <w:t xml:space="preserve">Because both egg number and egg size declined across clutches, clutch order was included as an additional fixed effect to test whether it explained the weak positive within-female slope. When clutch order was accounted for, the within-female effect collapsed to zero (</w:t>
-      </w:r>
-      <m:oMath>
-        <m:sSub>
-          <m:e>
-            <m:r>
-              <m:t>β</m:t>
-            </m:r>
-          </m:e>
-          <m:sub>
-            <m:r>
-              <m:t>W</m:t>
-            </m:r>
-          </m:sub>
-        </m:sSub>
-      </m:oMath>
-      <w:r>
-        <w:t xml:space="preserve"> </w:t>
-      </w:r>
-      <w:r>
-        <w:t xml:space="preserve">= -0.0004, 95% CrI [-0.0045, 0.0035]). Thus, there was no evidence that females plastically traded egg number against egg size within clutches; the apparent association in the initial model was entirely explained by parallel declines from clutch one to clutch two.</w:t>
-      </w:r>
-    </w:p>
-    <w:p>
-      <w:pPr>
-        <w:pStyle w:val="BodyText"/>
-      </w:pPr>
-      <w:r>
-        <w:t xml:space="preserve">Allowing within-female slopes to vary among females produced similar fixed-effect estimates (</w:t>
-      </w:r>
-      <m:oMath>
-        <m:sSub>
-          <m:e>
-            <m:r>
-              <m:t>β</m:t>
-            </m:r>
-          </m:e>
-          <m:sub>
-            <m:r>
-              <m:t>W</m:t>
-            </m:r>
-          </m:sub>
-        </m:sSub>
-      </m:oMath>
-      <w:r>
-        <w:t xml:space="preserve"> </w:t>
-      </w:r>
-      <w:r>
-        <w:t xml:space="preserve">= 0.0034, 95% CrI [-0.0004, 0.0076];</w:t>
-      </w:r>
-      <w:r>
-        <w:t xml:space="preserve"> </w:t>
-      </w:r>
-      <m:oMath>
-        <m:sSub>
-          <m:e>
-            <m:r>
-              <m:t>β</m:t>
-            </m:r>
-          </m:e>
-          <m:sub>
-            <m:r>
-              <m:t>B</m:t>
-            </m:r>
-          </m:sub>
-        </m:sSub>
-      </m:oMath>
-      <w:r>
-        <w:t xml:space="preserve"> </w:t>
-      </w:r>
-      <w:r>
-        <w:t xml:space="preserve">= -0.0041, 95% CrI [-0.0082, -0.0002];</w:t>
-      </w:r>
-      <w:r>
-        <w:t xml:space="preserve"> </w:t>
-      </w:r>
-      <w:hyperlink w:anchor="fig-three">
-        <w:r>
-          <w:rPr>
-            <w:rStyle w:val="Hyperlink"/>
-          </w:rPr>
-          <w:t xml:space="preserve">Figure 3</w:t>
-        </w:r>
-      </w:hyperlink>
-      <w:r>
-        <w:t xml:space="preserve">). Variation in within-female slopes was small (SD = 0.0046, 95% CrI [0.0003, 0.0110]), and the intercept–slope correlation was highly uncertain (</w:t>
-      </w:r>
-      <w:r>
-        <w:rPr>
-          <w:i/>
-          <w:iCs/>
-        </w:rPr>
-        <w:t xml:space="preserve">r</w:t>
-      </w:r>
-      <w:r>
-        <w:t xml:space="preserve"> </w:t>
-      </w:r>
-      <w:r>
-        <w:t xml:space="preserve">= 0.20, 95% CrI [-0.67, 0.85]), indicating no strong evidence that females differed substantially in plastic allocation patterns.</w:t>
-      </w:r>
-    </w:p>
-    <w:bookmarkStart w:id="27" w:name="Xa0713afe1a0937a4c359af3d72eeaa97e62c984"/>
+    <w:bookmarkEnd w:id="25"/>
+    <w:bookmarkStart w:id="26" w:name="Xa0713afe1a0937a4c359af3d72eeaa97e62c984"/>
     <w:p>
       <w:pPr>
         <w:pStyle w:val="Heading4"/>
@@ -1439,10 +1481,9 @@
         <w:t xml:space="preserve">Egg size was highly repeatable in both broods, but repeatability was higher in first broods (R = 0.64 [95% CrI: 0.54, 0.74]) than in second broods (R = 0.79 [95% CrI: 0.71, 0.86]), indicating greater within-female variance in egg size expression during second reproductive attempts.</w:t>
       </w:r>
     </w:p>
+    <w:bookmarkEnd w:id="26"/>
     <w:bookmarkEnd w:id="27"/>
-    <w:bookmarkEnd w:id="28"/>
-    <w:bookmarkEnd w:id="29"/>
-    <w:bookmarkStart w:id="30" w:name="discussion"/>
+    <w:bookmarkStart w:id="28" w:name="discussion"/>
     <w:p>
       <w:pPr>
         <w:pStyle w:val="Heading1"/>
@@ -1751,14 +1792,50 @@
         <w:t xml:space="preserve">. In contrast, the near-zero repeatability of egg number suggests that clutch size may respond primarily to short-term physiological or environmental conditions, potentially limiting its direct evolutionary response. Future work measuring resource acquisition directly, experimentally manipulating resource availability, or estimating genetic correlations between egg size and egg number would help determine whether the observed among-female trade-off reflects adaptive divergence in allocation rules or condition-dependent constraint.</w:t>
       </w:r>
     </w:p>
+    <w:bookmarkEnd w:id="28"/>
+    <w:bookmarkStart w:id="29" w:name="data-availability"/>
+    <w:p>
+      <w:pPr>
+        <w:pStyle w:val="Heading1"/>
+      </w:pPr>
+      <w:r>
+        <w:t xml:space="preserve">Data availability</w:t>
+      </w:r>
+    </w:p>
+    <w:p>
+      <w:pPr>
+        <w:pStyle w:val="FirstParagraph"/>
+      </w:pPr>
+      <w:r>
+        <w:t xml:space="preserve">Data are available through the OSF repository at 10.17605/OSF.IO/KWCS8.</w:t>
+      </w:r>
+    </w:p>
+    <w:bookmarkEnd w:id="29"/>
+    <w:bookmarkStart w:id="30" w:name="author-contributions"/>
+    <w:p>
+      <w:pPr>
+        <w:pStyle w:val="Heading1"/>
+      </w:pPr>
+      <w:r>
+        <w:t xml:space="preserve">Author contributions</w:t>
+      </w:r>
+    </w:p>
+    <w:p>
+      <w:pPr>
+        <w:pStyle w:val="FirstParagraph"/>
+      </w:pPr>
+      <w:r>
+        <w:t xml:space="preserve">CDK collected and analyzed the data, and wrote the manuscript.</w:t>
+      </w:r>
+    </w:p>
     <w:bookmarkEnd w:id="30"/>
-    <w:bookmarkStart w:id="31" w:name="data-availability"/>
+    <w:bookmarkStart w:id="31" w:name="funding"/>
     <w:p>
       <w:pPr>
         <w:pStyle w:val="Heading1"/>
       </w:pPr>
       <w:r>
-        <w:t xml:space="preserve">Data availability</w:t>
+        <w:t xml:space="preserve">Funding</w:t>
       </w:r>
     </w:p>
     <w:p>
@@ -1766,17 +1843,17 @@
         <w:pStyle w:val="FirstParagraph"/>
       </w:pPr>
       <w:r>
-        <w:t xml:space="preserve">Data are available through the OSF repository at 10.17605/OSF.IO/KWCS8.</w:t>
+        <w:t xml:space="preserve">The study was funded by a Discovery Grant from the Natural Sciences and Engineering Research Council of Canada (NSERC).</w:t>
       </w:r>
     </w:p>
     <w:bookmarkEnd w:id="31"/>
-    <w:bookmarkStart w:id="32" w:name="author-contributions"/>
+    <w:bookmarkStart w:id="32" w:name="conflict-of-interest"/>
     <w:p>
       <w:pPr>
         <w:pStyle w:val="Heading1"/>
       </w:pPr>
       <w:r>
-        <w:t xml:space="preserve">Author contributions</w:t>
+        <w:t xml:space="preserve">Conflict of Interest</w:t>
       </w:r>
     </w:p>
     <w:p>
@@ -1784,17 +1861,17 @@
         <w:pStyle w:val="FirstParagraph"/>
       </w:pPr>
       <w:r>
-        <w:t xml:space="preserve">CDK collected and analyzed the data, and wrote the manuscript.</w:t>
+        <w:t xml:space="preserve">I declare no conflict of interest.</w:t>
       </w:r>
     </w:p>
     <w:bookmarkEnd w:id="32"/>
-    <w:bookmarkStart w:id="33" w:name="funding"/>
+    <w:bookmarkStart w:id="33" w:name="acknowledgements"/>
     <w:p>
       <w:pPr>
         <w:pStyle w:val="Heading1"/>
       </w:pPr>
       <w:r>
-        <w:t xml:space="preserve">Funding</w:t>
+        <w:t xml:space="preserve">Acknowledgements</w:t>
       </w:r>
     </w:p>
     <w:p>
@@ -1802,236 +1879,151 @@
         <w:pStyle w:val="FirstParagraph"/>
       </w:pPr>
       <w:r>
-        <w:t xml:space="preserve">The study was funded by a Discovery Grant from the Natural Sciences and Engineering Research Council of Canada (NSERC).</w:t>
+        <w:t xml:space="preserve">I thank Andréanne Nault and Clara Smythe for assistance in animal care and data collection.</w:t>
+      </w:r>
+    </w:p>
+    <w:p>
+      <w:r>
+        <w:br w:type="page"/>
       </w:r>
     </w:p>
     <w:bookmarkEnd w:id="33"/>
-    <w:bookmarkStart w:id="34" w:name="conflict-of-interest"/>
+    <w:bookmarkStart w:id="90" w:name="references"/>
     <w:p>
       <w:pPr>
         <w:pStyle w:val="Heading1"/>
       </w:pPr>
       <w:r>
-        <w:t xml:space="preserve">Conflict of Interest</w:t>
-      </w:r>
-    </w:p>
-    <w:p>
-      <w:pPr>
-        <w:pStyle w:val="FirstParagraph"/>
-      </w:pPr>
-      <w:r>
-        <w:t xml:space="preserve">I declare no conflict of interest.</w:t>
+        <w:t xml:space="preserve">References</w:t>
+      </w:r>
+    </w:p>
+    <w:bookmarkStart w:id="73" w:name="refs"/>
+    <w:bookmarkStart w:id="34" w:name="ref-bernardo1996"/>
+    <w:p>
+      <w:pPr>
+        <w:pStyle w:val="Bibliography"/>
+      </w:pPr>
+      <w:r>
+        <w:t xml:space="preserve">Bernardo, J. 1996. The particular maternal effect of propagule size, especially egg size: Patterns, models, quality of evidence and interpretations. Am Zool 36:216–236.</w:t>
       </w:r>
     </w:p>
     <w:bookmarkEnd w:id="34"/>
-    <w:bookmarkStart w:id="35" w:name="acknowledgements"/>
-    <w:p>
-      <w:pPr>
-        <w:pStyle w:val="Heading1"/>
-      </w:pPr>
-      <w:r>
-        <w:t xml:space="preserve">Acknowledgements</w:t>
-      </w:r>
-    </w:p>
-    <w:p>
-      <w:pPr>
-        <w:pStyle w:val="FirstParagraph"/>
-      </w:pPr>
-      <w:r>
-        <w:t xml:space="preserve">I thank Andréanne Nault and Clara Smythe for assistance in animal care and data collection.</w:t>
-      </w:r>
-    </w:p>
-    <w:p>
-      <w:r>
-        <w:br w:type="page"/>
+    <w:bookmarkStart w:id="35" w:name="ref-careau2017"/>
+    <w:p>
+      <w:pPr>
+        <w:pStyle w:val="Bibliography"/>
+      </w:pPr>
+      <w:r>
+        <w:t xml:space="preserve">Careau, V., and R. Wilson. 2017. Of uberfleas and krakens: Detecting trade-offs using mixed models. Integr Comp Biol 57:362–371.</w:t>
       </w:r>
     </w:p>
     <w:bookmarkEnd w:id="35"/>
-    <w:bookmarkStart w:id="95" w:name="references"/>
-    <w:p>
-      <w:pPr>
-        <w:pStyle w:val="Heading1"/>
-      </w:pPr>
-      <w:r>
-        <w:t xml:space="preserve">References</w:t>
-      </w:r>
-    </w:p>
-    <w:bookmarkStart w:id="78" w:name="refs"/>
-    <w:bookmarkStart w:id="36" w:name="ref-bernardo1996"/>
+    <w:bookmarkStart w:id="36" w:name="ref-clutton-brock1991"/>
     <w:p>
       <w:pPr>
         <w:pStyle w:val="Bibliography"/>
       </w:pPr>
       <w:r>
-        <w:t xml:space="preserve">Bernardo, J. 1996. The particular maternal effect of propagule size, especially egg size: Patterns, models, quality of evidence and interpretations. Am Zool 36:216–236.</w:t>
+        <w:t xml:space="preserve">Clutton-Brock, T. H. 1991.</w:t>
+      </w:r>
+      <w:r>
+        <w:t xml:space="preserve"> </w:t>
+      </w:r>
+      <w:r>
+        <w:t xml:space="preserve">The Evolution of Parental Care</w:t>
+      </w:r>
+      <w:r>
+        <w:t xml:space="preserve">. Princeton University Press.</w:t>
       </w:r>
     </w:p>
     <w:bookmarkEnd w:id="36"/>
-    <w:bookmarkStart w:id="37" w:name="ref-burkner2017"/>
+    <w:bookmarkStart w:id="37" w:name="ref-dingemanse2013"/>
     <w:p>
       <w:pPr>
         <w:pStyle w:val="Bibliography"/>
       </w:pPr>
       <w:r>
-        <w:t xml:space="preserve">Bürkner, P.-C. 2017.</w:t>
-      </w:r>
-      <w:r>
-        <w:t xml:space="preserve"> </w:t>
-      </w:r>
-      <w:r>
-        <w:t xml:space="preserve">brms</w:t>
-      </w:r>
-      <w:r>
-        <w:t xml:space="preserve">: An</w:t>
-      </w:r>
-      <w:r>
-        <w:t xml:space="preserve"> </w:t>
-      </w:r>
-      <w:r>
-        <w:t xml:space="preserve">R</w:t>
-      </w:r>
-      <w:r>
-        <w:t xml:space="preserve"> </w:t>
-      </w:r>
-      <w:r>
-        <w:t xml:space="preserve">package for</w:t>
-      </w:r>
-      <w:r>
-        <w:t xml:space="preserve"> </w:t>
-      </w:r>
-      <w:r>
-        <w:t xml:space="preserve">B</w:t>
-      </w:r>
-      <w:r>
-        <w:t xml:space="preserve">ayesian multilevel models using</w:t>
-      </w:r>
-      <w:r>
-        <w:t xml:space="preserve"> </w:t>
-      </w:r>
-      <w:r>
-        <w:t xml:space="preserve">S</w:t>
-      </w:r>
-      <w:r>
-        <w:t xml:space="preserve">tan. Journal of Statistical Software 80:4308.</w:t>
+        <w:t xml:space="preserve">Dingemanse, N., and N. Dochtermann. 2013. Quantifying individual variation in behaviour: Mixed-effect modelling approaches. J Anim Ecol 82:39–54. Evolutionary Ecology of Variation Group, Max Planck Institute for Ornithology, Eberhard-Gwinner-Stra</w:t>
+      </w:r>
+      <w:r>
+        <w:t xml:space="preserve">ß</w:t>
+      </w:r>
+      <w:r>
+        <w:t xml:space="preserve">e, 82319 Seewiesen (Starnberg), Germany. ndingemanse@orn.mpg.de.</w:t>
       </w:r>
     </w:p>
     <w:bookmarkEnd w:id="37"/>
-    <w:bookmarkStart w:id="38" w:name="ref-careau2017"/>
+    <w:bookmarkStart w:id="38" w:name="ref-falconer1996"/>
     <w:p>
       <w:pPr>
         <w:pStyle w:val="Bibliography"/>
       </w:pPr>
       <w:r>
-        <w:t xml:space="preserve">Careau, V., and R. Wilson. 2017. Of uberfleas and krakens: Detecting trade-offs using mixed models. Integr Comp Biol 57:362–371.</w:t>
+        <w:t xml:space="preserve">Falconer, D. S., and T. F. C. MacKay. 1996.</w:t>
+      </w:r>
+      <w:r>
+        <w:t xml:space="preserve"> </w:t>
+      </w:r>
+      <w:r>
+        <w:t xml:space="preserve">An Introduction Quantitative Genetics</w:t>
+      </w:r>
+      <w:r>
+        <w:t xml:space="preserve">. Pearson Education Limited, Essex, England.</w:t>
       </w:r>
     </w:p>
     <w:bookmarkEnd w:id="38"/>
-    <w:bookmarkStart w:id="39" w:name="ref-clutton-brock1991"/>
+    <w:bookmarkStart w:id="39" w:name="ref-fox2000"/>
     <w:p>
       <w:pPr>
         <w:pStyle w:val="Bibliography"/>
       </w:pPr>
       <w:r>
-        <w:t xml:space="preserve">Clutton-Brock, T. H. 1991.</w:t>
-      </w:r>
-      <w:r>
-        <w:t xml:space="preserve"> </w:t>
-      </w:r>
-      <w:r>
-        <w:t xml:space="preserve">The Evolution of Parental Care</w:t>
-      </w:r>
-      <w:r>
-        <w:t xml:space="preserve">. Princeton University Press.</w:t>
+        <w:t xml:space="preserve">Fox, C. W., and M. E. Czesak. 2000. Evolutionary ecology of progeny size in arthropods. Annu Rev Entomol 45:341–369.</w:t>
       </w:r>
     </w:p>
     <w:bookmarkEnd w:id="39"/>
-    <w:bookmarkStart w:id="40" w:name="ref-dingemanse2013"/>
+    <w:bookmarkStart w:id="40" w:name="ref-hargitai2005"/>
     <w:p>
       <w:pPr>
         <w:pStyle w:val="Bibliography"/>
       </w:pPr>
       <w:r>
-        <w:t xml:space="preserve">Dingemanse, N., and N. Dochtermann. 2013. Quantifying individual variation in behaviour: Mixed-effect modelling approaches. J Anim Ecol 82:39–54. Evolutionary Ecology of Variation Group, Max Planck Institute for Ornithology, Eberhard-Gwinner-Stra</w:t>
-      </w:r>
-      <w:r>
-        <w:t xml:space="preserve">ß</w:t>
-      </w:r>
-      <w:r>
-        <w:t xml:space="preserve">e, 82319 Seewiesen (Starnberg), Germany. ndingemanse@orn.mpg.de.</w:t>
+        <w:t xml:space="preserve">Hargitai, R., J. Török, L. Tóth, G. Hegyi, B. Rosivall, B. Szigeti, and E. Szöllősi. 2005. Effects of environmental conditions and parental quality on inter-and intraclutch egg-size variation in the collared flycatcher (ficedula albicollis). The Auk 122:509–522.</w:t>
       </w:r>
     </w:p>
     <w:bookmarkEnd w:id="40"/>
-    <w:bookmarkStart w:id="41" w:name="ref-falconer1996"/>
+    <w:bookmarkStart w:id="41" w:name="ref-harvey1983"/>
     <w:p>
       <w:pPr>
         <w:pStyle w:val="Bibliography"/>
       </w:pPr>
       <w:r>
-        <w:t xml:space="preserve">Falconer, D. S., and T. F. C. MacKay. 1996.</w:t>
-      </w:r>
-      <w:r>
-        <w:t xml:space="preserve"> </w:t>
-      </w:r>
-      <w:r>
-        <w:t xml:space="preserve">An Introduction Quantitative Genetics</w:t>
-      </w:r>
-      <w:r>
-        <w:t xml:space="preserve">. Pearson Education Limited, Essex, England.</w:t>
+        <w:t xml:space="preserve">Harvey, G. T. 1983. Environmental and genetic effects on mean egg weight in spruce budworm (lepidoptera: tortricidae). The Canadian Entomologist 115:1109–1117.</w:t>
       </w:r>
     </w:p>
     <w:bookmarkEnd w:id="41"/>
-    <w:bookmarkStart w:id="42" w:name="ref-fox2000"/>
+    <w:bookmarkStart w:id="42" w:name="ref-honek1993"/>
     <w:p>
       <w:pPr>
         <w:pStyle w:val="Bibliography"/>
       </w:pPr>
       <w:r>
-        <w:t xml:space="preserve">Fox, C. W., and M. E. Czesak. 2000. Evolutionary ecology of progeny size in arthropods. Annu Rev Entomol 45:341–369.</w:t>
+        <w:t xml:space="preserve">Honek, A. 1993. Intraspecific variation in body size and fecundity in insects: A general relationship. Oikos 483–492.</w:t>
       </w:r>
     </w:p>
     <w:bookmarkEnd w:id="42"/>
-    <w:bookmarkStart w:id="43" w:name="ref-hargitai2005"/>
+    <w:bookmarkStart w:id="44" w:name="ref-kay2020"/>
     <w:p>
       <w:pPr>
         <w:pStyle w:val="Bibliography"/>
       </w:pPr>
       <w:r>
-        <w:t xml:space="preserve">Hargitai, R., J. Török, L. Tóth, G. Hegyi, B. Rosivall, B. Szigeti, and E. Szöllősi. 2005. Effects of environmental conditions and parental quality on inter-and intraclutch egg-size variation in the collared flycatcher (ficedula albicollis). The Auk 122:509–522.</w:t>
-      </w:r>
-    </w:p>
-    <w:bookmarkEnd w:id="43"/>
-    <w:bookmarkStart w:id="44" w:name="ref-harvey1983"/>
-    <w:p>
-      <w:pPr>
-        <w:pStyle w:val="Bibliography"/>
-      </w:pPr>
-      <w:r>
-        <w:t xml:space="preserve">Harvey, G. T. 1983. Environmental and genetic effects on mean egg weight in spruce budworm (lepidoptera: tortricidae). The Canadian Entomologist 115:1109–1117.</w:t>
-      </w:r>
-    </w:p>
-    <w:bookmarkEnd w:id="44"/>
-    <w:bookmarkStart w:id="45" w:name="ref-honek1993"/>
-    <w:p>
-      <w:pPr>
-        <w:pStyle w:val="Bibliography"/>
-      </w:pPr>
-      <w:r>
-        <w:t xml:space="preserve">Honek, A. 1993. Intraspecific variation in body size and fecundity in insects: A general relationship. Oikos 483–492.</w:t>
-      </w:r>
-    </w:p>
-    <w:bookmarkEnd w:id="45"/>
-    <w:bookmarkStart w:id="47" w:name="ref-kay2020"/>
-    <w:p>
-      <w:pPr>
-        <w:pStyle w:val="Bibliography"/>
-      </w:pPr>
-      <w:r>
         <w:t xml:space="preserve">Kay, M. 2020.</w:t>
       </w:r>
       <w:r>
         <w:t xml:space="preserve"> </w:t>
       </w:r>
-      <w:hyperlink r:id="rId46">
+      <w:hyperlink r:id="rId43">
         <w:r>
           <w:rPr>
             <w:rStyle w:val="Hyperlink"/>
@@ -2091,8 +2083,8 @@
         <w:t xml:space="preserve">.</w:t>
       </w:r>
     </w:p>
-    <w:bookmarkEnd w:id="47"/>
-    <w:bookmarkStart w:id="48" w:name="ref-kelly2014"/>
+    <w:bookmarkEnd w:id="44"/>
+    <w:bookmarkStart w:id="45" w:name="ref-kelly2014"/>
     <w:p>
       <w:pPr>
         <w:pStyle w:val="Bibliography"/>
@@ -2101,8 +2093,8 @@
         <w:t xml:space="preserve">Kelly, C. D., B. Tawes, and A. Worthington. 2014. Evaluating indices of body condition in two cricket species. Ecology and Evolution 4:4476–4487.</w:t>
       </w:r>
     </w:p>
-    <w:bookmarkEnd w:id="48"/>
-    <w:bookmarkStart w:id="49" w:name="ref-koch2014"/>
+    <w:bookmarkEnd w:id="45"/>
+    <w:bookmarkStart w:id="46" w:name="ref-koch2014"/>
     <w:p>
       <w:pPr>
         <w:pStyle w:val="Bibliography"/>
@@ -2111,8 +2103,8 @@
         <w:t xml:space="preserve">Koch, L. K., and J. Meunier. 2014. Mother and offspring fitness in an insect with maternal care: Phenotypic trade-offs between egg number, egg mass and egg care. BMC Evol Biol 14:125.</w:t>
       </w:r>
     </w:p>
-    <w:bookmarkEnd w:id="49"/>
-    <w:bookmarkStart w:id="50" w:name="ref-lack1947"/>
+    <w:bookmarkEnd w:id="46"/>
+    <w:bookmarkStart w:id="47" w:name="ref-lack1947"/>
     <w:p>
       <w:pPr>
         <w:pStyle w:val="Bibliography"/>
@@ -2131,188 +2123,178 @@
         <w:t xml:space="preserve">). The Journal of Animal Ecology 19–25.</w:t>
       </w:r>
     </w:p>
+    <w:bookmarkEnd w:id="47"/>
+    <w:bookmarkStart w:id="48" w:name="ref-lessells1987"/>
+    <w:p>
+      <w:pPr>
+        <w:pStyle w:val="Bibliography"/>
+      </w:pPr>
+      <w:r>
+        <w:t xml:space="preserve">Lessells, C., and P. T. Boag. 1987. Unrepeatable repeatabilities: A common mistake. The Auk 104:116–121.</w:t>
+      </w:r>
+    </w:p>
+    <w:bookmarkEnd w:id="48"/>
+    <w:bookmarkStart w:id="49" w:name="ref-meunier2024"/>
+    <w:p>
+      <w:pPr>
+        <w:pStyle w:val="Bibliography"/>
+      </w:pPr>
+      <w:r>
+        <w:t xml:space="preserve">Meunier, J. 2024. The biology and social life of earwigs (dermaptera). Annu Rev Entomol 69:259–276.</w:t>
+      </w:r>
+    </w:p>
+    <w:bookmarkEnd w:id="49"/>
+    <w:bookmarkStart w:id="50" w:name="ref-nilsson1993"/>
+    <w:p>
+      <w:pPr>
+        <w:pStyle w:val="Bibliography"/>
+      </w:pPr>
+      <w:r>
+        <w:t xml:space="preserve">Nilsson, J. ‐Å., and E. Svensson. 1993. Causes and consequences of egg mass variation between and within blue tit clutches. J Zool 230:469–481.</w:t>
+      </w:r>
+    </w:p>
     <w:bookmarkEnd w:id="50"/>
-    <w:bookmarkStart w:id="51" w:name="ref-lessells1987"/>
+    <w:bookmarkStart w:id="51" w:name="ref-parker1982"/>
     <w:p>
       <w:pPr>
         <w:pStyle w:val="Bibliography"/>
       </w:pPr>
       <w:r>
-        <w:t xml:space="preserve">Lessells, C., and P. T. Boag. 1987. Unrepeatable repeatabilities: A common mistake. The Auk 104:116–121.</w:t>
+        <w:t xml:space="preserve">Parker, G. A. 1982. Why are there so many tiny sperm? Sperm competition and the maintenance of two sexes. J Theor Biol 96:281–294.</w:t>
       </w:r>
     </w:p>
     <w:bookmarkEnd w:id="51"/>
-    <w:bookmarkStart w:id="52" w:name="ref-meunier2024"/>
+    <w:bookmarkStart w:id="52" w:name="ref-peig2009"/>
     <w:p>
       <w:pPr>
         <w:pStyle w:val="Bibliography"/>
       </w:pPr>
       <w:r>
-        <w:t xml:space="preserve">Meunier, J. 2024. The biology and social life of earwigs (dermaptera). Annu Rev Entomol 69:259–276.</w:t>
+        <w:t xml:space="preserve">Peig, J., and A. J. Green. 2009. New perspectives for estimating body condition from mass/length data: The scaled mass index as an alternative method. Oikos 118:1883–1891.</w:t>
       </w:r>
     </w:p>
     <w:bookmarkEnd w:id="52"/>
-    <w:bookmarkStart w:id="53" w:name="ref-nilsson1993"/>
+    <w:bookmarkStart w:id="53" w:name="ref-peig2010"/>
     <w:p>
       <w:pPr>
         <w:pStyle w:val="Bibliography"/>
       </w:pPr>
       <w:r>
-        <w:t xml:space="preserve">Nilsson, J. ‐Å., and E. Svensson. 1993. Causes and consequences of egg mass variation between and within blue tit clutches. J Zool 230:469–481.</w:t>
+        <w:t xml:space="preserve">Peig, J., and A. J. Green. 2010. The paradigm of body condition: A critical reappraisal of current methods based on mass and length. Funct Ecol 24:1323–1332.</w:t>
       </w:r>
     </w:p>
     <w:bookmarkEnd w:id="53"/>
-    <w:bookmarkStart w:id="54" w:name="ref-parker1982"/>
+    <w:bookmarkStart w:id="54" w:name="ref-r2013"/>
     <w:p>
       <w:pPr>
         <w:pStyle w:val="Bibliography"/>
       </w:pPr>
       <w:r>
-        <w:t xml:space="preserve">Parker, G. A. 1982. Why are there so many tiny sperm? Sperm competition and the maintenance of two sexes. J Theor Biol 96:281–294.</w:t>
+        <w:t xml:space="preserve">R Core Team. 2025.</w:t>
+      </w:r>
+      <w:r>
+        <w:t xml:space="preserve"> </w:t>
+      </w:r>
+      <w:r>
+        <w:t xml:space="preserve">R</w:t>
+      </w:r>
+      <w:r>
+        <w:t xml:space="preserve">:</w:t>
+      </w:r>
+      <w:r>
+        <w:t xml:space="preserve"> </w:t>
+      </w:r>
+      <w:r>
+        <w:t xml:space="preserve">A</w:t>
+      </w:r>
+      <w:r>
+        <w:t xml:space="preserve"> </w:t>
+      </w:r>
+      <w:r>
+        <w:t xml:space="preserve">language and environment for statistical computing. Vienna, Austria.</w:t>
       </w:r>
     </w:p>
     <w:bookmarkEnd w:id="54"/>
-    <w:bookmarkStart w:id="55" w:name="ref-peig2009"/>
+    <w:bookmarkStart w:id="55" w:name="ref-reznick2000"/>
     <w:p>
       <w:pPr>
         <w:pStyle w:val="Bibliography"/>
       </w:pPr>
       <w:r>
-        <w:t xml:space="preserve">Peig, J., and A. J. Green. 2009. New perspectives for estimating body condition from mass/length data: The scaled mass index as an alternative method. Oikos 118:1883–1891.</w:t>
+        <w:t xml:space="preserve">Reznick, D., L. Nunney, and A. Tessier. 2000. Big houses, big cars, superfleas and the costs of reproduction. Trends Ecol Evol 15:421–425.</w:t>
       </w:r>
     </w:p>
     <w:bookmarkEnd w:id="55"/>
-    <w:bookmarkStart w:id="56" w:name="ref-peig2010"/>
+    <w:bookmarkStart w:id="56" w:name="ref-roff1992a"/>
     <w:p>
       <w:pPr>
         <w:pStyle w:val="Bibliography"/>
       </w:pPr>
       <w:r>
-        <w:t xml:space="preserve">Peig, J., and A. J. Green. 2010. The paradigm of body condition: A critical reappraisal of current methods based on mass and length. Funct Ecol 24:1323–1332.</w:t>
+        <w:t xml:space="preserve">Roff, D. 1992.</w:t>
+      </w:r>
+      <w:r>
+        <w:t xml:space="preserve"> </w:t>
+      </w:r>
+      <w:r>
+        <w:t xml:space="preserve">Evolution of Life Histories: Theory and Analysis</w:t>
+      </w:r>
+      <w:r>
+        <w:t xml:space="preserve">. Chapman &amp; Hall, Inc., New York, NY.</w:t>
       </w:r>
     </w:p>
     <w:bookmarkEnd w:id="56"/>
-    <w:bookmarkStart w:id="57" w:name="ref-vandepol2009"/>
+    <w:bookmarkStart w:id="57" w:name="ref-schindelin2012"/>
     <w:p>
       <w:pPr>
         <w:pStyle w:val="Bibliography"/>
       </w:pPr>
       <w:r>
-        <w:t xml:space="preserve">Pol, M. van de, and J. Wright. 2009. A simple method for distinguishing within- versus between-subject effects using mixed models. Anim Behav 77:753–758.</w:t>
+        <w:t xml:space="preserve">Schindelin, J., I. Arganda-Carreras, E. Frise, V. Kaynig, M. Longair, T. Pietzsch, S. Preibisch, C. Rueden, S. Saalfeld, B. Schmid, J.-Y. Tinevez, D. J. White, V. Hartenstein, K. Eliceiri, P. Tomancak, and A. Cardona. 2012. Fiji: An open-source platform for biological-image analysis. Nat Methods 9:676–682. Max Planck Institute of Molecular Cell Biology; Genetics, Dresden, Germany.</w:t>
       </w:r>
     </w:p>
     <w:bookmarkEnd w:id="57"/>
-    <w:bookmarkStart w:id="58" w:name="ref-r2013"/>
+    <w:bookmarkStart w:id="58" w:name="ref-seko2006"/>
     <w:p>
       <w:pPr>
         <w:pStyle w:val="Bibliography"/>
       </w:pPr>
       <w:r>
-        <w:t xml:space="preserve">R Core Team. 2025.</w:t>
-      </w:r>
-      <w:r>
-        <w:t xml:space="preserve"> </w:t>
-      </w:r>
-      <w:r>
-        <w:t xml:space="preserve">R</w:t>
-      </w:r>
-      <w:r>
-        <w:t xml:space="preserve">:</w:t>
-      </w:r>
-      <w:r>
-        <w:t xml:space="preserve"> </w:t>
-      </w:r>
-      <w:r>
-        <w:t xml:space="preserve">A</w:t>
-      </w:r>
-      <w:r>
-        <w:t xml:space="preserve"> </w:t>
-      </w:r>
-      <w:r>
-        <w:t xml:space="preserve">language and environment for statistical computing. Vienna, Austria.</w:t>
+        <w:t xml:space="preserve">Seko, T., T. Miyatake, S. Fujioka, and F. Nakasuji. 2006. Genetic and environmental sources of egg size, fecundity and body size in the migrant skipper, parnara guttata guttata (lepidoptera: hesperiidae). Popul Ecol 48:225–232.</w:t>
       </w:r>
     </w:p>
     <w:bookmarkEnd w:id="58"/>
-    <w:bookmarkStart w:id="59" w:name="ref-reznick2000"/>
+    <w:bookmarkStart w:id="59" w:name="ref-simpson1951"/>
     <w:p>
       <w:pPr>
         <w:pStyle w:val="Bibliography"/>
       </w:pPr>
       <w:r>
-        <w:t xml:space="preserve">Reznick, D., L. Nunney, and A. Tessier. 2000. Big houses, big cars, superfleas and the costs of reproduction. Trends Ecol Evol 15:421–425.</w:t>
+        <w:t xml:space="preserve">Simpson, E. H. 1951. The interpretation of interaction in contingency tables. Journal of the Royal Statistical Society: Series B (Methodological) 13:238–241.</w:t>
       </w:r>
     </w:p>
     <w:bookmarkEnd w:id="59"/>
-    <w:bookmarkStart w:id="60" w:name="ref-roff1992a"/>
+    <w:bookmarkStart w:id="60" w:name="ref-slagsvold1984"/>
     <w:p>
       <w:pPr>
         <w:pStyle w:val="Bibliography"/>
       </w:pPr>
       <w:r>
-        <w:t xml:space="preserve">Roff, D. 1992.</w:t>
-      </w:r>
-      <w:r>
-        <w:t xml:space="preserve"> </w:t>
-      </w:r>
-      <w:r>
-        <w:t xml:space="preserve">Evolution of Life Histories: Theory and Analysis</w:t>
-      </w:r>
-      <w:r>
-        <w:t xml:space="preserve">. Chapman &amp; Hall, Inc., New York, NY.</w:t>
+        <w:t xml:space="preserve">Slagsvold, T., J. Sandvik, G. Rofstad, Ö. Lorentsen, and M. Husby. 1984. On the adaptive value of intraclutch egg-size variation in birds. The Auk 101:685–697.</w:t>
       </w:r>
     </w:p>
     <w:bookmarkEnd w:id="60"/>
-    <w:bookmarkStart w:id="61" w:name="ref-schindelin2012"/>
+    <w:bookmarkStart w:id="61" w:name="ref-smith1974"/>
     <w:p>
       <w:pPr>
         <w:pStyle w:val="Bibliography"/>
       </w:pPr>
       <w:r>
-        <w:t xml:space="preserve">Schindelin, J., I. Arganda-Carreras, E. Frise, V. Kaynig, M. Longair, T. Pietzsch, S. Preibisch, C. Rueden, S. Saalfeld, B. Schmid, J.-Y. Tinevez, D. J. White, V. Hartenstein, K. Eliceiri, P. Tomancak, and A. Cardona. 2012. Fiji: An open-source platform for biological-image analysis. Nat Methods 9:676–682. Max Planck Institute of Molecular Cell Biology; Genetics, Dresden, Germany.</w:t>
+        <w:t xml:space="preserve">Smith, C. C., and S. D. Fretwell. 1974. The optimal balance between size and number of offspring. Am Nat 108:499–506.</w:t>
       </w:r>
     </w:p>
     <w:bookmarkEnd w:id="61"/>
-    <w:bookmarkStart w:id="62" w:name="ref-seko2006"/>
-    <w:p>
-      <w:pPr>
-        <w:pStyle w:val="Bibliography"/>
-      </w:pPr>
-      <w:r>
-        <w:t xml:space="preserve">Seko, T., T. Miyatake, S. Fujioka, and F. Nakasuji. 2006. Genetic and environmental sources of egg size, fecundity and body size in the migrant skipper, parnara guttata guttata (lepidoptera: hesperiidae). Popul Ecol 48:225–232.</w:t>
-      </w:r>
-    </w:p>
-    <w:bookmarkEnd w:id="62"/>
-    <w:bookmarkStart w:id="63" w:name="ref-simpson1951"/>
-    <w:p>
-      <w:pPr>
-        <w:pStyle w:val="Bibliography"/>
-      </w:pPr>
-      <w:r>
-        <w:t xml:space="preserve">Simpson, E. H. 1951. The interpretation of interaction in contingency tables. Journal of the Royal Statistical Society: Series B (Methodological) 13:238–241.</w:t>
-      </w:r>
-    </w:p>
-    <w:bookmarkEnd w:id="63"/>
-    <w:bookmarkStart w:id="64" w:name="ref-slagsvold1984"/>
-    <w:p>
-      <w:pPr>
-        <w:pStyle w:val="Bibliography"/>
-      </w:pPr>
-      <w:r>
-        <w:t xml:space="preserve">Slagsvold, T., J. Sandvik, G. Rofstad, Ö. Lorentsen, and M. Husby. 1984. On the adaptive value of intraclutch egg-size variation in birds. The Auk 101:685–697.</w:t>
-      </w:r>
-    </w:p>
-    <w:bookmarkEnd w:id="64"/>
-    <w:bookmarkStart w:id="65" w:name="ref-smith1974"/>
-    <w:p>
-      <w:pPr>
-        <w:pStyle w:val="Bibliography"/>
-      </w:pPr>
-      <w:r>
-        <w:t xml:space="preserve">Smith, C. C., and S. D. Fretwell. 1974. The optimal balance between size and number of offspring. Am Nat 108:499–506.</w:t>
-      </w:r>
-    </w:p>
-    <w:bookmarkEnd w:id="65"/>
-    <w:bookmarkStart w:id="66" w:name="ref-staerkle2008"/>
+    <w:bookmarkStart w:id="62" w:name="ref-staerkle2008"/>
     <w:p>
       <w:pPr>
         <w:pStyle w:val="Bibliography"/>
@@ -2331,8 +2313,8 @@
         <w:t xml:space="preserve">). Ethology 114:844–850.</w:t>
       </w:r>
     </w:p>
-    <w:bookmarkEnd w:id="66"/>
-    <w:bookmarkStart w:id="67" w:name="ref-stearns1992"/>
+    <w:bookmarkEnd w:id="62"/>
+    <w:bookmarkStart w:id="63" w:name="ref-stearns1992"/>
     <w:p>
       <w:pPr>
         <w:pStyle w:val="Bibliography"/>
@@ -2350,8 +2332,8 @@
         <w:t xml:space="preserve">. Oxford University Press.</w:t>
       </w:r>
     </w:p>
-    <w:bookmarkEnd w:id="67"/>
-    <w:bookmarkStart w:id="68" w:name="ref-stoffel2017"/>
+    <w:bookmarkEnd w:id="63"/>
+    <w:bookmarkStart w:id="64" w:name="ref-stoffel2017"/>
     <w:p>
       <w:pPr>
         <w:pStyle w:val="Bibliography"/>
@@ -2366,8 +2348,8 @@
         <w:t xml:space="preserve">: Repeatability estimation and variance decomposition by generalized linear mixed‐effects models. Methods Ecol Evol 8:1639–1644.</w:t>
       </w:r>
     </w:p>
-    <w:bookmarkEnd w:id="68"/>
-    <w:bookmarkStart w:id="69" w:name="ref-torres-vila2012"/>
+    <w:bookmarkEnd w:id="64"/>
+    <w:bookmarkStart w:id="65" w:name="ref-torres-vila2012"/>
     <w:p>
       <w:pPr>
         <w:pStyle w:val="Bibliography"/>
@@ -2392,8 +2374,8 @@
         <w:t xml:space="preserve">L. Cauterruccio, ed. Moths: Types, ecological significance and control methods. Nova Science Publishers, New York, NY.</w:t>
       </w:r>
     </w:p>
-    <w:bookmarkEnd w:id="69"/>
-    <w:bookmarkStart w:id="70" w:name="ref-tourneur2018"/>
+    <w:bookmarkEnd w:id="65"/>
+    <w:bookmarkStart w:id="66" w:name="ref-tourneur2018"/>
     <w:p>
       <w:pPr>
         <w:pStyle w:val="Bibliography"/>
@@ -2418,8 +2400,8 @@
         <w:t xml:space="preserve">(dermaptera: Forficulidae) in three climatologically different zones of north america. The Canadian Entomologist 150:511–519.</w:t>
       </w:r>
     </w:p>
-    <w:bookmarkEnd w:id="70"/>
-    <w:bookmarkStart w:id="71" w:name="ref-tourneur1992"/>
+    <w:bookmarkEnd w:id="66"/>
+    <w:bookmarkStart w:id="67" w:name="ref-tourneur1992"/>
     <w:p>
       <w:pPr>
         <w:pStyle w:val="Bibliography"/>
@@ -2489,191 +2471,67 @@
         <w:t xml:space="preserve">orficulidae). The Canadian Entomologist 124:1055–1061.</w:t>
       </w:r>
     </w:p>
+    <w:bookmarkEnd w:id="67"/>
+    <w:bookmarkStart w:id="68" w:name="ref-vannoordwijk1986"/>
+    <w:p>
+      <w:pPr>
+        <w:pStyle w:val="Bibliography"/>
+      </w:pPr>
+      <w:r>
+        <w:t xml:space="preserve">Van Noordwijk, A. J., and G. de Jong. 1986. Acquisition and allocation of resources: Their influence on variation in life history tactics. Am Nat 128:137–142.</w:t>
+      </w:r>
+    </w:p>
+    <w:bookmarkEnd w:id="68"/>
+    <w:bookmarkStart w:id="69" w:name="ref-wickham2016"/>
+    <w:p>
+      <w:pPr>
+        <w:pStyle w:val="Bibliography"/>
+      </w:pPr>
+      <w:r>
+        <w:t xml:space="preserve">Wickham, H. 2016. ggplot2:</w:t>
+      </w:r>
+      <w:r>
+        <w:t xml:space="preserve"> </w:t>
+      </w:r>
+      <w:r>
+        <w:t xml:space="preserve">E</w:t>
+      </w:r>
+      <w:r>
+        <w:t xml:space="preserve">legant graphics for data analysis. Springer, New York.</w:t>
+      </w:r>
+    </w:p>
+    <w:bookmarkEnd w:id="69"/>
+    <w:bookmarkStart w:id="70" w:name="ref-winkler1987"/>
+    <w:p>
+      <w:pPr>
+        <w:pStyle w:val="Bibliography"/>
+      </w:pPr>
+      <w:r>
+        <w:t xml:space="preserve">Winkler, D. W., and K. Wallin. 1987. Offspring size and number: A life history model linking effort per offspring and total effort. Am Nat 129:708–720.</w:t>
+      </w:r>
+    </w:p>
+    <w:bookmarkEnd w:id="70"/>
+    <w:bookmarkStart w:id="71" w:name="ref-yanagi2006"/>
+    <w:p>
+      <w:pPr>
+        <w:pStyle w:val="Bibliography"/>
+      </w:pPr>
+      <w:r>
+        <w:t xml:space="preserve">Yanagi, S., T. Oikawa, and T. Miyatake. 2006. Heritability and genetic correlation estimates for egg size and number in callosobruchus chinensis (coleoptera: bruchidae). Ann Entomol Soc Am 99:364–368.</w:t>
+      </w:r>
+    </w:p>
     <w:bookmarkEnd w:id="71"/>
-    <w:bookmarkStart w:id="72" w:name="ref-vannoordwijk1986"/>
+    <w:bookmarkStart w:id="72" w:name="ref-yosef2008"/>
     <w:p>
       <w:pPr>
         <w:pStyle w:val="Bibliography"/>
       </w:pPr>
       <w:r>
-        <w:t xml:space="preserve">Van Noordwijk, A. J., and G. de Jong. 1986. Acquisition and allocation of resources: Their influence on variation in life history tactics. Am Nat 128:137–142.</w:t>
+        <w:t xml:space="preserve">Yosef, R., and P. Zduniak. 2008. Variation in clutch size, egg size variability and reproductive output in the desert finch (rhodospiza obsoleta). J Arid Environ 72:1631–1635.</w:t>
       </w:r>
     </w:p>
     <w:bookmarkEnd w:id="72"/>
-    <w:bookmarkStart w:id="73" w:name="ref-westneat2020"/>
-    <w:p>
-      <w:pPr>
-        <w:pStyle w:val="Bibliography"/>
-      </w:pPr>
-      <w:r>
-        <w:t xml:space="preserve">Westneat, D. F., Y. G. Araya-Ajoy, H. Allegue, B. Class, N. Dingemanse, N. A. Dochtermann, L. Z. Garamszegi, J. G. A. Martin, S. Nakagawa, D. Réale, and H. Schielzeth. 2020. Collision between biological process and statistical analysis revealed by mean centring. J Anim Ecol 89:2813–2824. Department of Biology, University of Kentucky, Lexington, KY, USA. Centre for Biodiversity Dynamics (CBD), Department of Biology, Norwegian University of Science; Technology (NTNU), Trondheim, Norway. D</w:t>
-      </w:r>
-      <w:r>
-        <w:t xml:space="preserve">é</w:t>
-      </w:r>
-      <w:r>
-        <w:t xml:space="preserve">partement des Sciences Biologiques, Universit</w:t>
-      </w:r>
-      <w:r>
-        <w:t xml:space="preserve">é</w:t>
-      </w:r>
-      <w:r>
-        <w:t xml:space="preserve"> </w:t>
-      </w:r>
-      <w:r>
-        <w:t xml:space="preserve">du Qu</w:t>
-      </w:r>
-      <w:r>
-        <w:t xml:space="preserve">é</w:t>
-      </w:r>
-      <w:r>
-        <w:t xml:space="preserve">bec</w:t>
-      </w:r>
-      <w:r>
-        <w:t xml:space="preserve"> </w:t>
-      </w:r>
-      <w:r>
-        <w:t xml:space="preserve">à</w:t>
-      </w:r>
-      <w:r>
-        <w:t xml:space="preserve"> </w:t>
-      </w:r>
-      <w:r>
-        <w:t xml:space="preserve">Montr</w:t>
-      </w:r>
-      <w:r>
-        <w:t xml:space="preserve">é</w:t>
-      </w:r>
-      <w:r>
-        <w:t xml:space="preserve">al, Montreal, QC, Canada. Global Change Ecology Research Group, University of the Sunshine Coast, Sunshine Coast, QLD, Australia. Behavioural Ecology, Department of Biology, Ludwig-Maximilians University of Munich, Planegg-Martinsried, Germany. Department of Biological Sciences, North Dakota State University, Fargo, ND, USA. Centre for Ecological Research, Institute of Ecology; Botany, V</w:t>
-      </w:r>
-      <w:r>
-        <w:t xml:space="preserve">á</w:t>
-      </w:r>
-      <w:r>
-        <w:t xml:space="preserve">cr</w:t>
-      </w:r>
-      <w:r>
-        <w:t xml:space="preserve">á</w:t>
-      </w:r>
-      <w:r>
-        <w:t xml:space="preserve">t</w:t>
-      </w:r>
-      <w:r>
-        <w:t xml:space="preserve">ó</w:t>
-      </w:r>
-      <w:r>
-        <w:t xml:space="preserve">t, Hungary. MTA-ELTE, Theoretical Biology; Evolutionary Ecology Research Group, Department of Plant Systematics, Ecology; Theoretical Biology, E</w:t>
-      </w:r>
-      <w:r>
-        <w:t xml:space="preserve">ö</w:t>
-      </w:r>
-      <w:r>
-        <w:t xml:space="preserve">tv</w:t>
-      </w:r>
-      <w:r>
-        <w:t xml:space="preserve">ö</w:t>
-      </w:r>
-      <w:r>
-        <w:t xml:space="preserve">s Lor</w:t>
-      </w:r>
-      <w:r>
-        <w:t xml:space="preserve">á</w:t>
-      </w:r>
-      <w:r>
-        <w:t xml:space="preserve">nd University, Budapest, Hungary. Department of Biology, University of Ottawa, Ottawa, ON, Canada. Evolution &amp; Ecology Research Centre; School of Biological, Earth; Environmental Sciences, University of New South Wales, Sydney, Australia. D</w:t>
-      </w:r>
-      <w:r>
-        <w:t xml:space="preserve">é</w:t>
-      </w:r>
-      <w:r>
-        <w:t xml:space="preserve">partement des Sciences Biologiques, Universit</w:t>
-      </w:r>
-      <w:r>
-        <w:t xml:space="preserve">é</w:t>
-      </w:r>
-      <w:r>
-        <w:t xml:space="preserve"> </w:t>
-      </w:r>
-      <w:r>
-        <w:t xml:space="preserve">du Qu</w:t>
-      </w:r>
-      <w:r>
-        <w:t xml:space="preserve">é</w:t>
-      </w:r>
-      <w:r>
-        <w:t xml:space="preserve">bec</w:t>
-      </w:r>
-      <w:r>
-        <w:t xml:space="preserve"> </w:t>
-      </w:r>
-      <w:r>
-        <w:t xml:space="preserve">à</w:t>
-      </w:r>
-      <w:r>
-        <w:t xml:space="preserve"> </w:t>
-      </w:r>
-      <w:r>
-        <w:t xml:space="preserve">Montr</w:t>
-      </w:r>
-      <w:r>
-        <w:t xml:space="preserve">é</w:t>
-      </w:r>
-      <w:r>
-        <w:t xml:space="preserve">al, Montreal, QC, Canada. Institute of Ecology; Evolution, Friedrich Schiller University, Jena, Germany.</w:t>
-      </w:r>
-    </w:p>
     <w:bookmarkEnd w:id="73"/>
-    <w:bookmarkStart w:id="74" w:name="ref-wickham2016"/>
-    <w:p>
-      <w:pPr>
-        <w:pStyle w:val="Bibliography"/>
-      </w:pPr>
-      <w:r>
-        <w:t xml:space="preserve">Wickham, H. 2016. ggplot2:</w:t>
-      </w:r>
-      <w:r>
-        <w:t xml:space="preserve"> </w:t>
-      </w:r>
-      <w:r>
-        <w:t xml:space="preserve">E</w:t>
-      </w:r>
-      <w:r>
-        <w:t xml:space="preserve">legant graphics for data analysis. Springer, New York.</w:t>
-      </w:r>
-    </w:p>
-    <w:bookmarkEnd w:id="74"/>
-    <w:bookmarkStart w:id="75" w:name="ref-winkler1987"/>
-    <w:p>
-      <w:pPr>
-        <w:pStyle w:val="Bibliography"/>
-      </w:pPr>
-      <w:r>
-        <w:t xml:space="preserve">Winkler, D. W., and K. Wallin. 1987. Offspring size and number: A life history model linking effort per offspring and total effort. Am Nat 129:708–720.</w:t>
-      </w:r>
-    </w:p>
-    <w:bookmarkEnd w:id="75"/>
-    <w:bookmarkStart w:id="76" w:name="ref-yanagi2006"/>
-    <w:p>
-      <w:pPr>
-        <w:pStyle w:val="Bibliography"/>
-      </w:pPr>
-      <w:r>
-        <w:t xml:space="preserve">Yanagi, S., T. Oikawa, and T. Miyatake. 2006. Heritability and genetic correlation estimates for egg size and number in callosobruchus chinensis (coleoptera: bruchidae). Ann Entomol Soc Am 99:364–368.</w:t>
-      </w:r>
-    </w:p>
-    <w:bookmarkEnd w:id="76"/>
-    <w:bookmarkStart w:id="77" w:name="ref-yosef2008"/>
-    <w:p>
-      <w:pPr>
-        <w:pStyle w:val="Bibliography"/>
-      </w:pPr>
-      <w:r>
-        <w:t xml:space="preserve">Yosef, R., and P. Zduniak. 2008. Variation in clutch size, egg size variability and reproductive output in the desert finch (rhodospiza obsoleta). J Arid Environ 72:1631–1635.</w:t>
-      </w:r>
-    </w:p>
-    <w:bookmarkEnd w:id="77"/>
-    <w:bookmarkEnd w:id="78"/>
     <w:p>
       <w:pPr>
         <w:pStyle w:val="BodyText"/>
@@ -2703,7 +2561,7 @@
       <w:tr>
         <w:tc>
           <w:tcPr/>
-          <w:bookmarkStart w:id="82" w:name="fig-one"/>
+          <w:bookmarkStart w:id="77" w:name="fig-one"/>
           <w:p>
             <w:pPr>
               <w:pStyle w:val="Compact"/>
@@ -2714,18 +2572,18 @@
                 <wp:inline>
                   <wp:extent cx="3810000" cy="2540000"/>
                   <wp:effectExtent b="0" l="0" r="0" t="0"/>
-                  <wp:docPr descr="" title="" id="80" name="Picture"/>
+                  <wp:docPr descr="" title="" id="75" name="Picture"/>
                   <a:graphic>
                     <a:graphicData uri="http://schemas.openxmlformats.org/drawingml/2006/picture">
                       <pic:pic>
                         <pic:nvPicPr>
-                          <pic:cNvPr descr="figure_1.jpg" id="81" name="Picture"/>
+                          <pic:cNvPr descr="figure_1.jpg" id="76" name="Picture"/>
                           <pic:cNvPicPr>
                             <a:picLocks noChangeArrowheads="1" noChangeAspect="1"/>
                           </pic:cNvPicPr>
                         </pic:nvPicPr>
                         <pic:blipFill>
-                          <a:blip r:embed="rId79"/>
+                          <a:blip r:embed="rId74"/>
                           <a:stretch>
                             <a:fillRect/>
                           </a:stretch>
@@ -2768,68 +2626,10 @@
               <w:t xml:space="preserve"> </w:t>
             </w:r>
             <w:r>
-              <w:t xml:space="preserve">and the shaded ribbon represents the 95% credible interval of the fitted relationship. The slope reflects the between-female effect (</w:t>
-            </w:r>
-            <m:oMath>
-              <m:sSub>
-                <m:e>
-                  <m:r>
-                    <m:t>β</m:t>
-                  </m:r>
-                </m:e>
-                <m:sub>
-                  <m:r>
-                    <m:t>B</m:t>
-                  </m:r>
-                </m:sub>
-              </m:sSub>
-            </m:oMath>
-            <w:r>
-              <w:t xml:space="preserve"> </w:t>
-            </w:r>
-            <w:r>
-              <w:t xml:space="preserve">= -0.0039, 95% CrI [-0.0076, -0.0001]), indicating whether females that produce more eggs on average lay larger or smaller eggs. This relationship corresponds to the Pearson correlation calculated among female means (</w:t>
-            </w:r>
-            <m:oMath>
-              <m:sSub>
-                <m:e>
-                  <m:r>
-                    <m:t>r</m:t>
-                  </m:r>
-                </m:e>
-                <m:sub>
-                  <m:r>
-                    <m:t>b</m:t>
-                  </m:r>
-                  <m:r>
-                    <m:t>e</m:t>
-                  </m:r>
-                  <m:r>
-                    <m:t>t</m:t>
-                  </m:r>
-                  <m:r>
-                    <m:t>w</m:t>
-                  </m:r>
-                  <m:r>
-                    <m:t>e</m:t>
-                  </m:r>
-                  <m:r>
-                    <m:t>e</m:t>
-                  </m:r>
-                  <m:r>
-                    <m:t>n</m:t>
-                  </m:r>
-                </m:sub>
-              </m:sSub>
-            </m:oMath>
-            <w:r>
-              <w:t xml:space="preserve"> </w:t>
-            </w:r>
-            <w:r>
-              <w:t xml:space="preserve">= -0.31, 95% CI [-0.55, -0.02]).</w:t>
+              <w:t xml:space="preserve">and the shaded ribbon represents the 95% credible interval of the fitted relationship. The slope reflects the between-female effect (), indicating whether females that produce more eggs on average lay larger or smaller eggs. This relationship corresponds to the Pearson correlation calculated among female means ().</w:t>
             </w:r>
           </w:p>
-          <w:bookmarkEnd w:id="82"/>
+          <w:bookmarkEnd w:id="77"/>
         </w:tc>
       </w:tr>
     </w:tbl>
@@ -2854,7 +2654,7 @@
       <w:tr>
         <w:tc>
           <w:tcPr/>
-          <w:bookmarkStart w:id="86" w:name="fig-two"/>
+          <w:bookmarkStart w:id="81" w:name="fig-two"/>
           <w:p>
             <w:pPr>
               <w:pStyle w:val="Compact"/>
@@ -2865,18 +2665,18 @@
                 <wp:inline>
                   <wp:extent cx="3810000" cy="2540000"/>
                   <wp:effectExtent b="0" l="0" r="0" t="0"/>
-                  <wp:docPr descr="" title="" id="84" name="Picture"/>
+                  <wp:docPr descr="" title="" id="79" name="Picture"/>
                   <a:graphic>
                     <a:graphicData uri="http://schemas.openxmlformats.org/drawingml/2006/picture">
                       <pic:pic>
                         <pic:nvPicPr>
-                          <pic:cNvPr descr="figure_2.jpg" id="85" name="Picture"/>
+                          <pic:cNvPr descr="figure_2.jpg" id="80" name="Picture"/>
                           <pic:cNvPicPr>
                             <a:picLocks noChangeArrowheads="1" noChangeAspect="1"/>
                           </pic:cNvPicPr>
                         </pic:nvPicPr>
                         <pic:blipFill>
-                          <a:blip r:embed="rId83"/>
+                          <a:blip r:embed="rId78"/>
                           <a:stretch>
                             <a:fillRect/>
                           </a:stretch>
@@ -2951,23 +2751,10 @@
               <w:t xml:space="preserve">?@eq-residual</w:t>
             </w:r>
             <w:r>
-              <w:t xml:space="preserve">, isolating within-female covariance between traits. The solid black line shows the linear regression fit to the residual values for visualization. The shallow slope is consistent with the posterior residual correlation estimated by the model (</w:t>
-            </w:r>
-            <w:r>
-              <w:rPr>
-                <w:i/>
-                <w:iCs/>
-              </w:rPr>
-              <w:t xml:space="preserve">r</w:t>
-            </w:r>
-            <w:r>
-              <w:t xml:space="preserve"> </w:t>
-            </w:r>
-            <w:r>
-              <w:t xml:space="preserve">= 0.0066 [-0.2018, 0.2299]), indicating little evidence for a within-female trade-off between egg number and egg size.</w:t>
+              <w:t xml:space="preserve">, isolating within-female covariance between traits. The solid black line shows the linear regression fit to the residual values for visualization. The shallow slope is consistent with the posterior residual correlation estimated by the model , indicating little evidence for a within-female trade-off between egg number and egg size.</w:t>
             </w:r>
           </w:p>
-          <w:bookmarkEnd w:id="86"/>
+          <w:bookmarkEnd w:id="81"/>
         </w:tc>
       </w:tr>
     </w:tbl>
@@ -2992,7 +2779,7 @@
       <w:tr>
         <w:tc>
           <w:tcPr/>
-          <w:bookmarkStart w:id="90" w:name="fig-three"/>
+          <w:bookmarkStart w:id="85" w:name="fig-three"/>
           <w:p>
             <w:pPr>
               <w:pStyle w:val="Compact"/>
@@ -3003,18 +2790,18 @@
                 <wp:inline>
                   <wp:extent cx="3810000" cy="2540000"/>
                   <wp:effectExtent b="0" l="0" r="0" t="0"/>
-                  <wp:docPr descr="" title="" id="88" name="Picture"/>
+                  <wp:docPr descr="" title="" id="83" name="Picture"/>
                   <a:graphic>
                     <a:graphicData uri="http://schemas.openxmlformats.org/drawingml/2006/picture">
                       <pic:pic>
                         <pic:nvPicPr>
-                          <pic:cNvPr descr="figure_3.jpg" id="89" name="Picture"/>
+                          <pic:cNvPr descr="figure_3.jpg" id="84" name="Picture"/>
                           <pic:cNvPicPr>
                             <a:picLocks noChangeArrowheads="1" noChangeAspect="1"/>
                           </pic:cNvPicPr>
                         </pic:nvPicPr>
                         <pic:blipFill>
-                          <a:blip r:embed="rId87"/>
+                          <a:blip r:embed="rId82"/>
                           <a:stretch>
                             <a:fillRect/>
                           </a:stretch>
@@ -3051,10 +2838,10 @@
               <w:pStyle w:val="ImageCaption"/>
             </w:pPr>
             <w:r>
-              <w:t xml:space="preserve">Figure 3: Mean egg size plotted against within-female deviation in egg number (clutch size minus each female’s mean). Points represent individual clutches, and thin gray lines connect successive clutches from the same female. The solid black line shows the posterior mean population-level effect of within-female egg-number deviation estimated from the mixed-effects model. The shaded ribbon represents the 95% credible interval of the posterior expected value (random effects excluded). Positive values on the x-axis indicate broods in which a female laid more eggs than her average, whereas negative values indicate broods with fewer eggs than her average. Note that second clutches (blue points) tend to negatively deviate from zero whereas first clutches (salmon points) tend to positively deviate from zero. The slope of the population-level line reflects the estimated within-female plastic response of egg size to changes in egg number 0.</w:t>
+              <w:t xml:space="preserve">Figure 3: Mean egg size plotted against within-female deviation in egg number (clutch size minus each female’s mean). Points represent individual clutches, and thin gray lines connect successive clutches from the same female. The solid black line shows the posterior mean population-level effect of within-female egg-number deviation estimated from the mixed-effects model. The shaded ribbon represents the 95% credible interval of the posterior expected value (random effects excluded). Positive values on the x-axis indicate broods in which a female laid more eggs than her average, whereas negative values indicate broods with fewer eggs than her average. Note that second clutches (blue points) tend to negatively deviate from zero whereas first clutches (salmon points) tend to positively deviate from zero. The slope of the population-level line reflects the estimated within-female plastic response of egg size to changes in egg number .</w:t>
             </w:r>
           </w:p>
-          <w:bookmarkEnd w:id="90"/>
+          <w:bookmarkEnd w:id="85"/>
         </w:tc>
       </w:tr>
     </w:tbl>
@@ -3079,7 +2866,7 @@
       <w:tr>
         <w:tc>
           <w:tcPr/>
-          <w:bookmarkStart w:id="94" w:name="fig-four"/>
+          <w:bookmarkStart w:id="89" w:name="fig-four"/>
           <w:p>
             <w:pPr>
               <w:pStyle w:val="Compact"/>
@@ -3090,18 +2877,18 @@
                 <wp:inline>
                   <wp:extent cx="3810000" cy="2540000"/>
                   <wp:effectExtent b="0" l="0" r="0" t="0"/>
-                  <wp:docPr descr="" title="" id="92" name="Picture"/>
+                  <wp:docPr descr="" title="" id="87" name="Picture"/>
                   <a:graphic>
                     <a:graphicData uri="http://schemas.openxmlformats.org/drawingml/2006/picture">
                       <pic:pic>
                         <pic:nvPicPr>
-                          <pic:cNvPr descr="figure_4.jpg" id="93" name="Picture"/>
+                          <pic:cNvPr descr="figure_4.jpg" id="88" name="Picture"/>
                           <pic:cNvPicPr>
                             <a:picLocks noChangeArrowheads="1" noChangeAspect="1"/>
                           </pic:cNvPicPr>
                         </pic:nvPicPr>
                         <pic:blipFill>
-                          <a:blip r:embed="rId91"/>
+                          <a:blip r:embed="rId86"/>
                           <a:stretch>
                             <a:fillRect/>
                           </a:stretch>
@@ -3141,11 +2928,11 @@
               <w:t xml:space="preserve">Figure 4: Clutch-specific variance components of egg size. (a) Between-female variance in egg size for first and second clutches, estimated from a hierarchical Bayesian model with clutch-specific female effects. (b) Within-clutch (egg-to-egg) variance for first and second clutches. Grey points represent posterior draws, black points indicate posterior medians, and vertical lines denote 95% credible intervals. Between-female variance did not differ clearly between clutches, whereas within-clutch variance was greater in second clutches.</w:t>
             </w:r>
           </w:p>
-          <w:bookmarkEnd w:id="94"/>
+          <w:bookmarkEnd w:id="89"/>
         </w:tc>
       </w:tr>
     </w:tbl>
-    <w:bookmarkEnd w:id="95"/>
+    <w:bookmarkEnd w:id="90"/>
     <w:sectPr>
       <w:headerReference r:id="rId10" w:type="even"/>
       <w:headerReference r:id="rId9" w:type="default"/>
@@ -3178,11 +2965,6 @@
         <w:docPartUnique/>
       </w:docPartObj>
     </w:sdtPr>
-    <w:sdtEndPr>
-      <w:rPr>
-        <w:rStyle w:val="PageNumber"/>
-      </w:rPr>
-    </w:sdtEndPr>
     <w:sdtContent>
       <w:p>
         <w:pPr>
@@ -3235,11 +3017,6 @@
         <w:docPartUnique/>
       </w:docPartObj>
     </w:sdtPr>
-    <w:sdtEndPr>
-      <w:rPr>
-        <w:rStyle w:val="PageNumber"/>
-      </w:rPr>
-    </w:sdtEndPr>
     <w:sdtContent>
       <w:p>
         <w:pPr>
@@ -3324,11 +3101,6 @@
         <w:docPartUnique/>
       </w:docPartObj>
     </w:sdtPr>
-    <w:sdtEndPr>
-      <w:rPr>
-        <w:rStyle w:val="PageNumber"/>
-      </w:rPr>
-    </w:sdtEndPr>
     <w:sdtContent>
       <w:p>
         <w:pPr>

</xml_diff>